<commit_message>
updated a little bit of the controller code(nothing too special from last commit) and fixed the document numbers
</commit_message>
<xml_diff>
--- a/project docs/Cyber_Proj_Shlomi_Levi.docx
+++ b/project docs/Cyber_Proj_Shlomi_Levi.docx
@@ -8,7 +8,7 @@
         <w:pStyle w:val="Normal"/>
         <w:bidi w:val="1"/>
         <w:spacing w:before="160" w:after="0"/>
-        <w:ind w:end="284"/>
+        <w:ind w:hanging="0" w:start="284" w:end="284"/>
         <w:jc w:val="start"/>
         <w:rPr>
           <w:rFonts w:ascii="Arial" w:hAnsi="Arial" w:cs="Arial"/>
@@ -31,7 +31,7 @@
       <w:pPr>
         <w:pStyle w:val="Normal"/>
         <w:bidi w:val="1"/>
-        <w:ind w:end="284"/>
+        <w:ind w:hanging="0" w:start="284" w:end="284"/>
         <w:jc w:val="start"/>
         <w:rPr>
           <w:rFonts w:ascii="Arial" w:hAnsi="Arial" w:cs="Arial"/>
@@ -54,7 +54,7 @@
       <w:pPr>
         <w:pStyle w:val="Normal"/>
         <w:bidi w:val="1"/>
-        <w:ind w:end="284"/>
+        <w:ind w:hanging="0" w:start="284" w:end="284"/>
         <w:jc w:val="start"/>
         <w:rPr>
           <w:rFonts w:ascii="Arial" w:hAnsi="Arial" w:cs="Arial"/>
@@ -298,10 +298,10 @@
         </w:tblCellMar>
       </w:tblPr>
       <w:tblGrid>
-        <w:gridCol w:w="2520"/>
+        <w:gridCol w:w="2519"/>
         <w:gridCol w:w="1490"/>
-        <w:gridCol w:w="4394"/>
-        <w:gridCol w:w="1595"/>
+        <w:gridCol w:w="4395"/>
+        <w:gridCol w:w="1594"/>
       </w:tblGrid>
       <w:tr>
         <w:trPr>
@@ -309,7 +309,7 @@
         </w:trPr>
         <w:tc>
           <w:tcPr>
-            <w:tcW w:w="2520" w:type="dxa"/>
+            <w:tcW w:w="2519" w:type="dxa"/>
             <w:tcBorders>
               <w:top w:val="single" w:sz="8" w:space="0" w:color="000000"/>
               <w:start w:val="single" w:sz="8" w:space="0" w:color="000000"/>
@@ -323,7 +323,7 @@
               <w:bidi w:val="1"/>
               <w:snapToGrid w:val="false"/>
               <w:spacing w:before="160" w:after="0"/>
-              <w:ind w:end="284"/>
+              <w:ind w:hanging="0" w:start="284" w:end="284"/>
               <w:jc w:val="start"/>
               <w:rPr>
                 <w:rFonts w:ascii="Arial" w:hAnsi="Arial" w:cs="Arial"/>
@@ -354,7 +354,7 @@
               <w:pStyle w:val="Normal"/>
               <w:bidi w:val="1"/>
               <w:spacing w:before="160" w:after="0"/>
-              <w:ind w:end="284"/>
+              <w:ind w:hanging="0" w:start="284" w:end="284"/>
               <w:jc w:val="start"/>
               <w:rPr/>
             </w:pPr>
@@ -415,7 +415,7 @@
         </w:tc>
         <w:tc>
           <w:tcPr>
-            <w:tcW w:w="4394" w:type="dxa"/>
+            <w:tcW w:w="4395" w:type="dxa"/>
             <w:tcBorders>
               <w:top w:val="single" w:sz="8" w:space="0" w:color="000000"/>
               <w:start w:val="single" w:sz="8" w:space="0" w:color="000000"/>
@@ -429,7 +429,7 @@
               <w:bidi w:val="1"/>
               <w:snapToGrid w:val="false"/>
               <w:spacing w:before="160" w:after="0"/>
-              <w:ind w:end="284"/>
+              <w:ind w:hanging="0" w:start="284" w:end="284"/>
               <w:jc w:val="start"/>
               <w:rPr>
                 <w:rFonts w:ascii="Arial" w:hAnsi="Arial" w:cs="Arial"/>
@@ -448,7 +448,7 @@
         </w:tc>
         <w:tc>
           <w:tcPr>
-            <w:tcW w:w="1595" w:type="dxa"/>
+            <w:tcW w:w="1594" w:type="dxa"/>
             <w:tcBorders>
               <w:top w:val="single" w:sz="8" w:space="0" w:color="000000"/>
               <w:start w:val="single" w:sz="8" w:space="0" w:color="000000"/>
@@ -461,7 +461,7 @@
               <w:pStyle w:val="Normal"/>
               <w:bidi w:val="1"/>
               <w:spacing w:before="160" w:after="0"/>
-              <w:ind w:end="284"/>
+              <w:ind w:hanging="0" w:start="284" w:end="284"/>
               <w:jc w:val="start"/>
               <w:rPr/>
             </w:pPr>
@@ -515,7 +515,7 @@
               <w:bidi w:val="1"/>
               <w:snapToGrid w:val="false"/>
               <w:spacing w:before="160" w:after="0"/>
-              <w:ind w:end="284"/>
+              <w:ind w:hanging="0" w:start="284" w:end="284"/>
               <w:jc w:val="start"/>
               <w:rPr>
                 <w:rFonts w:ascii="Arial" w:hAnsi="Arial" w:cs="Arial"/>
@@ -533,7 +533,7 @@
         </w:tc>
         <w:tc>
           <w:tcPr>
-            <w:tcW w:w="1595" w:type="dxa"/>
+            <w:tcW w:w="1594" w:type="dxa"/>
             <w:tcBorders>
               <w:top w:val="single" w:sz="8" w:space="0" w:color="000000"/>
               <w:start w:val="single" w:sz="8" w:space="0" w:color="000000"/>
@@ -546,7 +546,7 @@
               <w:pStyle w:val="Normal"/>
               <w:bidi w:val="1"/>
               <w:spacing w:before="160" w:after="0"/>
-              <w:ind w:end="284"/>
+              <w:ind w:hanging="0" w:start="284" w:end="284"/>
               <w:jc w:val="start"/>
               <w:rPr/>
             </w:pPr>
@@ -585,7 +585,7 @@
         </w:trPr>
         <w:tc>
           <w:tcPr>
-            <w:tcW w:w="2520" w:type="dxa"/>
+            <w:tcW w:w="2519" w:type="dxa"/>
             <w:tcBorders>
               <w:top w:val="single" w:sz="8" w:space="0" w:color="000000"/>
               <w:start w:val="single" w:sz="8" w:space="0" w:color="000000"/>
@@ -598,7 +598,7 @@
               <w:pStyle w:val="Normal"/>
               <w:bidi w:val="1"/>
               <w:spacing w:before="160" w:after="0"/>
-              <w:ind w:end="284"/>
+              <w:ind w:hanging="0" w:start="284" w:end="284"/>
               <w:jc w:val="start"/>
               <w:rPr>
                 <w:rFonts w:ascii="Arial" w:hAnsi="Arial" w:cs="Arial"/>
@@ -631,7 +631,7 @@
               <w:pStyle w:val="Normal"/>
               <w:bidi w:val="1"/>
               <w:spacing w:before="160" w:after="0"/>
-              <w:ind w:end="284"/>
+              <w:ind w:hanging="0" w:start="284" w:end="284"/>
               <w:jc w:val="start"/>
               <w:rPr>
                 <w:rFonts w:ascii="Arial" w:hAnsi="Arial" w:cs="Arial"/>
@@ -652,7 +652,7 @@
         </w:tc>
         <w:tc>
           <w:tcPr>
-            <w:tcW w:w="4394" w:type="dxa"/>
+            <w:tcW w:w="4395" w:type="dxa"/>
             <w:tcBorders>
               <w:top w:val="single" w:sz="8" w:space="0" w:color="000000"/>
               <w:start w:val="single" w:sz="8" w:space="0" w:color="000000"/>
@@ -665,7 +665,7 @@
               <w:pStyle w:val="Normal"/>
               <w:bidi w:val="1"/>
               <w:spacing w:before="160" w:after="0"/>
-              <w:ind w:end="284"/>
+              <w:ind w:hanging="0" w:start="284" w:end="284"/>
               <w:jc w:val="start"/>
               <w:rPr>
                 <w:rFonts w:ascii="Arial" w:hAnsi="Arial" w:cs="Arial"/>
@@ -686,7 +686,7 @@
         </w:tc>
         <w:tc>
           <w:tcPr>
-            <w:tcW w:w="1595" w:type="dxa"/>
+            <w:tcW w:w="1594" w:type="dxa"/>
             <w:tcBorders>
               <w:top w:val="single" w:sz="8" w:space="0" w:color="000000"/>
               <w:start w:val="single" w:sz="8" w:space="0" w:color="000000"/>
@@ -699,7 +699,7 @@
               <w:pStyle w:val="Normal"/>
               <w:bidi w:val="1"/>
               <w:spacing w:before="160" w:after="0"/>
-              <w:ind w:end="284"/>
+              <w:ind w:hanging="0" w:start="284" w:end="284"/>
               <w:jc w:val="start"/>
               <w:rPr/>
             </w:pPr>
@@ -794,9 +794,9 @@
         </w:tblCellMar>
       </w:tblPr>
       <w:tblGrid>
-        <w:gridCol w:w="1260"/>
+        <w:gridCol w:w="1259"/>
         <w:gridCol w:w="1008"/>
-        <w:gridCol w:w="7722"/>
+        <w:gridCol w:w="7723"/>
       </w:tblGrid>
       <w:tr>
         <w:trPr>
@@ -804,7 +804,7 @@
         </w:trPr>
         <w:tc>
           <w:tcPr>
-            <w:tcW w:w="1260" w:type="dxa"/>
+            <w:tcW w:w="1259" w:type="dxa"/>
             <w:tcBorders>
               <w:top w:val="single" w:sz="12" w:space="0" w:color="000000"/>
               <w:start w:val="single" w:sz="12" w:space="0" w:color="000000"/>
@@ -817,7 +817,7 @@
             <w:pPr>
               <w:pStyle w:val="Normal"/>
               <w:spacing w:before="160" w:after="0"/>
-              <w:ind w:start="34" w:end="284"/>
+              <w:ind w:hanging="0" w:start="34" w:end="284"/>
               <w:jc w:val="both"/>
               <w:rPr/>
             </w:pPr>
@@ -842,7 +842,7 @@
             <w:pPr>
               <w:pStyle w:val="Normal"/>
               <w:spacing w:before="160" w:after="0"/>
-              <w:ind w:start="0" w:end="284"/>
+              <w:ind w:hanging="0" w:start="0" w:end="284"/>
               <w:jc w:val="center"/>
               <w:rPr/>
             </w:pPr>
@@ -854,7 +854,7 @@
         </w:tc>
         <w:tc>
           <w:tcPr>
-            <w:tcW w:w="7722" w:type="dxa"/>
+            <w:tcW w:w="7723" w:type="dxa"/>
             <w:tcBorders>
               <w:top w:val="single" w:sz="12" w:space="0" w:color="000000"/>
               <w:start w:val="single" w:sz="6" w:space="0" w:color="000000"/>
@@ -867,7 +867,7 @@
             <w:pPr>
               <w:pStyle w:val="Normal"/>
               <w:spacing w:before="160" w:after="0"/>
-              <w:ind w:start="0" w:end="284"/>
+              <w:ind w:hanging="0" w:start="0" w:end="284"/>
               <w:rPr/>
             </w:pPr>
             <w:r>
@@ -883,7 +883,7 @@
         </w:trPr>
         <w:tc>
           <w:tcPr>
-            <w:tcW w:w="1260" w:type="dxa"/>
+            <w:tcW w:w="1259" w:type="dxa"/>
             <w:tcBorders>
               <w:start w:val="single" w:sz="12" w:space="0" w:color="000000"/>
               <w:bottom w:val="single" w:sz="6" w:space="0" w:color="000000"/>
@@ -894,7 +894,7 @@
             <w:pPr>
               <w:pStyle w:val="Normal"/>
               <w:spacing w:before="160" w:after="0"/>
-              <w:ind w:start="34" w:end="284"/>
+              <w:ind w:hanging="0" w:start="34" w:end="284"/>
               <w:jc w:val="both"/>
               <w:rPr>
                 <w:rFonts w:ascii="Arial" w:hAnsi="Arial" w:cs="Arial"/>
@@ -922,7 +922,7 @@
               <w:pStyle w:val="Normal"/>
               <w:snapToGrid w:val="false"/>
               <w:spacing w:before="160" w:after="0"/>
-              <w:ind w:start="0" w:end="284"/>
+              <w:ind w:hanging="0" w:start="0" w:end="284"/>
               <w:jc w:val="both"/>
               <w:rPr>
                 <w:rFonts w:ascii="Arial" w:hAnsi="Arial" w:cs="Arial"/>
@@ -939,7 +939,7 @@
         </w:tc>
         <w:tc>
           <w:tcPr>
-            <w:tcW w:w="7722" w:type="dxa"/>
+            <w:tcW w:w="7723" w:type="dxa"/>
             <w:tcBorders>
               <w:start w:val="single" w:sz="6" w:space="0" w:color="000000"/>
               <w:bottom w:val="single" w:sz="6" w:space="0" w:color="000000"/>
@@ -950,7 +950,7 @@
             <w:pPr>
               <w:pStyle w:val="Normal"/>
               <w:spacing w:before="160" w:after="0"/>
-              <w:ind w:start="0" w:end="284"/>
+              <w:ind w:hanging="0" w:start="0" w:end="284"/>
               <w:jc w:val="both"/>
               <w:rPr>
                 <w:rFonts w:ascii="Arial" w:hAnsi="Arial" w:cs="Arial"/>
@@ -971,7 +971,7 @@
         </w:trPr>
         <w:tc>
           <w:tcPr>
-            <w:tcW w:w="1260" w:type="dxa"/>
+            <w:tcW w:w="1259" w:type="dxa"/>
             <w:tcBorders>
               <w:top w:val="single" w:sz="6" w:space="0" w:color="000000"/>
               <w:start w:val="single" w:sz="12" w:space="0" w:color="000000"/>
@@ -984,7 +984,7 @@
               <w:pStyle w:val="Normal"/>
               <w:snapToGrid w:val="false"/>
               <w:spacing w:before="160" w:after="0"/>
-              <w:ind w:start="34" w:end="284"/>
+              <w:ind w:hanging="0" w:start="34" w:end="284"/>
               <w:jc w:val="both"/>
               <w:rPr>
                 <w:rFonts w:ascii="Arial" w:hAnsi="Arial" w:cs="Arial"/>
@@ -1012,7 +1012,7 @@
               <w:pStyle w:val="Normal"/>
               <w:snapToGrid w:val="false"/>
               <w:spacing w:before="160" w:after="0"/>
-              <w:ind w:start="0" w:end="284"/>
+              <w:ind w:hanging="0" w:start="0" w:end="284"/>
               <w:jc w:val="both"/>
               <w:rPr>
                 <w:rFonts w:ascii="Arial" w:hAnsi="Arial" w:cs="Arial"/>
@@ -1027,7 +1027,7 @@
         </w:tc>
         <w:tc>
           <w:tcPr>
-            <w:tcW w:w="7722" w:type="dxa"/>
+            <w:tcW w:w="7723" w:type="dxa"/>
             <w:tcBorders>
               <w:top w:val="single" w:sz="6" w:space="0" w:color="000000"/>
               <w:start w:val="single" w:sz="6" w:space="0" w:color="000000"/>
@@ -1040,7 +1040,7 @@
               <w:pStyle w:val="Normal"/>
               <w:snapToGrid w:val="false"/>
               <w:spacing w:before="160" w:after="0"/>
-              <w:ind w:start="0" w:end="284"/>
+              <w:ind w:hanging="0" w:start="0" w:end="284"/>
               <w:jc w:val="both"/>
               <w:rPr>
                 <w:rFonts w:ascii="Arial" w:hAnsi="Arial" w:cs="Arial"/>
@@ -1062,7 +1062,7 @@
         </w:trPr>
         <w:tc>
           <w:tcPr>
-            <w:tcW w:w="1260" w:type="dxa"/>
+            <w:tcW w:w="1259" w:type="dxa"/>
             <w:tcBorders>
               <w:top w:val="single" w:sz="6" w:space="0" w:color="000000"/>
               <w:start w:val="single" w:sz="12" w:space="0" w:color="000000"/>
@@ -1075,7 +1075,7 @@
               <w:pStyle w:val="Normal"/>
               <w:snapToGrid w:val="false"/>
               <w:spacing w:before="160" w:after="0"/>
-              <w:ind w:start="34" w:end="284"/>
+              <w:ind w:hanging="0" w:start="34" w:end="284"/>
               <w:jc w:val="both"/>
               <w:rPr>
                 <w:rFonts w:ascii="Arial" w:hAnsi="Arial" w:cs="Arial"/>
@@ -1105,7 +1105,7 @@
               <w:pStyle w:val="Normal"/>
               <w:snapToGrid w:val="false"/>
               <w:spacing w:before="160" w:after="0"/>
-              <w:ind w:start="0" w:end="284"/>
+              <w:ind w:hanging="0" w:start="0" w:end="284"/>
               <w:jc w:val="both"/>
               <w:rPr>
                 <w:rFonts w:ascii="Arial" w:hAnsi="Arial" w:cs="Arial"/>
@@ -1122,7 +1122,7 @@
         </w:tc>
         <w:tc>
           <w:tcPr>
-            <w:tcW w:w="7722" w:type="dxa"/>
+            <w:tcW w:w="7723" w:type="dxa"/>
             <w:tcBorders>
               <w:top w:val="single" w:sz="6" w:space="0" w:color="000000"/>
               <w:start w:val="single" w:sz="6" w:space="0" w:color="000000"/>
@@ -1135,7 +1135,7 @@
               <w:pStyle w:val="Normal"/>
               <w:snapToGrid w:val="false"/>
               <w:spacing w:before="160" w:after="0"/>
-              <w:ind w:start="0" w:end="284"/>
+              <w:ind w:hanging="0" w:start="0" w:end="284"/>
               <w:jc w:val="both"/>
               <w:rPr>
                 <w:rFonts w:ascii="Arial" w:hAnsi="Arial" w:cs="Arial"/>
@@ -1157,7 +1157,7 @@
         </w:trPr>
         <w:tc>
           <w:tcPr>
-            <w:tcW w:w="1260" w:type="dxa"/>
+            <w:tcW w:w="1259" w:type="dxa"/>
             <w:tcBorders>
               <w:top w:val="single" w:sz="6" w:space="0" w:color="000000"/>
               <w:start w:val="single" w:sz="12" w:space="0" w:color="000000"/>
@@ -1170,7 +1170,7 @@
               <w:pStyle w:val="Normal"/>
               <w:snapToGrid w:val="false"/>
               <w:spacing w:before="160" w:after="0"/>
-              <w:ind w:start="34" w:end="284"/>
+              <w:ind w:hanging="0" w:start="34" w:end="284"/>
               <w:jc w:val="both"/>
               <w:rPr>
                 <w:rFonts w:ascii="Arial" w:hAnsi="Arial" w:cs="Arial"/>
@@ -1200,7 +1200,7 @@
               <w:pStyle w:val="Normal"/>
               <w:snapToGrid w:val="false"/>
               <w:spacing w:before="160" w:after="0"/>
-              <w:ind w:start="0" w:end="284"/>
+              <w:ind w:hanging="0" w:start="0" w:end="284"/>
               <w:jc w:val="both"/>
               <w:rPr>
                 <w:rFonts w:ascii="Arial" w:hAnsi="Arial" w:cs="Arial"/>
@@ -1217,7 +1217,7 @@
         </w:tc>
         <w:tc>
           <w:tcPr>
-            <w:tcW w:w="7722" w:type="dxa"/>
+            <w:tcW w:w="7723" w:type="dxa"/>
             <w:tcBorders>
               <w:top w:val="single" w:sz="6" w:space="0" w:color="000000"/>
               <w:start w:val="single" w:sz="6" w:space="0" w:color="000000"/>
@@ -1230,7 +1230,7 @@
               <w:pStyle w:val="Normal"/>
               <w:snapToGrid w:val="false"/>
               <w:spacing w:before="160" w:after="0"/>
-              <w:ind w:start="0" w:end="284"/>
+              <w:ind w:hanging="0" w:start="0" w:end="284"/>
               <w:jc w:val="both"/>
               <w:rPr>
                 <w:rFonts w:ascii="Arial" w:hAnsi="Arial" w:cs="Arial"/>
@@ -1252,7 +1252,7 @@
         </w:trPr>
         <w:tc>
           <w:tcPr>
-            <w:tcW w:w="1260" w:type="dxa"/>
+            <w:tcW w:w="1259" w:type="dxa"/>
             <w:tcBorders>
               <w:top w:val="single" w:sz="6" w:space="0" w:color="000000"/>
               <w:start w:val="single" w:sz="12" w:space="0" w:color="000000"/>
@@ -1265,7 +1265,7 @@
               <w:pStyle w:val="Normal"/>
               <w:snapToGrid w:val="false"/>
               <w:spacing w:before="160" w:after="0"/>
-              <w:ind w:start="34" w:end="284"/>
+              <w:ind w:hanging="0" w:start="34" w:end="284"/>
               <w:jc w:val="both"/>
               <w:rPr>
                 <w:rFonts w:ascii="Arial" w:hAnsi="Arial" w:cs="Arial"/>
@@ -1295,7 +1295,7 @@
               <w:pStyle w:val="Normal"/>
               <w:snapToGrid w:val="false"/>
               <w:spacing w:before="160" w:after="0"/>
-              <w:ind w:start="0" w:end="284"/>
+              <w:ind w:hanging="0" w:start="0" w:end="284"/>
               <w:jc w:val="both"/>
               <w:rPr>
                 <w:rFonts w:ascii="Arial" w:hAnsi="Arial" w:cs="Arial"/>
@@ -1312,7 +1312,7 @@
         </w:tc>
         <w:tc>
           <w:tcPr>
-            <w:tcW w:w="7722" w:type="dxa"/>
+            <w:tcW w:w="7723" w:type="dxa"/>
             <w:tcBorders>
               <w:top w:val="single" w:sz="6" w:space="0" w:color="000000"/>
               <w:start w:val="single" w:sz="6" w:space="0" w:color="000000"/>
@@ -1325,7 +1325,7 @@
               <w:pStyle w:val="Normal"/>
               <w:snapToGrid w:val="false"/>
               <w:spacing w:before="160" w:after="0"/>
-              <w:ind w:start="0" w:end="284"/>
+              <w:ind w:hanging="0" w:start="0" w:end="284"/>
               <w:jc w:val="both"/>
               <w:rPr>
                 <w:rFonts w:ascii="Arial" w:hAnsi="Arial" w:cs="Arial"/>
@@ -1347,7 +1347,7 @@
         </w:trPr>
         <w:tc>
           <w:tcPr>
-            <w:tcW w:w="1260" w:type="dxa"/>
+            <w:tcW w:w="1259" w:type="dxa"/>
             <w:tcBorders>
               <w:top w:val="single" w:sz="6" w:space="0" w:color="000000"/>
               <w:start w:val="single" w:sz="12" w:space="0" w:color="000000"/>
@@ -1360,7 +1360,7 @@
               <w:pStyle w:val="Normal"/>
               <w:snapToGrid w:val="false"/>
               <w:spacing w:before="160" w:after="0"/>
-              <w:ind w:start="34" w:end="284"/>
+              <w:ind w:hanging="0" w:start="34" w:end="284"/>
               <w:jc w:val="both"/>
               <w:rPr>
                 <w:rFonts w:ascii="Arial" w:hAnsi="Arial" w:cs="Arial"/>
@@ -1390,7 +1390,7 @@
               <w:pStyle w:val="Normal"/>
               <w:snapToGrid w:val="false"/>
               <w:spacing w:before="160" w:after="0"/>
-              <w:ind w:start="0" w:end="284"/>
+              <w:ind w:hanging="0" w:start="0" w:end="284"/>
               <w:jc w:val="both"/>
               <w:rPr>
                 <w:rFonts w:ascii="Arial" w:hAnsi="Arial" w:cs="Arial"/>
@@ -1407,7 +1407,7 @@
         </w:tc>
         <w:tc>
           <w:tcPr>
-            <w:tcW w:w="7722" w:type="dxa"/>
+            <w:tcW w:w="7723" w:type="dxa"/>
             <w:tcBorders>
               <w:top w:val="single" w:sz="6" w:space="0" w:color="000000"/>
               <w:start w:val="single" w:sz="6" w:space="0" w:color="000000"/>
@@ -1420,7 +1420,7 @@
               <w:pStyle w:val="Normal"/>
               <w:snapToGrid w:val="false"/>
               <w:spacing w:before="160" w:after="0"/>
-              <w:ind w:start="0" w:end="284"/>
+              <w:ind w:hanging="0" w:start="0" w:end="284"/>
               <w:jc w:val="both"/>
               <w:rPr>
                 <w:rFonts w:ascii="Arial" w:hAnsi="Arial" w:cs="Arial"/>
@@ -1500,7 +1500,7 @@
     <w:p>
       <w:pPr>
         <w:pStyle w:val="TOCHeading"/>
-        <w:ind w:end="0"/>
+        <w:ind w:hanging="0" w:start="0" w:end="0"/>
         <w:jc w:val="start"/>
         <w:rPr/>
       </w:pPr>
@@ -1521,7 +1521,7 @@
           <w:pPr>
             <w:pStyle w:val="TOC1"/>
             <w:tabs>
-              <w:tab w:val="clear" w:pos="720"/>
+              <w:tab w:val="clear" w:pos="709"/>
               <w:tab w:val="left" w:pos="480" w:leader="none"/>
               <w:tab w:val="right" w:pos="9061" w:leader="dot"/>
             </w:tabs>
@@ -1532,13 +1532,15 @@
           </w:r>
           <w:r>
             <w:rPr>
+              <w:webHidden/>
               <w:rStyle w:val="IndexLink"/>
               <w:lang w:val="en-US" w:eastAsia="en-US"/>
             </w:rPr>
-            <w:instrText xml:space="preserve"> TOC \o "1-3" \h \z \u </w:instrText>
+            <w:instrText xml:space="preserve"> TOC \z \o "1-3" \u \h</w:instrText>
           </w:r>
           <w:r>
             <w:rPr>
+              <w:webHidden/>
               <w:rStyle w:val="IndexLink"/>
               <w:lang w:val="en-US" w:eastAsia="en-US"/>
             </w:rPr>
@@ -1547,6 +1549,7 @@
           <w:hyperlink w:anchor="__RefHeading___Toc209893722">
             <w:r>
               <w:rPr>
+                <w:webHidden/>
                 <w:rStyle w:val="IndexLink"/>
                 <w:lang w:val="en-US" w:eastAsia="en-US"/>
               </w:rPr>
@@ -1577,7 +1580,7 @@
           <w:pPr>
             <w:pStyle w:val="TOC2"/>
             <w:tabs>
-              <w:tab w:val="clear" w:pos="720"/>
+              <w:tab w:val="clear" w:pos="709"/>
               <w:tab w:val="left" w:pos="960" w:leader="none"/>
               <w:tab w:val="right" w:pos="9061" w:leader="dot"/>
             </w:tabs>
@@ -1586,6 +1589,7 @@
           <w:hyperlink w:anchor="__RefHeading___Toc209893723">
             <w:r>
               <w:rPr>
+                <w:webHidden/>
                 <w:rStyle w:val="IndexLink"/>
                 <w:lang w:val="en-US" w:eastAsia="en-US"/>
               </w:rPr>
@@ -1616,7 +1620,7 @@
           <w:pPr>
             <w:pStyle w:val="TOC2"/>
             <w:tabs>
-              <w:tab w:val="clear" w:pos="720"/>
+              <w:tab w:val="clear" w:pos="709"/>
               <w:tab w:val="left" w:pos="960" w:leader="none"/>
               <w:tab w:val="right" w:pos="9061" w:leader="dot"/>
             </w:tabs>
@@ -1625,6 +1629,7 @@
           <w:hyperlink w:anchor="__RefHeading___Toc209893724">
             <w:r>
               <w:rPr>
+                <w:webHidden/>
                 <w:rStyle w:val="IndexLink"/>
                 <w:lang w:val="en-US" w:eastAsia="en-US"/>
               </w:rPr>
@@ -1655,7 +1660,7 @@
           <w:pPr>
             <w:pStyle w:val="TOC2"/>
             <w:tabs>
-              <w:tab w:val="clear" w:pos="720"/>
+              <w:tab w:val="clear" w:pos="709"/>
               <w:tab w:val="left" w:pos="960" w:leader="none"/>
               <w:tab w:val="right" w:pos="9061" w:leader="dot"/>
             </w:tabs>
@@ -1664,6 +1669,7 @@
           <w:hyperlink w:anchor="__RefHeading___Toc209893725">
             <w:r>
               <w:rPr>
+                <w:webHidden/>
                 <w:rStyle w:val="IndexLink"/>
                 <w:lang w:val="en-US" w:eastAsia="en-US"/>
               </w:rPr>
@@ -1694,7 +1700,7 @@
           <w:pPr>
             <w:pStyle w:val="TOC2"/>
             <w:tabs>
-              <w:tab w:val="clear" w:pos="720"/>
+              <w:tab w:val="clear" w:pos="709"/>
               <w:tab w:val="left" w:pos="960" w:leader="none"/>
               <w:tab w:val="right" w:pos="9061" w:leader="dot"/>
             </w:tabs>
@@ -1703,6 +1709,7 @@
           <w:hyperlink w:anchor="__RefHeading___Toc209893726">
             <w:r>
               <w:rPr>
+                <w:webHidden/>
                 <w:rStyle w:val="IndexLink"/>
                 <w:lang w:val="en-US" w:eastAsia="en-US"/>
               </w:rPr>
@@ -1733,7 +1740,7 @@
           <w:pPr>
             <w:pStyle w:val="TOC2"/>
             <w:tabs>
-              <w:tab w:val="clear" w:pos="720"/>
+              <w:tab w:val="clear" w:pos="709"/>
               <w:tab w:val="left" w:pos="960" w:leader="none"/>
               <w:tab w:val="right" w:pos="9061" w:leader="dot"/>
             </w:tabs>
@@ -1742,6 +1749,7 @@
           <w:hyperlink w:anchor="__RefHeading___Toc209893727">
             <w:r>
               <w:rPr>
+                <w:webHidden/>
                 <w:rStyle w:val="IndexLink"/>
                 <w:lang w:val="en-US" w:eastAsia="en-US"/>
               </w:rPr>
@@ -1772,7 +1780,7 @@
           <w:pPr>
             <w:pStyle w:val="TOC3"/>
             <w:tabs>
-              <w:tab w:val="clear" w:pos="720"/>
+              <w:tab w:val="clear" w:pos="709"/>
               <w:tab w:val="left" w:pos="1440" w:leader="none"/>
               <w:tab w:val="right" w:pos="9061" w:leader="dot"/>
             </w:tabs>
@@ -1781,6 +1789,7 @@
           <w:hyperlink w:anchor="__RefHeading___Toc209893728">
             <w:r>
               <w:rPr>
+                <w:webHidden/>
                 <w:rStyle w:val="IndexLink"/>
                 <w:lang w:val="en-US" w:eastAsia="en-US"/>
               </w:rPr>
@@ -1811,7 +1820,7 @@
           <w:pPr>
             <w:pStyle w:val="TOC3"/>
             <w:tabs>
-              <w:tab w:val="clear" w:pos="720"/>
+              <w:tab w:val="clear" w:pos="709"/>
               <w:tab w:val="left" w:pos="1440" w:leader="none"/>
               <w:tab w:val="right" w:pos="9061" w:leader="dot"/>
             </w:tabs>
@@ -1820,6 +1829,7 @@
           <w:hyperlink w:anchor="__RefHeading___Toc209893729">
             <w:r>
               <w:rPr>
+                <w:webHidden/>
                 <w:rStyle w:val="IndexLink"/>
                 <w:lang w:val="en-US" w:eastAsia="en-US"/>
               </w:rPr>
@@ -1850,7 +1860,7 @@
           <w:pPr>
             <w:pStyle w:val="TOC3"/>
             <w:tabs>
-              <w:tab w:val="clear" w:pos="720"/>
+              <w:tab w:val="clear" w:pos="709"/>
               <w:tab w:val="left" w:pos="1440" w:leader="none"/>
               <w:tab w:val="right" w:pos="9061" w:leader="dot"/>
             </w:tabs>
@@ -1859,6 +1869,7 @@
           <w:hyperlink w:anchor="__RefHeading___Toc209893730">
             <w:r>
               <w:rPr>
+                <w:webHidden/>
                 <w:rStyle w:val="IndexLink"/>
                 <w:lang w:val="en-US" w:eastAsia="en-US"/>
               </w:rPr>
@@ -1889,7 +1900,7 @@
           <w:pPr>
             <w:pStyle w:val="TOC3"/>
             <w:tabs>
-              <w:tab w:val="clear" w:pos="720"/>
+              <w:tab w:val="clear" w:pos="709"/>
               <w:tab w:val="left" w:pos="1440" w:leader="none"/>
               <w:tab w:val="right" w:pos="9061" w:leader="dot"/>
             </w:tabs>
@@ -1898,6 +1909,7 @@
           <w:hyperlink w:anchor="__RefHeading___Toc209893731">
             <w:r>
               <w:rPr>
+                <w:webHidden/>
                 <w:rStyle w:val="IndexLink"/>
                 <w:lang w:val="en-US" w:eastAsia="en-US"/>
               </w:rPr>
@@ -1928,7 +1940,7 @@
           <w:pPr>
             <w:pStyle w:val="TOC3"/>
             <w:tabs>
-              <w:tab w:val="clear" w:pos="720"/>
+              <w:tab w:val="clear" w:pos="709"/>
               <w:tab w:val="left" w:pos="1440" w:leader="none"/>
               <w:tab w:val="right" w:pos="9061" w:leader="dot"/>
             </w:tabs>
@@ -1937,6 +1949,7 @@
           <w:hyperlink w:anchor="__RefHeading___Toc209893732">
             <w:r>
               <w:rPr>
+                <w:webHidden/>
                 <w:rStyle w:val="IndexLink"/>
                 <w:lang w:val="en-US" w:eastAsia="en-US"/>
               </w:rPr>
@@ -1967,7 +1980,7 @@
           <w:pPr>
             <w:pStyle w:val="TOC2"/>
             <w:tabs>
-              <w:tab w:val="clear" w:pos="720"/>
+              <w:tab w:val="clear" w:pos="709"/>
               <w:tab w:val="left" w:pos="960" w:leader="none"/>
               <w:tab w:val="right" w:pos="9061" w:leader="dot"/>
             </w:tabs>
@@ -1976,6 +1989,7 @@
           <w:hyperlink w:anchor="__RefHeading___Toc209893733">
             <w:r>
               <w:rPr>
+                <w:webHidden/>
                 <w:rStyle w:val="IndexLink"/>
                 <w:lang w:val="en-US" w:eastAsia="en-US"/>
               </w:rPr>
@@ -2006,7 +2020,7 @@
           <w:pPr>
             <w:pStyle w:val="TOC3"/>
             <w:tabs>
-              <w:tab w:val="clear" w:pos="720"/>
+              <w:tab w:val="clear" w:pos="709"/>
               <w:tab w:val="left" w:pos="1440" w:leader="none"/>
               <w:tab w:val="right" w:pos="9061" w:leader="dot"/>
             </w:tabs>
@@ -2015,6 +2029,7 @@
           <w:hyperlink w:anchor="__RefHeading___Toc209893734">
             <w:r>
               <w:rPr>
+                <w:webHidden/>
                 <w:rStyle w:val="IndexLink"/>
                 <w:lang w:val="en-US" w:eastAsia="en-US"/>
               </w:rPr>
@@ -2045,7 +2060,7 @@
           <w:pPr>
             <w:pStyle w:val="TOC2"/>
             <w:tabs>
-              <w:tab w:val="clear" w:pos="720"/>
+              <w:tab w:val="clear" w:pos="709"/>
               <w:tab w:val="left" w:pos="960" w:leader="none"/>
               <w:tab w:val="right" w:pos="9061" w:leader="dot"/>
             </w:tabs>
@@ -2054,6 +2069,7 @@
           <w:hyperlink w:anchor="__RefHeading___Toc209893735">
             <w:r>
               <w:rPr>
+                <w:webHidden/>
                 <w:rStyle w:val="IndexLink"/>
                 <w:lang w:val="en-US" w:eastAsia="en-US"/>
               </w:rPr>
@@ -2084,7 +2100,7 @@
           <w:pPr>
             <w:pStyle w:val="TOC2"/>
             <w:tabs>
-              <w:tab w:val="clear" w:pos="720"/>
+              <w:tab w:val="clear" w:pos="709"/>
               <w:tab w:val="left" w:pos="960" w:leader="none"/>
               <w:tab w:val="right" w:pos="9061" w:leader="dot"/>
             </w:tabs>
@@ -2093,6 +2109,7 @@
           <w:hyperlink w:anchor="__RefHeading___Toc209893736">
             <w:r>
               <w:rPr>
+                <w:webHidden/>
                 <w:rStyle w:val="IndexLink"/>
                 <w:lang w:val="en-US" w:eastAsia="en-US"/>
               </w:rPr>
@@ -2123,7 +2140,7 @@
           <w:pPr>
             <w:pStyle w:val="TOC3"/>
             <w:tabs>
-              <w:tab w:val="clear" w:pos="720"/>
+              <w:tab w:val="clear" w:pos="709"/>
               <w:tab w:val="left" w:pos="1440" w:leader="none"/>
               <w:tab w:val="right" w:pos="9061" w:leader="dot"/>
             </w:tabs>
@@ -2132,6 +2149,7 @@
           <w:hyperlink w:anchor="__RefHeading___Toc209893737">
             <w:r>
               <w:rPr>
+                <w:webHidden/>
                 <w:rStyle w:val="IndexLink"/>
                 <w:lang w:val="en-US" w:eastAsia="en-US"/>
               </w:rPr>
@@ -2162,7 +2180,7 @@
           <w:pPr>
             <w:pStyle w:val="TOC3"/>
             <w:tabs>
-              <w:tab w:val="clear" w:pos="720"/>
+              <w:tab w:val="clear" w:pos="709"/>
               <w:tab w:val="left" w:pos="1440" w:leader="none"/>
               <w:tab w:val="right" w:pos="9061" w:leader="dot"/>
             </w:tabs>
@@ -2171,6 +2189,7 @@
           <w:hyperlink w:anchor="__RefHeading___Toc209893738">
             <w:r>
               <w:rPr>
+                <w:webHidden/>
                 <w:rStyle w:val="IndexLink"/>
                 <w:lang w:val="en-US" w:eastAsia="en-US"/>
               </w:rPr>
@@ -2201,7 +2220,7 @@
           <w:pPr>
             <w:pStyle w:val="TOC1"/>
             <w:tabs>
-              <w:tab w:val="clear" w:pos="720"/>
+              <w:tab w:val="clear" w:pos="709"/>
               <w:tab w:val="left" w:pos="480" w:leader="none"/>
               <w:tab w:val="right" w:pos="9061" w:leader="dot"/>
             </w:tabs>
@@ -2210,6 +2229,7 @@
           <w:hyperlink w:anchor="__RefHeading___Toc209893739">
             <w:r>
               <w:rPr>
+                <w:webHidden/>
                 <w:rStyle w:val="IndexLink"/>
                 <w:lang w:val="en-US" w:eastAsia="en-US"/>
               </w:rPr>
@@ -2377,20 +2397,21 @@
         <w:pStyle w:val="Heading2"/>
         <w:numPr>
           <w:ilvl w:val="0"/>
-          <w:numId w:val="1"/>
+          <w:numId w:val="0"/>
         </w:numPr>
         <w:ind w:hanging="0" w:start="0" w:end="0"/>
         <w:rPr/>
       </w:pPr>
       <w:bookmarkStart w:id="1" w:name="__RefHeading___Toc209893724"/>
-      <w:r>
-        <w:rPr/>
-        <w:t>Related software or hardware</w:t>
-      </w:r>
       <w:bookmarkEnd w:id="1"/>
       <w:r>
         <w:rPr/>
-        <w:t xml:space="preserve"> </w:t>
+        <w:t>1.2</w:t>
+        <w:tab/>
+      </w:r>
+      <w:r>
+        <w:rPr/>
+        <w:t xml:space="preserve">Related software or hardware </w:t>
       </w:r>
     </w:p>
     <w:p>
@@ -2424,26 +2445,31 @@
     <w:p>
       <w:pPr>
         <w:pStyle w:val="Heading2"/>
+        <w:numPr>
+          <w:ilvl w:val="0"/>
+          <w:numId w:val="0"/>
+        </w:numPr>
         <w:ind w:hanging="0" w:start="0" w:end="0"/>
         <w:rPr>
           <w:lang w:eastAsia="en-US"/>
         </w:rPr>
       </w:pPr>
       <w:bookmarkStart w:id="2" w:name="__RefHeading___Toc209893725"/>
-      <w:r>
-        <w:rPr/>
-        <w:t>End-user characteristics</w:t>
-      </w:r>
       <w:bookmarkEnd w:id="2"/>
       <w:r>
         <w:rPr/>
-        <w:t xml:space="preserve"> </w:t>
+        <w:t>1.3</w:t>
+        <w:tab/>
+      </w:r>
+      <w:r>
+        <w:rPr/>
+        <w:t xml:space="preserve">End-user characteristics </w:t>
       </w:r>
     </w:p>
     <w:p>
       <w:pPr>
         <w:pStyle w:val="Normal"/>
-        <w:ind w:start="0" w:end="0"/>
+        <w:ind w:hanging="0" w:start="0" w:end="0"/>
         <w:rPr>
           <w:lang w:eastAsia="en-US"/>
         </w:rPr>
@@ -2460,6 +2486,10 @@
         <w:pStyle w:val="Heading2"/>
         <w:keepNext w:val="true"/>
         <w:widowControl/>
+        <w:numPr>
+          <w:ilvl w:val="0"/>
+          <w:numId w:val="0"/>
+        </w:numPr>
         <w:suppressAutoHyphens w:val="true"/>
         <w:bidi w:val="0"/>
         <w:spacing w:before="240" w:after="0"/>
@@ -2468,6 +2498,11 @@
       </w:pPr>
       <w:bookmarkStart w:id="3" w:name="__RefHeading___Toc209893726"/>
       <w:bookmarkEnd w:id="3"/>
+      <w:r>
+        <w:rPr/>
+        <w:t>1.4</w:t>
+        <w:tab/>
+      </w:r>
       <w:r>
         <w:rPr/>
         <w:t>General Constraints</w:t>
@@ -2608,7 +2643,7 @@
       <w:pPr>
         <w:pStyle w:val="Comment"/>
         <w:tabs>
-          <w:tab w:val="clear" w:pos="720"/>
+          <w:tab w:val="clear" w:pos="709"/>
           <w:tab w:val="left" w:pos="284" w:leader="none"/>
         </w:tabs>
         <w:ind w:hanging="284" w:start="284" w:end="284"/>
@@ -2626,7 +2661,7 @@
       <w:pPr>
         <w:pStyle w:val="Comment"/>
         <w:tabs>
-          <w:tab w:val="clear" w:pos="720"/>
+          <w:tab w:val="clear" w:pos="709"/>
           <w:tab w:val="left" w:pos="284" w:leader="none"/>
         </w:tabs>
         <w:ind w:hanging="284" w:start="284" w:end="284"/>
@@ -2644,7 +2679,7 @@
       <w:pPr>
         <w:pStyle w:val="Comment"/>
         <w:tabs>
-          <w:tab w:val="clear" w:pos="720"/>
+          <w:tab w:val="clear" w:pos="709"/>
           <w:tab w:val="left" w:pos="284" w:leader="none"/>
         </w:tabs>
         <w:ind w:hanging="284" w:start="284" w:end="284"/>
@@ -2662,7 +2697,7 @@
       <w:pPr>
         <w:pStyle w:val="Comment"/>
         <w:tabs>
-          <w:tab w:val="clear" w:pos="720"/>
+          <w:tab w:val="clear" w:pos="709"/>
           <w:tab w:val="left" w:pos="284" w:leader="none"/>
         </w:tabs>
         <w:ind w:hanging="284" w:start="284" w:end="284"/>
@@ -2680,7 +2715,7 @@
       <w:pPr>
         <w:pStyle w:val="Comment"/>
         <w:tabs>
-          <w:tab w:val="clear" w:pos="720"/>
+          <w:tab w:val="clear" w:pos="709"/>
           <w:tab w:val="left" w:pos="284" w:leader="none"/>
         </w:tabs>
         <w:ind w:hanging="284" w:start="284" w:end="284"/>
@@ -2698,7 +2733,7 @@
       <w:pPr>
         <w:pStyle w:val="Comment"/>
         <w:tabs>
-          <w:tab w:val="clear" w:pos="720"/>
+          <w:tab w:val="clear" w:pos="709"/>
           <w:tab w:val="left" w:pos="284" w:leader="none"/>
         </w:tabs>
         <w:ind w:hanging="284" w:start="284" w:end="284"/>
@@ -2716,7 +2751,7 @@
       <w:pPr>
         <w:pStyle w:val="Comment"/>
         <w:tabs>
-          <w:tab w:val="clear" w:pos="720"/>
+          <w:tab w:val="clear" w:pos="709"/>
           <w:tab w:val="left" w:pos="284" w:leader="none"/>
         </w:tabs>
         <w:ind w:hanging="284" w:start="284" w:end="284"/>
@@ -2734,7 +2769,7 @@
       <w:pPr>
         <w:pStyle w:val="Comment"/>
         <w:tabs>
-          <w:tab w:val="clear" w:pos="720"/>
+          <w:tab w:val="clear" w:pos="709"/>
           <w:tab w:val="left" w:pos="284" w:leader="none"/>
         </w:tabs>
         <w:ind w:hanging="284" w:start="284" w:end="284"/>
@@ -2752,7 +2787,7 @@
       <w:pPr>
         <w:pStyle w:val="Comment"/>
         <w:tabs>
-          <w:tab w:val="clear" w:pos="720"/>
+          <w:tab w:val="clear" w:pos="709"/>
           <w:tab w:val="left" w:pos="284" w:leader="none"/>
         </w:tabs>
         <w:ind w:hanging="284" w:start="284" w:end="284"/>
@@ -2770,7 +2805,7 @@
       <w:pPr>
         <w:pStyle w:val="Comment"/>
         <w:tabs>
-          <w:tab w:val="clear" w:pos="720"/>
+          <w:tab w:val="clear" w:pos="709"/>
           <w:tab w:val="left" w:pos="284" w:leader="none"/>
         </w:tabs>
         <w:ind w:hanging="284" w:start="284" w:end="284"/>
@@ -2788,7 +2823,7 @@
       <w:pPr>
         <w:pStyle w:val="Comment"/>
         <w:tabs>
-          <w:tab w:val="clear" w:pos="720"/>
+          <w:tab w:val="clear" w:pos="709"/>
           <w:tab w:val="left" w:pos="284" w:leader="none"/>
         </w:tabs>
         <w:ind w:hanging="284" w:start="284" w:end="284"/>
@@ -2805,6 +2840,10 @@
     <w:p>
       <w:pPr>
         <w:pStyle w:val="Heading2"/>
+        <w:numPr>
+          <w:ilvl w:val="0"/>
+          <w:numId w:val="0"/>
+        </w:numPr>
         <w:ind w:hanging="0" w:start="0" w:end="0"/>
         <w:rPr/>
       </w:pPr>
@@ -2812,13 +2851,18 @@
       <w:bookmarkEnd w:id="4"/>
       <w:r>
         <w:rPr/>
+        <w:t>1.5</w:t>
+        <w:tab/>
+      </w:r>
+      <w:r>
+        <w:rPr/>
         <w:t>System Architecture – Functionality</w:t>
       </w:r>
     </w:p>
     <w:p>
       <w:pPr>
         <w:pStyle w:val="Normal"/>
-        <w:ind w:start="0" w:end="0"/>
+        <w:ind w:hanging="0" w:start="0" w:end="0"/>
         <w:rPr/>
       </w:pPr>
       <w:r>
@@ -2829,7 +2873,7 @@
     <w:p>
       <w:pPr>
         <w:pStyle w:val="Normal"/>
-        <w:ind w:start="0" w:end="0"/>
+        <w:ind w:hanging="0" w:start="0" w:end="0"/>
         <w:rPr>
           <w:lang w:eastAsia="en-US"/>
         </w:rPr>
@@ -2839,7 +2883,7 @@
           <w:lang w:eastAsia="en-US"/>
         </w:rPr>
         <w:drawing>
-          <wp:anchor behindDoc="0" distT="0" distB="0" distL="0" distR="0" simplePos="0" locked="0" layoutInCell="0" allowOverlap="1" relativeHeight="28">
+          <wp:anchor behindDoc="0" distT="0" distB="0" distL="0" distR="0" simplePos="0" locked="0" layoutInCell="0" allowOverlap="1" relativeHeight="38">
             <wp:simplePos x="0" y="0"/>
             <wp:positionH relativeFrom="column">
               <wp:posOffset>772795</wp:posOffset>
@@ -2865,7 +2909,7 @@
                   </pic:nvPicPr>
                   <pic:blipFill>
                     <a:blip r:embed="rId3"/>
-                    <a:srcRect l="-29" t="-26" r="-29" b="-26"/>
+                    <a:srcRect l="-39" t="-35" r="-39" b="-35"/>
                     <a:stretch>
                       <a:fillRect/>
                     </a:stretch>
@@ -2905,6 +2949,10 @@
     <w:p>
       <w:pPr>
         <w:pStyle w:val="Heading3"/>
+        <w:numPr>
+          <w:ilvl w:val="0"/>
+          <w:numId w:val="0"/>
+        </w:numPr>
         <w:ind w:hanging="0" w:start="0" w:end="0"/>
         <w:jc w:val="both"/>
         <w:rPr/>
@@ -2913,12 +2961,21 @@
       <w:bookmarkEnd w:id="5"/>
       <w:r>
         <w:rPr/>
+        <w:t>1.5.1</w:t>
+        <w:tab/>
+      </w:r>
+      <w:r>
+        <w:rPr/>
         <w:t>Subsystem Architecture</w:t>
       </w:r>
     </w:p>
     <w:p>
       <w:pPr>
         <w:pStyle w:val="Heading4"/>
+        <w:numPr>
+          <w:ilvl w:val="0"/>
+          <w:numId w:val="0"/>
+        </w:numPr>
         <w:ind w:hanging="0" w:start="0" w:end="0"/>
         <w:rPr/>
       </w:pPr>
@@ -2945,7 +3002,7 @@
       <w:r>
         <w:rPr/>
         <w:drawing>
-          <wp:anchor behindDoc="0" distT="0" distB="0" distL="0" distR="0" simplePos="0" locked="0" layoutInCell="0" allowOverlap="1" relativeHeight="29">
+          <wp:anchor behindDoc="0" distT="0" distB="0" distL="0" distR="0" simplePos="0" locked="0" layoutInCell="0" allowOverlap="1" relativeHeight="39">
             <wp:simplePos x="0" y="0"/>
             <wp:positionH relativeFrom="column">
               <wp:align>center</wp:align>
@@ -2971,7 +3028,7 @@
                   </pic:nvPicPr>
                   <pic:blipFill>
                     <a:blip r:embed="rId4"/>
-                    <a:srcRect l="-21" t="-14" r="-21" b="-14"/>
+                    <a:srcRect l="-27" t="-19" r="-27" b="-19"/>
                     <a:stretch>
                       <a:fillRect/>
                     </a:stretch>
@@ -2998,6 +3055,10 @@
     <w:p>
       <w:pPr>
         <w:pStyle w:val="Heading4"/>
+        <w:numPr>
+          <w:ilvl w:val="0"/>
+          <w:numId w:val="0"/>
+        </w:numPr>
         <w:ind w:hanging="0" w:start="0" w:end="0"/>
         <w:rPr/>
       </w:pPr>
@@ -3015,13 +3076,13 @@
     <w:p>
       <w:pPr>
         <w:pStyle w:val="Normal"/>
-        <w:ind w:start="0" w:end="0"/>
+        <w:ind w:hanging="0" w:start="0" w:end="0"/>
         <w:rPr/>
       </w:pPr>
       <w:r>
         <w:rPr/>
         <w:drawing>
-          <wp:anchor behindDoc="0" distT="0" distB="0" distL="0" distR="0" simplePos="0" locked="0" layoutInCell="0" allowOverlap="1" relativeHeight="30">
+          <wp:anchor behindDoc="0" distT="0" distB="0" distL="0" distR="0" simplePos="0" locked="0" layoutInCell="0" allowOverlap="1" relativeHeight="40">
             <wp:simplePos x="0" y="0"/>
             <wp:positionH relativeFrom="column">
               <wp:align>center</wp:align>
@@ -3047,7 +3108,7 @@
                   </pic:nvPicPr>
                   <pic:blipFill>
                     <a:blip r:embed="rId5"/>
-                    <a:srcRect l="-18" t="-17" r="-18" b="-17"/>
+                    <a:srcRect l="-24" t="-23" r="-24" b="-23"/>
                     <a:stretch>
                       <a:fillRect/>
                     </a:stretch>
@@ -3074,6 +3135,10 @@
     <w:p>
       <w:pPr>
         <w:pStyle w:val="Heading4"/>
+        <w:numPr>
+          <w:ilvl w:val="0"/>
+          <w:numId w:val="0"/>
+        </w:numPr>
         <w:ind w:hanging="0" w:start="0" w:end="0"/>
         <w:rPr/>
       </w:pPr>
@@ -3101,14 +3166,7 @@
         </w:rPr>
       </w:pPr>
       <w:r>
-        <w:rPr>
-          <w:rFonts w:cs="Times New Roman" w:ascii="Times New Roman" w:hAnsi="Times New Roman"/>
-          <w:b w:val="false"/>
-          <w:bCs w:val="false"/>
-          <w:i w:val="false"/>
-          <w:iCs w:val="false"/>
-          <w:szCs w:val="20"/>
-        </w:rPr>
+        <w:rPr/>
         <w:drawing>
           <wp:inline distT="0" distB="0" distL="0" distR="0">
             <wp:extent cx="4123690" cy="6713220"/>
@@ -3128,7 +3186,7 @@
                   </pic:nvPicPr>
                   <pic:blipFill>
                     <a:blip r:embed="rId6"/>
-                    <a:srcRect l="-62" t="-38" r="-62" b="-38"/>
+                    <a:srcRect l="-68" t="-42" r="-68" b="-42"/>
                     <a:stretch>
                       <a:fillRect/>
                     </a:stretch>
@@ -3153,6 +3211,10 @@
     <w:p>
       <w:pPr>
         <w:pStyle w:val="Heading4"/>
+        <w:numPr>
+          <w:ilvl w:val="0"/>
+          <w:numId w:val="0"/>
+        </w:numPr>
         <w:ind w:hanging="0" w:start="0" w:end="0"/>
         <w:rPr/>
       </w:pPr>
@@ -3174,12 +3236,21 @@
     <w:p>
       <w:pPr>
         <w:pStyle w:val="Heading3"/>
+        <w:numPr>
+          <w:ilvl w:val="0"/>
+          <w:numId w:val="0"/>
+        </w:numPr>
         <w:ind w:hanging="0" w:start="0" w:end="0"/>
         <w:jc w:val="both"/>
         <w:rPr/>
       </w:pPr>
       <w:bookmarkStart w:id="6" w:name="__RefHeading___Toc209893729"/>
       <w:bookmarkEnd w:id="6"/>
+      <w:r>
+        <w:rPr/>
+        <w:t>1.5.2</w:t>
+        <w:tab/>
+      </w:r>
       <w:r>
         <w:rPr/>
         <w:t>DB tables</w:t>
@@ -3221,7 +3292,7 @@
                   </pic:nvPicPr>
                   <pic:blipFill>
                     <a:blip r:embed="rId7"/>
-                    <a:srcRect l="-90" t="-109" r="-90" b="-109"/>
+                    <a:srcRect l="-99" t="-120" r="-99" b="-120"/>
                     <a:stretch>
                       <a:fillRect/>
                     </a:stretch>
@@ -3246,6 +3317,10 @@
     <w:p>
       <w:pPr>
         <w:pStyle w:val="Heading3"/>
+        <w:numPr>
+          <w:ilvl w:val="0"/>
+          <w:numId w:val="0"/>
+        </w:numPr>
         <w:ind w:hanging="0" w:start="0" w:end="0"/>
         <w:jc w:val="both"/>
         <w:rPr/>
@@ -3256,7 +3331,7 @@
         <mc:AlternateContent>
           <mc:Choice Requires="wps">
             <w:drawing>
-              <wp:anchor behindDoc="0" distT="0" distB="0" distL="114935" distR="114935" simplePos="0" locked="0" layoutInCell="1" allowOverlap="1" relativeHeight="27">
+              <wp:anchor behindDoc="0" distT="0" distB="173990" distL="0" distR="0" simplePos="0" locked="0" layoutInCell="1" allowOverlap="1" relativeHeight="36">
                 <wp:simplePos x="0" y="0"/>
                 <wp:positionH relativeFrom="column">
                   <wp:posOffset>2865120</wp:posOffset>
@@ -3267,11 +3342,11 @@
                 <wp:extent cx="1024255" cy="175895"/>
                 <wp:effectExtent l="0" t="0" r="0" b="174625"/>
                 <wp:wrapNone/>
-                <wp:docPr id="6" name=""/>
+                <wp:docPr id="6" name="Shape1"/>
                 <a:graphic xmlns:a="http://schemas.openxmlformats.org/drawingml/2006/main">
                   <a:graphicData uri="http://schemas.microsoft.com/office/word/2010/wordprocessingShape">
                     <wps:wsp>
-                      <wps:cNvSpPr txBox="1"/>
+                      <wps:cNvSpPr/>
                       <wps:spPr>
                         <a:xfrm>
                           <a:off x="0" y="0"/>
@@ -3285,23 +3360,30 @@
                           <a:noFill/>
                         </a:ln>
                       </wps:spPr>
+                      <wps:style>
+                        <a:lnRef idx="0"/>
+                        <a:fillRef idx="0"/>
+                        <a:effectRef idx="0"/>
+                        <a:fontRef idx="minor"/>
+                      </wps:style>
                       <wps:txbx>
                         <w:txbxContent>
                           <w:p>
                             <w:pPr>
-                              <w:overflowPunct w:val="false"/>
+                              <w:pStyle w:val="FrameContents"/>
+                              <w:overflowPunct w:val="true"/>
                               <w:bidi w:val="0"/>
                               <w:spacing w:before="0" w:after="0"/>
-                              <w:ind w:start="284" w:end="284" w:hanging="0"/>
+                              <w:ind w:hanging="0" w:start="284" w:end="284"/>
                               <w:rPr/>
                             </w:pPr>
                             <w:r>
                               <w:rPr>
+                                <w:rFonts w:eastAsia="Noto Serif CJK SC" w:cs="Noto Sans Devanagari" w:ascii="Liberation Serif;Times New Roman" w:hAnsi="Liberation Serif;Times New Roman"/>
+                                <w:color w:val="auto"/>
+                                <w:kern w:val="2"/>
                                 <w:sz w:val="24"/>
-                                <w:kern w:val="2"/>
                                 <w:szCs w:val="24"/>
-                                <w:rFonts w:ascii="Liberation Serif;Times New Roman" w:hAnsi="Liberation Serif;Times New Roman" w:eastAsia="Noto Serif CJK SC" w:cs="Noto Sans Devanagari"/>
-                                <w:color w:val="auto"/>
                                 <w:lang w:val="en-US" w:eastAsia="zh-CN" w:bidi="hi-IN"/>
                               </w:rPr>
                               <w:t>Full msg length</w:t>
@@ -3309,7 +3391,7 @@
                           </w:p>
                         </w:txbxContent>
                       </wps:txbx>
-                      <wps:bodyPr wrap="square" lIns="0" rIns="0" tIns="0" bIns="0" anchor="t">
+                      <wps:bodyPr lIns="0" rIns="0" tIns="0" bIns="0" anchor="t">
                         <a:noAutofit/>
                       </wps:bodyPr>
                     </wps:wsp>
@@ -3320,28 +3402,27 @@
           </mc:Choice>
           <mc:Fallback>
             <w:pict>
-              <v:shapetype id="_x0000_t202" coordsize="21600,21600" o:spt="202" path="m,l,21600l21600,21600l21600,xe">
-                <v:stroke joinstyle="miter"/>
-                <v:path gradientshapeok="t" o:connecttype="rect"/>
-              </v:shapetype>
-              <v:shape id="shape_0" stroked="f" o:allowincell="f" style="position:absolute;margin-left:225.6pt;margin-top:15.7pt;width:80.6pt;height:13.8pt;mso-wrap-style:square;v-text-anchor:top" type="_x0000_t202">
+              <v:rect id="shape_0" ID="Shape1" path="m0,0l-2147483645,0l-2147483645,-2147483646l0,-2147483646xe" stroked="f" o:allowincell="f" style="position:absolute;margin-left:225.6pt;margin-top:15.7pt;width:80.6pt;height:13.8pt;mso-wrap-style:square;v-text-anchor:top">
+                <v:fill o:detectmouseclick="t" on="false"/>
+                <v:stroke color="#3465a4" joinstyle="round" endcap="flat"/>
                 <v:textbox>
                   <w:txbxContent>
                     <w:p>
                       <w:pPr>
-                        <w:overflowPunct w:val="false"/>
+                        <w:pStyle w:val="FrameContents"/>
+                        <w:overflowPunct w:val="true"/>
                         <w:bidi w:val="0"/>
                         <w:spacing w:before="0" w:after="0"/>
-                        <w:ind w:start="284" w:end="284" w:hanging="0"/>
+                        <w:ind w:hanging="0" w:start="284" w:end="284"/>
                         <w:rPr/>
                       </w:pPr>
                       <w:r>
                         <w:rPr>
+                          <w:rFonts w:eastAsia="Noto Serif CJK SC" w:cs="Noto Sans Devanagari" w:ascii="Liberation Serif;Times New Roman" w:hAnsi="Liberation Serif;Times New Roman"/>
+                          <w:color w:val="auto"/>
+                          <w:kern w:val="2"/>
                           <w:sz w:val="24"/>
-                          <w:kern w:val="2"/>
                           <w:szCs w:val="24"/>
-                          <w:rFonts w:ascii="Liberation Serif;Times New Roman" w:hAnsi="Liberation Serif;Times New Roman" w:eastAsia="Noto Serif CJK SC" w:cs="Noto Sans Devanagari"/>
-                          <w:color w:val="auto"/>
                           <w:lang w:val="en-US" w:eastAsia="zh-CN" w:bidi="hi-IN"/>
                         </w:rPr>
                         <w:t>Full msg length</w:t>
@@ -3349,23 +3430,26 @@
                     </w:p>
                   </w:txbxContent>
                 </v:textbox>
-                <v:fill o:detectmouseclick="t" on="false"/>
-                <v:stroke color="#3465a4" joinstyle="round" endcap="flat"/>
                 <w10:wrap type="none"/>
-              </v:shape>
+              </v:rect>
             </w:pict>
           </mc:Fallback>
         </mc:AlternateContent>
       </w:r>
       <w:r>
         <w:rPr/>
+        <w:t>1.5.3</w:t>
+        <w:tab/>
+      </w:r>
+      <w:r>
+        <w:rPr/>
         <w:t>Protocol</w:t>
       </w:r>
     </w:p>
     <w:p>
       <w:pPr>
         <w:pStyle w:val="Normal"/>
-        <w:ind w:start="0" w:end="0"/>
+        <w:ind w:hanging="0" w:start="0" w:end="0"/>
         <w:jc w:val="both"/>
         <w:rPr/>
       </w:pPr>
@@ -3374,7 +3458,7 @@
         <mc:AlternateContent>
           <mc:Choice Requires="wps">
             <w:drawing>
-              <wp:anchor behindDoc="0" distT="0" distB="0" distL="114935" distR="114935" simplePos="0" locked="0" layoutInCell="1" allowOverlap="1" relativeHeight="7">
+              <wp:anchor behindDoc="0" distT="5715" distB="4445" distL="5080" distR="5715" simplePos="0" locked="0" layoutInCell="1" allowOverlap="1" relativeHeight="7">
                 <wp:simplePos x="0" y="0"/>
                 <wp:positionH relativeFrom="column">
                   <wp:posOffset>34925</wp:posOffset>
@@ -3446,7 +3530,7 @@
                   <v:h position="@2,0"/>
                 </v:handles>
               </v:shapetype>
-              <v:shape id="shape_0" ID="Shape 1" fillcolor="#729fcf" stroked="t" o:allowincell="f" style="position:absolute;margin-left:2.75pt;margin-top:14.95pt;width:37.95pt;height:2.1pt;mso-wrap-style:none;v-text-anchor:middle" type="_x0000_t69">
+              <v:shape id="shape_0" ID="Shape 1" path="l-2147483636,0l-2147483636,-2147483631l-2147483635,-2147483631l-2147483635,0l-2147483622,-2147483632l-2147483635,-2147483621l-2147483635,-2147483629l-2147483636,-2147483629l-2147483636,-2147483621xe" fillcolor="#729fcf" stroked="t" o:allowincell="f" style="position:absolute;margin-left:2.75pt;margin-top:14.95pt;width:37.95pt;height:2.1pt;mso-wrap-style:none;v-text-anchor:middle" type="_x0000_t69">
                 <v:fill o:detectmouseclick="t" type="solid" color2="#8d6030"/>
                 <v:stroke color="#3465a4" weight="9360" joinstyle="round" endcap="flat"/>
                 <w10:wrap type="none"/>
@@ -3457,7 +3541,7 @@
         <mc:AlternateContent>
           <mc:Choice Requires="wps">
             <w:drawing>
-              <wp:anchor behindDoc="0" distT="0" distB="0" distL="114935" distR="114935" simplePos="0" locked="0" layoutInCell="1" allowOverlap="1" relativeHeight="8">
+              <wp:anchor behindDoc="0" distT="5715" distB="4445" distL="5080" distR="5715" simplePos="0" locked="0" layoutInCell="1" allowOverlap="1" relativeHeight="8">
                 <wp:simplePos x="0" y="0"/>
                 <wp:positionH relativeFrom="column">
                   <wp:posOffset>34925</wp:posOffset>
@@ -3509,7 +3593,7 @@
           </mc:Choice>
           <mc:Fallback>
             <w:pict>
-              <v:shape id="shape_0" ID="Shape 2" fillcolor="#729fcf" stroked="t" o:allowincell="f" style="position:absolute;margin-left:2.75pt;margin-top:14.95pt;width:37.95pt;height:2.1pt;mso-wrap-style:none;v-text-anchor:middle" type="_x0000_t69">
+              <v:shape id="shape_0" ID="Shape 2" path="l-2147483636,0l-2147483636,-2147483631l-2147483635,-2147483631l-2147483635,0l-2147483622,-2147483632l-2147483635,-2147483621l-2147483635,-2147483629l-2147483636,-2147483629l-2147483636,-2147483621xe" fillcolor="#729fcf" stroked="t" o:allowincell="f" style="position:absolute;margin-left:2.75pt;margin-top:14.95pt;width:37.95pt;height:2.1pt;mso-wrap-style:none;v-text-anchor:middle" type="_x0000_t69">
                 <v:fill o:detectmouseclick="t" type="solid" color2="#8d6030"/>
                 <v:stroke color="#3465a4" weight="9360" joinstyle="round" endcap="flat"/>
                 <w10:wrap type="none"/>
@@ -3520,7 +3604,7 @@
         <mc:AlternateContent>
           <mc:Choice Requires="wps">
             <w:drawing>
-              <wp:anchor behindDoc="0" distT="0" distB="0" distL="114935" distR="114935" simplePos="0" locked="0" layoutInCell="1" allowOverlap="1" relativeHeight="9">
+              <wp:anchor behindDoc="0" distT="5715" distB="4445" distL="5080" distR="5715" simplePos="0" locked="0" layoutInCell="1" allowOverlap="1" relativeHeight="9">
                 <wp:simplePos x="0" y="0"/>
                 <wp:positionH relativeFrom="column">
                   <wp:posOffset>626745</wp:posOffset>
@@ -3572,7 +3656,7 @@
           </mc:Choice>
           <mc:Fallback>
             <w:pict>
-              <v:shape id="shape_0" ID="Shape 5" fillcolor="#729fcf" stroked="t" o:allowincell="f" style="position:absolute;margin-left:49.35pt;margin-top:14.65pt;width:37.95pt;height:2.1pt;mso-wrap-style:none;v-text-anchor:middle" type="_x0000_t69">
+              <v:shape id="shape_0" ID="Shape 5" path="l-2147483636,0l-2147483636,-2147483631l-2147483635,-2147483631l-2147483635,0l-2147483622,-2147483632l-2147483635,-2147483621l-2147483635,-2147483629l-2147483636,-2147483629l-2147483636,-2147483621xe" fillcolor="#729fcf" stroked="t" o:allowincell="f" style="position:absolute;margin-left:49.35pt;margin-top:14.65pt;width:37.95pt;height:2.1pt;mso-wrap-style:none;v-text-anchor:middle" type="_x0000_t69">
                 <v:fill o:detectmouseclick="t" type="solid" color2="#8d6030"/>
                 <v:stroke color="#3465a4" weight="9360" joinstyle="round" endcap="flat"/>
                 <w10:wrap type="none"/>
@@ -3583,7 +3667,7 @@
         <mc:AlternateContent>
           <mc:Choice Requires="wps">
             <w:drawing>
-              <wp:anchor behindDoc="0" distT="0" distB="0" distL="114935" distR="114935" simplePos="0" locked="0" layoutInCell="1" allowOverlap="1" relativeHeight="10">
+              <wp:anchor behindDoc="0" distT="5080" distB="5715" distL="5080" distR="5715" simplePos="0" locked="0" layoutInCell="1" allowOverlap="1" relativeHeight="10">
                 <wp:simplePos x="0" y="0"/>
                 <wp:positionH relativeFrom="column">
                   <wp:posOffset>1202055</wp:posOffset>
@@ -3635,7 +3719,7 @@
           </mc:Choice>
           <mc:Fallback>
             <w:pict>
-              <v:shape id="shape_0" ID="Shape 3" fillcolor="#729fcf" stroked="t" o:allowincell="f" style="position:absolute;margin-left:94.65pt;margin-top:14.45pt;width:38.05pt;height:2.15pt;mso-wrap-style:none;v-text-anchor:middle" type="_x0000_t69">
+              <v:shape id="shape_0" ID="Shape 3" path="l-2147483636,0l-2147483636,-2147483631l-2147483635,-2147483631l-2147483635,0l-2147483622,-2147483632l-2147483635,-2147483621l-2147483635,-2147483629l-2147483636,-2147483629l-2147483636,-2147483621xe" fillcolor="#729fcf" stroked="t" o:allowincell="f" style="position:absolute;margin-left:94.65pt;margin-top:14.45pt;width:38.05pt;height:2.15pt;mso-wrap-style:none;v-text-anchor:middle" type="_x0000_t69">
                 <v:fill o:detectmouseclick="t" type="solid" color2="#8d6030"/>
                 <v:stroke color="#3465a4" weight="9360" joinstyle="round" endcap="flat"/>
                 <w10:wrap type="none"/>
@@ -3646,7 +3730,7 @@
         <mc:AlternateContent>
           <mc:Choice Requires="wps">
             <w:drawing>
-              <wp:anchor behindDoc="0" distT="0" distB="0" distL="114935" distR="114935" simplePos="0" locked="0" layoutInCell="1" allowOverlap="1" relativeHeight="11">
+              <wp:anchor behindDoc="0" distT="5715" distB="4445" distL="5080" distR="5715" simplePos="0" locked="0" layoutInCell="1" allowOverlap="1" relativeHeight="11">
                 <wp:simplePos x="0" y="0"/>
                 <wp:positionH relativeFrom="column">
                   <wp:posOffset>603250</wp:posOffset>
@@ -3698,7 +3782,7 @@
           </mc:Choice>
           <mc:Fallback>
             <w:pict>
-              <v:shape id="shape_0" ID="Shape 4" fillcolor="black" stroked="t" o:allowincell="f" style="position:absolute;margin-left:47.5pt;margin-top:5.05pt;width:401.45pt;height:2.1pt;mso-wrap-style:none;v-text-anchor:middle" type="_x0000_t69">
+              <v:shape id="shape_0" ID="Shape 4" path="l-2147483636,0l-2147483636,-2147483631l-2147483635,-2147483631l-2147483635,0l-2147483622,-2147483632l-2147483635,-2147483621l-2147483635,-2147483629l-2147483636,-2147483629l-2147483636,-2147483621xe" fillcolor="black" stroked="t" o:allowincell="f" style="position:absolute;margin-left:47.5pt;margin-top:5.05pt;width:401.45pt;height:2.1pt;mso-wrap-style:none;v-text-anchor:middle" type="_x0000_t69">
                 <v:fill o:detectmouseclick="t" type="solid" color2="white"/>
                 <v:stroke color="#3465a4" weight="9360" joinstyle="round" endcap="flat"/>
                 <w10:wrap type="none"/>
@@ -3709,7 +3793,7 @@
         <mc:AlternateContent>
           <mc:Choice Requires="wps">
             <w:drawing>
-              <wp:anchor behindDoc="0" distT="0" distB="0" distL="114935" distR="114935" simplePos="0" locked="0" layoutInCell="1" allowOverlap="1" relativeHeight="12">
+              <wp:anchor behindDoc="0" distT="5715" distB="4445" distL="5080" distR="5715" simplePos="0" locked="0" layoutInCell="1" allowOverlap="1" relativeHeight="12">
                 <wp:simplePos x="0" y="0"/>
                 <wp:positionH relativeFrom="column">
                   <wp:posOffset>1759585</wp:posOffset>
@@ -3761,7 +3845,7 @@
           </mc:Choice>
           <mc:Fallback>
             <w:pict>
-              <v:shape id="shape_0" ID="Shape 6" fillcolor="#729fcf" stroked="t" o:allowincell="f" style="position:absolute;margin-left:138.55pt;margin-top:14.45pt;width:37.95pt;height:2.1pt;mso-wrap-style:none;v-text-anchor:middle" type="_x0000_t69">
+              <v:shape id="shape_0" ID="Shape 6" path="l-2147483636,0l-2147483636,-2147483631l-2147483635,-2147483631l-2147483635,0l-2147483622,-2147483632l-2147483635,-2147483621l-2147483635,-2147483629l-2147483636,-2147483629l-2147483636,-2147483621xe" fillcolor="#729fcf" stroked="t" o:allowincell="f" style="position:absolute;margin-left:138.55pt;margin-top:14.45pt;width:37.95pt;height:2.1pt;mso-wrap-style:none;v-text-anchor:middle" type="_x0000_t69">
                 <v:fill o:detectmouseclick="t" type="solid" color2="#8d6030"/>
                 <v:stroke color="#3465a4" weight="9360" joinstyle="round" endcap="flat"/>
                 <w10:wrap type="none"/>
@@ -3772,7 +3856,7 @@
         <mc:AlternateContent>
           <mc:Choice Requires="wps">
             <w:drawing>
-              <wp:anchor behindDoc="0" distT="0" distB="0" distL="114935" distR="114935" simplePos="0" locked="0" layoutInCell="1" allowOverlap="1" relativeHeight="13">
+              <wp:anchor behindDoc="0" distT="5715" distB="4445" distL="5080" distR="5715" simplePos="0" locked="0" layoutInCell="1" allowOverlap="1" relativeHeight="13">
                 <wp:simplePos x="0" y="0"/>
                 <wp:positionH relativeFrom="column">
                   <wp:posOffset>2334895</wp:posOffset>
@@ -3824,7 +3908,7 @@
           </mc:Choice>
           <mc:Fallback>
             <w:pict>
-              <v:shape id="shape_0" ID="Shape 7" fillcolor="#729fcf" stroked="t" o:allowincell="f" style="position:absolute;margin-left:183.85pt;margin-top:14.4pt;width:37.95pt;height:2.1pt;mso-wrap-style:none;v-text-anchor:middle" type="_x0000_t69">
+              <v:shape id="shape_0" ID="Shape 7" path="l-2147483636,0l-2147483636,-2147483631l-2147483635,-2147483631l-2147483635,0l-2147483622,-2147483632l-2147483635,-2147483621l-2147483635,-2147483629l-2147483636,-2147483629l-2147483636,-2147483621xe" fillcolor="#729fcf" stroked="t" o:allowincell="f" style="position:absolute;margin-left:183.85pt;margin-top:14.4pt;width:37.95pt;height:2.1pt;mso-wrap-style:none;v-text-anchor:middle" type="_x0000_t69">
                 <v:fill o:detectmouseclick="t" type="solid" color2="#8d6030"/>
                 <v:stroke color="#3465a4" weight="9360" joinstyle="round" endcap="flat"/>
                 <w10:wrap type="none"/>
@@ -3835,7 +3919,7 @@
         <mc:AlternateContent>
           <mc:Choice Requires="wps">
             <w:drawing>
-              <wp:anchor behindDoc="0" distT="0" distB="0" distL="114935" distR="114935" simplePos="0" locked="0" layoutInCell="1" allowOverlap="1" relativeHeight="14">
+              <wp:anchor behindDoc="0" distT="5715" distB="4445" distL="5080" distR="5715" simplePos="0" locked="0" layoutInCell="1" allowOverlap="1" relativeHeight="14">
                 <wp:simplePos x="0" y="0"/>
                 <wp:positionH relativeFrom="column">
                   <wp:posOffset>2916555</wp:posOffset>
@@ -3887,7 +3971,7 @@
           </mc:Choice>
           <mc:Fallback>
             <w:pict>
-              <v:shape id="shape_0" ID="Shape 8" fillcolor="#729fcf" stroked="t" o:allowincell="f" style="position:absolute;margin-left:229.65pt;margin-top:14.15pt;width:37.95pt;height:2.1pt;mso-wrap-style:none;v-text-anchor:middle" type="_x0000_t69">
+              <v:shape id="shape_0" ID="Shape 8" path="l-2147483636,0l-2147483636,-2147483631l-2147483635,-2147483631l-2147483635,0l-2147483622,-2147483632l-2147483635,-2147483621l-2147483635,-2147483629l-2147483636,-2147483629l-2147483636,-2147483621xe" fillcolor="#729fcf" stroked="t" o:allowincell="f" style="position:absolute;margin-left:229.65pt;margin-top:14.15pt;width:37.95pt;height:2.1pt;mso-wrap-style:none;v-text-anchor:middle" type="_x0000_t69">
                 <v:fill o:detectmouseclick="t" type="solid" color2="#8d6030"/>
                 <v:stroke color="#3465a4" weight="9360" joinstyle="round" endcap="flat"/>
                 <w10:wrap type="none"/>
@@ -3898,7 +3982,7 @@
         <mc:AlternateContent>
           <mc:Choice Requires="wps">
             <w:drawing>
-              <wp:anchor behindDoc="0" distT="0" distB="0" distL="114935" distR="114935" simplePos="0" locked="0" layoutInCell="1" allowOverlap="1" relativeHeight="15">
+              <wp:anchor behindDoc="0" distT="5715" distB="4445" distL="5080" distR="5715" simplePos="0" locked="0" layoutInCell="1" allowOverlap="1" relativeHeight="15">
                 <wp:simplePos x="0" y="0"/>
                 <wp:positionH relativeFrom="column">
                   <wp:posOffset>3491230</wp:posOffset>
@@ -3950,7 +4034,7 @@
           </mc:Choice>
           <mc:Fallback>
             <w:pict>
-              <v:shape id="shape_0" ID="Shape 9" fillcolor="#729fcf" stroked="t" o:allowincell="f" style="position:absolute;margin-left:274.9pt;margin-top:14.15pt;width:37.95pt;height:2.1pt;mso-wrap-style:none;v-text-anchor:middle" type="_x0000_t69">
+              <v:shape id="shape_0" ID="Shape 9" path="l-2147483636,0l-2147483636,-2147483631l-2147483635,-2147483631l-2147483635,0l-2147483622,-2147483632l-2147483635,-2147483621l-2147483635,-2147483629l-2147483636,-2147483629l-2147483636,-2147483621xe" fillcolor="#729fcf" stroked="t" o:allowincell="f" style="position:absolute;margin-left:274.9pt;margin-top:14.15pt;width:37.95pt;height:2.1pt;mso-wrap-style:none;v-text-anchor:middle" type="_x0000_t69">
                 <v:fill o:detectmouseclick="t" type="solid" color2="#8d6030"/>
                 <v:stroke color="#3465a4" weight="9360" joinstyle="round" endcap="flat"/>
                 <w10:wrap type="none"/>
@@ -3961,7 +4045,7 @@
         <mc:AlternateContent>
           <mc:Choice Requires="wps">
             <w:drawing>
-              <wp:anchor behindDoc="0" distT="0" distB="0" distL="114935" distR="114935" simplePos="0" locked="0" layoutInCell="1" allowOverlap="1" relativeHeight="16">
+              <wp:anchor behindDoc="0" distT="5715" distB="4445" distL="5080" distR="5715" simplePos="0" locked="0" layoutInCell="1" allowOverlap="1" relativeHeight="16">
                 <wp:simplePos x="0" y="0"/>
                 <wp:positionH relativeFrom="column">
                   <wp:posOffset>4059555</wp:posOffset>
@@ -4013,7 +4097,7 @@
           </mc:Choice>
           <mc:Fallback>
             <w:pict>
-              <v:shape id="shape_0" ID="Shape 10" fillcolor="#729fcf" stroked="t" o:allowincell="f" style="position:absolute;margin-left:319.65pt;margin-top:13.6pt;width:37.95pt;height:2.1pt;mso-wrap-style:none;v-text-anchor:middle" type="_x0000_t69">
+              <v:shape id="shape_0" ID="Shape 10" path="l-2147483636,0l-2147483636,-2147483631l-2147483635,-2147483631l-2147483635,0l-2147483622,-2147483632l-2147483635,-2147483621l-2147483635,-2147483629l-2147483636,-2147483629l-2147483636,-2147483621xe" fillcolor="#729fcf" stroked="t" o:allowincell="f" style="position:absolute;margin-left:319.65pt;margin-top:13.6pt;width:37.95pt;height:2.1pt;mso-wrap-style:none;v-text-anchor:middle" type="_x0000_t69">
                 <v:fill o:detectmouseclick="t" type="solid" color2="#8d6030"/>
                 <v:stroke color="#3465a4" weight="9360" joinstyle="round" endcap="flat"/>
                 <w10:wrap type="none"/>
@@ -4024,7 +4108,7 @@
         <mc:AlternateContent>
           <mc:Choice Requires="wps">
             <w:drawing>
-              <wp:anchor behindDoc="0" distT="0" distB="0" distL="114935" distR="114935" simplePos="0" locked="0" layoutInCell="1" allowOverlap="1" relativeHeight="17">
+              <wp:anchor behindDoc="0" distT="5715" distB="4445" distL="5080" distR="5715" simplePos="0" locked="0" layoutInCell="1" allowOverlap="1" relativeHeight="17">
                 <wp:simplePos x="0" y="0"/>
                 <wp:positionH relativeFrom="column">
                   <wp:posOffset>4613275</wp:posOffset>
@@ -4076,7 +4160,7 @@
           </mc:Choice>
           <mc:Fallback>
             <w:pict>
-              <v:shape id="shape_0" ID="Shape 11" fillcolor="#729fcf" stroked="t" o:allowincell="f" style="position:absolute;margin-left:363.25pt;margin-top:13.05pt;width:37.95pt;height:2.1pt;mso-wrap-style:none;v-text-anchor:middle" type="_x0000_t69">
+              <v:shape id="shape_0" ID="Shape 11" path="l-2147483636,0l-2147483636,-2147483631l-2147483635,-2147483631l-2147483635,0l-2147483622,-2147483632l-2147483635,-2147483621l-2147483635,-2147483629l-2147483636,-2147483629l-2147483636,-2147483621xe" fillcolor="#729fcf" stroked="t" o:allowincell="f" style="position:absolute;margin-left:363.25pt;margin-top:13.05pt;width:37.95pt;height:2.1pt;mso-wrap-style:none;v-text-anchor:middle" type="_x0000_t69">
                 <v:fill o:detectmouseclick="t" type="solid" color2="#8d6030"/>
                 <v:stroke color="#3465a4" weight="9360" joinstyle="round" endcap="flat"/>
                 <w10:wrap type="none"/>
@@ -4087,7 +4171,7 @@
         <mc:AlternateContent>
           <mc:Choice Requires="wps">
             <w:drawing>
-              <wp:anchor behindDoc="0" distT="0" distB="0" distL="114935" distR="114935" simplePos="0" locked="0" layoutInCell="1" allowOverlap="1" relativeHeight="18">
+              <wp:anchor behindDoc="0" distT="0" distB="0" distL="0" distR="0" simplePos="0" locked="0" layoutInCell="1" allowOverlap="1" relativeHeight="18">
                 <wp:simplePos x="0" y="0"/>
                 <wp:positionH relativeFrom="column">
                   <wp:posOffset>-5080</wp:posOffset>
@@ -4098,11 +4182,11 @@
                 <wp:extent cx="714375" cy="235585"/>
                 <wp:effectExtent l="0" t="0" r="0" b="0"/>
                 <wp:wrapNone/>
-                <wp:docPr id="18" name=""/>
+                <wp:docPr id="18" name="Shape14"/>
                 <a:graphic xmlns:a="http://schemas.openxmlformats.org/drawingml/2006/main">
                   <a:graphicData uri="http://schemas.microsoft.com/office/word/2010/wordprocessingShape">
                     <wps:wsp>
-                      <wps:cNvSpPr txBox="1"/>
+                      <wps:cNvSpPr/>
                       <wps:spPr>
                         <a:xfrm>
                           <a:off x="0" y="0"/>
@@ -4116,23 +4200,30 @@
                           <a:noFill/>
                         </a:ln>
                       </wps:spPr>
+                      <wps:style>
+                        <a:lnRef idx="0"/>
+                        <a:fillRef idx="0"/>
+                        <a:effectRef idx="0"/>
+                        <a:fontRef idx="minor"/>
+                      </wps:style>
                       <wps:txbx>
                         <w:txbxContent>
                           <w:p>
                             <w:pPr>
-                              <w:overflowPunct w:val="false"/>
+                              <w:pStyle w:val="FrameContents"/>
+                              <w:overflowPunct w:val="true"/>
                               <w:bidi w:val="0"/>
                               <w:spacing w:before="0" w:after="0"/>
-                              <w:ind w:start="284" w:end="284" w:hanging="0"/>
+                              <w:ind w:hanging="0" w:start="284" w:end="284"/>
                               <w:rPr/>
                             </w:pPr>
                             <w:r>
                               <w:rPr>
+                                <w:rFonts w:eastAsia="Noto Serif CJK SC" w:cs="Noto Sans Devanagari" w:ascii="Liberation Serif;Times New Roman" w:hAnsi="Liberation Serif;Times New Roman"/>
+                                <w:color w:val="auto"/>
+                                <w:kern w:val="2"/>
                                 <w:sz w:val="12"/>
-                                <w:kern w:val="2"/>
                                 <w:szCs w:val="12"/>
-                                <w:rFonts w:ascii="Liberation Serif;Times New Roman" w:hAnsi="Liberation Serif;Times New Roman" w:eastAsia="Noto Serif CJK SC" w:cs="Noto Sans Devanagari"/>
-                                <w:color w:val="auto"/>
                                 <w:lang w:val="en-US" w:eastAsia="zh-CN" w:bidi="hi-IN"/>
                               </w:rPr>
                               <w:t>header_size = 4</w:t>
@@ -4140,7 +4231,7 @@
                           </w:p>
                         </w:txbxContent>
                       </wps:txbx>
-                      <wps:bodyPr wrap="square" lIns="0" rIns="0" tIns="0" bIns="0" anchor="t">
+                      <wps:bodyPr lIns="0" rIns="0" tIns="0" bIns="0" anchor="t">
                         <a:noAutofit/>
                       </wps:bodyPr>
                     </wps:wsp>
@@ -4151,24 +4242,27 @@
           </mc:Choice>
           <mc:Fallback>
             <w:pict>
-              <v:shape id="shape_0" stroked="f" o:allowincell="f" style="position:absolute;margin-left:-0.4pt;margin-top:5.05pt;width:56.2pt;height:18.5pt;mso-wrap-style:square;v-text-anchor:top" type="_x0000_t202">
+              <v:rect id="shape_0" ID="Shape14" path="m0,0l-2147483645,0l-2147483645,-2147483646l0,-2147483646xe" stroked="f" o:allowincell="f" style="position:absolute;margin-left:-0.4pt;margin-top:5.05pt;width:56.2pt;height:18.5pt;mso-wrap-style:square;v-text-anchor:top">
+                <v:fill o:detectmouseclick="t" on="false"/>
+                <v:stroke color="#3465a4" joinstyle="round" endcap="flat"/>
                 <v:textbox>
                   <w:txbxContent>
                     <w:p>
                       <w:pPr>
-                        <w:overflowPunct w:val="false"/>
+                        <w:pStyle w:val="FrameContents"/>
+                        <w:overflowPunct w:val="true"/>
                         <w:bidi w:val="0"/>
                         <w:spacing w:before="0" w:after="0"/>
-                        <w:ind w:start="284" w:end="284" w:hanging="0"/>
+                        <w:ind w:hanging="0" w:start="284" w:end="284"/>
                         <w:rPr/>
                       </w:pPr>
                       <w:r>
                         <w:rPr>
+                          <w:rFonts w:eastAsia="Noto Serif CJK SC" w:cs="Noto Sans Devanagari" w:ascii="Liberation Serif;Times New Roman" w:hAnsi="Liberation Serif;Times New Roman"/>
+                          <w:color w:val="auto"/>
+                          <w:kern w:val="2"/>
                           <w:sz w:val="12"/>
-                          <w:kern w:val="2"/>
                           <w:szCs w:val="12"/>
-                          <w:rFonts w:ascii="Liberation Serif;Times New Roman" w:hAnsi="Liberation Serif;Times New Roman" w:eastAsia="Noto Serif CJK SC" w:cs="Noto Sans Devanagari"/>
-                          <w:color w:val="auto"/>
                           <w:lang w:val="en-US" w:eastAsia="zh-CN" w:bidi="hi-IN"/>
                         </w:rPr>
                         <w:t>header_size = 4</w:t>
@@ -4176,17 +4270,15 @@
                     </w:p>
                   </w:txbxContent>
                 </v:textbox>
-                <v:fill o:detectmouseclick="t" on="false"/>
-                <v:stroke color="#3465a4" joinstyle="round" endcap="flat"/>
                 <w10:wrap type="none"/>
-              </v:shape>
+              </v:rect>
             </w:pict>
           </mc:Fallback>
         </mc:AlternateContent>
         <mc:AlternateContent>
           <mc:Choice Requires="wps">
             <w:drawing>
-              <wp:anchor behindDoc="0" distT="0" distB="0" distL="114935" distR="114935" simplePos="0" locked="0" layoutInCell="1" allowOverlap="1" relativeHeight="19">
+              <wp:anchor behindDoc="0" distT="0" distB="0" distL="0" distR="0" simplePos="0" locked="0" layoutInCell="1" allowOverlap="1" relativeHeight="20">
                 <wp:simplePos x="0" y="0"/>
                 <wp:positionH relativeFrom="column">
                   <wp:posOffset>570230</wp:posOffset>
@@ -4197,11 +4289,11 @@
                 <wp:extent cx="714375" cy="235585"/>
                 <wp:effectExtent l="0" t="0" r="0" b="0"/>
                 <wp:wrapNone/>
-                <wp:docPr id="19" name=""/>
+                <wp:docPr id="19" name="Shape15"/>
                 <a:graphic xmlns:a="http://schemas.openxmlformats.org/drawingml/2006/main">
                   <a:graphicData uri="http://schemas.microsoft.com/office/word/2010/wordprocessingShape">
                     <wps:wsp>
-                      <wps:cNvSpPr txBox="1"/>
+                      <wps:cNvSpPr/>
                       <wps:spPr>
                         <a:xfrm>
                           <a:off x="0" y="0"/>
@@ -4215,23 +4307,30 @@
                           <a:noFill/>
                         </a:ln>
                       </wps:spPr>
+                      <wps:style>
+                        <a:lnRef idx="0"/>
+                        <a:fillRef idx="0"/>
+                        <a:effectRef idx="0"/>
+                        <a:fontRef idx="minor"/>
+                      </wps:style>
                       <wps:txbx>
                         <w:txbxContent>
                           <w:p>
                             <w:pPr>
-                              <w:overflowPunct w:val="false"/>
+                              <w:pStyle w:val="FrameContents"/>
+                              <w:overflowPunct w:val="true"/>
                               <w:bidi w:val="0"/>
                               <w:spacing w:before="0" w:after="0"/>
-                              <w:ind w:start="284" w:end="284" w:hanging="0"/>
+                              <w:ind w:hanging="0" w:start="284" w:end="284"/>
                               <w:rPr/>
                             </w:pPr>
                             <w:r>
                               <w:rPr>
+                                <w:rFonts w:eastAsia="Noto Serif CJK SC" w:cs="Noto Sans Devanagari" w:ascii="Liberation Serif;Times New Roman" w:hAnsi="Liberation Serif;Times New Roman"/>
+                                <w:color w:val="auto"/>
+                                <w:kern w:val="2"/>
                                 <w:sz w:val="12"/>
-                                <w:kern w:val="2"/>
                                 <w:szCs w:val="12"/>
-                                <w:rFonts w:ascii="Liberation Serif;Times New Roman" w:hAnsi="Liberation Serif;Times New Roman" w:eastAsia="Noto Serif CJK SC" w:cs="Noto Sans Devanagari"/>
-                                <w:color w:val="auto"/>
                                 <w:lang w:val="en-US" w:eastAsia="zh-CN" w:bidi="hi-IN"/>
                               </w:rPr>
                               <w:t>header_size = 4</w:t>
@@ -4239,7 +4338,7 @@
                           </w:p>
                         </w:txbxContent>
                       </wps:txbx>
-                      <wps:bodyPr wrap="square" lIns="0" rIns="0" tIns="0" bIns="0" anchor="t">
+                      <wps:bodyPr lIns="0" rIns="0" tIns="0" bIns="0" anchor="t">
                         <a:noAutofit/>
                       </wps:bodyPr>
                     </wps:wsp>
@@ -4250,24 +4349,27 @@
           </mc:Choice>
           <mc:Fallback>
             <w:pict>
-              <v:shape id="shape_0" stroked="f" o:allowincell="f" style="position:absolute;margin-left:44.9pt;margin-top:5.05pt;width:56.2pt;height:18.5pt;mso-wrap-style:square;v-text-anchor:top" type="_x0000_t202">
+              <v:rect id="shape_0" ID="Shape15" path="m0,0l-2147483645,0l-2147483645,-2147483646l0,-2147483646xe" stroked="f" o:allowincell="f" style="position:absolute;margin-left:44.9pt;margin-top:5.05pt;width:56.2pt;height:18.5pt;mso-wrap-style:square;v-text-anchor:top">
+                <v:fill o:detectmouseclick="t" on="false"/>
+                <v:stroke color="#3465a4" joinstyle="round" endcap="flat"/>
                 <v:textbox>
                   <w:txbxContent>
                     <w:p>
                       <w:pPr>
-                        <w:overflowPunct w:val="false"/>
+                        <w:pStyle w:val="FrameContents"/>
+                        <w:overflowPunct w:val="true"/>
                         <w:bidi w:val="0"/>
                         <w:spacing w:before="0" w:after="0"/>
-                        <w:ind w:start="284" w:end="284" w:hanging="0"/>
+                        <w:ind w:hanging="0" w:start="284" w:end="284"/>
                         <w:rPr/>
                       </w:pPr>
                       <w:r>
                         <w:rPr>
+                          <w:rFonts w:eastAsia="Noto Serif CJK SC" w:cs="Noto Sans Devanagari" w:ascii="Liberation Serif;Times New Roman" w:hAnsi="Liberation Serif;Times New Roman"/>
+                          <w:color w:val="auto"/>
+                          <w:kern w:val="2"/>
                           <w:sz w:val="12"/>
-                          <w:kern w:val="2"/>
                           <w:szCs w:val="12"/>
-                          <w:rFonts w:ascii="Liberation Serif;Times New Roman" w:hAnsi="Liberation Serif;Times New Roman" w:eastAsia="Noto Serif CJK SC" w:cs="Noto Sans Devanagari"/>
-                          <w:color w:val="auto"/>
                           <w:lang w:val="en-US" w:eastAsia="zh-CN" w:bidi="hi-IN"/>
                         </w:rPr>
                         <w:t>header_size = 4</w:t>
@@ -4275,17 +4377,15 @@
                     </w:p>
                   </w:txbxContent>
                 </v:textbox>
-                <v:fill o:detectmouseclick="t" on="false"/>
-                <v:stroke color="#3465a4" joinstyle="round" endcap="flat"/>
                 <w10:wrap type="none"/>
-              </v:shape>
+              </v:rect>
             </w:pict>
           </mc:Fallback>
         </mc:AlternateContent>
         <mc:AlternateContent>
           <mc:Choice Requires="wps">
             <w:drawing>
-              <wp:anchor behindDoc="0" distT="0" distB="0" distL="114935" distR="114935" simplePos="0" locked="0" layoutInCell="1" allowOverlap="1" relativeHeight="20">
+              <wp:anchor behindDoc="0" distT="0" distB="0" distL="0" distR="0" simplePos="0" locked="0" layoutInCell="1" allowOverlap="1" relativeHeight="22">
                 <wp:simplePos x="0" y="0"/>
                 <wp:positionH relativeFrom="column">
                   <wp:posOffset>1736725</wp:posOffset>
@@ -4296,11 +4396,11 @@
                 <wp:extent cx="714375" cy="235585"/>
                 <wp:effectExtent l="0" t="0" r="0" b="0"/>
                 <wp:wrapNone/>
-                <wp:docPr id="20" name=""/>
+                <wp:docPr id="20" name="Shape16"/>
                 <a:graphic xmlns:a="http://schemas.openxmlformats.org/drawingml/2006/main">
                   <a:graphicData uri="http://schemas.microsoft.com/office/word/2010/wordprocessingShape">
                     <wps:wsp>
-                      <wps:cNvSpPr txBox="1"/>
+                      <wps:cNvSpPr/>
                       <wps:spPr>
                         <a:xfrm>
                           <a:off x="0" y="0"/>
@@ -4314,23 +4414,30 @@
                           <a:noFill/>
                         </a:ln>
                       </wps:spPr>
+                      <wps:style>
+                        <a:lnRef idx="0"/>
+                        <a:fillRef idx="0"/>
+                        <a:effectRef idx="0"/>
+                        <a:fontRef idx="minor"/>
+                      </wps:style>
                       <wps:txbx>
                         <w:txbxContent>
                           <w:p>
                             <w:pPr>
-                              <w:overflowPunct w:val="false"/>
+                              <w:pStyle w:val="FrameContents"/>
+                              <w:overflowPunct w:val="true"/>
                               <w:bidi w:val="0"/>
                               <w:spacing w:before="0" w:after="0"/>
-                              <w:ind w:start="284" w:end="284" w:hanging="0"/>
+                              <w:ind w:hanging="0" w:start="284" w:end="284"/>
                               <w:rPr/>
                             </w:pPr>
                             <w:r>
                               <w:rPr>
+                                <w:rFonts w:eastAsia="Noto Serif CJK SC" w:cs="Noto Sans Devanagari" w:ascii="Liberation Serif;Times New Roman" w:hAnsi="Liberation Serif;Times New Roman"/>
+                                <w:color w:val="auto"/>
+                                <w:kern w:val="2"/>
                                 <w:sz w:val="12"/>
-                                <w:kern w:val="2"/>
                                 <w:szCs w:val="12"/>
-                                <w:rFonts w:ascii="Liberation Serif;Times New Roman" w:hAnsi="Liberation Serif;Times New Roman" w:eastAsia="Noto Serif CJK SC" w:cs="Noto Sans Devanagari"/>
-                                <w:color w:val="auto"/>
                                 <w:lang w:val="en-US" w:eastAsia="zh-CN" w:bidi="hi-IN"/>
                               </w:rPr>
                               <w:t>header_size = 4</w:t>
@@ -4338,7 +4445,7 @@
                           </w:p>
                         </w:txbxContent>
                       </wps:txbx>
-                      <wps:bodyPr wrap="square" lIns="0" rIns="0" tIns="0" bIns="0" anchor="t">
+                      <wps:bodyPr lIns="0" rIns="0" tIns="0" bIns="0" anchor="t">
                         <a:noAutofit/>
                       </wps:bodyPr>
                     </wps:wsp>
@@ -4349,24 +4456,27 @@
           </mc:Choice>
           <mc:Fallback>
             <w:pict>
-              <v:shape id="shape_0" stroked="f" o:allowincell="f" style="position:absolute;margin-left:136.75pt;margin-top:5.05pt;width:56.2pt;height:18.5pt;mso-wrap-style:square;v-text-anchor:top" type="_x0000_t202">
+              <v:rect id="shape_0" ID="Shape16" path="m0,0l-2147483645,0l-2147483645,-2147483646l0,-2147483646xe" stroked="f" o:allowincell="f" style="position:absolute;margin-left:136.75pt;margin-top:5.05pt;width:56.2pt;height:18.5pt;mso-wrap-style:square;v-text-anchor:top">
+                <v:fill o:detectmouseclick="t" on="false"/>
+                <v:stroke color="#3465a4" joinstyle="round" endcap="flat"/>
                 <v:textbox>
                   <w:txbxContent>
                     <w:p>
                       <w:pPr>
-                        <w:overflowPunct w:val="false"/>
+                        <w:pStyle w:val="FrameContents"/>
+                        <w:overflowPunct w:val="true"/>
                         <w:bidi w:val="0"/>
                         <w:spacing w:before="0" w:after="0"/>
-                        <w:ind w:start="284" w:end="284" w:hanging="0"/>
+                        <w:ind w:hanging="0" w:start="284" w:end="284"/>
                         <w:rPr/>
                       </w:pPr>
                       <w:r>
                         <w:rPr>
+                          <w:rFonts w:eastAsia="Noto Serif CJK SC" w:cs="Noto Sans Devanagari" w:ascii="Liberation Serif;Times New Roman" w:hAnsi="Liberation Serif;Times New Roman"/>
+                          <w:color w:val="auto"/>
+                          <w:kern w:val="2"/>
                           <w:sz w:val="12"/>
-                          <w:kern w:val="2"/>
                           <w:szCs w:val="12"/>
-                          <w:rFonts w:ascii="Liberation Serif;Times New Roman" w:hAnsi="Liberation Serif;Times New Roman" w:eastAsia="Noto Serif CJK SC" w:cs="Noto Sans Devanagari"/>
-                          <w:color w:val="auto"/>
                           <w:lang w:val="en-US" w:eastAsia="zh-CN" w:bidi="hi-IN"/>
                         </w:rPr>
                         <w:t>header_size = 4</w:t>
@@ -4374,17 +4484,15 @@
                     </w:p>
                   </w:txbxContent>
                 </v:textbox>
-                <v:fill o:detectmouseclick="t" on="false"/>
-                <v:stroke color="#3465a4" joinstyle="round" endcap="flat"/>
                 <w10:wrap type="none"/>
-              </v:shape>
+              </v:rect>
             </w:pict>
           </mc:Fallback>
         </mc:AlternateContent>
         <mc:AlternateContent>
           <mc:Choice Requires="wps">
             <w:drawing>
-              <wp:anchor behindDoc="0" distT="0" distB="0" distL="114935" distR="114935" simplePos="0" locked="0" layoutInCell="1" allowOverlap="1" relativeHeight="21">
+              <wp:anchor behindDoc="0" distT="0" distB="0" distL="0" distR="0" simplePos="0" locked="0" layoutInCell="1" allowOverlap="1" relativeHeight="24">
                 <wp:simplePos x="0" y="0"/>
                 <wp:positionH relativeFrom="column">
                   <wp:posOffset>2917190</wp:posOffset>
@@ -4395,11 +4503,11 @@
                 <wp:extent cx="714375" cy="235585"/>
                 <wp:effectExtent l="0" t="0" r="0" b="0"/>
                 <wp:wrapNone/>
-                <wp:docPr id="21" name=""/>
+                <wp:docPr id="21" name="Shape17"/>
                 <a:graphic xmlns:a="http://schemas.openxmlformats.org/drawingml/2006/main">
                   <a:graphicData uri="http://schemas.microsoft.com/office/word/2010/wordprocessingShape">
                     <wps:wsp>
-                      <wps:cNvSpPr txBox="1"/>
+                      <wps:cNvSpPr/>
                       <wps:spPr>
                         <a:xfrm>
                           <a:off x="0" y="0"/>
@@ -4413,23 +4521,30 @@
                           <a:noFill/>
                         </a:ln>
                       </wps:spPr>
+                      <wps:style>
+                        <a:lnRef idx="0"/>
+                        <a:fillRef idx="0"/>
+                        <a:effectRef idx="0"/>
+                        <a:fontRef idx="minor"/>
+                      </wps:style>
                       <wps:txbx>
                         <w:txbxContent>
                           <w:p>
                             <w:pPr>
-                              <w:overflowPunct w:val="false"/>
+                              <w:pStyle w:val="FrameContents"/>
+                              <w:overflowPunct w:val="true"/>
                               <w:bidi w:val="0"/>
                               <w:spacing w:before="0" w:after="0"/>
-                              <w:ind w:start="284" w:end="284" w:hanging="0"/>
+                              <w:ind w:hanging="0" w:start="284" w:end="284"/>
                               <w:rPr/>
                             </w:pPr>
                             <w:r>
                               <w:rPr>
+                                <w:rFonts w:eastAsia="Noto Serif CJK SC" w:cs="Noto Sans Devanagari" w:ascii="Liberation Serif;Times New Roman" w:hAnsi="Liberation Serif;Times New Roman"/>
+                                <w:color w:val="auto"/>
+                                <w:kern w:val="2"/>
                                 <w:sz w:val="12"/>
-                                <w:kern w:val="2"/>
                                 <w:szCs w:val="12"/>
-                                <w:rFonts w:ascii="Liberation Serif;Times New Roman" w:hAnsi="Liberation Serif;Times New Roman" w:eastAsia="Noto Serif CJK SC" w:cs="Noto Sans Devanagari"/>
-                                <w:color w:val="auto"/>
                                 <w:lang w:val="en-US" w:eastAsia="zh-CN" w:bidi="hi-IN"/>
                               </w:rPr>
                               <w:t>header_size = 4</w:t>
@@ -4437,7 +4552,7 @@
                           </w:p>
                         </w:txbxContent>
                       </wps:txbx>
-                      <wps:bodyPr wrap="square" lIns="0" rIns="0" tIns="0" bIns="0" anchor="t">
+                      <wps:bodyPr lIns="0" rIns="0" tIns="0" bIns="0" anchor="t">
                         <a:noAutofit/>
                       </wps:bodyPr>
                     </wps:wsp>
@@ -4448,24 +4563,27 @@
           </mc:Choice>
           <mc:Fallback>
             <w:pict>
-              <v:shape id="shape_0" stroked="f" o:allowincell="f" style="position:absolute;margin-left:229.7pt;margin-top:5.05pt;width:56.2pt;height:18.5pt;mso-wrap-style:square;v-text-anchor:top" type="_x0000_t202">
+              <v:rect id="shape_0" ID="Shape17" path="m0,0l-2147483645,0l-2147483645,-2147483646l0,-2147483646xe" stroked="f" o:allowincell="f" style="position:absolute;margin-left:229.7pt;margin-top:5.05pt;width:56.2pt;height:18.5pt;mso-wrap-style:square;v-text-anchor:top">
+                <v:fill o:detectmouseclick="t" on="false"/>
+                <v:stroke color="#3465a4" joinstyle="round" endcap="flat"/>
                 <v:textbox>
                   <w:txbxContent>
                     <w:p>
                       <w:pPr>
-                        <w:overflowPunct w:val="false"/>
+                        <w:pStyle w:val="FrameContents"/>
+                        <w:overflowPunct w:val="true"/>
                         <w:bidi w:val="0"/>
                         <w:spacing w:before="0" w:after="0"/>
-                        <w:ind w:start="284" w:end="284" w:hanging="0"/>
+                        <w:ind w:hanging="0" w:start="284" w:end="284"/>
                         <w:rPr/>
                       </w:pPr>
                       <w:r>
                         <w:rPr>
+                          <w:rFonts w:eastAsia="Noto Serif CJK SC" w:cs="Noto Sans Devanagari" w:ascii="Liberation Serif;Times New Roman" w:hAnsi="Liberation Serif;Times New Roman"/>
+                          <w:color w:val="auto"/>
+                          <w:kern w:val="2"/>
                           <w:sz w:val="12"/>
-                          <w:kern w:val="2"/>
                           <w:szCs w:val="12"/>
-                          <w:rFonts w:ascii="Liberation Serif;Times New Roman" w:hAnsi="Liberation Serif;Times New Roman" w:eastAsia="Noto Serif CJK SC" w:cs="Noto Sans Devanagari"/>
-                          <w:color w:val="auto"/>
                           <w:lang w:val="en-US" w:eastAsia="zh-CN" w:bidi="hi-IN"/>
                         </w:rPr>
                         <w:t>header_size = 4</w:t>
@@ -4473,17 +4591,15 @@
                     </w:p>
                   </w:txbxContent>
                 </v:textbox>
-                <v:fill o:detectmouseclick="t" on="false"/>
-                <v:stroke color="#3465a4" joinstyle="round" endcap="flat"/>
                 <w10:wrap type="none"/>
-              </v:shape>
+              </v:rect>
             </w:pict>
           </mc:Fallback>
         </mc:AlternateContent>
         <mc:AlternateContent>
           <mc:Choice Requires="wps">
             <w:drawing>
-              <wp:anchor behindDoc="0" distT="0" distB="0" distL="114935" distR="114935" simplePos="0" locked="0" layoutInCell="1" allowOverlap="1" relativeHeight="22">
+              <wp:anchor behindDoc="0" distT="0" distB="0" distL="0" distR="0" simplePos="0" locked="0" layoutInCell="1" allowOverlap="1" relativeHeight="26">
                 <wp:simplePos x="0" y="0"/>
                 <wp:positionH relativeFrom="column">
                   <wp:posOffset>4032885</wp:posOffset>
@@ -4494,11 +4610,11 @@
                 <wp:extent cx="714375" cy="235585"/>
                 <wp:effectExtent l="0" t="0" r="0" b="0"/>
                 <wp:wrapNone/>
-                <wp:docPr id="22" name=""/>
+                <wp:docPr id="22" name="Shape18"/>
                 <a:graphic xmlns:a="http://schemas.openxmlformats.org/drawingml/2006/main">
                   <a:graphicData uri="http://schemas.microsoft.com/office/word/2010/wordprocessingShape">
                     <wps:wsp>
-                      <wps:cNvSpPr txBox="1"/>
+                      <wps:cNvSpPr/>
                       <wps:spPr>
                         <a:xfrm>
                           <a:off x="0" y="0"/>
@@ -4512,23 +4628,30 @@
                           <a:noFill/>
                         </a:ln>
                       </wps:spPr>
+                      <wps:style>
+                        <a:lnRef idx="0"/>
+                        <a:fillRef idx="0"/>
+                        <a:effectRef idx="0"/>
+                        <a:fontRef idx="minor"/>
+                      </wps:style>
                       <wps:txbx>
                         <w:txbxContent>
                           <w:p>
                             <w:pPr>
-                              <w:overflowPunct w:val="false"/>
+                              <w:pStyle w:val="FrameContents"/>
+                              <w:overflowPunct w:val="true"/>
                               <w:bidi w:val="0"/>
                               <w:spacing w:before="0" w:after="0"/>
-                              <w:ind w:start="284" w:end="284" w:hanging="0"/>
+                              <w:ind w:hanging="0" w:start="284" w:end="284"/>
                               <w:rPr/>
                             </w:pPr>
                             <w:r>
                               <w:rPr>
+                                <w:rFonts w:eastAsia="Noto Serif CJK SC" w:cs="Noto Sans Devanagari" w:ascii="Liberation Serif;Times New Roman" w:hAnsi="Liberation Serif;Times New Roman"/>
+                                <w:color w:val="auto"/>
+                                <w:kern w:val="2"/>
                                 <w:sz w:val="12"/>
-                                <w:kern w:val="2"/>
                                 <w:szCs w:val="12"/>
-                                <w:rFonts w:ascii="Liberation Serif;Times New Roman" w:hAnsi="Liberation Serif;Times New Roman" w:eastAsia="Noto Serif CJK SC" w:cs="Noto Sans Devanagari"/>
-                                <w:color w:val="auto"/>
                                 <w:lang w:val="en-US" w:eastAsia="zh-CN" w:bidi="hi-IN"/>
                               </w:rPr>
                               <w:t>header_size = 4</w:t>
@@ -4536,7 +4659,7 @@
                           </w:p>
                         </w:txbxContent>
                       </wps:txbx>
-                      <wps:bodyPr wrap="square" lIns="0" rIns="0" tIns="0" bIns="0" anchor="t">
+                      <wps:bodyPr lIns="0" rIns="0" tIns="0" bIns="0" anchor="t">
                         <a:noAutofit/>
                       </wps:bodyPr>
                     </wps:wsp>
@@ -4547,24 +4670,27 @@
           </mc:Choice>
           <mc:Fallback>
             <w:pict>
-              <v:shape id="shape_0" stroked="f" o:allowincell="f" style="position:absolute;margin-left:317.55pt;margin-top:5.05pt;width:56.2pt;height:18.5pt;mso-wrap-style:square;v-text-anchor:top" type="_x0000_t202">
+              <v:rect id="shape_0" ID="Shape18" path="m0,0l-2147483645,0l-2147483645,-2147483646l0,-2147483646xe" stroked="f" o:allowincell="f" style="position:absolute;margin-left:317.55pt;margin-top:5.05pt;width:56.2pt;height:18.5pt;mso-wrap-style:square;v-text-anchor:top">
+                <v:fill o:detectmouseclick="t" on="false"/>
+                <v:stroke color="#3465a4" joinstyle="round" endcap="flat"/>
                 <v:textbox>
                   <w:txbxContent>
                     <w:p>
                       <w:pPr>
-                        <w:overflowPunct w:val="false"/>
+                        <w:pStyle w:val="FrameContents"/>
+                        <w:overflowPunct w:val="true"/>
                         <w:bidi w:val="0"/>
                         <w:spacing w:before="0" w:after="0"/>
-                        <w:ind w:start="284" w:end="284" w:hanging="0"/>
+                        <w:ind w:hanging="0" w:start="284" w:end="284"/>
                         <w:rPr/>
                       </w:pPr>
                       <w:r>
                         <w:rPr>
+                          <w:rFonts w:eastAsia="Noto Serif CJK SC" w:cs="Noto Sans Devanagari" w:ascii="Liberation Serif;Times New Roman" w:hAnsi="Liberation Serif;Times New Roman"/>
+                          <w:color w:val="auto"/>
+                          <w:kern w:val="2"/>
                           <w:sz w:val="12"/>
-                          <w:kern w:val="2"/>
                           <w:szCs w:val="12"/>
-                          <w:rFonts w:ascii="Liberation Serif;Times New Roman" w:hAnsi="Liberation Serif;Times New Roman" w:eastAsia="Noto Serif CJK SC" w:cs="Noto Sans Devanagari"/>
-                          <w:color w:val="auto"/>
                           <w:lang w:val="en-US" w:eastAsia="zh-CN" w:bidi="hi-IN"/>
                         </w:rPr>
                         <w:t>header_size = 4</w:t>
@@ -4572,17 +4698,15 @@
                     </w:p>
                   </w:txbxContent>
                 </v:textbox>
-                <v:fill o:detectmouseclick="t" on="false"/>
-                <v:stroke color="#3465a4" joinstyle="round" endcap="flat"/>
                 <w10:wrap type="none"/>
-              </v:shape>
+              </v:rect>
             </w:pict>
           </mc:Fallback>
         </mc:AlternateContent>
         <mc:AlternateContent>
           <mc:Choice Requires="wps">
             <w:drawing>
-              <wp:anchor behindDoc="0" distT="0" distB="0" distL="114935" distR="114935" simplePos="0" locked="0" layoutInCell="1" allowOverlap="1" relativeHeight="23">
+              <wp:anchor behindDoc="0" distT="0" distB="0" distL="0" distR="0" simplePos="0" locked="0" layoutInCell="1" allowOverlap="1" relativeHeight="28">
                 <wp:simplePos x="0" y="0"/>
                 <wp:positionH relativeFrom="column">
                   <wp:posOffset>1175385</wp:posOffset>
@@ -4593,11 +4717,11 @@
                 <wp:extent cx="714375" cy="235585"/>
                 <wp:effectExtent l="0" t="0" r="0" b="0"/>
                 <wp:wrapNone/>
-                <wp:docPr id="23" name=""/>
+                <wp:docPr id="23" name="Shape19"/>
                 <a:graphic xmlns:a="http://schemas.openxmlformats.org/drawingml/2006/main">
                   <a:graphicData uri="http://schemas.microsoft.com/office/word/2010/wordprocessingShape">
                     <wps:wsp>
-                      <wps:cNvSpPr txBox="1"/>
+                      <wps:cNvSpPr/>
                       <wps:spPr>
                         <a:xfrm>
                           <a:off x="0" y="0"/>
@@ -4611,23 +4735,30 @@
                           <a:noFill/>
                         </a:ln>
                       </wps:spPr>
+                      <wps:style>
+                        <a:lnRef idx="0"/>
+                        <a:fillRef idx="0"/>
+                        <a:effectRef idx="0"/>
+                        <a:fontRef idx="minor"/>
+                      </wps:style>
                       <wps:txbx>
                         <w:txbxContent>
                           <w:p>
                             <w:pPr>
-                              <w:overflowPunct w:val="false"/>
+                              <w:pStyle w:val="FrameContents"/>
+                              <w:overflowPunct w:val="true"/>
                               <w:bidi w:val="0"/>
                               <w:spacing w:before="0" w:after="0"/>
-                              <w:ind w:start="284" w:end="284" w:hanging="0"/>
+                              <w:ind w:hanging="0" w:start="284" w:end="284"/>
                               <w:rPr/>
                             </w:pPr>
                             <w:r>
                               <w:rPr>
+                                <w:rFonts w:eastAsia="Noto Serif CJK SC" w:cs="Noto Sans Devanagari" w:ascii="Liberation Serif;Times New Roman" w:hAnsi="Liberation Serif;Times New Roman"/>
+                                <w:color w:val="auto"/>
+                                <w:kern w:val="2"/>
                                 <w:sz w:val="12"/>
-                                <w:kern w:val="2"/>
                                 <w:szCs w:val="12"/>
-                                <w:rFonts w:ascii="Liberation Serif;Times New Roman" w:hAnsi="Liberation Serif;Times New Roman" w:eastAsia="Noto Serif CJK SC" w:cs="Noto Sans Devanagari"/>
-                                <w:color w:val="auto"/>
                                 <w:lang w:val="en-US" w:eastAsia="zh-CN" w:bidi="hi-IN"/>
                               </w:rPr>
                               <w:t>Type length</w:t>
@@ -4635,7 +4766,7 @@
                           </w:p>
                         </w:txbxContent>
                       </wps:txbx>
-                      <wps:bodyPr wrap="square" lIns="0" rIns="0" tIns="0" bIns="0" anchor="t">
+                      <wps:bodyPr lIns="0" rIns="0" tIns="0" bIns="0" anchor="t">
                         <a:noAutofit/>
                       </wps:bodyPr>
                     </wps:wsp>
@@ -4646,24 +4777,27 @@
           </mc:Choice>
           <mc:Fallback>
             <w:pict>
-              <v:shape id="shape_0" stroked="f" o:allowincell="f" style="position:absolute;margin-left:92.55pt;margin-top:7.2pt;width:56.2pt;height:18.5pt;mso-wrap-style:square;v-text-anchor:top" type="_x0000_t202">
+              <v:rect id="shape_0" ID="Shape19" path="m0,0l-2147483645,0l-2147483645,-2147483646l0,-2147483646xe" stroked="f" o:allowincell="f" style="position:absolute;margin-left:92.55pt;margin-top:7.2pt;width:56.2pt;height:18.5pt;mso-wrap-style:square;v-text-anchor:top">
+                <v:fill o:detectmouseclick="t" on="false"/>
+                <v:stroke color="#3465a4" joinstyle="round" endcap="flat"/>
                 <v:textbox>
                   <w:txbxContent>
                     <w:p>
                       <w:pPr>
-                        <w:overflowPunct w:val="false"/>
+                        <w:pStyle w:val="FrameContents"/>
+                        <w:overflowPunct w:val="true"/>
                         <w:bidi w:val="0"/>
                         <w:spacing w:before="0" w:after="0"/>
-                        <w:ind w:start="284" w:end="284" w:hanging="0"/>
+                        <w:ind w:hanging="0" w:start="284" w:end="284"/>
                         <w:rPr/>
                       </w:pPr>
                       <w:r>
                         <w:rPr>
+                          <w:rFonts w:eastAsia="Noto Serif CJK SC" w:cs="Noto Sans Devanagari" w:ascii="Liberation Serif;Times New Roman" w:hAnsi="Liberation Serif;Times New Roman"/>
+                          <w:color w:val="auto"/>
+                          <w:kern w:val="2"/>
                           <w:sz w:val="12"/>
-                          <w:kern w:val="2"/>
                           <w:szCs w:val="12"/>
-                          <w:rFonts w:ascii="Liberation Serif;Times New Roman" w:hAnsi="Liberation Serif;Times New Roman" w:eastAsia="Noto Serif CJK SC" w:cs="Noto Sans Devanagari"/>
-                          <w:color w:val="auto"/>
                           <w:lang w:val="en-US" w:eastAsia="zh-CN" w:bidi="hi-IN"/>
                         </w:rPr>
                         <w:t>Type length</w:t>
@@ -4671,17 +4805,15 @@
                     </w:p>
                   </w:txbxContent>
                 </v:textbox>
-                <v:fill o:detectmouseclick="t" on="false"/>
-                <v:stroke color="#3465a4" joinstyle="round" endcap="flat"/>
                 <w10:wrap type="none"/>
-              </v:shape>
+              </v:rect>
             </w:pict>
           </mc:Fallback>
         </mc:AlternateContent>
         <mc:AlternateContent>
           <mc:Choice Requires="wps">
             <w:drawing>
-              <wp:anchor behindDoc="0" distT="0" distB="0" distL="114935" distR="114935" simplePos="0" locked="0" layoutInCell="1" allowOverlap="1" relativeHeight="24">
+              <wp:anchor behindDoc="0" distT="0" distB="0" distL="0" distR="0" simplePos="0" locked="0" layoutInCell="1" allowOverlap="1" relativeHeight="30">
                 <wp:simplePos x="0" y="0"/>
                 <wp:positionH relativeFrom="column">
                   <wp:posOffset>2345690</wp:posOffset>
@@ -4692,11 +4824,11 @@
                 <wp:extent cx="714375" cy="235585"/>
                 <wp:effectExtent l="0" t="0" r="0" b="0"/>
                 <wp:wrapNone/>
-                <wp:docPr id="24" name=""/>
+                <wp:docPr id="24" name="Shape20"/>
                 <a:graphic xmlns:a="http://schemas.openxmlformats.org/drawingml/2006/main">
                   <a:graphicData uri="http://schemas.microsoft.com/office/word/2010/wordprocessingShape">
                     <wps:wsp>
-                      <wps:cNvSpPr txBox="1"/>
+                      <wps:cNvSpPr/>
                       <wps:spPr>
                         <a:xfrm>
                           <a:off x="0" y="0"/>
@@ -4710,23 +4842,30 @@
                           <a:noFill/>
                         </a:ln>
                       </wps:spPr>
+                      <wps:style>
+                        <a:lnRef idx="0"/>
+                        <a:fillRef idx="0"/>
+                        <a:effectRef idx="0"/>
+                        <a:fontRef idx="minor"/>
+                      </wps:style>
                       <wps:txbx>
                         <w:txbxContent>
                           <w:p>
                             <w:pPr>
-                              <w:overflowPunct w:val="false"/>
+                              <w:pStyle w:val="FrameContents"/>
+                              <w:overflowPunct w:val="true"/>
                               <w:bidi w:val="0"/>
                               <w:spacing w:before="0" w:after="0"/>
-                              <w:ind w:start="284" w:end="284" w:hanging="0"/>
+                              <w:ind w:hanging="0" w:start="284" w:end="284"/>
                               <w:rPr/>
                             </w:pPr>
                             <w:r>
                               <w:rPr>
+                                <w:rFonts w:eastAsia="Noto Serif CJK SC" w:cs="Noto Sans Devanagari" w:ascii="Liberation Serif;Times New Roman" w:hAnsi="Liberation Serif;Times New Roman"/>
+                                <w:color w:val="auto"/>
+                                <w:kern w:val="2"/>
                                 <w:sz w:val="12"/>
-                                <w:kern w:val="2"/>
                                 <w:szCs w:val="12"/>
-                                <w:rFonts w:ascii="Liberation Serif;Times New Roman" w:hAnsi="Liberation Serif;Times New Roman" w:eastAsia="Noto Serif CJK SC" w:cs="Noto Sans Devanagari"/>
-                                <w:color w:val="auto"/>
                                 <w:lang w:val="en-US" w:eastAsia="zh-CN" w:bidi="hi-IN"/>
                               </w:rPr>
                               <w:t>Key1 length</w:t>
@@ -4734,7 +4873,7 @@
                           </w:p>
                         </w:txbxContent>
                       </wps:txbx>
-                      <wps:bodyPr wrap="square" lIns="0" rIns="0" tIns="0" bIns="0" anchor="t">
+                      <wps:bodyPr lIns="0" rIns="0" tIns="0" bIns="0" anchor="t">
                         <a:noAutofit/>
                       </wps:bodyPr>
                     </wps:wsp>
@@ -4745,24 +4884,27 @@
           </mc:Choice>
           <mc:Fallback>
             <w:pict>
-              <v:shape id="shape_0" stroked="f" o:allowincell="f" style="position:absolute;margin-left:184.7pt;margin-top:7.2pt;width:56.2pt;height:18.5pt;mso-wrap-style:square;v-text-anchor:top" type="_x0000_t202">
+              <v:rect id="shape_0" ID="Shape20" path="m0,0l-2147483645,0l-2147483645,-2147483646l0,-2147483646xe" stroked="f" o:allowincell="f" style="position:absolute;margin-left:184.7pt;margin-top:7.2pt;width:56.2pt;height:18.5pt;mso-wrap-style:square;v-text-anchor:top">
+                <v:fill o:detectmouseclick="t" on="false"/>
+                <v:stroke color="#3465a4" joinstyle="round" endcap="flat"/>
                 <v:textbox>
                   <w:txbxContent>
                     <w:p>
                       <w:pPr>
-                        <w:overflowPunct w:val="false"/>
+                        <w:pStyle w:val="FrameContents"/>
+                        <w:overflowPunct w:val="true"/>
                         <w:bidi w:val="0"/>
                         <w:spacing w:before="0" w:after="0"/>
-                        <w:ind w:start="284" w:end="284" w:hanging="0"/>
+                        <w:ind w:hanging="0" w:start="284" w:end="284"/>
                         <w:rPr/>
                       </w:pPr>
                       <w:r>
                         <w:rPr>
+                          <w:rFonts w:eastAsia="Noto Serif CJK SC" w:cs="Noto Sans Devanagari" w:ascii="Liberation Serif;Times New Roman" w:hAnsi="Liberation Serif;Times New Roman"/>
+                          <w:color w:val="auto"/>
+                          <w:kern w:val="2"/>
                           <w:sz w:val="12"/>
-                          <w:kern w:val="2"/>
                           <w:szCs w:val="12"/>
-                          <w:rFonts w:ascii="Liberation Serif;Times New Roman" w:hAnsi="Liberation Serif;Times New Roman" w:eastAsia="Noto Serif CJK SC" w:cs="Noto Sans Devanagari"/>
-                          <w:color w:val="auto"/>
                           <w:lang w:val="en-US" w:eastAsia="zh-CN" w:bidi="hi-IN"/>
                         </w:rPr>
                         <w:t>Key1 length</w:t>
@@ -4770,17 +4912,15 @@
                     </w:p>
                   </w:txbxContent>
                 </v:textbox>
-                <v:fill o:detectmouseclick="t" on="false"/>
-                <v:stroke color="#3465a4" joinstyle="round" endcap="flat"/>
                 <w10:wrap type="none"/>
-              </v:shape>
+              </v:rect>
             </w:pict>
           </mc:Fallback>
         </mc:AlternateContent>
         <mc:AlternateContent>
           <mc:Choice Requires="wps">
             <w:drawing>
-              <wp:anchor behindDoc="0" distT="0" distB="0" distL="114935" distR="114935" simplePos="0" locked="0" layoutInCell="1" allowOverlap="1" relativeHeight="25">
+              <wp:anchor behindDoc="0" distT="0" distB="0" distL="0" distR="0" simplePos="0" locked="0" layoutInCell="1" allowOverlap="1" relativeHeight="32">
                 <wp:simplePos x="0" y="0"/>
                 <wp:positionH relativeFrom="column">
                   <wp:posOffset>4655185</wp:posOffset>
@@ -4791,11 +4931,11 @@
                 <wp:extent cx="714375" cy="235585"/>
                 <wp:effectExtent l="0" t="0" r="0" b="0"/>
                 <wp:wrapNone/>
-                <wp:docPr id="25" name=""/>
+                <wp:docPr id="25" name="Shape21"/>
                 <a:graphic xmlns:a="http://schemas.openxmlformats.org/drawingml/2006/main">
                   <a:graphicData uri="http://schemas.microsoft.com/office/word/2010/wordprocessingShape">
                     <wps:wsp>
-                      <wps:cNvSpPr txBox="1"/>
+                      <wps:cNvSpPr/>
                       <wps:spPr>
                         <a:xfrm>
                           <a:off x="0" y="0"/>
@@ -4809,23 +4949,30 @@
                           <a:noFill/>
                         </a:ln>
                       </wps:spPr>
+                      <wps:style>
+                        <a:lnRef idx="0"/>
+                        <a:fillRef idx="0"/>
+                        <a:effectRef idx="0"/>
+                        <a:fontRef idx="minor"/>
+                      </wps:style>
                       <wps:txbx>
                         <w:txbxContent>
                           <w:p>
                             <w:pPr>
-                              <w:overflowPunct w:val="false"/>
+                              <w:pStyle w:val="FrameContents"/>
+                              <w:overflowPunct w:val="true"/>
                               <w:bidi w:val="0"/>
                               <w:spacing w:before="0" w:after="0"/>
-                              <w:ind w:start="284" w:end="284" w:hanging="0"/>
+                              <w:ind w:hanging="0" w:start="284" w:end="284"/>
                               <w:rPr/>
                             </w:pPr>
                             <w:r>
                               <w:rPr>
+                                <w:rFonts w:eastAsia="Noto Serif CJK SC" w:cs="Noto Sans Devanagari" w:ascii="Liberation Serif;Times New Roman" w:hAnsi="Liberation Serif;Times New Roman"/>
+                                <w:color w:val="auto"/>
+                                <w:kern w:val="2"/>
                                 <w:sz w:val="12"/>
-                                <w:kern w:val="2"/>
                                 <w:szCs w:val="12"/>
-                                <w:rFonts w:ascii="Liberation Serif;Times New Roman" w:hAnsi="Liberation Serif;Times New Roman" w:eastAsia="Noto Serif CJK SC" w:cs="Noto Sans Devanagari"/>
-                                <w:color w:val="auto"/>
                                 <w:lang w:val="en-US" w:eastAsia="zh-CN" w:bidi="hi-IN"/>
                               </w:rPr>
                               <w:t>Key2 length</w:t>
@@ -4833,7 +4980,7 @@
                           </w:p>
                         </w:txbxContent>
                       </wps:txbx>
-                      <wps:bodyPr wrap="square" lIns="0" rIns="0" tIns="0" bIns="0" anchor="t">
+                      <wps:bodyPr lIns="0" rIns="0" tIns="0" bIns="0" anchor="t">
                         <a:noAutofit/>
                       </wps:bodyPr>
                     </wps:wsp>
@@ -4844,24 +4991,27 @@
           </mc:Choice>
           <mc:Fallback>
             <w:pict>
-              <v:shape id="shape_0" stroked="f" o:allowincell="f" style="position:absolute;margin-left:366.55pt;margin-top:5.05pt;width:56.2pt;height:18.5pt;mso-wrap-style:square;v-text-anchor:top" type="_x0000_t202">
+              <v:rect id="shape_0" ID="Shape21" path="m0,0l-2147483645,0l-2147483645,-2147483646l0,-2147483646xe" stroked="f" o:allowincell="f" style="position:absolute;margin-left:366.55pt;margin-top:5.05pt;width:56.2pt;height:18.5pt;mso-wrap-style:square;v-text-anchor:top">
+                <v:fill o:detectmouseclick="t" on="false"/>
+                <v:stroke color="#3465a4" joinstyle="round" endcap="flat"/>
                 <v:textbox>
                   <w:txbxContent>
                     <w:p>
                       <w:pPr>
-                        <w:overflowPunct w:val="false"/>
+                        <w:pStyle w:val="FrameContents"/>
+                        <w:overflowPunct w:val="true"/>
                         <w:bidi w:val="0"/>
                         <w:spacing w:before="0" w:after="0"/>
-                        <w:ind w:start="284" w:end="284" w:hanging="0"/>
+                        <w:ind w:hanging="0" w:start="284" w:end="284"/>
                         <w:rPr/>
                       </w:pPr>
                       <w:r>
                         <w:rPr>
+                          <w:rFonts w:eastAsia="Noto Serif CJK SC" w:cs="Noto Sans Devanagari" w:ascii="Liberation Serif;Times New Roman" w:hAnsi="Liberation Serif;Times New Roman"/>
+                          <w:color w:val="auto"/>
+                          <w:kern w:val="2"/>
                           <w:sz w:val="12"/>
-                          <w:kern w:val="2"/>
                           <w:szCs w:val="12"/>
-                          <w:rFonts w:ascii="Liberation Serif;Times New Roman" w:hAnsi="Liberation Serif;Times New Roman" w:eastAsia="Noto Serif CJK SC" w:cs="Noto Sans Devanagari"/>
-                          <w:color w:val="auto"/>
                           <w:lang w:val="en-US" w:eastAsia="zh-CN" w:bidi="hi-IN"/>
                         </w:rPr>
                         <w:t>Key2 length</w:t>
@@ -4869,17 +5019,15 @@
                     </w:p>
                   </w:txbxContent>
                 </v:textbox>
-                <v:fill o:detectmouseclick="t" on="false"/>
-                <v:stroke color="#3465a4" joinstyle="round" endcap="flat"/>
                 <w10:wrap type="none"/>
-              </v:shape>
+              </v:rect>
             </w:pict>
           </mc:Fallback>
         </mc:AlternateContent>
         <mc:AlternateContent>
           <mc:Choice Requires="wps">
             <w:drawing>
-              <wp:anchor behindDoc="0" distT="0" distB="0" distL="114935" distR="114935" simplePos="0" locked="0" layoutInCell="1" allowOverlap="1" relativeHeight="26">
+              <wp:anchor behindDoc="0" distT="0" distB="0" distL="0" distR="0" simplePos="0" locked="0" layoutInCell="1" allowOverlap="1" relativeHeight="34">
                 <wp:simplePos x="0" y="0"/>
                 <wp:positionH relativeFrom="column">
                   <wp:posOffset>3515995</wp:posOffset>
@@ -4890,11 +5038,11 @@
                 <wp:extent cx="714375" cy="235585"/>
                 <wp:effectExtent l="0" t="0" r="0" b="0"/>
                 <wp:wrapNone/>
-                <wp:docPr id="26" name=""/>
+                <wp:docPr id="26" name="Shape22"/>
                 <a:graphic xmlns:a="http://schemas.openxmlformats.org/drawingml/2006/main">
                   <a:graphicData uri="http://schemas.microsoft.com/office/word/2010/wordprocessingShape">
                     <wps:wsp>
-                      <wps:cNvSpPr txBox="1"/>
+                      <wps:cNvSpPr/>
                       <wps:spPr>
                         <a:xfrm>
                           <a:off x="0" y="0"/>
@@ -4908,23 +5056,30 @@
                           <a:noFill/>
                         </a:ln>
                       </wps:spPr>
+                      <wps:style>
+                        <a:lnRef idx="0"/>
+                        <a:fillRef idx="0"/>
+                        <a:effectRef idx="0"/>
+                        <a:fontRef idx="minor"/>
+                      </wps:style>
                       <wps:txbx>
                         <w:txbxContent>
                           <w:p>
                             <w:pPr>
-                              <w:overflowPunct w:val="false"/>
+                              <w:pStyle w:val="FrameContents"/>
+                              <w:overflowPunct w:val="true"/>
                               <w:bidi w:val="0"/>
                               <w:spacing w:before="0" w:after="0"/>
-                              <w:ind w:start="284" w:end="284" w:hanging="0"/>
+                              <w:ind w:hanging="0" w:start="284" w:end="284"/>
                               <w:rPr/>
                             </w:pPr>
                             <w:r>
                               <w:rPr>
+                                <w:rFonts w:eastAsia="Noto Serif CJK SC" w:cs="Noto Sans Devanagari" w:ascii="Liberation Serif;Times New Roman" w:hAnsi="Liberation Serif;Times New Roman"/>
+                                <w:color w:val="auto"/>
+                                <w:kern w:val="2"/>
                                 <w:sz w:val="12"/>
-                                <w:kern w:val="2"/>
                                 <w:szCs w:val="12"/>
-                                <w:rFonts w:ascii="Liberation Serif;Times New Roman" w:hAnsi="Liberation Serif;Times New Roman" w:eastAsia="Noto Serif CJK SC" w:cs="Noto Sans Devanagari"/>
-                                <w:color w:val="auto"/>
                                 <w:lang w:val="en-US" w:eastAsia="zh-CN" w:bidi="hi-IN"/>
                               </w:rPr>
                               <w:t>Value1 length</w:t>
@@ -4932,7 +5087,7 @@
                           </w:p>
                         </w:txbxContent>
                       </wps:txbx>
-                      <wps:bodyPr wrap="square" lIns="0" rIns="0" tIns="0" bIns="0" anchor="t">
+                      <wps:bodyPr lIns="0" rIns="0" tIns="0" bIns="0" anchor="t">
                         <a:noAutofit/>
                       </wps:bodyPr>
                     </wps:wsp>
@@ -4943,24 +5098,27 @@
           </mc:Choice>
           <mc:Fallback>
             <w:pict>
-              <v:shape id="shape_0" stroked="f" o:allowincell="f" style="position:absolute;margin-left:276.85pt;margin-top:5.05pt;width:56.2pt;height:18.5pt;mso-wrap-style:square;v-text-anchor:top" type="_x0000_t202">
+              <v:rect id="shape_0" ID="Shape22" path="m0,0l-2147483645,0l-2147483645,-2147483646l0,-2147483646xe" stroked="f" o:allowincell="f" style="position:absolute;margin-left:276.85pt;margin-top:5.05pt;width:56.2pt;height:18.5pt;mso-wrap-style:square;v-text-anchor:top">
+                <v:fill o:detectmouseclick="t" on="false"/>
+                <v:stroke color="#3465a4" joinstyle="round" endcap="flat"/>
                 <v:textbox>
                   <w:txbxContent>
                     <w:p>
                       <w:pPr>
-                        <w:overflowPunct w:val="false"/>
+                        <w:pStyle w:val="FrameContents"/>
+                        <w:overflowPunct w:val="true"/>
                         <w:bidi w:val="0"/>
                         <w:spacing w:before="0" w:after="0"/>
-                        <w:ind w:start="284" w:end="284" w:hanging="0"/>
+                        <w:ind w:hanging="0" w:start="284" w:end="284"/>
                         <w:rPr/>
                       </w:pPr>
                       <w:r>
                         <w:rPr>
+                          <w:rFonts w:eastAsia="Noto Serif CJK SC" w:cs="Noto Sans Devanagari" w:ascii="Liberation Serif;Times New Roman" w:hAnsi="Liberation Serif;Times New Roman"/>
+                          <w:color w:val="auto"/>
+                          <w:kern w:val="2"/>
                           <w:sz w:val="12"/>
-                          <w:kern w:val="2"/>
                           <w:szCs w:val="12"/>
-                          <w:rFonts w:ascii="Liberation Serif;Times New Roman" w:hAnsi="Liberation Serif;Times New Roman" w:eastAsia="Noto Serif CJK SC" w:cs="Noto Sans Devanagari"/>
-                          <w:color w:val="auto"/>
                           <w:lang w:val="en-US" w:eastAsia="zh-CN" w:bidi="hi-IN"/>
                         </w:rPr>
                         <w:t>Value1 length</w:t>
@@ -4968,10 +5126,8 @@
                     </w:p>
                   </w:txbxContent>
                 </v:textbox>
-                <v:fill o:detectmouseclick="t" on="false"/>
-                <v:stroke color="#3465a4" joinstyle="round" endcap="flat"/>
                 <w10:wrap type="none"/>
-              </v:shape>
+              </v:rect>
             </w:pict>
           </mc:Fallback>
         </mc:AlternateContent>
@@ -4991,22 +5147,22 @@
         </w:tblCellMar>
       </w:tblPr>
       <w:tblGrid>
-        <w:gridCol w:w="907"/>
-        <w:gridCol w:w="907"/>
-        <w:gridCol w:w="907"/>
-        <w:gridCol w:w="907"/>
-        <w:gridCol w:w="907"/>
-        <w:gridCol w:w="907"/>
-        <w:gridCol w:w="907"/>
-        <w:gridCol w:w="907"/>
-        <w:gridCol w:w="907"/>
+        <w:gridCol w:w="906"/>
+        <w:gridCol w:w="908"/>
+        <w:gridCol w:w="906"/>
+        <w:gridCol w:w="908"/>
+        <w:gridCol w:w="906"/>
+        <w:gridCol w:w="908"/>
+        <w:gridCol w:w="906"/>
+        <w:gridCol w:w="908"/>
+        <w:gridCol w:w="906"/>
         <w:gridCol w:w="907"/>
       </w:tblGrid>
       <w:tr>
         <w:trPr/>
         <w:tc>
           <w:tcPr>
-            <w:tcW w:w="907" w:type="dxa"/>
+            <w:tcW w:w="906" w:type="dxa"/>
             <w:tcBorders>
               <w:top w:val="single" w:sz="4" w:space="0" w:color="000000"/>
               <w:start w:val="single" w:sz="4" w:space="0" w:color="000000"/>
@@ -5033,7 +5189,7 @@
         </w:tc>
         <w:tc>
           <w:tcPr>
-            <w:tcW w:w="907" w:type="dxa"/>
+            <w:tcW w:w="908" w:type="dxa"/>
             <w:tcBorders>
               <w:top w:val="single" w:sz="4" w:space="0" w:color="000000"/>
               <w:start w:val="single" w:sz="4" w:space="0" w:color="000000"/>
@@ -5054,7 +5210,7 @@
         </w:tc>
         <w:tc>
           <w:tcPr>
-            <w:tcW w:w="907" w:type="dxa"/>
+            <w:tcW w:w="906" w:type="dxa"/>
             <w:tcBorders>
               <w:top w:val="single" w:sz="4" w:space="0" w:color="000000"/>
               <w:start w:val="single" w:sz="4" w:space="0" w:color="000000"/>
@@ -5075,7 +5231,7 @@
         </w:tc>
         <w:tc>
           <w:tcPr>
-            <w:tcW w:w="907" w:type="dxa"/>
+            <w:tcW w:w="908" w:type="dxa"/>
             <w:tcBorders>
               <w:top w:val="single" w:sz="4" w:space="0" w:color="000000"/>
               <w:start w:val="single" w:sz="4" w:space="0" w:color="000000"/>
@@ -5096,7 +5252,7 @@
         </w:tc>
         <w:tc>
           <w:tcPr>
-            <w:tcW w:w="907" w:type="dxa"/>
+            <w:tcW w:w="906" w:type="dxa"/>
             <w:tcBorders>
               <w:top w:val="single" w:sz="4" w:space="0" w:color="000000"/>
               <w:start w:val="single" w:sz="4" w:space="0" w:color="000000"/>
@@ -5117,7 +5273,7 @@
         </w:tc>
         <w:tc>
           <w:tcPr>
-            <w:tcW w:w="907" w:type="dxa"/>
+            <w:tcW w:w="908" w:type="dxa"/>
             <w:tcBorders>
               <w:top w:val="single" w:sz="4" w:space="0" w:color="000000"/>
               <w:start w:val="single" w:sz="4" w:space="0" w:color="000000"/>
@@ -5138,7 +5294,7 @@
         </w:tc>
         <w:tc>
           <w:tcPr>
-            <w:tcW w:w="907" w:type="dxa"/>
+            <w:tcW w:w="906" w:type="dxa"/>
             <w:tcBorders>
               <w:top w:val="single" w:sz="4" w:space="0" w:color="000000"/>
               <w:start w:val="single" w:sz="4" w:space="0" w:color="000000"/>
@@ -5159,7 +5315,7 @@
         </w:tc>
         <w:tc>
           <w:tcPr>
-            <w:tcW w:w="907" w:type="dxa"/>
+            <w:tcW w:w="908" w:type="dxa"/>
             <w:tcBorders>
               <w:top w:val="single" w:sz="4" w:space="0" w:color="000000"/>
               <w:start w:val="single" w:sz="4" w:space="0" w:color="000000"/>
@@ -5180,7 +5336,7 @@
         </w:tc>
         <w:tc>
           <w:tcPr>
-            <w:tcW w:w="907" w:type="dxa"/>
+            <w:tcW w:w="906" w:type="dxa"/>
             <w:tcBorders>
               <w:top w:val="single" w:sz="4" w:space="0" w:color="000000"/>
               <w:start w:val="single" w:sz="4" w:space="0" w:color="000000"/>
@@ -5215,7 +5371,7 @@
               <w:widowControl w:val="false"/>
               <w:suppressLineNumbers/>
               <w:spacing w:before="29" w:after="0"/>
-              <w:ind w:end="29"/>
+              <w:ind w:hanging="0" w:start="29" w:end="29"/>
               <w:rPr/>
             </w:pPr>
             <w:r>
@@ -5277,6 +5433,10 @@
     <w:p>
       <w:pPr>
         <w:pStyle w:val="Heading3"/>
+        <w:numPr>
+          <w:ilvl w:val="0"/>
+          <w:numId w:val="0"/>
+        </w:numPr>
         <w:ind w:hanging="0" w:start="0" w:end="0"/>
         <w:jc w:val="both"/>
         <w:rPr/>
@@ -5285,6 +5445,11 @@
       <w:bookmarkEnd w:id="8"/>
       <w:r>
         <w:rPr/>
+        <w:t>1.5.4</w:t>
+        <w:tab/>
+      </w:r>
+      <w:r>
+        <w:rPr/>
         <w:t>Encription</w:t>
       </w:r>
     </w:p>
@@ -5301,12 +5466,21 @@
     <w:p>
       <w:pPr>
         <w:pStyle w:val="Heading3"/>
+        <w:numPr>
+          <w:ilvl w:val="0"/>
+          <w:numId w:val="0"/>
+        </w:numPr>
         <w:ind w:hanging="0" w:start="0" w:end="0"/>
         <w:jc w:val="both"/>
         <w:rPr/>
       </w:pPr>
       <w:bookmarkStart w:id="9" w:name="__RefHeading___Toc209893732"/>
       <w:bookmarkEnd w:id="9"/>
+      <w:r>
+        <w:rPr/>
+        <w:t>1.5.5</w:t>
+        <w:tab/>
+      </w:r>
       <w:r>
         <w:rPr/>
         <w:t>Classes</w:t>
@@ -5348,7 +5522,7 @@
                   </pic:nvPicPr>
                   <pic:blipFill>
                     <a:blip r:embed="rId8"/>
-                    <a:srcRect l="-57" t="-71" r="-57" b="-71"/>
+                    <a:srcRect l="-63" t="-78" r="-63" b="-78"/>
                     <a:stretch>
                       <a:fillRect/>
                     </a:stretch>
@@ -5377,13 +5551,22 @@
     <w:p>
       <w:pPr>
         <w:pStyle w:val="Heading2"/>
-        <w:ind w:hanging="289" w:start="578" w:end="0"/>
+        <w:numPr>
+          <w:ilvl w:val="0"/>
+          <w:numId w:val="0"/>
+        </w:numPr>
+        <w:ind w:hanging="0" w:start="578" w:end="0"/>
         <w:rPr/>
       </w:pPr>
       <w:bookmarkStart w:id="10" w:name="__RefHeading___Toc209893733"/>
       <w:bookmarkEnd w:id="10"/>
       <w:r>
         <w:rPr/>
+        <w:t>1.6</w:t>
+        <w:tab/>
+      </w:r>
+      <w:r>
+        <w:rPr/>
         <w:t>System Architecture - Presentation Layer</w:t>
       </w:r>
     </w:p>
@@ -5400,12 +5583,21 @@
     <w:p>
       <w:pPr>
         <w:pStyle w:val="Heading3"/>
+        <w:numPr>
+          <w:ilvl w:val="0"/>
+          <w:numId w:val="0"/>
+        </w:numPr>
         <w:ind w:hanging="0" w:start="0" w:end="0"/>
         <w:jc w:val="both"/>
         <w:rPr/>
       </w:pPr>
       <w:bookmarkStart w:id="11" w:name="__RefHeading___Toc209893734"/>
       <w:bookmarkEnd w:id="11"/>
+      <w:r>
+        <w:rPr/>
+        <w:t>1.6.1</w:t>
+        <w:tab/>
+      </w:r>
       <w:r>
         <w:rPr/>
         <w:t>Forms workflow</w:t>
@@ -5447,7 +5639,7 @@
                   </pic:nvPicPr>
                   <pic:blipFill>
                     <a:blip r:embed="rId9"/>
-                    <a:srcRect l="-56" t="-77" r="-56" b="-77"/>
+                    <a:srcRect l="-61" t="-85" r="-61" b="-85"/>
                     <a:stretch>
                       <a:fillRect/>
                     </a:stretch>
@@ -5476,13 +5668,22 @@
     <w:p>
       <w:pPr>
         <w:pStyle w:val="Heading2"/>
-        <w:ind w:hanging="289" w:start="578" w:end="0"/>
+        <w:numPr>
+          <w:ilvl w:val="0"/>
+          <w:numId w:val="0"/>
+        </w:numPr>
+        <w:ind w:hanging="0" w:start="578" w:end="0"/>
         <w:rPr/>
       </w:pPr>
       <w:bookmarkStart w:id="12" w:name="__RefHeading___Toc209893735"/>
       <w:bookmarkEnd w:id="12"/>
       <w:r>
         <w:rPr/>
+        <w:t>1.7</w:t>
+        <w:tab/>
+      </w:r>
+      <w:r>
+        <w:rPr/>
         <w:t>Source Code</w:t>
       </w:r>
     </w:p>
@@ -5499,13 +5700,22 @@
     <w:p>
       <w:pPr>
         <w:pStyle w:val="Heading2"/>
-        <w:ind w:hanging="289" w:start="578" w:end="0"/>
+        <w:numPr>
+          <w:ilvl w:val="0"/>
+          <w:numId w:val="0"/>
+        </w:numPr>
+        <w:ind w:hanging="0" w:start="578" w:end="0"/>
         <w:rPr/>
       </w:pPr>
       <w:bookmarkStart w:id="13" w:name="__RefHeading___Toc209893736"/>
       <w:bookmarkEnd w:id="13"/>
       <w:r>
         <w:rPr/>
+        <w:t>1.8</w:t>
+        <w:tab/>
+      </w:r>
+      <w:r>
+        <w:rPr/>
         <w:t>SW Test plan</w:t>
       </w:r>
     </w:p>
@@ -5522,6 +5732,10 @@
     <w:p>
       <w:pPr>
         <w:pStyle w:val="Heading3"/>
+        <w:numPr>
+          <w:ilvl w:val="0"/>
+          <w:numId w:val="0"/>
+        </w:numPr>
         <w:ind w:hanging="0" w:start="0" w:end="0"/>
         <w:jc w:val="both"/>
         <w:rPr/>
@@ -5546,6 +5760,10 @@
     <w:p>
       <w:pPr>
         <w:pStyle w:val="Heading3"/>
+        <w:numPr>
+          <w:ilvl w:val="0"/>
+          <w:numId w:val="0"/>
+        </w:numPr>
         <w:ind w:hanging="0" w:start="0" w:end="0"/>
         <w:jc w:val="both"/>
         <w:rPr/>
@@ -5590,10 +5808,12 @@
       </w:r>
     </w:p>
     <w:sectPr>
-      <w:headerReference w:type="default" r:id="rId10"/>
-      <w:headerReference w:type="first" r:id="rId11"/>
-      <w:footerReference w:type="default" r:id="rId12"/>
-      <w:footerReference w:type="first" r:id="rId13"/>
+      <w:headerReference w:type="even" r:id="rId10"/>
+      <w:headerReference w:type="default" r:id="rId11"/>
+      <w:headerReference w:type="first" r:id="rId12"/>
+      <w:footerReference w:type="even" r:id="rId13"/>
+      <w:footerReference w:type="default" r:id="rId14"/>
+      <w:footerReference w:type="first" r:id="rId15"/>
       <w:type w:val="nextPage"/>
       <w:pgSz w:w="11906" w:h="16838"/>
       <w:pgMar w:left="1418" w:right="1418" w:gutter="0" w:header="720" w:top="1440" w:footer="754" w:bottom="879"/>
@@ -5608,6 +5828,20 @@
 </file>
 
 <file path=word/footer1.xml><?xml version="1.0" encoding="utf-8"?>
+<w:ftr xmlns:o="urn:schemas-microsoft-com:office:office" xmlns:r="http://schemas.openxmlformats.org/officeDocument/2006/relationships" xmlns:v="urn:schemas-microsoft-com:vml" xmlns:w="http://schemas.openxmlformats.org/wordprocessingml/2006/main" xmlns:w10="urn:schemas-microsoft-com:office:word" xmlns:wp="http://schemas.openxmlformats.org/drawingml/2006/wordprocessingDrawing" xmlns:pic="http://schemas.openxmlformats.org/drawingml/2006/picture" xmlns:wps="http://schemas.microsoft.com/office/word/2010/wordprocessingShape" xmlns:wpg="http://schemas.microsoft.com/office/word/2010/wordprocessingGroup" xmlns:mc="http://schemas.openxmlformats.org/markup-compatibility/2006" xmlns:wp14="http://schemas.microsoft.com/office/word/2010/wordprocessingDrawing" xmlns:w14="http://schemas.microsoft.com/office/word/2010/wordml" xmlns:w15="http://schemas.microsoft.com/office/word/2012/wordml" mc:Ignorable="w14 wp14 w15">
+  <w:p>
+    <w:pPr>
+      <w:pStyle w:val="Footer"/>
+      <w:rPr/>
+    </w:pPr>
+    <w:r>
+      <w:rPr/>
+    </w:r>
+  </w:p>
+</w:ftr>
+</file>
+
+<file path=word/footer2.xml><?xml version="1.0" encoding="utf-8"?>
 <w:ftr xmlns:o="urn:schemas-microsoft-com:office:office" xmlns:r="http://schemas.openxmlformats.org/officeDocument/2006/relationships" xmlns:v="urn:schemas-microsoft-com:vml" xmlns:w="http://schemas.openxmlformats.org/wordprocessingml/2006/main" xmlns:w10="urn:schemas-microsoft-com:office:word" xmlns:wp="http://schemas.openxmlformats.org/drawingml/2006/wordprocessingDrawing" xmlns:pic="http://schemas.openxmlformats.org/drawingml/2006/picture" xmlns:wps="http://schemas.microsoft.com/office/word/2010/wordprocessingShape" xmlns:wpg="http://schemas.microsoft.com/office/word/2010/wordprocessingGroup" xmlns:mc="http://schemas.openxmlformats.org/markup-compatibility/2006" xmlns:wp14="http://schemas.microsoft.com/office/word/2010/wordprocessingDrawing" xmlns:w14="http://schemas.microsoft.com/office/word/2010/wordml" xmlns:w15="http://schemas.microsoft.com/office/word/2012/wordml" mc:Ignorable="w14 wp14 w15">
   <w:p>
     <w:pPr>
@@ -5667,7 +5901,7 @@
 </w:ftr>
 </file>
 
-<file path=word/footer2.xml><?xml version="1.0" encoding="utf-8"?>
+<file path=word/footer3.xml><?xml version="1.0" encoding="utf-8"?>
 <w:ftr xmlns:o="urn:schemas-microsoft-com:office:office" xmlns:r="http://schemas.openxmlformats.org/officeDocument/2006/relationships" xmlns:v="urn:schemas-microsoft-com:vml" xmlns:w="http://schemas.openxmlformats.org/wordprocessingml/2006/main" xmlns:w10="urn:schemas-microsoft-com:office:word" xmlns:wp="http://schemas.openxmlformats.org/drawingml/2006/wordprocessingDrawing" xmlns:pic="http://schemas.openxmlformats.org/drawingml/2006/picture" xmlns:wps="http://schemas.microsoft.com/office/word/2010/wordprocessingShape" xmlns:wpg="http://schemas.microsoft.com/office/word/2010/wordprocessingGroup" xmlns:mc="http://schemas.openxmlformats.org/markup-compatibility/2006" xmlns:wp14="http://schemas.microsoft.com/office/word/2010/wordprocessingDrawing" xmlns:w14="http://schemas.microsoft.com/office/word/2010/wordml" xmlns:w15="http://schemas.microsoft.com/office/word/2012/wordml" mc:Ignorable="w14 wp14 w15">
   <w:p>
     <w:pPr>
@@ -5682,6 +5916,20 @@
 </file>
 
 <file path=word/header1.xml><?xml version="1.0" encoding="utf-8"?>
+<w:hdr xmlns:o="urn:schemas-microsoft-com:office:office" xmlns:r="http://schemas.openxmlformats.org/officeDocument/2006/relationships" xmlns:v="urn:schemas-microsoft-com:vml" xmlns:w="http://schemas.openxmlformats.org/wordprocessingml/2006/main" xmlns:w10="urn:schemas-microsoft-com:office:word" xmlns:wp="http://schemas.openxmlformats.org/drawingml/2006/wordprocessingDrawing" xmlns:pic="http://schemas.openxmlformats.org/drawingml/2006/picture" xmlns:wps="http://schemas.microsoft.com/office/word/2010/wordprocessingShape" xmlns:wpg="http://schemas.microsoft.com/office/word/2010/wordprocessingGroup" xmlns:mc="http://schemas.openxmlformats.org/markup-compatibility/2006" xmlns:wp14="http://schemas.microsoft.com/office/word/2010/wordprocessingDrawing" xmlns:w14="http://schemas.microsoft.com/office/word/2010/wordml" xmlns:w15="http://schemas.microsoft.com/office/word/2012/wordml" mc:Ignorable="w14 wp14 w15">
+  <w:p>
+    <w:pPr>
+      <w:pStyle w:val="Header"/>
+      <w:rPr/>
+    </w:pPr>
+    <w:r>
+      <w:rPr/>
+    </w:r>
+  </w:p>
+</w:hdr>
+</file>
+
+<file path=word/header2.xml><?xml version="1.0" encoding="utf-8"?>
 <w:hdr xmlns:o="urn:schemas-microsoft-com:office:office" xmlns:r="http://schemas.openxmlformats.org/officeDocument/2006/relationships" xmlns:v="urn:schemas-microsoft-com:vml" xmlns:w="http://schemas.openxmlformats.org/wordprocessingml/2006/main" xmlns:w10="urn:schemas-microsoft-com:office:word" xmlns:wp="http://schemas.openxmlformats.org/drawingml/2006/wordprocessingDrawing" xmlns:pic="http://schemas.openxmlformats.org/drawingml/2006/picture" xmlns:wps="http://schemas.microsoft.com/office/word/2010/wordprocessingShape" xmlns:wpg="http://schemas.microsoft.com/office/word/2010/wordprocessingGroup" xmlns:mc="http://schemas.openxmlformats.org/markup-compatibility/2006" xmlns:wp14="http://schemas.microsoft.com/office/word/2010/wordprocessingDrawing" xmlns:w14="http://schemas.microsoft.com/office/word/2010/wordml" xmlns:w15="http://schemas.microsoft.com/office/word/2012/wordml" mc:Ignorable="w14 wp14 w15">
   <w:p>
     <w:pPr>
@@ -5764,7 +6012,7 @@
 </w:hdr>
 </file>
 
-<file path=word/header2.xml><?xml version="1.0" encoding="utf-8"?>
+<file path=word/header3.xml><?xml version="1.0" encoding="utf-8"?>
 <w:hdr xmlns:o="urn:schemas-microsoft-com:office:office" xmlns:r="http://schemas.openxmlformats.org/officeDocument/2006/relationships" xmlns:v="urn:schemas-microsoft-com:vml" xmlns:w="http://schemas.openxmlformats.org/wordprocessingml/2006/main" xmlns:w10="urn:schemas-microsoft-com:office:word" xmlns:wp="http://schemas.openxmlformats.org/drawingml/2006/wordprocessingDrawing" xmlns:pic="http://schemas.openxmlformats.org/drawingml/2006/picture" xmlns:wps="http://schemas.microsoft.com/office/word/2010/wordprocessingShape" xmlns:wpg="http://schemas.microsoft.com/office/word/2010/wordprocessingGroup" xmlns:mc="http://schemas.openxmlformats.org/markup-compatibility/2006" xmlns:wp14="http://schemas.microsoft.com/office/word/2010/wordprocessingDrawing" xmlns:w14="http://schemas.microsoft.com/office/word/2010/wordml" xmlns:w15="http://schemas.microsoft.com/office/word/2012/wordml" mc:Ignorable="w14 wp14 w15">
   <w:p>
     <w:pPr>
@@ -5792,7 +6040,7 @@
                 </pic:nvPicPr>
                 <pic:blipFill>
                   <a:blip r:embed="rId1"/>
-                  <a:srcRect l="-46" t="-185" r="-46" b="-185"/>
+                  <a:srcRect l="-51" t="-204" r="-51" b="-204"/>
                   <a:stretch>
                     <a:fillRect/>
                   </a:stretch>
@@ -5832,6 +6080,7 @@
         </w:tabs>
         <w:ind w:start="432" w:hanging="144"/>
       </w:pPr>
+      <w:rPr/>
     </w:lvl>
     <w:lvl w:ilvl="1">
       <w:start w:val="1"/>
@@ -5845,6 +6094,7 @@
         </w:tabs>
         <w:ind w:start="576" w:hanging="288"/>
       </w:pPr>
+      <w:rPr/>
     </w:lvl>
     <w:lvl w:ilvl="2">
       <w:start w:val="1"/>
@@ -5858,6 +6108,7 @@
         </w:tabs>
         <w:ind w:start="720" w:hanging="432"/>
       </w:pPr>
+      <w:rPr/>
     </w:lvl>
     <w:lvl w:ilvl="3">
       <w:start w:val="1"/>
@@ -5871,6 +6122,7 @@
         </w:tabs>
         <w:ind w:start="864" w:hanging="576"/>
       </w:pPr>
+      <w:rPr/>
     </w:lvl>
     <w:lvl w:ilvl="4">
       <w:start w:val="1"/>
@@ -5884,6 +6136,7 @@
         </w:tabs>
         <w:ind w:start="1008" w:hanging="720"/>
       </w:pPr>
+      <w:rPr/>
     </w:lvl>
     <w:lvl w:ilvl="5">
       <w:start w:val="1"/>
@@ -5897,6 +6150,7 @@
         </w:tabs>
         <w:ind w:start="1152" w:hanging="864"/>
       </w:pPr>
+      <w:rPr/>
     </w:lvl>
     <w:lvl w:ilvl="6">
       <w:start w:val="1"/>
@@ -5910,6 +6164,7 @@
         </w:tabs>
         <w:ind w:start="1296" w:hanging="1008"/>
       </w:pPr>
+      <w:rPr/>
     </w:lvl>
     <w:lvl w:ilvl="7">
       <w:start w:val="1"/>
@@ -5923,6 +6178,7 @@
         </w:tabs>
         <w:ind w:start="1440" w:hanging="1152"/>
       </w:pPr>
+      <w:rPr/>
     </w:lvl>
     <w:lvl w:ilvl="8">
       <w:start w:val="1"/>
@@ -5936,6 +6192,7 @@
         </w:tabs>
         <w:ind w:start="1584" w:hanging="1296"/>
       </w:pPr>
+      <w:rPr/>
     </w:lvl>
   </w:abstractNum>
   <w:abstractNum w:abstractNumId="2">
@@ -5954,6 +6211,102 @@
         <w:rFonts w:ascii="Symbol" w:hAnsi="Symbol" w:cs="Symbol" w:hint="default"/>
       </w:rPr>
     </w:lvl>
+    <w:lvl w:ilvl="1">
+      <w:start w:val="1"/>
+      <w:numFmt w:val="decimal"/>
+      <w:lvlText w:val="%2."/>
+      <w:lvlJc w:val="start"/>
+      <w:pPr>
+        <w:tabs>
+          <w:tab w:val="num" w:pos="1080"/>
+        </w:tabs>
+        <w:ind w:start="1080" w:hanging="360"/>
+      </w:pPr>
+    </w:lvl>
+    <w:lvl w:ilvl="2">
+      <w:start w:val="1"/>
+      <w:numFmt w:val="decimal"/>
+      <w:lvlText w:val="%3."/>
+      <w:lvlJc w:val="start"/>
+      <w:pPr>
+        <w:tabs>
+          <w:tab w:val="num" w:pos="1440"/>
+        </w:tabs>
+        <w:ind w:start="1440" w:hanging="360"/>
+      </w:pPr>
+    </w:lvl>
+    <w:lvl w:ilvl="3">
+      <w:start w:val="1"/>
+      <w:numFmt w:val="decimal"/>
+      <w:lvlText w:val="%4."/>
+      <w:lvlJc w:val="start"/>
+      <w:pPr>
+        <w:tabs>
+          <w:tab w:val="num" w:pos="1800"/>
+        </w:tabs>
+        <w:ind w:start="1800" w:hanging="360"/>
+      </w:pPr>
+    </w:lvl>
+    <w:lvl w:ilvl="4">
+      <w:start w:val="1"/>
+      <w:numFmt w:val="decimal"/>
+      <w:lvlText w:val="%5."/>
+      <w:lvlJc w:val="start"/>
+      <w:pPr>
+        <w:tabs>
+          <w:tab w:val="num" w:pos="2160"/>
+        </w:tabs>
+        <w:ind w:start="2160" w:hanging="360"/>
+      </w:pPr>
+    </w:lvl>
+    <w:lvl w:ilvl="5">
+      <w:start w:val="1"/>
+      <w:numFmt w:val="decimal"/>
+      <w:lvlText w:val="%6."/>
+      <w:lvlJc w:val="start"/>
+      <w:pPr>
+        <w:tabs>
+          <w:tab w:val="num" w:pos="2520"/>
+        </w:tabs>
+        <w:ind w:start="2520" w:hanging="360"/>
+      </w:pPr>
+    </w:lvl>
+    <w:lvl w:ilvl="6">
+      <w:start w:val="1"/>
+      <w:numFmt w:val="decimal"/>
+      <w:lvlText w:val="%7."/>
+      <w:lvlJc w:val="start"/>
+      <w:pPr>
+        <w:tabs>
+          <w:tab w:val="num" w:pos="2880"/>
+        </w:tabs>
+        <w:ind w:start="2880" w:hanging="360"/>
+      </w:pPr>
+    </w:lvl>
+    <w:lvl w:ilvl="7">
+      <w:start w:val="1"/>
+      <w:numFmt w:val="decimal"/>
+      <w:lvlText w:val="%8."/>
+      <w:lvlJc w:val="start"/>
+      <w:pPr>
+        <w:tabs>
+          <w:tab w:val="num" w:pos="3240"/>
+        </w:tabs>
+        <w:ind w:start="3240" w:hanging="360"/>
+      </w:pPr>
+    </w:lvl>
+    <w:lvl w:ilvl="8">
+      <w:start w:val="1"/>
+      <w:numFmt w:val="decimal"/>
+      <w:lvlText w:val="%9."/>
+      <w:lvlJc w:val="start"/>
+      <w:pPr>
+        <w:tabs>
+          <w:tab w:val="num" w:pos="3600"/>
+        </w:tabs>
+        <w:ind w:start="3600" w:hanging="360"/>
+      </w:pPr>
+    </w:lvl>
   </w:abstractNum>
   <w:abstractNum w:abstractNumId="3">
     <w:lvl w:ilvl="0">
@@ -5970,6 +6323,102 @@
       <w:rPr>
         <w:rFonts w:ascii="Symbol" w:hAnsi="Symbol" w:cs="Symbol" w:hint="default"/>
       </w:rPr>
+    </w:lvl>
+    <w:lvl w:ilvl="1">
+      <w:start w:val="1"/>
+      <w:numFmt w:val="decimal"/>
+      <w:lvlText w:val="%2."/>
+      <w:lvlJc w:val="start"/>
+      <w:pPr>
+        <w:tabs>
+          <w:tab w:val="num" w:pos="1080"/>
+        </w:tabs>
+        <w:ind w:start="1080" w:hanging="360"/>
+      </w:pPr>
+    </w:lvl>
+    <w:lvl w:ilvl="2">
+      <w:start w:val="1"/>
+      <w:numFmt w:val="decimal"/>
+      <w:lvlText w:val="%3."/>
+      <w:lvlJc w:val="start"/>
+      <w:pPr>
+        <w:tabs>
+          <w:tab w:val="num" w:pos="1440"/>
+        </w:tabs>
+        <w:ind w:start="1440" w:hanging="360"/>
+      </w:pPr>
+    </w:lvl>
+    <w:lvl w:ilvl="3">
+      <w:start w:val="1"/>
+      <w:numFmt w:val="decimal"/>
+      <w:lvlText w:val="%4."/>
+      <w:lvlJc w:val="start"/>
+      <w:pPr>
+        <w:tabs>
+          <w:tab w:val="num" w:pos="1800"/>
+        </w:tabs>
+        <w:ind w:start="1800" w:hanging="360"/>
+      </w:pPr>
+    </w:lvl>
+    <w:lvl w:ilvl="4">
+      <w:start w:val="1"/>
+      <w:numFmt w:val="decimal"/>
+      <w:lvlText w:val="%5."/>
+      <w:lvlJc w:val="start"/>
+      <w:pPr>
+        <w:tabs>
+          <w:tab w:val="num" w:pos="2160"/>
+        </w:tabs>
+        <w:ind w:start="2160" w:hanging="360"/>
+      </w:pPr>
+    </w:lvl>
+    <w:lvl w:ilvl="5">
+      <w:start w:val="1"/>
+      <w:numFmt w:val="decimal"/>
+      <w:lvlText w:val="%6."/>
+      <w:lvlJc w:val="start"/>
+      <w:pPr>
+        <w:tabs>
+          <w:tab w:val="num" w:pos="2520"/>
+        </w:tabs>
+        <w:ind w:start="2520" w:hanging="360"/>
+      </w:pPr>
+    </w:lvl>
+    <w:lvl w:ilvl="6">
+      <w:start w:val="1"/>
+      <w:numFmt w:val="decimal"/>
+      <w:lvlText w:val="%7."/>
+      <w:lvlJc w:val="start"/>
+      <w:pPr>
+        <w:tabs>
+          <w:tab w:val="num" w:pos="2880"/>
+        </w:tabs>
+        <w:ind w:start="2880" w:hanging="360"/>
+      </w:pPr>
+    </w:lvl>
+    <w:lvl w:ilvl="7">
+      <w:start w:val="1"/>
+      <w:numFmt w:val="decimal"/>
+      <w:lvlText w:val="%8."/>
+      <w:lvlJc w:val="start"/>
+      <w:pPr>
+        <w:tabs>
+          <w:tab w:val="num" w:pos="3240"/>
+        </w:tabs>
+        <w:ind w:start="3240" w:hanging="360"/>
+      </w:pPr>
+    </w:lvl>
+    <w:lvl w:ilvl="8">
+      <w:start w:val="1"/>
+      <w:numFmt w:val="decimal"/>
+      <w:lvlText w:val="%9."/>
+      <w:lvlJc w:val="start"/>
+      <w:pPr>
+        <w:tabs>
+          <w:tab w:val="num" w:pos="3600"/>
+        </w:tabs>
+        <w:ind w:start="3600" w:hanging="360"/>
+      </w:pPr>
     </w:lvl>
   </w:abstractNum>
   <w:abstractNum w:abstractNumId="4">
@@ -5985,6 +6434,7 @@
         </w:tabs>
         <w:ind w:start="357" w:hanging="68"/>
       </w:pPr>
+      <w:rPr/>
     </w:lvl>
     <w:lvl w:ilvl="1">
       <w:start w:val="1"/>
@@ -5997,6 +6447,7 @@
         </w:tabs>
         <w:ind w:start="1304" w:hanging="453"/>
       </w:pPr>
+      <w:rPr/>
     </w:lvl>
     <w:lvl w:ilvl="2">
       <w:start w:val="1"/>
@@ -6009,6 +6460,7 @@
         </w:tabs>
         <w:ind w:start="2211" w:hanging="1077"/>
       </w:pPr>
+      <w:rPr/>
     </w:lvl>
     <w:lvl w:ilvl="3">
       <w:start w:val="1"/>
@@ -6021,6 +6473,7 @@
         </w:tabs>
         <w:ind w:start="3345" w:hanging="1134"/>
       </w:pPr>
+      <w:rPr/>
     </w:lvl>
     <w:lvl w:ilvl="4">
       <w:start w:val="1"/>
@@ -6033,6 +6486,7 @@
         </w:tabs>
         <w:ind w:start="2234" w:hanging="816"/>
       </w:pPr>
+      <w:rPr/>
     </w:lvl>
     <w:lvl w:ilvl="5">
       <w:start w:val="1"/>
@@ -6045,6 +6499,7 @@
         </w:tabs>
         <w:ind w:start="2738" w:hanging="941"/>
       </w:pPr>
+      <w:rPr/>
     </w:lvl>
     <w:lvl w:ilvl="6">
       <w:start w:val="1"/>
@@ -6057,6 +6512,7 @@
         </w:tabs>
         <w:ind w:start="3237" w:hanging="1077"/>
       </w:pPr>
+      <w:rPr/>
     </w:lvl>
     <w:lvl w:ilvl="7">
       <w:start w:val="1"/>
@@ -6069,6 +6525,7 @@
         </w:tabs>
         <w:ind w:start="3742" w:hanging="1225"/>
       </w:pPr>
+      <w:rPr/>
     </w:lvl>
     <w:lvl w:ilvl="8">
       <w:start w:val="1"/>
@@ -6081,6 +6538,7 @@
         </w:tabs>
         <w:ind w:start="4320" w:hanging="1440"/>
       </w:pPr>
+      <w:rPr/>
     </w:lvl>
   </w:abstractNum>
   <w:abstractNum w:abstractNumId="5">
@@ -6099,6 +6557,102 @@
         <w:rFonts w:ascii="Symbol" w:hAnsi="Symbol" w:cs="Symbol" w:hint="default"/>
         <w:color w:val="000000"/>
       </w:rPr>
+    </w:lvl>
+    <w:lvl w:ilvl="1">
+      <w:start w:val="1"/>
+      <w:numFmt w:val="decimal"/>
+      <w:lvlText w:val="%2."/>
+      <w:lvlJc w:val="start"/>
+      <w:pPr>
+        <w:tabs>
+          <w:tab w:val="num" w:pos="1080"/>
+        </w:tabs>
+        <w:ind w:start="1080" w:hanging="360"/>
+      </w:pPr>
+    </w:lvl>
+    <w:lvl w:ilvl="2">
+      <w:start w:val="1"/>
+      <w:numFmt w:val="decimal"/>
+      <w:lvlText w:val="%3."/>
+      <w:lvlJc w:val="start"/>
+      <w:pPr>
+        <w:tabs>
+          <w:tab w:val="num" w:pos="1440"/>
+        </w:tabs>
+        <w:ind w:start="1440" w:hanging="360"/>
+      </w:pPr>
+    </w:lvl>
+    <w:lvl w:ilvl="3">
+      <w:start w:val="1"/>
+      <w:numFmt w:val="decimal"/>
+      <w:lvlText w:val="%4."/>
+      <w:lvlJc w:val="start"/>
+      <w:pPr>
+        <w:tabs>
+          <w:tab w:val="num" w:pos="1800"/>
+        </w:tabs>
+        <w:ind w:start="1800" w:hanging="360"/>
+      </w:pPr>
+    </w:lvl>
+    <w:lvl w:ilvl="4">
+      <w:start w:val="1"/>
+      <w:numFmt w:val="decimal"/>
+      <w:lvlText w:val="%5."/>
+      <w:lvlJc w:val="start"/>
+      <w:pPr>
+        <w:tabs>
+          <w:tab w:val="num" w:pos="2160"/>
+        </w:tabs>
+        <w:ind w:start="2160" w:hanging="360"/>
+      </w:pPr>
+    </w:lvl>
+    <w:lvl w:ilvl="5">
+      <w:start w:val="1"/>
+      <w:numFmt w:val="decimal"/>
+      <w:lvlText w:val="%6."/>
+      <w:lvlJc w:val="start"/>
+      <w:pPr>
+        <w:tabs>
+          <w:tab w:val="num" w:pos="2520"/>
+        </w:tabs>
+        <w:ind w:start="2520" w:hanging="360"/>
+      </w:pPr>
+    </w:lvl>
+    <w:lvl w:ilvl="6">
+      <w:start w:val="1"/>
+      <w:numFmt w:val="decimal"/>
+      <w:lvlText w:val="%7."/>
+      <w:lvlJc w:val="start"/>
+      <w:pPr>
+        <w:tabs>
+          <w:tab w:val="num" w:pos="2880"/>
+        </w:tabs>
+        <w:ind w:start="2880" w:hanging="360"/>
+      </w:pPr>
+    </w:lvl>
+    <w:lvl w:ilvl="7">
+      <w:start w:val="1"/>
+      <w:numFmt w:val="decimal"/>
+      <w:lvlText w:val="%8."/>
+      <w:lvlJc w:val="start"/>
+      <w:pPr>
+        <w:tabs>
+          <w:tab w:val="num" w:pos="3240"/>
+        </w:tabs>
+        <w:ind w:start="3240" w:hanging="360"/>
+      </w:pPr>
+    </w:lvl>
+    <w:lvl w:ilvl="8">
+      <w:start w:val="1"/>
+      <w:numFmt w:val="decimal"/>
+      <w:lvlText w:val="%9."/>
+      <w:lvlJc w:val="start"/>
+      <w:pPr>
+        <w:tabs>
+          <w:tab w:val="num" w:pos="3600"/>
+        </w:tabs>
+        <w:ind w:start="3600" w:hanging="360"/>
+      </w:pPr>
     </w:lvl>
   </w:abstractNum>
   <w:abstractNum w:abstractNumId="6">
@@ -6128,6 +6682,7 @@
         </w:tabs>
         <w:ind w:start="1080" w:hanging="360"/>
       </w:pPr>
+      <w:rPr/>
     </w:lvl>
     <w:lvl w:ilvl="2">
       <w:start w:val="1"/>
@@ -6140,6 +6695,7 @@
         </w:tabs>
         <w:ind w:start="1440" w:hanging="360"/>
       </w:pPr>
+      <w:rPr/>
     </w:lvl>
     <w:lvl w:ilvl="3">
       <w:start w:val="1"/>
@@ -6152,6 +6708,7 @@
         </w:tabs>
         <w:ind w:start="1800" w:hanging="360"/>
       </w:pPr>
+      <w:rPr/>
     </w:lvl>
     <w:lvl w:ilvl="4">
       <w:start w:val="1"/>
@@ -6164,6 +6721,7 @@
         </w:tabs>
         <w:ind w:start="2160" w:hanging="360"/>
       </w:pPr>
+      <w:rPr/>
     </w:lvl>
     <w:lvl w:ilvl="5">
       <w:start w:val="1"/>
@@ -6176,6 +6734,7 @@
         </w:tabs>
         <w:ind w:start="2520" w:hanging="360"/>
       </w:pPr>
+      <w:rPr/>
     </w:lvl>
     <w:lvl w:ilvl="6">
       <w:start w:val="1"/>
@@ -6188,6 +6747,7 @@
         </w:tabs>
         <w:ind w:start="2880" w:hanging="360"/>
       </w:pPr>
+      <w:rPr/>
     </w:lvl>
     <w:lvl w:ilvl="7">
       <w:start w:val="1"/>
@@ -6200,6 +6760,7 @@
         </w:tabs>
         <w:ind w:start="3240" w:hanging="360"/>
       </w:pPr>
+      <w:rPr/>
     </w:lvl>
     <w:lvl w:ilvl="8">
       <w:start w:val="1"/>
@@ -6212,6 +6773,7 @@
         </w:tabs>
         <w:ind w:start="3600" w:hanging="360"/>
       </w:pPr>
+      <w:rPr/>
     </w:lvl>
   </w:abstractNum>
   <w:num w:numId="1">
@@ -6261,10 +6823,12 @@
       <w:bidi w:val="0"/>
       <w:spacing w:before="160" w:after="0"/>
       <w:ind w:hanging="0" w:start="284" w:end="284"/>
+      <w:jc w:val="start"/>
     </w:pPr>
     <w:rPr>
       <w:rFonts w:ascii="Times New Roman" w:hAnsi="Times New Roman" w:eastAsia="Times New Roman" w:cs="Arial"/>
       <w:color w:val="auto"/>
+      <w:kern w:val="0"/>
       <w:sz w:val="24"/>
       <w:szCs w:val="20"/>
       <w:lang w:val="en-US" w:eastAsia="zh-CN" w:bidi="ar-SA"/>
@@ -6283,6 +6847,7 @@
       <w:suppressAutoHyphens w:val="true"/>
       <w:bidi w:val="0"/>
       <w:spacing w:before="360" w:after="120"/>
+      <w:jc w:val="start"/>
       <w:outlineLvl w:val="0"/>
     </w:pPr>
     <w:rPr>
@@ -6291,6 +6856,7 @@
       <w:bCs/>
       <w:smallCaps/>
       <w:color w:val="auto"/>
+      <w:kern w:val="0"/>
       <w:sz w:val="36"/>
       <w:szCs w:val="36"/>
       <w:lang w:val="en-US" w:eastAsia="zh-CN" w:bidi="ar-SA"/>
@@ -6824,7 +7390,7 @@
     <w:qFormat/>
     <w:pPr>
       <w:tabs>
-        <w:tab w:val="clear" w:pos="720"/>
+        <w:tab w:val="clear" w:pos="709"/>
         <w:tab w:val="left" w:pos="1021" w:leader="none"/>
       </w:tabs>
       <w:spacing w:before="160" w:after="180"/>
@@ -6859,7 +7425,7 @@
     <w:pPr>
       <w:suppressLineNumbers/>
       <w:tabs>
-        <w:tab w:val="clear" w:pos="720"/>
+        <w:tab w:val="clear" w:pos="709"/>
         <w:tab w:val="center" w:pos="4986" w:leader="none"/>
         <w:tab w:val="right" w:pos="9972" w:leader="none"/>
       </w:tabs>
@@ -6875,10 +7441,13 @@
       </w:pBdr>
       <w:suppressAutoHyphens w:val="true"/>
       <w:bidi w:val="0"/>
+      <w:spacing w:before="0" w:after="0"/>
+      <w:jc w:val="start"/>
     </w:pPr>
     <w:rPr>
       <w:rFonts w:ascii="Times New Roman" w:hAnsi="Times New Roman" w:eastAsia="Times New Roman" w:cs="Times New Roman"/>
       <w:color w:val="auto"/>
+      <w:kern w:val="0"/>
       <w:sz w:val="24"/>
       <w:szCs w:val="20"/>
       <w:lang w:val="en-US" w:eastAsia="en-US" w:bidi="ar-SA"/>
@@ -6896,10 +7465,13 @@
       </w:pBdr>
       <w:suppressAutoHyphens w:val="true"/>
       <w:bidi w:val="0"/>
+      <w:spacing w:before="0" w:after="0"/>
+      <w:jc w:val="start"/>
     </w:pPr>
     <w:rPr>
       <w:rFonts w:ascii="Times New Roman" w:hAnsi="Times New Roman" w:eastAsia="Times New Roman" w:cs="Times New Roman"/>
       <w:color w:val="auto"/>
+      <w:kern w:val="0"/>
       <w:sz w:val="24"/>
       <w:szCs w:val="20"/>
       <w:lang w:val="en-US" w:eastAsia="en-US" w:bidi="ar-SA"/>
@@ -6915,10 +7487,13 @@
       </w:pBdr>
       <w:suppressAutoHyphens w:val="true"/>
       <w:bidi w:val="0"/>
+      <w:spacing w:before="0" w:after="0"/>
+      <w:jc w:val="start"/>
     </w:pPr>
     <w:rPr>
       <w:rFonts w:ascii="Times New Roman" w:hAnsi="Times New Roman" w:eastAsia="Times New Roman" w:cs="Times New Roman"/>
       <w:color w:val="auto"/>
+      <w:kern w:val="0"/>
       <w:sz w:val="24"/>
       <w:szCs w:val="20"/>
       <w:lang w:val="en-US" w:eastAsia="en-US" w:bidi="ar-SA"/>
@@ -7071,10 +7646,12 @@
       <w:suppressAutoHyphens w:val="true"/>
       <w:bidi w:val="0"/>
       <w:spacing w:before="40" w:after="40"/>
+      <w:jc w:val="start"/>
     </w:pPr>
     <w:rPr>
       <w:rFonts w:ascii="Arial" w:hAnsi="Arial" w:eastAsia="Times New Roman" w:cs="Arial"/>
       <w:color w:val="auto"/>
+      <w:kern w:val="0"/>
       <w:sz w:val="20"/>
       <w:szCs w:val="20"/>
       <w:lang w:val="en-US" w:eastAsia="en-US" w:bidi="ar-SA"/>
@@ -7132,8 +7709,7 @@
         <w:ilvl w:val="0"/>
         <w:numId w:val="6"/>
       </w:numPr>
-      <w:overflowPunct w:val="false"/>
-      <w:autoSpaceDE w:val="false"/>
+      <w:overflowPunct w:val="true"/>
       <w:spacing w:before="0" w:after="120"/>
       <w:ind w:hanging="360" w:start="0" w:end="360"/>
       <w:jc w:val="both"/>
@@ -7162,6 +7738,12 @@
       <w:szCs w:val="22"/>
       <w:lang w:bidi="he-IL"/>
     </w:rPr>
+  </w:style>
+  <w:style w:type="paragraph" w:styleId="IndexHeading">
+    <w:name w:val="index heading"/>
+    <w:basedOn w:val="Heading"/>
+    <w:pPr/>
+    <w:rPr/>
   </w:style>
   <w:style w:type="paragraph" w:styleId="TOCHeading">
     <w:name w:val="TOC Heading"/>
@@ -7252,6 +7834,49 @@
     <w:pPr>
       <w:jc w:val="both"/>
     </w:pPr>
+    <w:rPr/>
+  </w:style>
+  <w:style w:type="paragraph" w:styleId="TOC4">
+    <w:name w:val="toc 4"/>
+    <w:basedOn w:val="Index"/>
+    <w:pPr/>
+    <w:rPr/>
+  </w:style>
+  <w:style w:type="paragraph" w:styleId="TOC5">
+    <w:name w:val="toc 5"/>
+    <w:basedOn w:val="Index"/>
+    <w:pPr/>
+    <w:rPr/>
+  </w:style>
+  <w:style w:type="paragraph" w:styleId="TOC6">
+    <w:name w:val="toc 6"/>
+    <w:basedOn w:val="Index"/>
+    <w:pPr/>
+    <w:rPr/>
+  </w:style>
+  <w:style w:type="paragraph" w:styleId="TOC7">
+    <w:name w:val="toc 7"/>
+    <w:basedOn w:val="Index"/>
+    <w:pPr/>
+    <w:rPr/>
+  </w:style>
+  <w:style w:type="paragraph" w:styleId="TOC8">
+    <w:name w:val="toc 8"/>
+    <w:basedOn w:val="Index"/>
+    <w:pPr/>
+    <w:rPr/>
+  </w:style>
+  <w:style w:type="paragraph" w:styleId="TOC9">
+    <w:name w:val="toc 9"/>
+    <w:basedOn w:val="Index"/>
+    <w:pPr/>
+    <w:rPr/>
+  </w:style>
+  <w:style w:type="paragraph" w:styleId="FrameContents">
+    <w:name w:val="Frame Contents"/>
+    <w:basedOn w:val="Normal"/>
+    <w:qFormat/>
+    <w:pPr/>
     <w:rPr/>
   </w:style>
   <w:style w:type="numbering" w:styleId="WW8Num1">

</xml_diff>

<commit_message>
added database diagram to the project document
</commit_message>
<xml_diff>
--- a/project docs/Cyber_Proj_Shlomi_Levi.docx
+++ b/project docs/Cyber_Proj_Shlomi_Levi.docx
@@ -300,8 +300,8 @@
       <w:tblGrid>
         <w:gridCol w:w="2519"/>
         <w:gridCol w:w="1490"/>
-        <w:gridCol w:w="4395"/>
-        <w:gridCol w:w="1594"/>
+        <w:gridCol w:w="4396"/>
+        <w:gridCol w:w="1593"/>
       </w:tblGrid>
       <w:tr>
         <w:trPr>
@@ -415,7 +415,7 @@
         </w:tc>
         <w:tc>
           <w:tcPr>
-            <w:tcW w:w="4395" w:type="dxa"/>
+            <w:tcW w:w="4396" w:type="dxa"/>
             <w:tcBorders>
               <w:top w:val="single" w:sz="8" w:space="0" w:color="000000"/>
               <w:start w:val="single" w:sz="8" w:space="0" w:color="000000"/>
@@ -448,7 +448,7 @@
         </w:tc>
         <w:tc>
           <w:tcPr>
-            <w:tcW w:w="1594" w:type="dxa"/>
+            <w:tcW w:w="1593" w:type="dxa"/>
             <w:tcBorders>
               <w:top w:val="single" w:sz="8" w:space="0" w:color="000000"/>
               <w:start w:val="single" w:sz="8" w:space="0" w:color="000000"/>
@@ -500,7 +500,7 @@
         </w:trPr>
         <w:tc>
           <w:tcPr>
-            <w:tcW w:w="8404" w:type="dxa"/>
+            <w:tcW w:w="8405" w:type="dxa"/>
             <w:gridSpan w:val="3"/>
             <w:tcBorders>
               <w:top w:val="single" w:sz="8" w:space="0" w:color="000000"/>
@@ -533,7 +533,7 @@
         </w:tc>
         <w:tc>
           <w:tcPr>
-            <w:tcW w:w="1594" w:type="dxa"/>
+            <w:tcW w:w="1593" w:type="dxa"/>
             <w:tcBorders>
               <w:top w:val="single" w:sz="8" w:space="0" w:color="000000"/>
               <w:start w:val="single" w:sz="8" w:space="0" w:color="000000"/>
@@ -652,7 +652,7 @@
         </w:tc>
         <w:tc>
           <w:tcPr>
-            <w:tcW w:w="4395" w:type="dxa"/>
+            <w:tcW w:w="4396" w:type="dxa"/>
             <w:tcBorders>
               <w:top w:val="single" w:sz="8" w:space="0" w:color="000000"/>
               <w:start w:val="single" w:sz="8" w:space="0" w:color="000000"/>
@@ -686,7 +686,7 @@
         </w:tc>
         <w:tc>
           <w:tcPr>
-            <w:tcW w:w="1594" w:type="dxa"/>
+            <w:tcW w:w="1593" w:type="dxa"/>
             <w:tcBorders>
               <w:top w:val="single" w:sz="8" w:space="0" w:color="000000"/>
               <w:start w:val="single" w:sz="8" w:space="0" w:color="000000"/>
@@ -794,9 +794,9 @@
         </w:tblCellMar>
       </w:tblPr>
       <w:tblGrid>
-        <w:gridCol w:w="1259"/>
+        <w:gridCol w:w="1258"/>
         <w:gridCol w:w="1008"/>
-        <w:gridCol w:w="7723"/>
+        <w:gridCol w:w="7724"/>
       </w:tblGrid>
       <w:tr>
         <w:trPr>
@@ -804,7 +804,7 @@
         </w:trPr>
         <w:tc>
           <w:tcPr>
-            <w:tcW w:w="1259" w:type="dxa"/>
+            <w:tcW w:w="1258" w:type="dxa"/>
             <w:tcBorders>
               <w:top w:val="single" w:sz="12" w:space="0" w:color="000000"/>
               <w:start w:val="single" w:sz="12" w:space="0" w:color="000000"/>
@@ -854,7 +854,7 @@
         </w:tc>
         <w:tc>
           <w:tcPr>
-            <w:tcW w:w="7723" w:type="dxa"/>
+            <w:tcW w:w="7724" w:type="dxa"/>
             <w:tcBorders>
               <w:top w:val="single" w:sz="12" w:space="0" w:color="000000"/>
               <w:start w:val="single" w:sz="6" w:space="0" w:color="000000"/>
@@ -883,7 +883,7 @@
         </w:trPr>
         <w:tc>
           <w:tcPr>
-            <w:tcW w:w="1259" w:type="dxa"/>
+            <w:tcW w:w="1258" w:type="dxa"/>
             <w:tcBorders>
               <w:start w:val="single" w:sz="12" w:space="0" w:color="000000"/>
               <w:bottom w:val="single" w:sz="6" w:space="0" w:color="000000"/>
@@ -939,7 +939,7 @@
         </w:tc>
         <w:tc>
           <w:tcPr>
-            <w:tcW w:w="7723" w:type="dxa"/>
+            <w:tcW w:w="7724" w:type="dxa"/>
             <w:tcBorders>
               <w:start w:val="single" w:sz="6" w:space="0" w:color="000000"/>
               <w:bottom w:val="single" w:sz="6" w:space="0" w:color="000000"/>
@@ -971,7 +971,7 @@
         </w:trPr>
         <w:tc>
           <w:tcPr>
-            <w:tcW w:w="1259" w:type="dxa"/>
+            <w:tcW w:w="1258" w:type="dxa"/>
             <w:tcBorders>
               <w:top w:val="single" w:sz="6" w:space="0" w:color="000000"/>
               <w:start w:val="single" w:sz="12" w:space="0" w:color="000000"/>
@@ -1027,7 +1027,7 @@
         </w:tc>
         <w:tc>
           <w:tcPr>
-            <w:tcW w:w="7723" w:type="dxa"/>
+            <w:tcW w:w="7724" w:type="dxa"/>
             <w:tcBorders>
               <w:top w:val="single" w:sz="6" w:space="0" w:color="000000"/>
               <w:start w:val="single" w:sz="6" w:space="0" w:color="000000"/>
@@ -1062,7 +1062,7 @@
         </w:trPr>
         <w:tc>
           <w:tcPr>
-            <w:tcW w:w="1259" w:type="dxa"/>
+            <w:tcW w:w="1258" w:type="dxa"/>
             <w:tcBorders>
               <w:top w:val="single" w:sz="6" w:space="0" w:color="000000"/>
               <w:start w:val="single" w:sz="12" w:space="0" w:color="000000"/>
@@ -1122,7 +1122,7 @@
         </w:tc>
         <w:tc>
           <w:tcPr>
-            <w:tcW w:w="7723" w:type="dxa"/>
+            <w:tcW w:w="7724" w:type="dxa"/>
             <w:tcBorders>
               <w:top w:val="single" w:sz="6" w:space="0" w:color="000000"/>
               <w:start w:val="single" w:sz="6" w:space="0" w:color="000000"/>
@@ -1157,7 +1157,7 @@
         </w:trPr>
         <w:tc>
           <w:tcPr>
-            <w:tcW w:w="1259" w:type="dxa"/>
+            <w:tcW w:w="1258" w:type="dxa"/>
             <w:tcBorders>
               <w:top w:val="single" w:sz="6" w:space="0" w:color="000000"/>
               <w:start w:val="single" w:sz="12" w:space="0" w:color="000000"/>
@@ -1217,7 +1217,7 @@
         </w:tc>
         <w:tc>
           <w:tcPr>
-            <w:tcW w:w="7723" w:type="dxa"/>
+            <w:tcW w:w="7724" w:type="dxa"/>
             <w:tcBorders>
               <w:top w:val="single" w:sz="6" w:space="0" w:color="000000"/>
               <w:start w:val="single" w:sz="6" w:space="0" w:color="000000"/>
@@ -1252,7 +1252,7 @@
         </w:trPr>
         <w:tc>
           <w:tcPr>
-            <w:tcW w:w="1259" w:type="dxa"/>
+            <w:tcW w:w="1258" w:type="dxa"/>
             <w:tcBorders>
               <w:top w:val="single" w:sz="6" w:space="0" w:color="000000"/>
               <w:start w:val="single" w:sz="12" w:space="0" w:color="000000"/>
@@ -1312,7 +1312,7 @@
         </w:tc>
         <w:tc>
           <w:tcPr>
-            <w:tcW w:w="7723" w:type="dxa"/>
+            <w:tcW w:w="7724" w:type="dxa"/>
             <w:tcBorders>
               <w:top w:val="single" w:sz="6" w:space="0" w:color="000000"/>
               <w:start w:val="single" w:sz="6" w:space="0" w:color="000000"/>
@@ -1347,7 +1347,7 @@
         </w:trPr>
         <w:tc>
           <w:tcPr>
-            <w:tcW w:w="1259" w:type="dxa"/>
+            <w:tcW w:w="1258" w:type="dxa"/>
             <w:tcBorders>
               <w:top w:val="single" w:sz="6" w:space="0" w:color="000000"/>
               <w:start w:val="single" w:sz="12" w:space="0" w:color="000000"/>
@@ -1407,7 +1407,7 @@
         </w:tc>
         <w:tc>
           <w:tcPr>
-            <w:tcW w:w="7723" w:type="dxa"/>
+            <w:tcW w:w="7724" w:type="dxa"/>
             <w:tcBorders>
               <w:top w:val="single" w:sz="6" w:space="0" w:color="000000"/>
               <w:start w:val="single" w:sz="6" w:space="0" w:color="000000"/>
@@ -1534,6 +1534,7 @@
             <w:rPr>
               <w:webHidden/>
               <w:rStyle w:val="IndexLink"/>
+              <w:vanish w:val="false"/>
               <w:lang w:val="en-US" w:eastAsia="en-US"/>
             </w:rPr>
             <w:instrText xml:space="preserve"> TOC \z \o "1-3" \u \h</w:instrText>
@@ -1542,6 +1543,7 @@
             <w:rPr>
               <w:webHidden/>
               <w:rStyle w:val="IndexLink"/>
+              <w:vanish w:val="false"/>
               <w:lang w:val="en-US" w:eastAsia="en-US"/>
             </w:rPr>
             <w:fldChar w:fldCharType="separate"/>
@@ -1551,6 +1553,7 @@
               <w:rPr>
                 <w:webHidden/>
                 <w:rStyle w:val="IndexLink"/>
+                <w:vanish w:val="false"/>
                 <w:lang w:val="en-US" w:eastAsia="en-US"/>
               </w:rPr>
               <w:t>1.</w:t>
@@ -1591,6 +1594,7 @@
               <w:rPr>
                 <w:webHidden/>
                 <w:rStyle w:val="IndexLink"/>
+                <w:vanish w:val="false"/>
                 <w:lang w:val="en-US" w:eastAsia="en-US"/>
               </w:rPr>
               <w:t>1.1</w:t>
@@ -1631,6 +1635,7 @@
               <w:rPr>
                 <w:webHidden/>
                 <w:rStyle w:val="IndexLink"/>
+                <w:vanish w:val="false"/>
                 <w:lang w:val="en-US" w:eastAsia="en-US"/>
               </w:rPr>
               <w:t>1.2</w:t>
@@ -1671,6 +1676,7 @@
               <w:rPr>
                 <w:webHidden/>
                 <w:rStyle w:val="IndexLink"/>
+                <w:vanish w:val="false"/>
                 <w:lang w:val="en-US" w:eastAsia="en-US"/>
               </w:rPr>
               <w:t>1.3</w:t>
@@ -1711,6 +1717,7 @@
               <w:rPr>
                 <w:webHidden/>
                 <w:rStyle w:val="IndexLink"/>
+                <w:vanish w:val="false"/>
                 <w:lang w:val="en-US" w:eastAsia="en-US"/>
               </w:rPr>
               <w:t>1.4</w:t>
@@ -1751,6 +1758,7 @@
               <w:rPr>
                 <w:webHidden/>
                 <w:rStyle w:val="IndexLink"/>
+                <w:vanish w:val="false"/>
                 <w:lang w:val="en-US" w:eastAsia="en-US"/>
               </w:rPr>
               <w:t>1.5</w:t>
@@ -1791,6 +1799,7 @@
               <w:rPr>
                 <w:webHidden/>
                 <w:rStyle w:val="IndexLink"/>
+                <w:vanish w:val="false"/>
                 <w:lang w:val="en-US" w:eastAsia="en-US"/>
               </w:rPr>
               <w:t>1.5.1</w:t>
@@ -1831,6 +1840,7 @@
               <w:rPr>
                 <w:webHidden/>
                 <w:rStyle w:val="IndexLink"/>
+                <w:vanish w:val="false"/>
                 <w:lang w:val="en-US" w:eastAsia="en-US"/>
               </w:rPr>
               <w:t>1.5.2</w:t>
@@ -1871,6 +1881,7 @@
               <w:rPr>
                 <w:webHidden/>
                 <w:rStyle w:val="IndexLink"/>
+                <w:vanish w:val="false"/>
                 <w:lang w:val="en-US" w:eastAsia="en-US"/>
               </w:rPr>
               <w:t>1.5.3</w:t>
@@ -1911,6 +1922,7 @@
               <w:rPr>
                 <w:webHidden/>
                 <w:rStyle w:val="IndexLink"/>
+                <w:vanish w:val="false"/>
                 <w:lang w:val="en-US" w:eastAsia="en-US"/>
               </w:rPr>
               <w:t>1.5.4</w:t>
@@ -1951,6 +1963,7 @@
               <w:rPr>
                 <w:webHidden/>
                 <w:rStyle w:val="IndexLink"/>
+                <w:vanish w:val="false"/>
                 <w:lang w:val="en-US" w:eastAsia="en-US"/>
               </w:rPr>
               <w:t>1.5.5</w:t>
@@ -1991,6 +2004,7 @@
               <w:rPr>
                 <w:webHidden/>
                 <w:rStyle w:val="IndexLink"/>
+                <w:vanish w:val="false"/>
                 <w:lang w:val="en-US" w:eastAsia="en-US"/>
               </w:rPr>
               <w:t>1.6</w:t>
@@ -2031,6 +2045,7 @@
               <w:rPr>
                 <w:webHidden/>
                 <w:rStyle w:val="IndexLink"/>
+                <w:vanish w:val="false"/>
                 <w:lang w:val="en-US" w:eastAsia="en-US"/>
               </w:rPr>
               <w:t>1.6.1</w:t>
@@ -2071,6 +2086,7 @@
               <w:rPr>
                 <w:webHidden/>
                 <w:rStyle w:val="IndexLink"/>
+                <w:vanish w:val="false"/>
                 <w:lang w:val="en-US" w:eastAsia="en-US"/>
               </w:rPr>
               <w:t>1.7</w:t>
@@ -2111,6 +2127,7 @@
               <w:rPr>
                 <w:webHidden/>
                 <w:rStyle w:val="IndexLink"/>
+                <w:vanish w:val="false"/>
                 <w:lang w:val="en-US" w:eastAsia="en-US"/>
               </w:rPr>
               <w:t>1.8</w:t>
@@ -2151,6 +2168,7 @@
               <w:rPr>
                 <w:webHidden/>
                 <w:rStyle w:val="IndexLink"/>
+                <w:vanish w:val="false"/>
                 <w:lang w:val="en-US" w:eastAsia="en-US"/>
               </w:rPr>
               <w:t>1.8.1</w:t>
@@ -2191,6 +2209,7 @@
               <w:rPr>
                 <w:webHidden/>
                 <w:rStyle w:val="IndexLink"/>
+                <w:vanish w:val="false"/>
                 <w:lang w:val="en-US" w:eastAsia="en-US"/>
               </w:rPr>
               <w:t>1.8.2</w:t>
@@ -2231,6 +2250,7 @@
               <w:rPr>
                 <w:webHidden/>
                 <w:rStyle w:val="IndexLink"/>
+                <w:vanish w:val="false"/>
                 <w:lang w:val="en-US" w:eastAsia="en-US"/>
               </w:rPr>
               <w:t>2.</w:t>
@@ -2408,9 +2428,6 @@
         <w:rPr/>
         <w:t>1.2</w:t>
         <w:tab/>
-      </w:r>
-      <w:r>
-        <w:rPr/>
         <w:t xml:space="preserve">Related software or hardware </w:t>
       </w:r>
     </w:p>
@@ -2460,9 +2477,6 @@
         <w:rPr/>
         <w:t>1.3</w:t>
         <w:tab/>
-      </w:r>
-      <w:r>
-        <w:rPr/>
         <w:t xml:space="preserve">End-user characteristics </w:t>
       </w:r>
     </w:p>
@@ -2502,9 +2516,6 @@
         <w:rPr/>
         <w:t>1.4</w:t>
         <w:tab/>
-      </w:r>
-      <w:r>
-        <w:rPr/>
         <w:t>General Constraints</w:t>
       </w:r>
     </w:p>
@@ -2853,9 +2864,6 @@
         <w:rPr/>
         <w:t>1.5</w:t>
         <w:tab/>
-      </w:r>
-      <w:r>
-        <w:rPr/>
         <w:t>System Architecture – Functionality</w:t>
       </w:r>
     </w:p>
@@ -2883,7 +2891,7 @@
           <w:lang w:eastAsia="en-US"/>
         </w:rPr>
         <w:drawing>
-          <wp:anchor behindDoc="0" distT="0" distB="0" distL="0" distR="0" simplePos="0" locked="0" layoutInCell="0" allowOverlap="1" relativeHeight="38">
+          <wp:anchor behindDoc="0" distT="0" distB="0" distL="0" distR="0" simplePos="0" locked="0" layoutInCell="0" allowOverlap="1" relativeHeight="37">
             <wp:simplePos x="0" y="0"/>
             <wp:positionH relativeFrom="column">
               <wp:posOffset>772795</wp:posOffset>
@@ -2963,9 +2971,6 @@
         <w:rPr/>
         <w:t>1.5.1</w:t>
         <w:tab/>
-      </w:r>
-      <w:r>
-        <w:rPr/>
         <w:t>Subsystem Architecture</w:t>
       </w:r>
     </w:p>
@@ -3002,7 +3007,7 @@
       <w:r>
         <w:rPr/>
         <w:drawing>
-          <wp:anchor behindDoc="0" distT="0" distB="0" distL="0" distR="0" simplePos="0" locked="0" layoutInCell="0" allowOverlap="1" relativeHeight="39">
+          <wp:anchor behindDoc="0" distT="0" distB="0" distL="0" distR="0" simplePos="0" locked="0" layoutInCell="0" allowOverlap="1" relativeHeight="38">
             <wp:simplePos x="0" y="0"/>
             <wp:positionH relativeFrom="column">
               <wp:align>center</wp:align>
@@ -3082,7 +3087,7 @@
       <w:r>
         <w:rPr/>
         <w:drawing>
-          <wp:anchor behindDoc="0" distT="0" distB="0" distL="0" distR="0" simplePos="0" locked="0" layoutInCell="0" allowOverlap="1" relativeHeight="40">
+          <wp:anchor behindDoc="0" distT="0" distB="0" distL="0" distR="0" simplePos="0" locked="0" layoutInCell="0" allowOverlap="1" relativeHeight="39">
             <wp:simplePos x="0" y="0"/>
             <wp:positionH relativeFrom="column">
               <wp:align>center</wp:align>
@@ -3250,33 +3255,34 @@
         <w:rPr/>
         <w:t>1.5.2</w:t>
         <w:tab/>
-      </w:r>
-      <w:r>
-        <w:rPr/>
         <w:t>DB tables</w:t>
       </w:r>
     </w:p>
     <w:p>
       <w:pPr>
         <w:pStyle w:val="Normal"/>
-        <w:rPr/>
-      </w:pPr>
-      <w:r>
-        <w:rPr/>
-        <w:t>…</w:t>
-      </w:r>
-    </w:p>
-    <w:p>
-      <w:pPr>
-        <w:pStyle w:val="Normal"/>
+        <w:numPr>
+          <w:ilvl w:val="0"/>
+          <w:numId w:val="0"/>
+        </w:numPr>
+        <w:ind w:hanging="0" w:start="0" w:end="0"/>
+        <w:jc w:val="both"/>
         <w:rPr/>
       </w:pPr>
       <w:r>
         <w:rPr/>
         <w:drawing>
-          <wp:inline distT="0" distB="0" distL="0" distR="0">
-            <wp:extent cx="4006215" cy="3300730"/>
+          <wp:anchor behindDoc="0" distT="0" distB="0" distL="0" distR="0" simplePos="0" locked="0" layoutInCell="0" allowOverlap="1" relativeHeight="40">
+            <wp:simplePos x="0" y="0"/>
+            <wp:positionH relativeFrom="column">
+              <wp:align>center</wp:align>
+            </wp:positionH>
+            <wp:positionV relativeFrom="paragraph">
+              <wp:posOffset>635</wp:posOffset>
+            </wp:positionV>
+            <wp:extent cx="4933950" cy="3343275"/>
             <wp:effectExtent l="0" t="0" r="0" b="0"/>
+            <wp:wrapTopAndBottom/>
             <wp:docPr id="5" name="Image5" descr="" title=""/>
             <wp:cNvGraphicFramePr>
               <a:graphicFrameLocks xmlns:a="http://schemas.openxmlformats.org/drawingml/2006/main" noChangeAspect="1"/>
@@ -3292,7 +3298,6 @@
                   </pic:nvPicPr>
                   <pic:blipFill>
                     <a:blip r:embed="rId7"/>
-                    <a:srcRect l="-99" t="-120" r="-99" b="-120"/>
                     <a:stretch>
                       <a:fillRect/>
                     </a:stretch>
@@ -3300,7 +3305,7 @@
                   <pic:spPr bwMode="auto">
                     <a:xfrm>
                       <a:off x="0" y="0"/>
-                      <a:ext cx="4006215" cy="3300730"/>
+                      <a:ext cx="4933950" cy="3343275"/>
                     </a:xfrm>
                     <a:prstGeom prst="rect">
                       <a:avLst/>
@@ -3310,8 +3315,17 @@
                 </pic:pic>
               </a:graphicData>
             </a:graphic>
-          </wp:inline>
+          </wp:anchor>
         </w:drawing>
+      </w:r>
+    </w:p>
+    <w:p>
+      <w:pPr>
+        <w:pStyle w:val="Normal"/>
+        <w:rPr/>
+      </w:pPr>
+      <w:r>
+        <w:rPr/>
       </w:r>
     </w:p>
     <w:p>
@@ -3328,18 +3342,37 @@
       <w:bookmarkStart w:id="7" w:name="__RefHeading___Toc209893730"/>
       <w:bookmarkEnd w:id="7"/>
       <w:r>
+        <w:rPr/>
+        <w:t>1.5.3</w:t>
+        <w:tab/>
+        <w:t>Protocol</w:t>
+      </w:r>
+    </w:p>
+    <w:p>
+      <w:pPr>
+        <w:pStyle w:val="Normal"/>
+        <w:numPr>
+          <w:ilvl w:val="0"/>
+          <w:numId w:val="0"/>
+        </w:numPr>
+        <w:ind w:hanging="0" w:start="0" w:end="0"/>
+        <w:jc w:val="both"/>
+        <w:rPr/>
+      </w:pPr>
+      <w:r>
+        <w:rPr/>
         <mc:AlternateContent>
           <mc:Choice Requires="wps">
             <w:drawing>
-              <wp:anchor behindDoc="0" distT="0" distB="173990" distL="0" distR="0" simplePos="0" locked="0" layoutInCell="1" allowOverlap="1" relativeHeight="36">
+              <wp:anchor behindDoc="0" distT="0" distB="173990" distL="0" distR="0" simplePos="0" locked="0" layoutInCell="1" allowOverlap="1" relativeHeight="35">
                 <wp:simplePos x="0" y="0"/>
                 <wp:positionH relativeFrom="column">
-                  <wp:posOffset>2865120</wp:posOffset>
+                  <wp:posOffset>22225</wp:posOffset>
                 </wp:positionH>
                 <wp:positionV relativeFrom="paragraph">
-                  <wp:posOffset>199390</wp:posOffset>
+                  <wp:posOffset>97155</wp:posOffset>
                 </wp:positionV>
-                <wp:extent cx="1024255" cy="175895"/>
+                <wp:extent cx="5709285" cy="175895"/>
                 <wp:effectExtent l="0" t="0" r="0" b="174625"/>
                 <wp:wrapNone/>
                 <wp:docPr id="6" name="Shape1"/>
@@ -3350,7 +3383,7 @@
                       <wps:spPr>
                         <a:xfrm>
                           <a:off x="0" y="0"/>
-                          <a:ext cx="1024200" cy="176040"/>
+                          <a:ext cx="5709240" cy="176040"/>
                         </a:xfrm>
                         <a:prstGeom prst="rect">
                           <a:avLst/>
@@ -3370,8 +3403,8 @@
                         <w:txbxContent>
                           <w:p>
                             <w:pPr>
-                              <w:pStyle w:val="FrameContents"/>
-                              <w:overflowPunct w:val="true"/>
+                              <w:pStyle w:val="FrameContentsuser"/>
+                              <w:overflowPunct w:val="false"/>
                               <w:bidi w:val="0"/>
                               <w:spacing w:before="0" w:after="0"/>
                               <w:ind w:hanging="0" w:start="284" w:end="284"/>
@@ -3402,15 +3435,15 @@
           </mc:Choice>
           <mc:Fallback>
             <w:pict>
-              <v:rect id="shape_0" ID="Shape1" path="m0,0l-2147483645,0l-2147483645,-2147483646l0,-2147483646xe" stroked="f" o:allowincell="f" style="position:absolute;margin-left:225.6pt;margin-top:15.7pt;width:80.6pt;height:13.8pt;mso-wrap-style:square;v-text-anchor:top">
+              <v:rect id="shape_0" ID="Shape1" path="m0,0l-2147483645,0l-2147483645,-2147483646l0,-2147483646xe" stroked="f" o:allowincell="f" style="position:absolute;margin-left:1.75pt;margin-top:7.65pt;width:449.5pt;height:13.8pt;mso-wrap-style:square;v-text-anchor:top">
                 <v:fill o:detectmouseclick="t" on="false"/>
                 <v:stroke color="#3465a4" joinstyle="round" endcap="flat"/>
                 <v:textbox>
                   <w:txbxContent>
                     <w:p>
                       <w:pPr>
-                        <w:pStyle w:val="FrameContents"/>
-                        <w:overflowPunct w:val="true"/>
+                        <w:pStyle w:val="FrameContentsuser"/>
+                        <w:overflowPunct w:val="false"/>
                         <w:bidi w:val="0"/>
                         <w:spacing w:before="0" w:after="0"/>
                         <w:ind w:hanging="0" w:start="284" w:end="284"/>
@@ -3436,15 +3469,6 @@
           </mc:Fallback>
         </mc:AlternateContent>
       </w:r>
-      <w:r>
-        <w:rPr/>
-        <w:t>1.5.3</w:t>
-        <w:tab/>
-      </w:r>
-      <w:r>
-        <w:rPr/>
-        <w:t>Protocol</w:t>
-      </w:r>
     </w:p>
     <w:p>
       <w:pPr>
@@ -3458,7 +3482,7 @@
         <mc:AlternateContent>
           <mc:Choice Requires="wps">
             <w:drawing>
-              <wp:anchor behindDoc="0" distT="5715" distB="4445" distL="5080" distR="5715" simplePos="0" locked="0" layoutInCell="1" allowOverlap="1" relativeHeight="7">
+              <wp:anchor behindDoc="0" distT="5715" distB="4445" distL="5080" distR="5715" simplePos="0" locked="0" layoutInCell="1" allowOverlap="1" relativeHeight="6">
                 <wp:simplePos x="0" y="0"/>
                 <wp:positionH relativeFrom="column">
                   <wp:posOffset>34925</wp:posOffset>
@@ -3541,7 +3565,7 @@
         <mc:AlternateContent>
           <mc:Choice Requires="wps">
             <w:drawing>
-              <wp:anchor behindDoc="0" distT="5715" distB="4445" distL="5080" distR="5715" simplePos="0" locked="0" layoutInCell="1" allowOverlap="1" relativeHeight="8">
+              <wp:anchor behindDoc="0" distT="5715" distB="4445" distL="5080" distR="5715" simplePos="0" locked="0" layoutInCell="1" allowOverlap="1" relativeHeight="7">
                 <wp:simplePos x="0" y="0"/>
                 <wp:positionH relativeFrom="column">
                   <wp:posOffset>34925</wp:posOffset>
@@ -3604,7 +3628,7 @@
         <mc:AlternateContent>
           <mc:Choice Requires="wps">
             <w:drawing>
-              <wp:anchor behindDoc="0" distT="5715" distB="4445" distL="5080" distR="5715" simplePos="0" locked="0" layoutInCell="1" allowOverlap="1" relativeHeight="9">
+              <wp:anchor behindDoc="0" distT="5715" distB="4445" distL="5080" distR="5715" simplePos="0" locked="0" layoutInCell="1" allowOverlap="1" relativeHeight="8">
                 <wp:simplePos x="0" y="0"/>
                 <wp:positionH relativeFrom="column">
                   <wp:posOffset>626745</wp:posOffset>
@@ -3667,7 +3691,7 @@
         <mc:AlternateContent>
           <mc:Choice Requires="wps">
             <w:drawing>
-              <wp:anchor behindDoc="0" distT="5080" distB="5715" distL="5080" distR="5715" simplePos="0" locked="0" layoutInCell="1" allowOverlap="1" relativeHeight="10">
+              <wp:anchor behindDoc="0" distT="5080" distB="5715" distL="5080" distR="5715" simplePos="0" locked="0" layoutInCell="1" allowOverlap="1" relativeHeight="9">
                 <wp:simplePos x="0" y="0"/>
                 <wp:positionH relativeFrom="column">
                   <wp:posOffset>1202055</wp:posOffset>
@@ -3730,15 +3754,15 @@
         <mc:AlternateContent>
           <mc:Choice Requires="wps">
             <w:drawing>
-              <wp:anchor behindDoc="0" distT="5715" distB="4445" distL="5080" distR="5715" simplePos="0" locked="0" layoutInCell="1" allowOverlap="1" relativeHeight="11">
+              <wp:anchor behindDoc="0" distT="5715" distB="4445" distL="5080" distR="5715" simplePos="0" locked="0" layoutInCell="1" allowOverlap="1" relativeHeight="10">
                 <wp:simplePos x="0" y="0"/>
                 <wp:positionH relativeFrom="column">
-                  <wp:posOffset>603250</wp:posOffset>
+                  <wp:posOffset>594995</wp:posOffset>
                 </wp:positionH>
                 <wp:positionV relativeFrom="paragraph">
-                  <wp:posOffset>64135</wp:posOffset>
+                  <wp:posOffset>16510</wp:posOffset>
                 </wp:positionV>
-                <wp:extent cx="5099050" cy="27305"/>
+                <wp:extent cx="5099050" cy="47625"/>
                 <wp:effectExtent l="5080" t="5715" r="5715" b="4445"/>
                 <wp:wrapNone/>
                 <wp:docPr id="11" name="Shape 4"/>
@@ -3749,7 +3773,7 @@
                       <wps:spPr>
                         <a:xfrm>
                           <a:off x="0" y="0"/>
-                          <a:ext cx="5099040" cy="27360"/>
+                          <a:ext cx="5099040" cy="47520"/>
                         </a:xfrm>
                         <a:prstGeom prst="leftRightArrow">
                           <a:avLst>
@@ -3758,7 +3782,7 @@
                           </a:avLst>
                         </a:prstGeom>
                         <a:solidFill>
-                          <a:srgbClr val="000000"/>
+                          <a:srgbClr val="3465a4"/>
                         </a:solidFill>
                         <a:ln w="9360">
                           <a:solidFill>
@@ -3782,8 +3806,8 @@
           </mc:Choice>
           <mc:Fallback>
             <w:pict>
-              <v:shape id="shape_0" ID="Shape 4" path="l-2147483636,0l-2147483636,-2147483631l-2147483635,-2147483631l-2147483635,0l-2147483622,-2147483632l-2147483635,-2147483621l-2147483635,-2147483629l-2147483636,-2147483629l-2147483636,-2147483621xe" fillcolor="black" stroked="t" o:allowincell="f" style="position:absolute;margin-left:47.5pt;margin-top:5.05pt;width:401.45pt;height:2.1pt;mso-wrap-style:none;v-text-anchor:middle" type="_x0000_t69">
-                <v:fill o:detectmouseclick="t" type="solid" color2="white"/>
+              <v:shape id="shape_0" ID="Shape 4" path="l-2147483636,0l-2147483636,-2147483631l-2147483635,-2147483631l-2147483635,0l-2147483622,-2147483632l-2147483635,-2147483621l-2147483635,-2147483629l-2147483636,-2147483629l-2147483636,-2147483621xe" fillcolor="#3465a4" stroked="t" o:allowincell="f" style="position:absolute;margin-left:46.85pt;margin-top:1.3pt;width:401.45pt;height:3.7pt;mso-wrap-style:none;v-text-anchor:middle" type="_x0000_t69">
+                <v:fill o:detectmouseclick="t" type="solid" color2="#cb9a5b"/>
                 <v:stroke color="#3465a4" weight="9360" joinstyle="round" endcap="flat"/>
                 <w10:wrap type="none"/>
               </v:shape>
@@ -3793,7 +3817,7 @@
         <mc:AlternateContent>
           <mc:Choice Requires="wps">
             <w:drawing>
-              <wp:anchor behindDoc="0" distT="5715" distB="4445" distL="5080" distR="5715" simplePos="0" locked="0" layoutInCell="1" allowOverlap="1" relativeHeight="12">
+              <wp:anchor behindDoc="0" distT="5715" distB="4445" distL="5080" distR="5715" simplePos="0" locked="0" layoutInCell="1" allowOverlap="1" relativeHeight="11">
                 <wp:simplePos x="0" y="0"/>
                 <wp:positionH relativeFrom="column">
                   <wp:posOffset>1759585</wp:posOffset>
@@ -3856,7 +3880,7 @@
         <mc:AlternateContent>
           <mc:Choice Requires="wps">
             <w:drawing>
-              <wp:anchor behindDoc="0" distT="5715" distB="4445" distL="5080" distR="5715" simplePos="0" locked="0" layoutInCell="1" allowOverlap="1" relativeHeight="13">
+              <wp:anchor behindDoc="0" distT="5715" distB="4445" distL="5080" distR="5715" simplePos="0" locked="0" layoutInCell="1" allowOverlap="1" relativeHeight="12">
                 <wp:simplePos x="0" y="0"/>
                 <wp:positionH relativeFrom="column">
                   <wp:posOffset>2334895</wp:posOffset>
@@ -3919,7 +3943,7 @@
         <mc:AlternateContent>
           <mc:Choice Requires="wps">
             <w:drawing>
-              <wp:anchor behindDoc="0" distT="5715" distB="4445" distL="5080" distR="5715" simplePos="0" locked="0" layoutInCell="1" allowOverlap="1" relativeHeight="14">
+              <wp:anchor behindDoc="0" distT="5715" distB="4445" distL="5080" distR="5715" simplePos="0" locked="0" layoutInCell="1" allowOverlap="1" relativeHeight="13">
                 <wp:simplePos x="0" y="0"/>
                 <wp:positionH relativeFrom="column">
                   <wp:posOffset>2916555</wp:posOffset>
@@ -3982,7 +4006,7 @@
         <mc:AlternateContent>
           <mc:Choice Requires="wps">
             <w:drawing>
-              <wp:anchor behindDoc="0" distT="5715" distB="4445" distL="5080" distR="5715" simplePos="0" locked="0" layoutInCell="1" allowOverlap="1" relativeHeight="15">
+              <wp:anchor behindDoc="0" distT="5715" distB="4445" distL="5080" distR="5715" simplePos="0" locked="0" layoutInCell="1" allowOverlap="1" relativeHeight="14">
                 <wp:simplePos x="0" y="0"/>
                 <wp:positionH relativeFrom="column">
                   <wp:posOffset>3491230</wp:posOffset>
@@ -4045,7 +4069,7 @@
         <mc:AlternateContent>
           <mc:Choice Requires="wps">
             <w:drawing>
-              <wp:anchor behindDoc="0" distT="5715" distB="4445" distL="5080" distR="5715" simplePos="0" locked="0" layoutInCell="1" allowOverlap="1" relativeHeight="16">
+              <wp:anchor behindDoc="0" distT="5715" distB="4445" distL="5080" distR="5715" simplePos="0" locked="0" layoutInCell="1" allowOverlap="1" relativeHeight="15">
                 <wp:simplePos x="0" y="0"/>
                 <wp:positionH relativeFrom="column">
                   <wp:posOffset>4059555</wp:posOffset>
@@ -4108,7 +4132,7 @@
         <mc:AlternateContent>
           <mc:Choice Requires="wps">
             <w:drawing>
-              <wp:anchor behindDoc="0" distT="5715" distB="4445" distL="5080" distR="5715" simplePos="0" locked="0" layoutInCell="1" allowOverlap="1" relativeHeight="17">
+              <wp:anchor behindDoc="0" distT="5715" distB="4445" distL="5080" distR="5715" simplePos="0" locked="0" layoutInCell="1" allowOverlap="1" relativeHeight="16">
                 <wp:simplePos x="0" y="0"/>
                 <wp:positionH relativeFrom="column">
                   <wp:posOffset>4613275</wp:posOffset>
@@ -4171,7 +4195,7 @@
         <mc:AlternateContent>
           <mc:Choice Requires="wps">
             <w:drawing>
-              <wp:anchor behindDoc="0" distT="0" distB="0" distL="0" distR="0" simplePos="0" locked="0" layoutInCell="1" allowOverlap="1" relativeHeight="18">
+              <wp:anchor behindDoc="0" distT="0" distB="0" distL="0" distR="0" simplePos="0" locked="0" layoutInCell="1" allowOverlap="1" relativeHeight="17">
                 <wp:simplePos x="0" y="0"/>
                 <wp:positionH relativeFrom="column">
                   <wp:posOffset>-5080</wp:posOffset>
@@ -4210,8 +4234,8 @@
                         <w:txbxContent>
                           <w:p>
                             <w:pPr>
-                              <w:pStyle w:val="FrameContents"/>
-                              <w:overflowPunct w:val="true"/>
+                              <w:pStyle w:val="FrameContentsuser"/>
+                              <w:overflowPunct w:val="false"/>
                               <w:bidi w:val="0"/>
                               <w:spacing w:before="0" w:after="0"/>
                               <w:ind w:hanging="0" w:start="284" w:end="284"/>
@@ -4249,8 +4273,8 @@
                   <w:txbxContent>
                     <w:p>
                       <w:pPr>
-                        <w:pStyle w:val="FrameContents"/>
-                        <w:overflowPunct w:val="true"/>
+                        <w:pStyle w:val="FrameContentsuser"/>
+                        <w:overflowPunct w:val="false"/>
                         <w:bidi w:val="0"/>
                         <w:spacing w:before="0" w:after="0"/>
                         <w:ind w:hanging="0" w:start="284" w:end="284"/>
@@ -4278,7 +4302,7 @@
         <mc:AlternateContent>
           <mc:Choice Requires="wps">
             <w:drawing>
-              <wp:anchor behindDoc="0" distT="0" distB="0" distL="0" distR="0" simplePos="0" locked="0" layoutInCell="1" allowOverlap="1" relativeHeight="20">
+              <wp:anchor behindDoc="0" distT="0" distB="0" distL="0" distR="0" simplePos="0" locked="0" layoutInCell="1" allowOverlap="1" relativeHeight="19">
                 <wp:simplePos x="0" y="0"/>
                 <wp:positionH relativeFrom="column">
                   <wp:posOffset>570230</wp:posOffset>
@@ -4317,8 +4341,8 @@
                         <w:txbxContent>
                           <w:p>
                             <w:pPr>
-                              <w:pStyle w:val="FrameContents"/>
-                              <w:overflowPunct w:val="true"/>
+                              <w:pStyle w:val="FrameContentsuser"/>
+                              <w:overflowPunct w:val="false"/>
                               <w:bidi w:val="0"/>
                               <w:spacing w:before="0" w:after="0"/>
                               <w:ind w:hanging="0" w:start="284" w:end="284"/>
@@ -4356,8 +4380,8 @@
                   <w:txbxContent>
                     <w:p>
                       <w:pPr>
-                        <w:pStyle w:val="FrameContents"/>
-                        <w:overflowPunct w:val="true"/>
+                        <w:pStyle w:val="FrameContentsuser"/>
+                        <w:overflowPunct w:val="false"/>
                         <w:bidi w:val="0"/>
                         <w:spacing w:before="0" w:after="0"/>
                         <w:ind w:hanging="0" w:start="284" w:end="284"/>
@@ -4385,7 +4409,7 @@
         <mc:AlternateContent>
           <mc:Choice Requires="wps">
             <w:drawing>
-              <wp:anchor behindDoc="0" distT="0" distB="0" distL="0" distR="0" simplePos="0" locked="0" layoutInCell="1" allowOverlap="1" relativeHeight="22">
+              <wp:anchor behindDoc="0" distT="0" distB="0" distL="0" distR="0" simplePos="0" locked="0" layoutInCell="1" allowOverlap="1" relativeHeight="21">
                 <wp:simplePos x="0" y="0"/>
                 <wp:positionH relativeFrom="column">
                   <wp:posOffset>1736725</wp:posOffset>
@@ -4424,8 +4448,8 @@
                         <w:txbxContent>
                           <w:p>
                             <w:pPr>
-                              <w:pStyle w:val="FrameContents"/>
-                              <w:overflowPunct w:val="true"/>
+                              <w:pStyle w:val="FrameContentsuser"/>
+                              <w:overflowPunct w:val="false"/>
                               <w:bidi w:val="0"/>
                               <w:spacing w:before="0" w:after="0"/>
                               <w:ind w:hanging="0" w:start="284" w:end="284"/>
@@ -4463,8 +4487,8 @@
                   <w:txbxContent>
                     <w:p>
                       <w:pPr>
-                        <w:pStyle w:val="FrameContents"/>
-                        <w:overflowPunct w:val="true"/>
+                        <w:pStyle w:val="FrameContentsuser"/>
+                        <w:overflowPunct w:val="false"/>
                         <w:bidi w:val="0"/>
                         <w:spacing w:before="0" w:after="0"/>
                         <w:ind w:hanging="0" w:start="284" w:end="284"/>
@@ -4492,7 +4516,7 @@
         <mc:AlternateContent>
           <mc:Choice Requires="wps">
             <w:drawing>
-              <wp:anchor behindDoc="0" distT="0" distB="0" distL="0" distR="0" simplePos="0" locked="0" layoutInCell="1" allowOverlap="1" relativeHeight="24">
+              <wp:anchor behindDoc="0" distT="0" distB="0" distL="0" distR="0" simplePos="0" locked="0" layoutInCell="1" allowOverlap="1" relativeHeight="23">
                 <wp:simplePos x="0" y="0"/>
                 <wp:positionH relativeFrom="column">
                   <wp:posOffset>2917190</wp:posOffset>
@@ -4531,8 +4555,8 @@
                         <w:txbxContent>
                           <w:p>
                             <w:pPr>
-                              <w:pStyle w:val="FrameContents"/>
-                              <w:overflowPunct w:val="true"/>
+                              <w:pStyle w:val="FrameContentsuser"/>
+                              <w:overflowPunct w:val="false"/>
                               <w:bidi w:val="0"/>
                               <w:spacing w:before="0" w:after="0"/>
                               <w:ind w:hanging="0" w:start="284" w:end="284"/>
@@ -4570,8 +4594,8 @@
                   <w:txbxContent>
                     <w:p>
                       <w:pPr>
-                        <w:pStyle w:val="FrameContents"/>
-                        <w:overflowPunct w:val="true"/>
+                        <w:pStyle w:val="FrameContentsuser"/>
+                        <w:overflowPunct w:val="false"/>
                         <w:bidi w:val="0"/>
                         <w:spacing w:before="0" w:after="0"/>
                         <w:ind w:hanging="0" w:start="284" w:end="284"/>
@@ -4599,7 +4623,7 @@
         <mc:AlternateContent>
           <mc:Choice Requires="wps">
             <w:drawing>
-              <wp:anchor behindDoc="0" distT="0" distB="0" distL="0" distR="0" simplePos="0" locked="0" layoutInCell="1" allowOverlap="1" relativeHeight="26">
+              <wp:anchor behindDoc="0" distT="0" distB="0" distL="0" distR="0" simplePos="0" locked="0" layoutInCell="1" allowOverlap="1" relativeHeight="25">
                 <wp:simplePos x="0" y="0"/>
                 <wp:positionH relativeFrom="column">
                   <wp:posOffset>4032885</wp:posOffset>
@@ -4638,8 +4662,8 @@
                         <w:txbxContent>
                           <w:p>
                             <w:pPr>
-                              <w:pStyle w:val="FrameContents"/>
-                              <w:overflowPunct w:val="true"/>
+                              <w:pStyle w:val="FrameContentsuser"/>
+                              <w:overflowPunct w:val="false"/>
                               <w:bidi w:val="0"/>
                               <w:spacing w:before="0" w:after="0"/>
                               <w:ind w:hanging="0" w:start="284" w:end="284"/>
@@ -4677,8 +4701,8 @@
                   <w:txbxContent>
                     <w:p>
                       <w:pPr>
-                        <w:pStyle w:val="FrameContents"/>
-                        <w:overflowPunct w:val="true"/>
+                        <w:pStyle w:val="FrameContentsuser"/>
+                        <w:overflowPunct w:val="false"/>
                         <w:bidi w:val="0"/>
                         <w:spacing w:before="0" w:after="0"/>
                         <w:ind w:hanging="0" w:start="284" w:end="284"/>
@@ -4706,7 +4730,7 @@
         <mc:AlternateContent>
           <mc:Choice Requires="wps">
             <w:drawing>
-              <wp:anchor behindDoc="0" distT="0" distB="0" distL="0" distR="0" simplePos="0" locked="0" layoutInCell="1" allowOverlap="1" relativeHeight="28">
+              <wp:anchor behindDoc="0" distT="0" distB="0" distL="0" distR="0" simplePos="0" locked="0" layoutInCell="1" allowOverlap="1" relativeHeight="27">
                 <wp:simplePos x="0" y="0"/>
                 <wp:positionH relativeFrom="column">
                   <wp:posOffset>1175385</wp:posOffset>
@@ -4745,8 +4769,8 @@
                         <w:txbxContent>
                           <w:p>
                             <w:pPr>
-                              <w:pStyle w:val="FrameContents"/>
-                              <w:overflowPunct w:val="true"/>
+                              <w:pStyle w:val="FrameContentsuser"/>
+                              <w:overflowPunct w:val="false"/>
                               <w:bidi w:val="0"/>
                               <w:spacing w:before="0" w:after="0"/>
                               <w:ind w:hanging="0" w:start="284" w:end="284"/>
@@ -4784,8 +4808,8 @@
                   <w:txbxContent>
                     <w:p>
                       <w:pPr>
-                        <w:pStyle w:val="FrameContents"/>
-                        <w:overflowPunct w:val="true"/>
+                        <w:pStyle w:val="FrameContentsuser"/>
+                        <w:overflowPunct w:val="false"/>
                         <w:bidi w:val="0"/>
                         <w:spacing w:before="0" w:after="0"/>
                         <w:ind w:hanging="0" w:start="284" w:end="284"/>
@@ -4813,7 +4837,7 @@
         <mc:AlternateContent>
           <mc:Choice Requires="wps">
             <w:drawing>
-              <wp:anchor behindDoc="0" distT="0" distB="0" distL="0" distR="0" simplePos="0" locked="0" layoutInCell="1" allowOverlap="1" relativeHeight="30">
+              <wp:anchor behindDoc="0" distT="0" distB="0" distL="0" distR="0" simplePos="0" locked="0" layoutInCell="1" allowOverlap="1" relativeHeight="29">
                 <wp:simplePos x="0" y="0"/>
                 <wp:positionH relativeFrom="column">
                   <wp:posOffset>2345690</wp:posOffset>
@@ -4852,8 +4876,8 @@
                         <w:txbxContent>
                           <w:p>
                             <w:pPr>
-                              <w:pStyle w:val="FrameContents"/>
-                              <w:overflowPunct w:val="true"/>
+                              <w:pStyle w:val="FrameContentsuser"/>
+                              <w:overflowPunct w:val="false"/>
                               <w:bidi w:val="0"/>
                               <w:spacing w:before="0" w:after="0"/>
                               <w:ind w:hanging="0" w:start="284" w:end="284"/>
@@ -4891,8 +4915,8 @@
                   <w:txbxContent>
                     <w:p>
                       <w:pPr>
-                        <w:pStyle w:val="FrameContents"/>
-                        <w:overflowPunct w:val="true"/>
+                        <w:pStyle w:val="FrameContentsuser"/>
+                        <w:overflowPunct w:val="false"/>
                         <w:bidi w:val="0"/>
                         <w:spacing w:before="0" w:after="0"/>
                         <w:ind w:hanging="0" w:start="284" w:end="284"/>
@@ -4920,7 +4944,7 @@
         <mc:AlternateContent>
           <mc:Choice Requires="wps">
             <w:drawing>
-              <wp:anchor behindDoc="0" distT="0" distB="0" distL="0" distR="0" simplePos="0" locked="0" layoutInCell="1" allowOverlap="1" relativeHeight="32">
+              <wp:anchor behindDoc="0" distT="0" distB="0" distL="0" distR="0" simplePos="0" locked="0" layoutInCell="1" allowOverlap="1" relativeHeight="31">
                 <wp:simplePos x="0" y="0"/>
                 <wp:positionH relativeFrom="column">
                   <wp:posOffset>4655185</wp:posOffset>
@@ -4959,8 +4983,8 @@
                         <w:txbxContent>
                           <w:p>
                             <w:pPr>
-                              <w:pStyle w:val="FrameContents"/>
-                              <w:overflowPunct w:val="true"/>
+                              <w:pStyle w:val="FrameContentsuser"/>
+                              <w:overflowPunct w:val="false"/>
                               <w:bidi w:val="0"/>
                               <w:spacing w:before="0" w:after="0"/>
                               <w:ind w:hanging="0" w:start="284" w:end="284"/>
@@ -4998,8 +5022,8 @@
                   <w:txbxContent>
                     <w:p>
                       <w:pPr>
-                        <w:pStyle w:val="FrameContents"/>
-                        <w:overflowPunct w:val="true"/>
+                        <w:pStyle w:val="FrameContentsuser"/>
+                        <w:overflowPunct w:val="false"/>
                         <w:bidi w:val="0"/>
                         <w:spacing w:before="0" w:after="0"/>
                         <w:ind w:hanging="0" w:start="284" w:end="284"/>
@@ -5027,7 +5051,7 @@
         <mc:AlternateContent>
           <mc:Choice Requires="wps">
             <w:drawing>
-              <wp:anchor behindDoc="0" distT="0" distB="0" distL="0" distR="0" simplePos="0" locked="0" layoutInCell="1" allowOverlap="1" relativeHeight="34">
+              <wp:anchor behindDoc="0" distT="0" distB="0" distL="0" distR="0" simplePos="0" locked="0" layoutInCell="1" allowOverlap="1" relativeHeight="33">
                 <wp:simplePos x="0" y="0"/>
                 <wp:positionH relativeFrom="column">
                   <wp:posOffset>3515995</wp:posOffset>
@@ -5066,8 +5090,8 @@
                         <w:txbxContent>
                           <w:p>
                             <w:pPr>
-                              <w:pStyle w:val="FrameContents"/>
-                              <w:overflowPunct w:val="true"/>
+                              <w:pStyle w:val="FrameContentsuser"/>
+                              <w:overflowPunct w:val="false"/>
                               <w:bidi w:val="0"/>
                               <w:spacing w:before="0" w:after="0"/>
                               <w:ind w:hanging="0" w:start="284" w:end="284"/>
@@ -5105,8 +5129,8 @@
                   <w:txbxContent>
                     <w:p>
                       <w:pPr>
-                        <w:pStyle w:val="FrameContents"/>
-                        <w:overflowPunct w:val="true"/>
+                        <w:pStyle w:val="FrameContentsuser"/>
+                        <w:overflowPunct w:val="false"/>
                         <w:bidi w:val="0"/>
                         <w:spacing w:before="0" w:after="0"/>
                         <w:ind w:hanging="0" w:start="284" w:end="284"/>
@@ -5447,9 +5471,6 @@
         <w:rPr/>
         <w:t>1.5.4</w:t>
         <w:tab/>
-      </w:r>
-      <w:r>
-        <w:rPr/>
         <w:t>Encription</w:t>
       </w:r>
     </w:p>
@@ -5480,9 +5501,6 @@
         <w:rPr/>
         <w:t>1.5.5</w:t>
         <w:tab/>
-      </w:r>
-      <w:r>
-        <w:rPr/>
         <w:t>Classes</w:t>
       </w:r>
     </w:p>
@@ -5564,9 +5582,6 @@
         <w:rPr/>
         <w:t>1.6</w:t>
         <w:tab/>
-      </w:r>
-      <w:r>
-        <w:rPr/>
         <w:t>System Architecture - Presentation Layer</w:t>
       </w:r>
     </w:p>
@@ -5597,9 +5612,6 @@
         <w:rPr/>
         <w:t>1.6.1</w:t>
         <w:tab/>
-      </w:r>
-      <w:r>
-        <w:rPr/>
         <w:t>Forms workflow</w:t>
       </w:r>
     </w:p>
@@ -5681,9 +5693,6 @@
         <w:rPr/>
         <w:t>1.7</w:t>
         <w:tab/>
-      </w:r>
-      <w:r>
-        <w:rPr/>
         <w:t>Source Code</w:t>
       </w:r>
     </w:p>
@@ -5713,9 +5722,6 @@
         <w:rPr/>
         <w:t>1.8</w:t>
         <w:tab/>
-      </w:r>
-      <w:r>
-        <w:rPr/>
         <w:t>SW Test plan</w:t>
       </w:r>
     </w:p>
@@ -6222,6 +6228,7 @@
         </w:tabs>
         <w:ind w:start="1080" w:hanging="360"/>
       </w:pPr>
+      <w:rPr/>
     </w:lvl>
     <w:lvl w:ilvl="2">
       <w:start w:val="1"/>
@@ -6234,6 +6241,7 @@
         </w:tabs>
         <w:ind w:start="1440" w:hanging="360"/>
       </w:pPr>
+      <w:rPr/>
     </w:lvl>
     <w:lvl w:ilvl="3">
       <w:start w:val="1"/>
@@ -6246,6 +6254,7 @@
         </w:tabs>
         <w:ind w:start="1800" w:hanging="360"/>
       </w:pPr>
+      <w:rPr/>
     </w:lvl>
     <w:lvl w:ilvl="4">
       <w:start w:val="1"/>
@@ -6258,6 +6267,7 @@
         </w:tabs>
         <w:ind w:start="2160" w:hanging="360"/>
       </w:pPr>
+      <w:rPr/>
     </w:lvl>
     <w:lvl w:ilvl="5">
       <w:start w:val="1"/>
@@ -6270,6 +6280,7 @@
         </w:tabs>
         <w:ind w:start="2520" w:hanging="360"/>
       </w:pPr>
+      <w:rPr/>
     </w:lvl>
     <w:lvl w:ilvl="6">
       <w:start w:val="1"/>
@@ -6282,6 +6293,7 @@
         </w:tabs>
         <w:ind w:start="2880" w:hanging="360"/>
       </w:pPr>
+      <w:rPr/>
     </w:lvl>
     <w:lvl w:ilvl="7">
       <w:start w:val="1"/>
@@ -6294,6 +6306,7 @@
         </w:tabs>
         <w:ind w:start="3240" w:hanging="360"/>
       </w:pPr>
+      <w:rPr/>
     </w:lvl>
     <w:lvl w:ilvl="8">
       <w:start w:val="1"/>
@@ -6306,6 +6319,7 @@
         </w:tabs>
         <w:ind w:start="3600" w:hanging="360"/>
       </w:pPr>
+      <w:rPr/>
     </w:lvl>
   </w:abstractNum>
   <w:abstractNum w:abstractNumId="3">
@@ -6335,6 +6349,7 @@
         </w:tabs>
         <w:ind w:start="1080" w:hanging="360"/>
       </w:pPr>
+      <w:rPr/>
     </w:lvl>
     <w:lvl w:ilvl="2">
       <w:start w:val="1"/>
@@ -6347,6 +6362,7 @@
         </w:tabs>
         <w:ind w:start="1440" w:hanging="360"/>
       </w:pPr>
+      <w:rPr/>
     </w:lvl>
     <w:lvl w:ilvl="3">
       <w:start w:val="1"/>
@@ -6359,6 +6375,7 @@
         </w:tabs>
         <w:ind w:start="1800" w:hanging="360"/>
       </w:pPr>
+      <w:rPr/>
     </w:lvl>
     <w:lvl w:ilvl="4">
       <w:start w:val="1"/>
@@ -6371,6 +6388,7 @@
         </w:tabs>
         <w:ind w:start="2160" w:hanging="360"/>
       </w:pPr>
+      <w:rPr/>
     </w:lvl>
     <w:lvl w:ilvl="5">
       <w:start w:val="1"/>
@@ -6383,6 +6401,7 @@
         </w:tabs>
         <w:ind w:start="2520" w:hanging="360"/>
       </w:pPr>
+      <w:rPr/>
     </w:lvl>
     <w:lvl w:ilvl="6">
       <w:start w:val="1"/>
@@ -6395,6 +6414,7 @@
         </w:tabs>
         <w:ind w:start="2880" w:hanging="360"/>
       </w:pPr>
+      <w:rPr/>
     </w:lvl>
     <w:lvl w:ilvl="7">
       <w:start w:val="1"/>
@@ -6407,6 +6427,7 @@
         </w:tabs>
         <w:ind w:start="3240" w:hanging="360"/>
       </w:pPr>
+      <w:rPr/>
     </w:lvl>
     <w:lvl w:ilvl="8">
       <w:start w:val="1"/>
@@ -6419,6 +6440,7 @@
         </w:tabs>
         <w:ind w:start="3600" w:hanging="360"/>
       </w:pPr>
+      <w:rPr/>
     </w:lvl>
   </w:abstractNum>
   <w:abstractNum w:abstractNumId="4">
@@ -6569,6 +6591,7 @@
         </w:tabs>
         <w:ind w:start="1080" w:hanging="360"/>
       </w:pPr>
+      <w:rPr/>
     </w:lvl>
     <w:lvl w:ilvl="2">
       <w:start w:val="1"/>
@@ -6581,6 +6604,7 @@
         </w:tabs>
         <w:ind w:start="1440" w:hanging="360"/>
       </w:pPr>
+      <w:rPr/>
     </w:lvl>
     <w:lvl w:ilvl="3">
       <w:start w:val="1"/>
@@ -6593,6 +6617,7 @@
         </w:tabs>
         <w:ind w:start="1800" w:hanging="360"/>
       </w:pPr>
+      <w:rPr/>
     </w:lvl>
     <w:lvl w:ilvl="4">
       <w:start w:val="1"/>
@@ -6605,6 +6630,7 @@
         </w:tabs>
         <w:ind w:start="2160" w:hanging="360"/>
       </w:pPr>
+      <w:rPr/>
     </w:lvl>
     <w:lvl w:ilvl="5">
       <w:start w:val="1"/>
@@ -6617,6 +6643,7 @@
         </w:tabs>
         <w:ind w:start="2520" w:hanging="360"/>
       </w:pPr>
+      <w:rPr/>
     </w:lvl>
     <w:lvl w:ilvl="6">
       <w:start w:val="1"/>
@@ -6629,6 +6656,7 @@
         </w:tabs>
         <w:ind w:start="2880" w:hanging="360"/>
       </w:pPr>
+      <w:rPr/>
     </w:lvl>
     <w:lvl w:ilvl="7">
       <w:start w:val="1"/>
@@ -6641,6 +6669,7 @@
         </w:tabs>
         <w:ind w:start="3240" w:hanging="360"/>
       </w:pPr>
+      <w:rPr/>
     </w:lvl>
     <w:lvl w:ilvl="8">
       <w:start w:val="1"/>
@@ -6653,6 +6682,7 @@
         </w:tabs>
         <w:ind w:start="3600" w:hanging="360"/>
       </w:pPr>
+      <w:rPr/>
     </w:lvl>
   </w:abstractNum>
   <w:abstractNum w:abstractNumId="6">
@@ -7709,7 +7739,7 @@
         <w:ilvl w:val="0"/>
         <w:numId w:val="6"/>
       </w:numPr>
-      <w:overflowPunct w:val="true"/>
+      <w:overflowPunct w:val="false"/>
       <w:spacing w:before="0" w:after="120"/>
       <w:ind w:hanging="360" w:start="0" w:end="360"/>
       <w:jc w:val="both"/>
@@ -7869,6 +7899,13 @@
   <w:style w:type="paragraph" w:styleId="TOC9">
     <w:name w:val="toc 9"/>
     <w:basedOn w:val="Index"/>
+    <w:pPr/>
+    <w:rPr/>
+  </w:style>
+  <w:style w:type="paragraph" w:styleId="FrameContentsuser">
+    <w:name w:val="Frame Contents (user)"/>
+    <w:basedOn w:val="Normal"/>
+    <w:qFormat/>
     <w:pPr/>
     <w:rPr/>
   </w:style>

</xml_diff>

<commit_message>
splited client.cpp and client.h to more files added connectToServer function for the arduino
</commit_message>
<xml_diff>
--- a/project docs/Cyber_Proj_Shlomi_Levi.docx
+++ b/project docs/Cyber_Proj_Shlomi_Levi.docx
@@ -8,8 +8,8 @@
         <w:pStyle w:val="Normal"/>
         <w:bidi w:val="1"/>
         <w:spacing w:before="160" w:after="0"/>
-        <w:ind w:hanging="0" w:start="284" w:end="284"/>
-        <w:jc w:val="start"/>
+        <w:ind w:hanging="0" w:left="284" w:right="284"/>
+        <w:jc w:val="left"/>
         <w:rPr>
           <w:rFonts w:ascii="Arial" w:hAnsi="Arial" w:cs="Arial"/>
           <w:sz w:val="32"/>
@@ -31,8 +31,8 @@
       <w:pPr>
         <w:pStyle w:val="Normal"/>
         <w:bidi w:val="1"/>
-        <w:ind w:hanging="0" w:start="284" w:end="284"/>
-        <w:jc w:val="start"/>
+        <w:ind w:hanging="0" w:left="284" w:right="284"/>
+        <w:jc w:val="left"/>
         <w:rPr>
           <w:rFonts w:ascii="Arial" w:hAnsi="Arial" w:cs="Arial"/>
           <w:sz w:val="32"/>
@@ -54,8 +54,8 @@
       <w:pPr>
         <w:pStyle w:val="Normal"/>
         <w:bidi w:val="1"/>
-        <w:ind w:hanging="0" w:start="284" w:end="284"/>
-        <w:jc w:val="start"/>
+        <w:ind w:hanging="0" w:left="284" w:right="284"/>
+        <w:jc w:val="left"/>
         <w:rPr>
           <w:rFonts w:ascii="Arial" w:hAnsi="Arial" w:cs="Arial"/>
           <w:sz w:val="44"/>
@@ -65,7 +65,6 @@
       <w:r>
         <w:rPr>
           <w:rFonts w:ascii="Arial" w:hAnsi="Arial"/>
-          <w:sz w:val="32"/>
           <w:sz w:val="32"/>
           <w:szCs w:val="32"/>
           <w:rtl w:val="true"/>
@@ -85,7 +84,6 @@
       <w:r>
         <w:rPr>
           <w:rFonts w:ascii="Arial" w:hAnsi="Arial"/>
-          <w:sz w:val="32"/>
           <w:sz w:val="32"/>
           <w:szCs w:val="32"/>
           <w:rtl w:val="true"/>
@@ -135,7 +133,6 @@
         <w:rPr>
           <w:rFonts w:ascii="Arial" w:hAnsi="Arial"/>
           <w:sz w:val="32"/>
-          <w:sz w:val="32"/>
           <w:szCs w:val="32"/>
           <w:rtl w:val="true"/>
           <w:lang w:bidi="he-IL"/>
@@ -173,7 +170,6 @@
         <w:rPr>
           <w:rFonts w:ascii="Arial" w:hAnsi="Arial"/>
           <w:sz w:val="32"/>
-          <w:sz w:val="32"/>
           <w:szCs w:val="32"/>
           <w:rtl w:val="true"/>
           <w:lang w:bidi="he-IL"/>
@@ -222,31 +218,29 @@
         <w:rPr>
           <w:rFonts w:ascii="Arial" w:hAnsi="Arial"/>
           <w:sz w:val="32"/>
+          <w:szCs w:val="32"/>
+          <w:rtl w:val="true"/>
+          <w:lang w:bidi="he-IL"/>
+        </w:rPr>
+        <w:t>תשפ</w:t>
+      </w:r>
+      <w:r>
+        <w:rPr>
+          <w:rFonts w:cs="Arial" w:ascii="Arial" w:hAnsi="Arial"/>
+          <w:sz w:val="32"/>
+          <w:szCs w:val="32"/>
+          <w:rtl w:val="true"/>
+        </w:rPr>
+        <w:t>"</w:t>
+      </w:r>
+      <w:r>
+        <w:rPr>
+          <w:rFonts w:ascii="Arial" w:hAnsi="Arial"/>
           <w:sz w:val="32"/>
           <w:szCs w:val="32"/>
           <w:rtl w:val="true"/>
           <w:lang w:bidi="he-IL"/>
         </w:rPr>
-        <w:t>תשפ</w:t>
-      </w:r>
-      <w:r>
-        <w:rPr>
-          <w:rFonts w:cs="Arial" w:ascii="Arial" w:hAnsi="Arial"/>
-          <w:sz w:val="32"/>
-          <w:szCs w:val="32"/>
-          <w:rtl w:val="true"/>
-        </w:rPr>
-        <w:t>"</w:t>
-      </w:r>
-      <w:r>
-        <w:rPr>
-          <w:rFonts w:ascii="Arial" w:hAnsi="Arial"/>
-          <w:sz w:val="32"/>
-          <w:sz w:val="32"/>
-          <w:szCs w:val="32"/>
-          <w:rtl w:val="true"/>
-          <w:lang w:bidi="he-IL"/>
-        </w:rPr>
         <w:t>ו</w:t>
       </w:r>
     </w:p>
@@ -287,20 +281,20 @@
     <w:tbl>
       <w:tblPr>
         <w:tblW w:w="9999" w:type="dxa"/>
-        <w:jc w:val="start"/>
+        <w:jc w:val="left"/>
         <w:tblInd w:w="-342" w:type="dxa"/>
         <w:tblLayout w:type="fixed"/>
         <w:tblCellMar>
           <w:top w:w="0" w:type="dxa"/>
-          <w:start w:w="108" w:type="dxa"/>
+          <w:left w:w="108" w:type="dxa"/>
           <w:bottom w:w="0" w:type="dxa"/>
-          <w:end w:w="108" w:type="dxa"/>
+          <w:right w:w="108" w:type="dxa"/>
         </w:tblCellMar>
       </w:tblPr>
       <w:tblGrid>
         <w:gridCol w:w="2519"/>
         <w:gridCol w:w="1490"/>
-        <w:gridCol w:w="4396"/>
+        <w:gridCol w:w="4397"/>
         <w:gridCol w:w="1593"/>
       </w:tblGrid>
       <w:tr>
@@ -312,9 +306,9 @@
             <w:tcW w:w="2519" w:type="dxa"/>
             <w:tcBorders>
               <w:top w:val="single" w:sz="8" w:space="0" w:color="000000"/>
-              <w:start w:val="single" w:sz="8" w:space="0" w:color="000000"/>
+              <w:left w:val="single" w:sz="8" w:space="0" w:color="000000"/>
               <w:bottom w:val="single" w:sz="8" w:space="0" w:color="000000"/>
-              <w:end w:val="single" w:sz="8" w:space="0" w:color="000000"/>
+              <w:right w:val="single" w:sz="8" w:space="0" w:color="000000"/>
             </w:tcBorders>
           </w:tcPr>
           <w:p>
@@ -323,8 +317,8 @@
               <w:bidi w:val="1"/>
               <w:snapToGrid w:val="false"/>
               <w:spacing w:before="160" w:after="0"/>
-              <w:ind w:hanging="0" w:start="284" w:end="284"/>
-              <w:jc w:val="start"/>
+              <w:ind w:hanging="0" w:left="284" w:right="284"/>
+              <w:jc w:val="left"/>
               <w:rPr>
                 <w:rFonts w:ascii="Arial" w:hAnsi="Arial" w:cs="Arial"/>
                 <w:szCs w:val="24"/>
@@ -344,9 +338,9 @@
             <w:tcW w:w="1490" w:type="dxa"/>
             <w:tcBorders>
               <w:top w:val="single" w:sz="8" w:space="0" w:color="000000"/>
-              <w:start w:val="single" w:sz="8" w:space="0" w:color="000000"/>
+              <w:left w:val="single" w:sz="8" w:space="0" w:color="000000"/>
               <w:bottom w:val="single" w:sz="8" w:space="0" w:color="000000"/>
-              <w:end w:val="single" w:sz="8" w:space="0" w:color="000000"/>
+              <w:right w:val="single" w:sz="8" w:space="0" w:color="000000"/>
             </w:tcBorders>
           </w:tcPr>
           <w:p>
@@ -354,8 +348,8 @@
               <w:pStyle w:val="Normal"/>
               <w:bidi w:val="1"/>
               <w:spacing w:before="160" w:after="0"/>
-              <w:ind w:hanging="0" w:start="284" w:end="284"/>
-              <w:jc w:val="start"/>
+              <w:ind w:hanging="0" w:left="284" w:right="284"/>
+              <w:jc w:val="left"/>
               <w:rPr/>
             </w:pPr>
             <w:r>
@@ -415,12 +409,12 @@
         </w:tc>
         <w:tc>
           <w:tcPr>
-            <w:tcW w:w="4396" w:type="dxa"/>
+            <w:tcW w:w="4397" w:type="dxa"/>
             <w:tcBorders>
               <w:top w:val="single" w:sz="8" w:space="0" w:color="000000"/>
-              <w:start w:val="single" w:sz="8" w:space="0" w:color="000000"/>
+              <w:left w:val="single" w:sz="8" w:space="0" w:color="000000"/>
               <w:bottom w:val="single" w:sz="8" w:space="0" w:color="000000"/>
-              <w:end w:val="single" w:sz="8" w:space="0" w:color="000000"/>
+              <w:right w:val="single" w:sz="8" w:space="0" w:color="000000"/>
             </w:tcBorders>
           </w:tcPr>
           <w:p>
@@ -429,8 +423,8 @@
               <w:bidi w:val="1"/>
               <w:snapToGrid w:val="false"/>
               <w:spacing w:before="160" w:after="0"/>
-              <w:ind w:hanging="0" w:start="284" w:end="284"/>
-              <w:jc w:val="start"/>
+              <w:ind w:hanging="0" w:left="284" w:right="284"/>
+              <w:jc w:val="left"/>
               <w:rPr>
                 <w:rFonts w:ascii="Arial" w:hAnsi="Arial" w:cs="Arial"/>
                 <w:szCs w:val="24"/>
@@ -451,9 +445,9 @@
             <w:tcW w:w="1593" w:type="dxa"/>
             <w:tcBorders>
               <w:top w:val="single" w:sz="8" w:space="0" w:color="000000"/>
-              <w:start w:val="single" w:sz="8" w:space="0" w:color="000000"/>
+              <w:left w:val="single" w:sz="8" w:space="0" w:color="000000"/>
               <w:bottom w:val="single" w:sz="8" w:space="0" w:color="000000"/>
-              <w:end w:val="single" w:sz="8" w:space="0" w:color="000000"/>
+              <w:right w:val="single" w:sz="8" w:space="0" w:color="000000"/>
             </w:tcBorders>
           </w:tcPr>
           <w:p>
@@ -461,8 +455,8 @@
               <w:pStyle w:val="Normal"/>
               <w:bidi w:val="1"/>
               <w:spacing w:before="160" w:after="0"/>
-              <w:ind w:hanging="0" w:start="284" w:end="284"/>
-              <w:jc w:val="start"/>
+              <w:ind w:hanging="0" w:left="284" w:right="284"/>
+              <w:jc w:val="left"/>
               <w:rPr/>
             </w:pPr>
             <w:r>
@@ -500,13 +494,13 @@
         </w:trPr>
         <w:tc>
           <w:tcPr>
-            <w:tcW w:w="8405" w:type="dxa"/>
+            <w:tcW w:w="8406" w:type="dxa"/>
             <w:gridSpan w:val="3"/>
             <w:tcBorders>
               <w:top w:val="single" w:sz="8" w:space="0" w:color="000000"/>
-              <w:start w:val="single" w:sz="8" w:space="0" w:color="000000"/>
+              <w:left w:val="single" w:sz="8" w:space="0" w:color="000000"/>
               <w:bottom w:val="single" w:sz="8" w:space="0" w:color="000000"/>
-              <w:end w:val="single" w:sz="8" w:space="0" w:color="000000"/>
+              <w:right w:val="single" w:sz="8" w:space="0" w:color="000000"/>
             </w:tcBorders>
           </w:tcPr>
           <w:p>
@@ -515,8 +509,8 @@
               <w:bidi w:val="1"/>
               <w:snapToGrid w:val="false"/>
               <w:spacing w:before="160" w:after="0"/>
-              <w:ind w:hanging="0" w:start="284" w:end="284"/>
-              <w:jc w:val="start"/>
+              <w:ind w:hanging="0" w:left="284" w:right="284"/>
+              <w:jc w:val="left"/>
               <w:rPr>
                 <w:rFonts w:ascii="Arial" w:hAnsi="Arial" w:cs="Arial"/>
                 <w:szCs w:val="24"/>
@@ -536,9 +530,9 @@
             <w:tcW w:w="1593" w:type="dxa"/>
             <w:tcBorders>
               <w:top w:val="single" w:sz="8" w:space="0" w:color="000000"/>
-              <w:start w:val="single" w:sz="8" w:space="0" w:color="000000"/>
+              <w:left w:val="single" w:sz="8" w:space="0" w:color="000000"/>
               <w:bottom w:val="single" w:sz="8" w:space="0" w:color="000000"/>
-              <w:end w:val="single" w:sz="8" w:space="0" w:color="000000"/>
+              <w:right w:val="single" w:sz="8" w:space="0" w:color="000000"/>
             </w:tcBorders>
           </w:tcPr>
           <w:p>
@@ -546,8 +540,8 @@
               <w:pStyle w:val="Normal"/>
               <w:bidi w:val="1"/>
               <w:spacing w:before="160" w:after="0"/>
-              <w:ind w:hanging="0" w:start="284" w:end="284"/>
-              <w:jc w:val="start"/>
+              <w:ind w:hanging="0" w:left="284" w:right="284"/>
+              <w:jc w:val="left"/>
               <w:rPr/>
             </w:pPr>
             <w:r>
@@ -588,9 +582,9 @@
             <w:tcW w:w="2519" w:type="dxa"/>
             <w:tcBorders>
               <w:top w:val="single" w:sz="8" w:space="0" w:color="000000"/>
-              <w:start w:val="single" w:sz="8" w:space="0" w:color="000000"/>
+              <w:left w:val="single" w:sz="8" w:space="0" w:color="000000"/>
               <w:bottom w:val="single" w:sz="8" w:space="0" w:color="000000"/>
-              <w:end w:val="single" w:sz="8" w:space="0" w:color="000000"/>
+              <w:right w:val="single" w:sz="8" w:space="0" w:color="000000"/>
             </w:tcBorders>
           </w:tcPr>
           <w:p>
@@ -598,8 +592,8 @@
               <w:pStyle w:val="Normal"/>
               <w:bidi w:val="1"/>
               <w:spacing w:before="160" w:after="0"/>
-              <w:ind w:hanging="0" w:start="284" w:end="284"/>
-              <w:jc w:val="start"/>
+              <w:ind w:hanging="0" w:left="284" w:right="284"/>
+              <w:jc w:val="left"/>
               <w:rPr>
                 <w:rFonts w:ascii="Arial" w:hAnsi="Arial" w:cs="Arial"/>
                 <w:szCs w:val="24"/>
@@ -621,9 +615,9 @@
             <w:tcW w:w="1490" w:type="dxa"/>
             <w:tcBorders>
               <w:top w:val="single" w:sz="8" w:space="0" w:color="000000"/>
-              <w:start w:val="single" w:sz="8" w:space="0" w:color="000000"/>
+              <w:left w:val="single" w:sz="8" w:space="0" w:color="000000"/>
               <w:bottom w:val="single" w:sz="8" w:space="0" w:color="000000"/>
-              <w:end w:val="single" w:sz="8" w:space="0" w:color="000000"/>
+              <w:right w:val="single" w:sz="8" w:space="0" w:color="000000"/>
             </w:tcBorders>
           </w:tcPr>
           <w:p>
@@ -631,8 +625,8 @@
               <w:pStyle w:val="Normal"/>
               <w:bidi w:val="1"/>
               <w:spacing w:before="160" w:after="0"/>
-              <w:ind w:hanging="0" w:start="284" w:end="284"/>
-              <w:jc w:val="start"/>
+              <w:ind w:hanging="0" w:left="284" w:right="284"/>
+              <w:jc w:val="left"/>
               <w:rPr>
                 <w:rFonts w:ascii="Arial" w:hAnsi="Arial" w:cs="Arial"/>
                 <w:szCs w:val="24"/>
@@ -652,12 +646,12 @@
         </w:tc>
         <w:tc>
           <w:tcPr>
-            <w:tcW w:w="4396" w:type="dxa"/>
+            <w:tcW w:w="4397" w:type="dxa"/>
             <w:tcBorders>
               <w:top w:val="single" w:sz="8" w:space="0" w:color="000000"/>
-              <w:start w:val="single" w:sz="8" w:space="0" w:color="000000"/>
+              <w:left w:val="single" w:sz="8" w:space="0" w:color="000000"/>
               <w:bottom w:val="single" w:sz="8" w:space="0" w:color="000000"/>
-              <w:end w:val="single" w:sz="8" w:space="0" w:color="000000"/>
+              <w:right w:val="single" w:sz="8" w:space="0" w:color="000000"/>
             </w:tcBorders>
           </w:tcPr>
           <w:p>
@@ -665,8 +659,8 @@
               <w:pStyle w:val="Normal"/>
               <w:bidi w:val="1"/>
               <w:spacing w:before="160" w:after="0"/>
-              <w:ind w:hanging="0" w:start="284" w:end="284"/>
-              <w:jc w:val="start"/>
+              <w:ind w:hanging="0" w:left="284" w:right="284"/>
+              <w:jc w:val="left"/>
               <w:rPr>
                 <w:rFonts w:ascii="Arial" w:hAnsi="Arial" w:cs="Arial"/>
                 <w:szCs w:val="24"/>
@@ -689,9 +683,9 @@
             <w:tcW w:w="1593" w:type="dxa"/>
             <w:tcBorders>
               <w:top w:val="single" w:sz="8" w:space="0" w:color="000000"/>
-              <w:start w:val="single" w:sz="8" w:space="0" w:color="000000"/>
+              <w:left w:val="single" w:sz="8" w:space="0" w:color="000000"/>
               <w:bottom w:val="single" w:sz="8" w:space="0" w:color="000000"/>
-              <w:end w:val="single" w:sz="8" w:space="0" w:color="000000"/>
+              <w:right w:val="single" w:sz="8" w:space="0" w:color="000000"/>
             </w:tcBorders>
           </w:tcPr>
           <w:p>
@@ -699,8 +693,8 @@
               <w:pStyle w:val="Normal"/>
               <w:bidi w:val="1"/>
               <w:spacing w:before="160" w:after="0"/>
-              <w:ind w:hanging="0" w:start="284" w:end="284"/>
-              <w:jc w:val="start"/>
+              <w:ind w:hanging="0" w:left="284" w:right="284"/>
+              <w:jc w:val="left"/>
               <w:rPr/>
             </w:pPr>
             <w:r>
@@ -788,15 +782,15 @@
         <w:tblLayout w:type="fixed"/>
         <w:tblCellMar>
           <w:top w:w="0" w:type="dxa"/>
-          <w:start w:w="108" w:type="dxa"/>
+          <w:left w:w="108" w:type="dxa"/>
           <w:bottom w:w="0" w:type="dxa"/>
-          <w:end w:w="108" w:type="dxa"/>
+          <w:right w:w="108" w:type="dxa"/>
         </w:tblCellMar>
       </w:tblPr>
       <w:tblGrid>
-        <w:gridCol w:w="1258"/>
+        <w:gridCol w:w="1257"/>
         <w:gridCol w:w="1008"/>
-        <w:gridCol w:w="7724"/>
+        <w:gridCol w:w="7725"/>
       </w:tblGrid>
       <w:tr>
         <w:trPr>
@@ -804,12 +798,12 @@
         </w:trPr>
         <w:tc>
           <w:tcPr>
-            <w:tcW w:w="1258" w:type="dxa"/>
+            <w:tcW w:w="1257" w:type="dxa"/>
             <w:tcBorders>
               <w:top w:val="single" w:sz="12" w:space="0" w:color="000000"/>
-              <w:start w:val="single" w:sz="12" w:space="0" w:color="000000"/>
+              <w:left w:val="single" w:sz="12" w:space="0" w:color="000000"/>
               <w:bottom w:val="single" w:sz="18" w:space="0" w:color="000000"/>
-              <w:end w:val="single" w:sz="6" w:space="0" w:color="000000"/>
+              <w:right w:val="single" w:sz="6" w:space="0" w:color="000000"/>
             </w:tcBorders>
             <w:shd w:fill="CCCCCC" w:val="clear"/>
           </w:tcPr>
@@ -817,7 +811,7 @@
             <w:pPr>
               <w:pStyle w:val="Normal"/>
               <w:spacing w:before="160" w:after="0"/>
-              <w:ind w:hanging="0" w:start="34" w:end="284"/>
+              <w:ind w:hanging="0" w:left="34" w:right="284"/>
               <w:jc w:val="both"/>
               <w:rPr/>
             </w:pPr>
@@ -832,9 +826,9 @@
             <w:tcW w:w="1008" w:type="dxa"/>
             <w:tcBorders>
               <w:top w:val="single" w:sz="12" w:space="0" w:color="000000"/>
-              <w:start w:val="single" w:sz="6" w:space="0" w:color="000000"/>
+              <w:left w:val="single" w:sz="6" w:space="0" w:color="000000"/>
               <w:bottom w:val="single" w:sz="18" w:space="0" w:color="000000"/>
-              <w:end w:val="single" w:sz="6" w:space="0" w:color="000000"/>
+              <w:right w:val="single" w:sz="6" w:space="0" w:color="000000"/>
             </w:tcBorders>
             <w:shd w:fill="CCCCCC" w:val="clear"/>
           </w:tcPr>
@@ -842,7 +836,7 @@
             <w:pPr>
               <w:pStyle w:val="Normal"/>
               <w:spacing w:before="160" w:after="0"/>
-              <w:ind w:hanging="0" w:start="0" w:end="284"/>
+              <w:ind w:hanging="0" w:left="0" w:right="284"/>
               <w:jc w:val="center"/>
               <w:rPr/>
             </w:pPr>
@@ -854,12 +848,12 @@
         </w:tc>
         <w:tc>
           <w:tcPr>
-            <w:tcW w:w="7724" w:type="dxa"/>
+            <w:tcW w:w="7725" w:type="dxa"/>
             <w:tcBorders>
               <w:top w:val="single" w:sz="12" w:space="0" w:color="000000"/>
-              <w:start w:val="single" w:sz="6" w:space="0" w:color="000000"/>
+              <w:left w:val="single" w:sz="6" w:space="0" w:color="000000"/>
               <w:bottom w:val="single" w:sz="18" w:space="0" w:color="000000"/>
-              <w:end w:val="single" w:sz="12" w:space="0" w:color="000000"/>
+              <w:right w:val="single" w:sz="12" w:space="0" w:color="000000"/>
             </w:tcBorders>
             <w:shd w:fill="CCCCCC" w:val="clear"/>
           </w:tcPr>
@@ -867,7 +861,7 @@
             <w:pPr>
               <w:pStyle w:val="Normal"/>
               <w:spacing w:before="160" w:after="0"/>
-              <w:ind w:hanging="0" w:start="0" w:end="284"/>
+              <w:ind w:hanging="0" w:left="0" w:right="284"/>
               <w:rPr/>
             </w:pPr>
             <w:r>
@@ -883,18 +877,18 @@
         </w:trPr>
         <w:tc>
           <w:tcPr>
-            <w:tcW w:w="1258" w:type="dxa"/>
+            <w:tcW w:w="1257" w:type="dxa"/>
             <w:tcBorders>
-              <w:start w:val="single" w:sz="12" w:space="0" w:color="000000"/>
+              <w:left w:val="single" w:sz="12" w:space="0" w:color="000000"/>
               <w:bottom w:val="single" w:sz="6" w:space="0" w:color="000000"/>
-              <w:end w:val="single" w:sz="6" w:space="0" w:color="000000"/>
+              <w:right w:val="single" w:sz="6" w:space="0" w:color="000000"/>
             </w:tcBorders>
           </w:tcPr>
           <w:p>
             <w:pPr>
               <w:pStyle w:val="Normal"/>
               <w:spacing w:before="160" w:after="0"/>
-              <w:ind w:hanging="0" w:start="34" w:end="284"/>
+              <w:ind w:hanging="0" w:left="34" w:right="284"/>
               <w:jc w:val="both"/>
               <w:rPr>
                 <w:rFonts w:ascii="Arial" w:hAnsi="Arial" w:cs="Arial"/>
@@ -912,9 +906,9 @@
           <w:tcPr>
             <w:tcW w:w="1008" w:type="dxa"/>
             <w:tcBorders>
-              <w:start w:val="single" w:sz="6" w:space="0" w:color="000000"/>
+              <w:left w:val="single" w:sz="6" w:space="0" w:color="000000"/>
               <w:bottom w:val="single" w:sz="6" w:space="0" w:color="000000"/>
-              <w:end w:val="single" w:sz="6" w:space="0" w:color="000000"/>
+              <w:right w:val="single" w:sz="6" w:space="0" w:color="000000"/>
             </w:tcBorders>
           </w:tcPr>
           <w:p>
@@ -922,7 +916,7 @@
               <w:pStyle w:val="Normal"/>
               <w:snapToGrid w:val="false"/>
               <w:spacing w:before="160" w:after="0"/>
-              <w:ind w:hanging="0" w:start="0" w:end="284"/>
+              <w:ind w:hanging="0" w:left="0" w:right="284"/>
               <w:jc w:val="both"/>
               <w:rPr>
                 <w:rFonts w:ascii="Arial" w:hAnsi="Arial" w:cs="Arial"/>
@@ -939,18 +933,18 @@
         </w:tc>
         <w:tc>
           <w:tcPr>
-            <w:tcW w:w="7724" w:type="dxa"/>
+            <w:tcW w:w="7725" w:type="dxa"/>
             <w:tcBorders>
-              <w:start w:val="single" w:sz="6" w:space="0" w:color="000000"/>
+              <w:left w:val="single" w:sz="6" w:space="0" w:color="000000"/>
               <w:bottom w:val="single" w:sz="6" w:space="0" w:color="000000"/>
-              <w:end w:val="single" w:sz="12" w:space="0" w:color="000000"/>
+              <w:right w:val="single" w:sz="12" w:space="0" w:color="000000"/>
             </w:tcBorders>
           </w:tcPr>
           <w:p>
             <w:pPr>
               <w:pStyle w:val="Normal"/>
               <w:spacing w:before="160" w:after="0"/>
-              <w:ind w:hanging="0" w:start="0" w:end="284"/>
+              <w:ind w:hanging="0" w:left="0" w:right="284"/>
               <w:jc w:val="both"/>
               <w:rPr>
                 <w:rFonts w:ascii="Arial" w:hAnsi="Arial" w:cs="Arial"/>
@@ -971,12 +965,12 @@
         </w:trPr>
         <w:tc>
           <w:tcPr>
-            <w:tcW w:w="1258" w:type="dxa"/>
+            <w:tcW w:w="1257" w:type="dxa"/>
             <w:tcBorders>
               <w:top w:val="single" w:sz="6" w:space="0" w:color="000000"/>
-              <w:start w:val="single" w:sz="12" w:space="0" w:color="000000"/>
+              <w:left w:val="single" w:sz="12" w:space="0" w:color="000000"/>
               <w:bottom w:val="single" w:sz="6" w:space="0" w:color="000000"/>
-              <w:end w:val="single" w:sz="6" w:space="0" w:color="000000"/>
+              <w:right w:val="single" w:sz="6" w:space="0" w:color="000000"/>
             </w:tcBorders>
           </w:tcPr>
           <w:p>
@@ -984,7 +978,7 @@
               <w:pStyle w:val="Normal"/>
               <w:snapToGrid w:val="false"/>
               <w:spacing w:before="160" w:after="0"/>
-              <w:ind w:hanging="0" w:start="34" w:end="284"/>
+              <w:ind w:hanging="0" w:left="34" w:right="284"/>
               <w:jc w:val="both"/>
               <w:rPr>
                 <w:rFonts w:ascii="Arial" w:hAnsi="Arial" w:cs="Arial"/>
@@ -1002,9 +996,9 @@
             <w:tcW w:w="1008" w:type="dxa"/>
             <w:tcBorders>
               <w:top w:val="single" w:sz="6" w:space="0" w:color="000000"/>
-              <w:start w:val="single" w:sz="6" w:space="0" w:color="000000"/>
+              <w:left w:val="single" w:sz="6" w:space="0" w:color="000000"/>
               <w:bottom w:val="single" w:sz="6" w:space="0" w:color="000000"/>
-              <w:end w:val="single" w:sz="6" w:space="0" w:color="000000"/>
+              <w:right w:val="single" w:sz="6" w:space="0" w:color="000000"/>
             </w:tcBorders>
           </w:tcPr>
           <w:p>
@@ -1012,7 +1006,7 @@
               <w:pStyle w:val="Normal"/>
               <w:snapToGrid w:val="false"/>
               <w:spacing w:before="160" w:after="0"/>
-              <w:ind w:hanging="0" w:start="0" w:end="284"/>
+              <w:ind w:hanging="0" w:left="0" w:right="284"/>
               <w:jc w:val="both"/>
               <w:rPr>
                 <w:rFonts w:ascii="Arial" w:hAnsi="Arial" w:cs="Arial"/>
@@ -1027,12 +1021,12 @@
         </w:tc>
         <w:tc>
           <w:tcPr>
-            <w:tcW w:w="7724" w:type="dxa"/>
+            <w:tcW w:w="7725" w:type="dxa"/>
             <w:tcBorders>
               <w:top w:val="single" w:sz="6" w:space="0" w:color="000000"/>
-              <w:start w:val="single" w:sz="6" w:space="0" w:color="000000"/>
+              <w:left w:val="single" w:sz="6" w:space="0" w:color="000000"/>
               <w:bottom w:val="single" w:sz="6" w:space="0" w:color="000000"/>
-              <w:end w:val="single" w:sz="12" w:space="0" w:color="000000"/>
+              <w:right w:val="single" w:sz="12" w:space="0" w:color="000000"/>
             </w:tcBorders>
           </w:tcPr>
           <w:p>
@@ -1040,7 +1034,7 @@
               <w:pStyle w:val="Normal"/>
               <w:snapToGrid w:val="false"/>
               <w:spacing w:before="160" w:after="0"/>
-              <w:ind w:hanging="0" w:start="0" w:end="284"/>
+              <w:ind w:hanging="0" w:left="0" w:right="284"/>
               <w:jc w:val="both"/>
               <w:rPr>
                 <w:rFonts w:ascii="Arial" w:hAnsi="Arial" w:cs="Arial"/>
@@ -1062,12 +1056,12 @@
         </w:trPr>
         <w:tc>
           <w:tcPr>
-            <w:tcW w:w="1258" w:type="dxa"/>
+            <w:tcW w:w="1257" w:type="dxa"/>
             <w:tcBorders>
               <w:top w:val="single" w:sz="6" w:space="0" w:color="000000"/>
-              <w:start w:val="single" w:sz="12" w:space="0" w:color="000000"/>
+              <w:left w:val="single" w:sz="12" w:space="0" w:color="000000"/>
               <w:bottom w:val="single" w:sz="6" w:space="0" w:color="000000"/>
-              <w:end w:val="single" w:sz="6" w:space="0" w:color="000000"/>
+              <w:right w:val="single" w:sz="6" w:space="0" w:color="000000"/>
             </w:tcBorders>
           </w:tcPr>
           <w:p>
@@ -1075,7 +1069,7 @@
               <w:pStyle w:val="Normal"/>
               <w:snapToGrid w:val="false"/>
               <w:spacing w:before="160" w:after="0"/>
-              <w:ind w:hanging="0" w:start="34" w:end="284"/>
+              <w:ind w:hanging="0" w:left="34" w:right="284"/>
               <w:jc w:val="both"/>
               <w:rPr>
                 <w:rFonts w:ascii="Arial" w:hAnsi="Arial" w:cs="Arial"/>
@@ -1095,9 +1089,9 @@
             <w:tcW w:w="1008" w:type="dxa"/>
             <w:tcBorders>
               <w:top w:val="single" w:sz="6" w:space="0" w:color="000000"/>
-              <w:start w:val="single" w:sz="6" w:space="0" w:color="000000"/>
+              <w:left w:val="single" w:sz="6" w:space="0" w:color="000000"/>
               <w:bottom w:val="single" w:sz="6" w:space="0" w:color="000000"/>
-              <w:end w:val="single" w:sz="6" w:space="0" w:color="000000"/>
+              <w:right w:val="single" w:sz="6" w:space="0" w:color="000000"/>
             </w:tcBorders>
           </w:tcPr>
           <w:p>
@@ -1105,7 +1099,7 @@
               <w:pStyle w:val="Normal"/>
               <w:snapToGrid w:val="false"/>
               <w:spacing w:before="160" w:after="0"/>
-              <w:ind w:hanging="0" w:start="0" w:end="284"/>
+              <w:ind w:hanging="0" w:left="0" w:right="284"/>
               <w:jc w:val="both"/>
               <w:rPr>
                 <w:rFonts w:ascii="Arial" w:hAnsi="Arial" w:cs="Arial"/>
@@ -1122,12 +1116,12 @@
         </w:tc>
         <w:tc>
           <w:tcPr>
-            <w:tcW w:w="7724" w:type="dxa"/>
+            <w:tcW w:w="7725" w:type="dxa"/>
             <w:tcBorders>
               <w:top w:val="single" w:sz="6" w:space="0" w:color="000000"/>
-              <w:start w:val="single" w:sz="6" w:space="0" w:color="000000"/>
+              <w:left w:val="single" w:sz="6" w:space="0" w:color="000000"/>
               <w:bottom w:val="single" w:sz="6" w:space="0" w:color="000000"/>
-              <w:end w:val="single" w:sz="12" w:space="0" w:color="000000"/>
+              <w:right w:val="single" w:sz="12" w:space="0" w:color="000000"/>
             </w:tcBorders>
           </w:tcPr>
           <w:p>
@@ -1135,7 +1129,7 @@
               <w:pStyle w:val="Normal"/>
               <w:snapToGrid w:val="false"/>
               <w:spacing w:before="160" w:after="0"/>
-              <w:ind w:hanging="0" w:start="0" w:end="284"/>
+              <w:ind w:hanging="0" w:left="0" w:right="284"/>
               <w:jc w:val="both"/>
               <w:rPr>
                 <w:rFonts w:ascii="Arial" w:hAnsi="Arial" w:cs="Arial"/>
@@ -1157,12 +1151,12 @@
         </w:trPr>
         <w:tc>
           <w:tcPr>
-            <w:tcW w:w="1258" w:type="dxa"/>
+            <w:tcW w:w="1257" w:type="dxa"/>
             <w:tcBorders>
               <w:top w:val="single" w:sz="6" w:space="0" w:color="000000"/>
-              <w:start w:val="single" w:sz="12" w:space="0" w:color="000000"/>
+              <w:left w:val="single" w:sz="12" w:space="0" w:color="000000"/>
               <w:bottom w:val="single" w:sz="6" w:space="0" w:color="000000"/>
-              <w:end w:val="single" w:sz="6" w:space="0" w:color="000000"/>
+              <w:right w:val="single" w:sz="6" w:space="0" w:color="000000"/>
             </w:tcBorders>
           </w:tcPr>
           <w:p>
@@ -1170,7 +1164,7 @@
               <w:pStyle w:val="Normal"/>
               <w:snapToGrid w:val="false"/>
               <w:spacing w:before="160" w:after="0"/>
-              <w:ind w:hanging="0" w:start="34" w:end="284"/>
+              <w:ind w:hanging="0" w:left="34" w:right="284"/>
               <w:jc w:val="both"/>
               <w:rPr>
                 <w:rFonts w:ascii="Arial" w:hAnsi="Arial" w:cs="Arial"/>
@@ -1190,9 +1184,9 @@
             <w:tcW w:w="1008" w:type="dxa"/>
             <w:tcBorders>
               <w:top w:val="single" w:sz="6" w:space="0" w:color="000000"/>
-              <w:start w:val="single" w:sz="6" w:space="0" w:color="000000"/>
+              <w:left w:val="single" w:sz="6" w:space="0" w:color="000000"/>
               <w:bottom w:val="single" w:sz="6" w:space="0" w:color="000000"/>
-              <w:end w:val="single" w:sz="6" w:space="0" w:color="000000"/>
+              <w:right w:val="single" w:sz="6" w:space="0" w:color="000000"/>
             </w:tcBorders>
           </w:tcPr>
           <w:p>
@@ -1200,7 +1194,7 @@
               <w:pStyle w:val="Normal"/>
               <w:snapToGrid w:val="false"/>
               <w:spacing w:before="160" w:after="0"/>
-              <w:ind w:hanging="0" w:start="0" w:end="284"/>
+              <w:ind w:hanging="0" w:left="0" w:right="284"/>
               <w:jc w:val="both"/>
               <w:rPr>
                 <w:rFonts w:ascii="Arial" w:hAnsi="Arial" w:cs="Arial"/>
@@ -1217,12 +1211,12 @@
         </w:tc>
         <w:tc>
           <w:tcPr>
-            <w:tcW w:w="7724" w:type="dxa"/>
+            <w:tcW w:w="7725" w:type="dxa"/>
             <w:tcBorders>
               <w:top w:val="single" w:sz="6" w:space="0" w:color="000000"/>
-              <w:start w:val="single" w:sz="6" w:space="0" w:color="000000"/>
+              <w:left w:val="single" w:sz="6" w:space="0" w:color="000000"/>
               <w:bottom w:val="single" w:sz="6" w:space="0" w:color="000000"/>
-              <w:end w:val="single" w:sz="12" w:space="0" w:color="000000"/>
+              <w:right w:val="single" w:sz="12" w:space="0" w:color="000000"/>
             </w:tcBorders>
           </w:tcPr>
           <w:p>
@@ -1230,7 +1224,7 @@
               <w:pStyle w:val="Normal"/>
               <w:snapToGrid w:val="false"/>
               <w:spacing w:before="160" w:after="0"/>
-              <w:ind w:hanging="0" w:start="0" w:end="284"/>
+              <w:ind w:hanging="0" w:left="0" w:right="284"/>
               <w:jc w:val="both"/>
               <w:rPr>
                 <w:rFonts w:ascii="Arial" w:hAnsi="Arial" w:cs="Arial"/>
@@ -1252,12 +1246,12 @@
         </w:trPr>
         <w:tc>
           <w:tcPr>
-            <w:tcW w:w="1258" w:type="dxa"/>
+            <w:tcW w:w="1257" w:type="dxa"/>
             <w:tcBorders>
               <w:top w:val="single" w:sz="6" w:space="0" w:color="000000"/>
-              <w:start w:val="single" w:sz="12" w:space="0" w:color="000000"/>
+              <w:left w:val="single" w:sz="12" w:space="0" w:color="000000"/>
               <w:bottom w:val="single" w:sz="6" w:space="0" w:color="000000"/>
-              <w:end w:val="single" w:sz="6" w:space="0" w:color="000000"/>
+              <w:right w:val="single" w:sz="6" w:space="0" w:color="000000"/>
             </w:tcBorders>
           </w:tcPr>
           <w:p>
@@ -1265,7 +1259,7 @@
               <w:pStyle w:val="Normal"/>
               <w:snapToGrid w:val="false"/>
               <w:spacing w:before="160" w:after="0"/>
-              <w:ind w:hanging="0" w:start="34" w:end="284"/>
+              <w:ind w:hanging="0" w:left="34" w:right="284"/>
               <w:jc w:val="both"/>
               <w:rPr>
                 <w:rFonts w:ascii="Arial" w:hAnsi="Arial" w:cs="Arial"/>
@@ -1285,9 +1279,9 @@
             <w:tcW w:w="1008" w:type="dxa"/>
             <w:tcBorders>
               <w:top w:val="single" w:sz="6" w:space="0" w:color="000000"/>
-              <w:start w:val="single" w:sz="6" w:space="0" w:color="000000"/>
+              <w:left w:val="single" w:sz="6" w:space="0" w:color="000000"/>
               <w:bottom w:val="single" w:sz="6" w:space="0" w:color="000000"/>
-              <w:end w:val="single" w:sz="6" w:space="0" w:color="000000"/>
+              <w:right w:val="single" w:sz="6" w:space="0" w:color="000000"/>
             </w:tcBorders>
           </w:tcPr>
           <w:p>
@@ -1295,7 +1289,7 @@
               <w:pStyle w:val="Normal"/>
               <w:snapToGrid w:val="false"/>
               <w:spacing w:before="160" w:after="0"/>
-              <w:ind w:hanging="0" w:start="0" w:end="284"/>
+              <w:ind w:hanging="0" w:left="0" w:right="284"/>
               <w:jc w:val="both"/>
               <w:rPr>
                 <w:rFonts w:ascii="Arial" w:hAnsi="Arial" w:cs="Arial"/>
@@ -1312,12 +1306,12 @@
         </w:tc>
         <w:tc>
           <w:tcPr>
-            <w:tcW w:w="7724" w:type="dxa"/>
+            <w:tcW w:w="7725" w:type="dxa"/>
             <w:tcBorders>
               <w:top w:val="single" w:sz="6" w:space="0" w:color="000000"/>
-              <w:start w:val="single" w:sz="6" w:space="0" w:color="000000"/>
+              <w:left w:val="single" w:sz="6" w:space="0" w:color="000000"/>
               <w:bottom w:val="single" w:sz="6" w:space="0" w:color="000000"/>
-              <w:end w:val="single" w:sz="12" w:space="0" w:color="000000"/>
+              <w:right w:val="single" w:sz="12" w:space="0" w:color="000000"/>
             </w:tcBorders>
           </w:tcPr>
           <w:p>
@@ -1325,7 +1319,7 @@
               <w:pStyle w:val="Normal"/>
               <w:snapToGrid w:val="false"/>
               <w:spacing w:before="160" w:after="0"/>
-              <w:ind w:hanging="0" w:start="0" w:end="284"/>
+              <w:ind w:hanging="0" w:left="0" w:right="284"/>
               <w:jc w:val="both"/>
               <w:rPr>
                 <w:rFonts w:ascii="Arial" w:hAnsi="Arial" w:cs="Arial"/>
@@ -1347,12 +1341,12 @@
         </w:trPr>
         <w:tc>
           <w:tcPr>
-            <w:tcW w:w="1258" w:type="dxa"/>
+            <w:tcW w:w="1257" w:type="dxa"/>
             <w:tcBorders>
               <w:top w:val="single" w:sz="6" w:space="0" w:color="000000"/>
-              <w:start w:val="single" w:sz="12" w:space="0" w:color="000000"/>
+              <w:left w:val="single" w:sz="12" w:space="0" w:color="000000"/>
               <w:bottom w:val="single" w:sz="12" w:space="0" w:color="000000"/>
-              <w:end w:val="single" w:sz="6" w:space="0" w:color="000000"/>
+              <w:right w:val="single" w:sz="6" w:space="0" w:color="000000"/>
             </w:tcBorders>
           </w:tcPr>
           <w:p>
@@ -1360,7 +1354,7 @@
               <w:pStyle w:val="Normal"/>
               <w:snapToGrid w:val="false"/>
               <w:spacing w:before="160" w:after="0"/>
-              <w:ind w:hanging="0" w:start="34" w:end="284"/>
+              <w:ind w:hanging="0" w:left="34" w:right="284"/>
               <w:jc w:val="both"/>
               <w:rPr>
                 <w:rFonts w:ascii="Arial" w:hAnsi="Arial" w:cs="Arial"/>
@@ -1380,9 +1374,9 @@
             <w:tcW w:w="1008" w:type="dxa"/>
             <w:tcBorders>
               <w:top w:val="single" w:sz="6" w:space="0" w:color="000000"/>
-              <w:start w:val="single" w:sz="6" w:space="0" w:color="000000"/>
+              <w:left w:val="single" w:sz="6" w:space="0" w:color="000000"/>
               <w:bottom w:val="single" w:sz="12" w:space="0" w:color="000000"/>
-              <w:end w:val="single" w:sz="6" w:space="0" w:color="000000"/>
+              <w:right w:val="single" w:sz="6" w:space="0" w:color="000000"/>
             </w:tcBorders>
           </w:tcPr>
           <w:p>
@@ -1390,7 +1384,7 @@
               <w:pStyle w:val="Normal"/>
               <w:snapToGrid w:val="false"/>
               <w:spacing w:before="160" w:after="0"/>
-              <w:ind w:hanging="0" w:start="0" w:end="284"/>
+              <w:ind w:hanging="0" w:left="0" w:right="284"/>
               <w:jc w:val="both"/>
               <w:rPr>
                 <w:rFonts w:ascii="Arial" w:hAnsi="Arial" w:cs="Arial"/>
@@ -1407,12 +1401,12 @@
         </w:tc>
         <w:tc>
           <w:tcPr>
-            <w:tcW w:w="7724" w:type="dxa"/>
+            <w:tcW w:w="7725" w:type="dxa"/>
             <w:tcBorders>
               <w:top w:val="single" w:sz="6" w:space="0" w:color="000000"/>
-              <w:start w:val="single" w:sz="6" w:space="0" w:color="000000"/>
+              <w:left w:val="single" w:sz="6" w:space="0" w:color="000000"/>
               <w:bottom w:val="single" w:sz="12" w:space="0" w:color="000000"/>
-              <w:end w:val="single" w:sz="12" w:space="0" w:color="000000"/>
+              <w:right w:val="single" w:sz="12" w:space="0" w:color="000000"/>
             </w:tcBorders>
           </w:tcPr>
           <w:p>
@@ -1420,7 +1414,7 @@
               <w:pStyle w:val="Normal"/>
               <w:snapToGrid w:val="false"/>
               <w:spacing w:before="160" w:after="0"/>
-              <w:ind w:hanging="0" w:start="0" w:end="284"/>
+              <w:ind w:hanging="0" w:left="0" w:right="284"/>
               <w:jc w:val="both"/>
               <w:rPr>
                 <w:rFonts w:ascii="Arial" w:hAnsi="Arial" w:cs="Arial"/>
@@ -1500,8 +1494,8 @@
     <w:p>
       <w:pPr>
         <w:pStyle w:val="TOCHeading"/>
-        <w:ind w:hanging="0" w:start="0" w:end="0"/>
-        <w:jc w:val="start"/>
+        <w:ind w:hanging="0" w:left="0" w:right="0"/>
+        <w:jc w:val="left"/>
         <w:rPr/>
       </w:pPr>
       <w:r>
@@ -1532,18 +1526,18 @@
           </w:r>
           <w:r>
             <w:rPr>
-              <w:webHidden/>
               <w:rStyle w:val="IndexLink"/>
               <w:vanish w:val="false"/>
+              <w:webHidden/>
               <w:lang w:val="en-US" w:eastAsia="en-US"/>
             </w:rPr>
             <w:instrText xml:space="preserve"> TOC \z \o "1-3" \u \h</w:instrText>
           </w:r>
           <w:r>
             <w:rPr>
-              <w:webHidden/>
               <w:rStyle w:val="IndexLink"/>
               <w:vanish w:val="false"/>
+              <w:webHidden/>
               <w:lang w:val="en-US" w:eastAsia="en-US"/>
             </w:rPr>
             <w:fldChar w:fldCharType="separate"/>
@@ -1551,9 +1545,9 @@
           <w:hyperlink w:anchor="__RefHeading___Toc209893722">
             <w:r>
               <w:rPr>
-                <w:webHidden/>
                 <w:rStyle w:val="IndexLink"/>
                 <w:vanish w:val="false"/>
+                <w:webHidden/>
                 <w:lang w:val="en-US" w:eastAsia="en-US"/>
               </w:rPr>
               <w:t>1.</w:t>
@@ -1592,9 +1586,9 @@
           <w:hyperlink w:anchor="__RefHeading___Toc209893723">
             <w:r>
               <w:rPr>
-                <w:webHidden/>
                 <w:rStyle w:val="IndexLink"/>
                 <w:vanish w:val="false"/>
+                <w:webHidden/>
                 <w:lang w:val="en-US" w:eastAsia="en-US"/>
               </w:rPr>
               <w:t>1.1</w:t>
@@ -1633,9 +1627,9 @@
           <w:hyperlink w:anchor="__RefHeading___Toc209893724">
             <w:r>
               <w:rPr>
-                <w:webHidden/>
                 <w:rStyle w:val="IndexLink"/>
                 <w:vanish w:val="false"/>
+                <w:webHidden/>
                 <w:lang w:val="en-US" w:eastAsia="en-US"/>
               </w:rPr>
               <w:t>1.2</w:t>
@@ -1674,9 +1668,9 @@
           <w:hyperlink w:anchor="__RefHeading___Toc209893725">
             <w:r>
               <w:rPr>
-                <w:webHidden/>
                 <w:rStyle w:val="IndexLink"/>
                 <w:vanish w:val="false"/>
+                <w:webHidden/>
                 <w:lang w:val="en-US" w:eastAsia="en-US"/>
               </w:rPr>
               <w:t>1.3</w:t>
@@ -1715,9 +1709,9 @@
           <w:hyperlink w:anchor="__RefHeading___Toc209893726">
             <w:r>
               <w:rPr>
-                <w:webHidden/>
                 <w:rStyle w:val="IndexLink"/>
                 <w:vanish w:val="false"/>
+                <w:webHidden/>
                 <w:lang w:val="en-US" w:eastAsia="en-US"/>
               </w:rPr>
               <w:t>1.4</w:t>
@@ -1756,9 +1750,9 @@
           <w:hyperlink w:anchor="__RefHeading___Toc209893727">
             <w:r>
               <w:rPr>
-                <w:webHidden/>
                 <w:rStyle w:val="IndexLink"/>
                 <w:vanish w:val="false"/>
+                <w:webHidden/>
                 <w:lang w:val="en-US" w:eastAsia="en-US"/>
               </w:rPr>
               <w:t>1.5</w:t>
@@ -1797,9 +1791,9 @@
           <w:hyperlink w:anchor="__RefHeading___Toc209893728">
             <w:r>
               <w:rPr>
-                <w:webHidden/>
                 <w:rStyle w:val="IndexLink"/>
                 <w:vanish w:val="false"/>
+                <w:webHidden/>
                 <w:lang w:val="en-US" w:eastAsia="en-US"/>
               </w:rPr>
               <w:t>1.5.1</w:t>
@@ -1838,9 +1832,9 @@
           <w:hyperlink w:anchor="__RefHeading___Toc209893729">
             <w:r>
               <w:rPr>
-                <w:webHidden/>
                 <w:rStyle w:val="IndexLink"/>
                 <w:vanish w:val="false"/>
+                <w:webHidden/>
                 <w:lang w:val="en-US" w:eastAsia="en-US"/>
               </w:rPr>
               <w:t>1.5.2</w:t>
@@ -1879,9 +1873,9 @@
           <w:hyperlink w:anchor="__RefHeading___Toc209893730">
             <w:r>
               <w:rPr>
-                <w:webHidden/>
                 <w:rStyle w:val="IndexLink"/>
                 <w:vanish w:val="false"/>
+                <w:webHidden/>
                 <w:lang w:val="en-US" w:eastAsia="en-US"/>
               </w:rPr>
               <w:t>1.5.3</w:t>
@@ -1920,9 +1914,9 @@
           <w:hyperlink w:anchor="__RefHeading___Toc209893731">
             <w:r>
               <w:rPr>
-                <w:webHidden/>
                 <w:rStyle w:val="IndexLink"/>
                 <w:vanish w:val="false"/>
+                <w:webHidden/>
                 <w:lang w:val="en-US" w:eastAsia="en-US"/>
               </w:rPr>
               <w:t>1.5.4</w:t>
@@ -1961,9 +1955,9 @@
           <w:hyperlink w:anchor="__RefHeading___Toc209893732">
             <w:r>
               <w:rPr>
-                <w:webHidden/>
                 <w:rStyle w:val="IndexLink"/>
                 <w:vanish w:val="false"/>
+                <w:webHidden/>
                 <w:lang w:val="en-US" w:eastAsia="en-US"/>
               </w:rPr>
               <w:t>1.5.5</w:t>
@@ -2002,9 +1996,9 @@
           <w:hyperlink w:anchor="__RefHeading___Toc209893733">
             <w:r>
               <w:rPr>
-                <w:webHidden/>
                 <w:rStyle w:val="IndexLink"/>
                 <w:vanish w:val="false"/>
+                <w:webHidden/>
                 <w:lang w:val="en-US" w:eastAsia="en-US"/>
               </w:rPr>
               <w:t>1.6</w:t>
@@ -2043,9 +2037,9 @@
           <w:hyperlink w:anchor="__RefHeading___Toc209893734">
             <w:r>
               <w:rPr>
-                <w:webHidden/>
                 <w:rStyle w:val="IndexLink"/>
                 <w:vanish w:val="false"/>
+                <w:webHidden/>
                 <w:lang w:val="en-US" w:eastAsia="en-US"/>
               </w:rPr>
               <w:t>1.6.1</w:t>
@@ -2084,9 +2078,9 @@
           <w:hyperlink w:anchor="__RefHeading___Toc209893735">
             <w:r>
               <w:rPr>
-                <w:webHidden/>
                 <w:rStyle w:val="IndexLink"/>
                 <w:vanish w:val="false"/>
+                <w:webHidden/>
                 <w:lang w:val="en-US" w:eastAsia="en-US"/>
               </w:rPr>
               <w:t>1.7</w:t>
@@ -2125,9 +2119,9 @@
           <w:hyperlink w:anchor="__RefHeading___Toc209893736">
             <w:r>
               <w:rPr>
-                <w:webHidden/>
                 <w:rStyle w:val="IndexLink"/>
                 <w:vanish w:val="false"/>
+                <w:webHidden/>
                 <w:lang w:val="en-US" w:eastAsia="en-US"/>
               </w:rPr>
               <w:t>1.8</w:t>
@@ -2166,9 +2160,9 @@
           <w:hyperlink w:anchor="__RefHeading___Toc209893737">
             <w:r>
               <w:rPr>
-                <w:webHidden/>
                 <w:rStyle w:val="IndexLink"/>
                 <w:vanish w:val="false"/>
+                <w:webHidden/>
                 <w:lang w:val="en-US" w:eastAsia="en-US"/>
               </w:rPr>
               <w:t>1.8.1</w:t>
@@ -2207,9 +2201,9 @@
           <w:hyperlink w:anchor="__RefHeading___Toc209893738">
             <w:r>
               <w:rPr>
-                <w:webHidden/>
                 <w:rStyle w:val="IndexLink"/>
                 <w:vanish w:val="false"/>
+                <w:webHidden/>
                 <w:lang w:val="en-US" w:eastAsia="en-US"/>
               </w:rPr>
               <w:t>1.8.2</w:t>
@@ -2248,9 +2242,9 @@
           <w:hyperlink w:anchor="__RefHeading___Toc209893739">
             <w:r>
               <w:rPr>
-                <w:webHidden/>
                 <w:rStyle w:val="IndexLink"/>
                 <w:vanish w:val="false"/>
+                <w:webHidden/>
                 <w:lang w:val="en-US" w:eastAsia="en-US"/>
               </w:rPr>
               <w:t>2.</w:t>
@@ -2334,7 +2328,7 @@
     <w:p>
       <w:pPr>
         <w:pStyle w:val="Heading1"/>
-        <w:ind w:hanging="0" w:start="0" w:end="0"/>
+        <w:ind w:hanging="0" w:left="0" w:right="0"/>
         <w:rPr/>
       </w:pPr>
       <w:r>
@@ -2361,7 +2355,7 @@
     <w:p>
       <w:pPr>
         <w:pStyle w:val="Heading2"/>
-        <w:ind w:hanging="0" w:start="0" w:end="0"/>
+        <w:ind w:hanging="0" w:left="0" w:right="0"/>
         <w:jc w:val="both"/>
         <w:rPr>
           <w:rFonts w:cs="Times New Roman"/>
@@ -2419,7 +2413,7 @@
           <w:ilvl w:val="0"/>
           <w:numId w:val="0"/>
         </w:numPr>
-        <w:ind w:hanging="0" w:start="0" w:end="0"/>
+        <w:ind w:hanging="0" w:left="0" w:right="0"/>
         <w:rPr/>
       </w:pPr>
       <w:bookmarkStart w:id="1" w:name="__RefHeading___Toc209893724"/>
@@ -2466,7 +2460,7 @@
           <w:ilvl w:val="0"/>
           <w:numId w:val="0"/>
         </w:numPr>
-        <w:ind w:hanging="0" w:start="0" w:end="0"/>
+        <w:ind w:hanging="0" w:left="0" w:right="0"/>
         <w:rPr>
           <w:lang w:eastAsia="en-US"/>
         </w:rPr>
@@ -2483,7 +2477,7 @@
     <w:p>
       <w:pPr>
         <w:pStyle w:val="Normal"/>
-        <w:ind w:hanging="0" w:start="0" w:end="0"/>
+        <w:ind w:hanging="0" w:left="0" w:right="0"/>
         <w:rPr>
           <w:lang w:eastAsia="en-US"/>
         </w:rPr>
@@ -2507,7 +2501,7 @@
         <w:suppressAutoHyphens w:val="true"/>
         <w:bidi w:val="0"/>
         <w:spacing w:before="240" w:after="0"/>
-        <w:ind w:hanging="0" w:start="0" w:end="0"/>
+        <w:ind w:hanging="0" w:left="0" w:right="0"/>
         <w:rPr/>
       </w:pPr>
       <w:bookmarkStart w:id="3" w:name="__RefHeading___Toc209893726"/>
@@ -2526,7 +2520,7 @@
           <w:ilvl w:val="0"/>
           <w:numId w:val="0"/>
         </w:numPr>
-        <w:ind w:hanging="0" w:start="720" w:end="284"/>
+        <w:ind w:hanging="0" w:left="720" w:right="284"/>
         <w:rPr/>
       </w:pPr>
       <w:r>
@@ -2541,7 +2535,7 @@
           <w:ilvl w:val="0"/>
           <w:numId w:val="0"/>
         </w:numPr>
-        <w:ind w:hanging="0" w:start="720" w:end="284"/>
+        <w:ind w:hanging="0" w:left="720" w:right="284"/>
         <w:rPr/>
       </w:pPr>
       <w:r>
@@ -2556,7 +2550,7 @@
           <w:ilvl w:val="0"/>
           <w:numId w:val="0"/>
         </w:numPr>
-        <w:ind w:hanging="0" w:start="1004" w:end="284"/>
+        <w:ind w:hanging="0" w:left="1004" w:right="284"/>
         <w:rPr/>
       </w:pPr>
       <w:r>
@@ -2571,7 +2565,7 @@
           <w:ilvl w:val="0"/>
           <w:numId w:val="3"/>
         </w:numPr>
-        <w:ind w:hanging="284" w:start="284" w:end="284"/>
+        <w:ind w:hanging="284" w:left="284" w:right="284"/>
         <w:rPr/>
       </w:pPr>
       <w:r>
@@ -2592,7 +2586,7 @@
           <w:ilvl w:val="0"/>
           <w:numId w:val="3"/>
         </w:numPr>
-        <w:ind w:hanging="284" w:start="284" w:end="284"/>
+        <w:ind w:hanging="284" w:left="284" w:right="284"/>
         <w:rPr/>
       </w:pPr>
       <w:r>
@@ -2613,7 +2607,7 @@
           <w:ilvl w:val="0"/>
           <w:numId w:val="3"/>
         </w:numPr>
-        <w:ind w:hanging="284" w:start="284" w:end="284"/>
+        <w:ind w:hanging="284" w:left="284" w:right="284"/>
         <w:rPr/>
       </w:pPr>
       <w:r>
@@ -2634,7 +2628,7 @@
           <w:ilvl w:val="0"/>
           <w:numId w:val="3"/>
         </w:numPr>
-        <w:ind w:hanging="284" w:start="284" w:end="284"/>
+        <w:ind w:hanging="284" w:left="284" w:right="284"/>
         <w:rPr>
           <w:lang w:eastAsia="en-US"/>
         </w:rPr>
@@ -2657,7 +2651,7 @@
           <w:tab w:val="clear" w:pos="709"/>
           <w:tab w:val="left" w:pos="284" w:leader="none"/>
         </w:tabs>
-        <w:ind w:hanging="284" w:start="284" w:end="284"/>
+        <w:ind w:hanging="284" w:left="284" w:right="284"/>
         <w:rPr>
           <w:lang w:eastAsia="en-US"/>
         </w:rPr>
@@ -2675,7 +2669,7 @@
           <w:tab w:val="clear" w:pos="709"/>
           <w:tab w:val="left" w:pos="284" w:leader="none"/>
         </w:tabs>
-        <w:ind w:hanging="284" w:start="284" w:end="284"/>
+        <w:ind w:hanging="284" w:left="284" w:right="284"/>
         <w:rPr>
           <w:lang w:eastAsia="en-US"/>
         </w:rPr>
@@ -2693,7 +2687,7 @@
           <w:tab w:val="clear" w:pos="709"/>
           <w:tab w:val="left" w:pos="284" w:leader="none"/>
         </w:tabs>
-        <w:ind w:hanging="284" w:start="284" w:end="284"/>
+        <w:ind w:hanging="284" w:left="284" w:right="284"/>
         <w:rPr>
           <w:lang w:eastAsia="en-US"/>
         </w:rPr>
@@ -2711,7 +2705,7 @@
           <w:tab w:val="clear" w:pos="709"/>
           <w:tab w:val="left" w:pos="284" w:leader="none"/>
         </w:tabs>
-        <w:ind w:hanging="284" w:start="284" w:end="284"/>
+        <w:ind w:hanging="284" w:left="284" w:right="284"/>
         <w:rPr>
           <w:lang w:eastAsia="en-US"/>
         </w:rPr>
@@ -2729,7 +2723,7 @@
           <w:tab w:val="clear" w:pos="709"/>
           <w:tab w:val="left" w:pos="284" w:leader="none"/>
         </w:tabs>
-        <w:ind w:hanging="284" w:start="284" w:end="284"/>
+        <w:ind w:hanging="284" w:left="284" w:right="284"/>
         <w:rPr>
           <w:lang w:eastAsia="en-US"/>
         </w:rPr>
@@ -2747,7 +2741,7 @@
           <w:tab w:val="clear" w:pos="709"/>
           <w:tab w:val="left" w:pos="284" w:leader="none"/>
         </w:tabs>
-        <w:ind w:hanging="284" w:start="284" w:end="284"/>
+        <w:ind w:hanging="284" w:left="284" w:right="284"/>
         <w:rPr>
           <w:lang w:eastAsia="en-US"/>
         </w:rPr>
@@ -2765,7 +2759,7 @@
           <w:tab w:val="clear" w:pos="709"/>
           <w:tab w:val="left" w:pos="284" w:leader="none"/>
         </w:tabs>
-        <w:ind w:hanging="284" w:start="284" w:end="284"/>
+        <w:ind w:hanging="284" w:left="284" w:right="284"/>
         <w:rPr>
           <w:lang w:eastAsia="en-US"/>
         </w:rPr>
@@ -2783,7 +2777,7 @@
           <w:tab w:val="clear" w:pos="709"/>
           <w:tab w:val="left" w:pos="284" w:leader="none"/>
         </w:tabs>
-        <w:ind w:hanging="284" w:start="284" w:end="284"/>
+        <w:ind w:hanging="284" w:left="284" w:right="284"/>
         <w:rPr>
           <w:lang w:eastAsia="en-US"/>
         </w:rPr>
@@ -2801,7 +2795,7 @@
           <w:tab w:val="clear" w:pos="709"/>
           <w:tab w:val="left" w:pos="284" w:leader="none"/>
         </w:tabs>
-        <w:ind w:hanging="284" w:start="284" w:end="284"/>
+        <w:ind w:hanging="284" w:left="284" w:right="284"/>
         <w:rPr>
           <w:lang w:eastAsia="en-US"/>
         </w:rPr>
@@ -2819,7 +2813,7 @@
           <w:tab w:val="clear" w:pos="709"/>
           <w:tab w:val="left" w:pos="284" w:leader="none"/>
         </w:tabs>
-        <w:ind w:hanging="284" w:start="284" w:end="284"/>
+        <w:ind w:hanging="284" w:left="284" w:right="284"/>
         <w:rPr>
           <w:lang w:eastAsia="en-US"/>
         </w:rPr>
@@ -2837,7 +2831,7 @@
           <w:tab w:val="clear" w:pos="709"/>
           <w:tab w:val="left" w:pos="284" w:leader="none"/>
         </w:tabs>
-        <w:ind w:hanging="284" w:start="284" w:end="284"/>
+        <w:ind w:hanging="284" w:left="284" w:right="284"/>
         <w:rPr>
           <w:lang w:eastAsia="en-US"/>
         </w:rPr>
@@ -2855,7 +2849,7 @@
           <w:ilvl w:val="0"/>
           <w:numId w:val="0"/>
         </w:numPr>
-        <w:ind w:hanging="0" w:start="0" w:end="0"/>
+        <w:ind w:hanging="0" w:left="0" w:right="0"/>
         <w:rPr/>
       </w:pPr>
       <w:bookmarkStart w:id="4" w:name="__RefHeading___Toc209893727"/>
@@ -2870,7 +2864,7 @@
     <w:p>
       <w:pPr>
         <w:pStyle w:val="Normal"/>
-        <w:ind w:hanging="0" w:start="0" w:end="0"/>
+        <w:ind w:hanging="0" w:left="0" w:right="0"/>
         <w:rPr/>
       </w:pPr>
       <w:r>
@@ -2881,7 +2875,7 @@
     <w:p>
       <w:pPr>
         <w:pStyle w:val="Normal"/>
-        <w:ind w:hanging="0" w:start="0" w:end="0"/>
+        <w:ind w:hanging="0" w:left="0" w:right="0"/>
         <w:rPr>
           <w:lang w:eastAsia="en-US"/>
         </w:rPr>
@@ -2891,7 +2885,7 @@
           <w:lang w:eastAsia="en-US"/>
         </w:rPr>
         <w:drawing>
-          <wp:anchor behindDoc="0" distT="0" distB="0" distL="0" distR="0" simplePos="0" locked="0" layoutInCell="0" allowOverlap="1" relativeHeight="37">
+          <wp:anchor distT="0" distB="0" distL="0" distR="0" simplePos="0" relativeHeight="36" behindDoc="0" locked="0" layoutInCell="0" allowOverlap="1">
             <wp:simplePos x="0" y="0"/>
             <wp:positionH relativeFrom="column">
               <wp:posOffset>772795</wp:posOffset>
@@ -2902,7 +2896,7 @@
             <wp:extent cx="3845560" cy="4239895"/>
             <wp:effectExtent l="0" t="0" r="0" b="0"/>
             <wp:wrapTopAndBottom/>
-            <wp:docPr id="1" name="Image1" descr="" title=""/>
+            <wp:docPr id="1" name="Image1"/>
             <wp:cNvGraphicFramePr>
               <a:graphicFrameLocks xmlns:a="http://schemas.openxmlformats.org/drawingml/2006/main" noChangeAspect="1"/>
             </wp:cNvGraphicFramePr>
@@ -2910,7 +2904,7 @@
               <a:graphicData uri="http://schemas.openxmlformats.org/drawingml/2006/picture">
                 <pic:pic xmlns:pic="http://schemas.openxmlformats.org/drawingml/2006/picture">
                   <pic:nvPicPr>
-                    <pic:cNvPr id="1" name="Image1" descr="" title=""/>
+                    <pic:cNvPr id="1" name="Image1"/>
                     <pic:cNvPicPr>
                       <a:picLocks noChangeAspect="1" noChangeArrowheads="1"/>
                     </pic:cNvPicPr>
@@ -2931,7 +2925,7 @@
                       <a:avLst/>
                     </a:prstGeom>
                     <a:solidFill>
-                      <a:srgbClr val="ffffff"/>
+                      <a:srgbClr val="FFFFFF"/>
                     </a:solidFill>
                   </pic:spPr>
                 </pic:pic>
@@ -2961,7 +2955,7 @@
           <w:ilvl w:val="0"/>
           <w:numId w:val="0"/>
         </w:numPr>
-        <w:ind w:hanging="0" w:start="0" w:end="0"/>
+        <w:ind w:hanging="0" w:left="0" w:right="0"/>
         <w:jc w:val="both"/>
         <w:rPr/>
       </w:pPr>
@@ -2981,7 +2975,7 @@
           <w:ilvl w:val="0"/>
           <w:numId w:val="0"/>
         </w:numPr>
-        <w:ind w:hanging="0" w:start="0" w:end="0"/>
+        <w:ind w:hanging="0" w:left="0" w:right="0"/>
         <w:rPr/>
       </w:pPr>
       <w:r>
@@ -3007,7 +3001,7 @@
       <w:r>
         <w:rPr/>
         <w:drawing>
-          <wp:anchor behindDoc="0" distT="0" distB="0" distL="0" distR="0" simplePos="0" locked="0" layoutInCell="0" allowOverlap="1" relativeHeight="38">
+          <wp:anchor distT="0" distB="0" distL="0" distR="0" simplePos="0" relativeHeight="37" behindDoc="0" locked="0" layoutInCell="0" allowOverlap="1">
             <wp:simplePos x="0" y="0"/>
             <wp:positionH relativeFrom="column">
               <wp:align>center</wp:align>
@@ -3018,7 +3012,7 @@
             <wp:extent cx="5237480" cy="7723505"/>
             <wp:effectExtent l="0" t="0" r="0" b="0"/>
             <wp:wrapSquare wrapText="largest"/>
-            <wp:docPr id="2" name="Image2" descr="" title=""/>
+            <wp:docPr id="2" name="Image2"/>
             <wp:cNvGraphicFramePr>
               <a:graphicFrameLocks xmlns:a="http://schemas.openxmlformats.org/drawingml/2006/main" noChangeAspect="1"/>
             </wp:cNvGraphicFramePr>
@@ -3026,7 +3020,7 @@
               <a:graphicData uri="http://schemas.openxmlformats.org/drawingml/2006/picture">
                 <pic:pic xmlns:pic="http://schemas.openxmlformats.org/drawingml/2006/picture">
                   <pic:nvPicPr>
-                    <pic:cNvPr id="2" name="Image2" descr="" title=""/>
+                    <pic:cNvPr id="2" name="Image2"/>
                     <pic:cNvPicPr>
                       <a:picLocks noChangeAspect="1" noChangeArrowheads="1"/>
                     </pic:cNvPicPr>
@@ -3047,7 +3041,7 @@
                       <a:avLst/>
                     </a:prstGeom>
                     <a:solidFill>
-                      <a:srgbClr val="ffffff"/>
+                      <a:srgbClr val="FFFFFF"/>
                     </a:solidFill>
                   </pic:spPr>
                 </pic:pic>
@@ -3064,7 +3058,7 @@
           <w:ilvl w:val="0"/>
           <w:numId w:val="0"/>
         </w:numPr>
-        <w:ind w:hanging="0" w:start="0" w:end="0"/>
+        <w:ind w:hanging="0" w:left="0" w:right="0"/>
         <w:rPr/>
       </w:pPr>
       <w:r>
@@ -3081,13 +3075,13 @@
     <w:p>
       <w:pPr>
         <w:pStyle w:val="Normal"/>
-        <w:ind w:hanging="0" w:start="0" w:end="0"/>
+        <w:ind w:hanging="0" w:left="0" w:right="0"/>
         <w:rPr/>
       </w:pPr>
       <w:r>
         <w:rPr/>
         <w:drawing>
-          <wp:anchor behindDoc="0" distT="0" distB="0" distL="0" distR="0" simplePos="0" locked="0" layoutInCell="0" allowOverlap="1" relativeHeight="39">
+          <wp:anchor distT="0" distB="0" distL="0" distR="0" simplePos="0" relativeHeight="38" behindDoc="0" locked="0" layoutInCell="0" allowOverlap="1">
             <wp:simplePos x="0" y="0"/>
             <wp:positionH relativeFrom="column">
               <wp:align>center</wp:align>
@@ -3098,7 +3092,7 @@
             <wp:extent cx="5758180" cy="6071870"/>
             <wp:effectExtent l="0" t="0" r="0" b="0"/>
             <wp:wrapSquare wrapText="largest"/>
-            <wp:docPr id="3" name="Image3" descr="" title=""/>
+            <wp:docPr id="3" name="Image3"/>
             <wp:cNvGraphicFramePr>
               <a:graphicFrameLocks xmlns:a="http://schemas.openxmlformats.org/drawingml/2006/main" noChangeAspect="1"/>
             </wp:cNvGraphicFramePr>
@@ -3106,7 +3100,7 @@
               <a:graphicData uri="http://schemas.openxmlformats.org/drawingml/2006/picture">
                 <pic:pic xmlns:pic="http://schemas.openxmlformats.org/drawingml/2006/picture">
                   <pic:nvPicPr>
-                    <pic:cNvPr id="3" name="Image3" descr="" title=""/>
+                    <pic:cNvPr id="3" name="Image3"/>
                     <pic:cNvPicPr>
                       <a:picLocks noChangeAspect="1" noChangeArrowheads="1"/>
                     </pic:cNvPicPr>
@@ -3127,7 +3121,7 @@
                       <a:avLst/>
                     </a:prstGeom>
                     <a:solidFill>
-                      <a:srgbClr val="ffffff"/>
+                      <a:srgbClr val="FFFFFF"/>
                     </a:solidFill>
                   </pic:spPr>
                 </pic:pic>
@@ -3144,7 +3138,7 @@
           <w:ilvl w:val="0"/>
           <w:numId w:val="0"/>
         </w:numPr>
-        <w:ind w:hanging="0" w:start="0" w:end="0"/>
+        <w:ind w:hanging="0" w:left="0" w:right="0"/>
         <w:rPr/>
       </w:pPr>
       <w:r>
@@ -3159,13 +3153,12 @@
           <w:ilvl w:val="0"/>
           <w:numId w:val="0"/>
         </w:numPr>
-        <w:ind w:hanging="0" w:start="864" w:end="0"/>
+        <w:ind w:hanging="0" w:left="864" w:right="0"/>
         <w:rPr>
           <w:rFonts w:ascii="Times New Roman" w:hAnsi="Times New Roman" w:cs="Times New Roman"/>
           <w:b w:val="false"/>
           <w:bCs w:val="false"/>
           <w:i w:val="false"/>
-          <w:i w:val="false"/>
           <w:iCs w:val="false"/>
           <w:szCs w:val="20"/>
         </w:rPr>
@@ -3173,10 +3166,18 @@
       <w:r>
         <w:rPr/>
         <w:drawing>
-          <wp:inline distT="0" distB="0" distL="0" distR="0">
-            <wp:extent cx="4123690" cy="6713220"/>
+          <wp:anchor distT="0" distB="0" distL="0" distR="0" simplePos="0" relativeHeight="40" behindDoc="0" locked="0" layoutInCell="0" allowOverlap="1">
+            <wp:simplePos x="0" y="0"/>
+            <wp:positionH relativeFrom="column">
+              <wp:align>center</wp:align>
+            </wp:positionH>
+            <wp:positionV relativeFrom="paragraph">
+              <wp:posOffset>635</wp:posOffset>
+            </wp:positionV>
+            <wp:extent cx="5210810" cy="5670550"/>
             <wp:effectExtent l="0" t="0" r="0" b="0"/>
-            <wp:docPr id="4" name="Image4" descr="" title=""/>
+            <wp:wrapSquare wrapText="largest"/>
+            <wp:docPr id="4" name="Image4"/>
             <wp:cNvGraphicFramePr>
               <a:graphicFrameLocks xmlns:a="http://schemas.openxmlformats.org/drawingml/2006/main" noChangeAspect="1"/>
             </wp:cNvGraphicFramePr>
@@ -3184,14 +3185,13 @@
               <a:graphicData uri="http://schemas.openxmlformats.org/drawingml/2006/picture">
                 <pic:pic xmlns:pic="http://schemas.openxmlformats.org/drawingml/2006/picture">
                   <pic:nvPicPr>
-                    <pic:cNvPr id="4" name="Image4" descr="" title=""/>
+                    <pic:cNvPr id="4" name="Image4"/>
                     <pic:cNvPicPr>
                       <a:picLocks noChangeAspect="1" noChangeArrowheads="1"/>
                     </pic:cNvPicPr>
                   </pic:nvPicPr>
                   <pic:blipFill>
                     <a:blip r:embed="rId6"/>
-                    <a:srcRect l="-68" t="-42" r="-68" b="-42"/>
                     <a:stretch>
                       <a:fillRect/>
                     </a:stretch>
@@ -3199,7 +3199,7 @@
                   <pic:spPr bwMode="auto">
                     <a:xfrm>
                       <a:off x="0" y="0"/>
-                      <a:ext cx="4123690" cy="6713220"/>
+                      <a:ext cx="5210810" cy="5670550"/>
                     </a:xfrm>
                     <a:prstGeom prst="rect">
                       <a:avLst/>
@@ -3209,7 +3209,7 @@
                 </pic:pic>
               </a:graphicData>
             </a:graphic>
-          </wp:inline>
+          </wp:anchor>
         </w:drawing>
       </w:r>
     </w:p>
@@ -3220,7 +3220,7 @@
           <w:ilvl w:val="0"/>
           <w:numId w:val="0"/>
         </w:numPr>
-        <w:ind w:hanging="0" w:start="0" w:end="0"/>
+        <w:ind w:hanging="0" w:left="0" w:right="0"/>
         <w:rPr/>
       </w:pPr>
       <w:r>
@@ -3236,6 +3236,78 @@
       <w:r>
         <w:rPr/>
         <w:t>…</w:t>
+      </w:r>
+    </w:p>
+    <w:p>
+      <w:pPr>
+        <w:pStyle w:val="Normal"/>
+        <w:rPr/>
+      </w:pPr>
+      <w:r>
+        <w:rPr/>
+      </w:r>
+    </w:p>
+    <w:p>
+      <w:pPr>
+        <w:pStyle w:val="Normal"/>
+        <w:rPr/>
+      </w:pPr>
+      <w:r>
+        <w:rPr/>
+      </w:r>
+    </w:p>
+    <w:p>
+      <w:pPr>
+        <w:pStyle w:val="Normal"/>
+        <w:rPr/>
+      </w:pPr>
+      <w:r>
+        <w:rPr/>
+      </w:r>
+    </w:p>
+    <w:p>
+      <w:pPr>
+        <w:pStyle w:val="Normal"/>
+        <w:rPr/>
+      </w:pPr>
+      <w:r>
+        <w:rPr/>
+      </w:r>
+    </w:p>
+    <w:p>
+      <w:pPr>
+        <w:pStyle w:val="Normal"/>
+        <w:rPr/>
+      </w:pPr>
+      <w:r>
+        <w:rPr/>
+      </w:r>
+    </w:p>
+    <w:p>
+      <w:pPr>
+        <w:pStyle w:val="Normal"/>
+        <w:rPr/>
+      </w:pPr>
+      <w:r>
+        <w:rPr/>
+      </w:r>
+    </w:p>
+    <w:p>
+      <w:pPr>
+        <w:pStyle w:val="Normal"/>
+        <w:rPr/>
+      </w:pPr>
+      <w:r>
+        <w:rPr/>
+      </w:r>
+    </w:p>
+    <w:p>
+      <w:pPr>
+        <w:pStyle w:val="Normal"/>
+        <w:rPr/>
+      </w:pPr>
+      <w:r>
+        <w:rPr/>
       </w:r>
     </w:p>
     <w:p>
@@ -3245,7 +3317,7 @@
           <w:ilvl w:val="0"/>
           <w:numId w:val="0"/>
         </w:numPr>
-        <w:ind w:hanging="0" w:start="0" w:end="0"/>
+        <w:ind w:hanging="0" w:left="0" w:right="0"/>
         <w:jc w:val="both"/>
         <w:rPr/>
       </w:pPr>
@@ -3265,14 +3337,14 @@
           <w:ilvl w:val="0"/>
           <w:numId w:val="0"/>
         </w:numPr>
-        <w:ind w:hanging="0" w:start="0" w:end="0"/>
+        <w:ind w:hanging="0" w:left="0" w:right="0"/>
         <w:jc w:val="both"/>
         <w:rPr/>
       </w:pPr>
       <w:r>
         <w:rPr/>
         <w:drawing>
-          <wp:anchor behindDoc="0" distT="0" distB="0" distL="0" distR="0" simplePos="0" locked="0" layoutInCell="0" allowOverlap="1" relativeHeight="40">
+          <wp:anchor distT="0" distB="0" distL="0" distR="0" simplePos="0" relativeHeight="39" behindDoc="0" locked="0" layoutInCell="0" allowOverlap="1">
             <wp:simplePos x="0" y="0"/>
             <wp:positionH relativeFrom="column">
               <wp:align>center</wp:align>
@@ -3283,7 +3355,7 @@
             <wp:extent cx="4933950" cy="3343275"/>
             <wp:effectExtent l="0" t="0" r="0" b="0"/>
             <wp:wrapTopAndBottom/>
-            <wp:docPr id="5" name="Image5" descr="" title=""/>
+            <wp:docPr id="5" name="Image5"/>
             <wp:cNvGraphicFramePr>
               <a:graphicFrameLocks xmlns:a="http://schemas.openxmlformats.org/drawingml/2006/main" noChangeAspect="1"/>
             </wp:cNvGraphicFramePr>
@@ -3291,7 +3363,7 @@
               <a:graphicData uri="http://schemas.openxmlformats.org/drawingml/2006/picture">
                 <pic:pic xmlns:pic="http://schemas.openxmlformats.org/drawingml/2006/picture">
                   <pic:nvPicPr>
-                    <pic:cNvPr id="5" name="Image5" descr="" title=""/>
+                    <pic:cNvPr id="5" name="Image5"/>
                     <pic:cNvPicPr>
                       <a:picLocks noChangeAspect="1" noChangeArrowheads="1"/>
                     </pic:cNvPicPr>
@@ -3335,7 +3407,7 @@
           <w:ilvl w:val="0"/>
           <w:numId w:val="0"/>
         </w:numPr>
-        <w:ind w:hanging="0" w:start="0" w:end="0"/>
+        <w:ind w:hanging="0" w:left="0" w:right="0"/>
         <w:jc w:val="both"/>
         <w:rPr/>
       </w:pPr>
@@ -3355,7 +3427,7 @@
           <w:ilvl w:val="0"/>
           <w:numId w:val="0"/>
         </w:numPr>
-        <w:ind w:hanging="0" w:start="0" w:end="0"/>
+        <w:ind w:hanging="0" w:left="0" w:right="0"/>
         <w:jc w:val="both"/>
         <w:rPr/>
       </w:pPr>
@@ -3364,7 +3436,7 @@
         <mc:AlternateContent>
           <mc:Choice Requires="wps">
             <w:drawing>
-              <wp:anchor behindDoc="0" distT="0" distB="173990" distL="0" distR="0" simplePos="0" locked="0" layoutInCell="1" allowOverlap="1" relativeHeight="35">
+              <wp:anchor distT="0" distB="173990" distL="0" distR="0" simplePos="0" relativeHeight="34" behindDoc="0" locked="0" layoutInCell="1" allowOverlap="1">
                 <wp:simplePos x="0" y="0"/>
                 <wp:positionH relativeFrom="column">
                   <wp:posOffset>22225</wp:posOffset>
@@ -3403,11 +3475,11 @@
                         <w:txbxContent>
                           <w:p>
                             <w:pPr>
-                              <w:pStyle w:val="FrameContentsuser"/>
-                              <w:overflowPunct w:val="false"/>
+                              <w:pStyle w:val="FrameContents"/>
+                              <w:overflowPunct w:val="true"/>
                               <w:bidi w:val="0"/>
                               <w:spacing w:before="0" w:after="0"/>
-                              <w:ind w:hanging="0" w:start="284" w:end="284"/>
+                              <w:ind w:hanging="0" w:left="284" w:right="284"/>
                               <w:rPr/>
                             </w:pPr>
                             <w:r>
@@ -3424,7 +3496,7 @@
                           </w:p>
                         </w:txbxContent>
                       </wps:txbx>
-                      <wps:bodyPr lIns="0" rIns="0" tIns="0" bIns="0" anchor="t">
+                      <wps:bodyPr lIns="0" tIns="0" rIns="0" bIns="0" anchor="t">
                         <a:noAutofit/>
                       </wps:bodyPr>
                     </wps:wsp>
@@ -3435,18 +3507,18 @@
           </mc:Choice>
           <mc:Fallback>
             <w:pict>
-              <v:rect id="shape_0" ID="Shape1" path="m0,0l-2147483645,0l-2147483645,-2147483646l0,-2147483646xe" stroked="f" o:allowincell="f" style="position:absolute;margin-left:1.75pt;margin-top:7.65pt;width:449.5pt;height:13.8pt;mso-wrap-style:square;v-text-anchor:top">
+              <v:rect id="shape_0" stroked="f" o:allowincell="f" style="position:absolute;margin-left:1.75pt;margin-top:7.65pt;width:449.5pt;height:13.8pt;mso-wrap-style:square;v-text-anchor:top">
                 <v:fill o:detectmouseclick="t" on="false"/>
                 <v:stroke color="#3465a4" joinstyle="round" endcap="flat"/>
                 <v:textbox>
                   <w:txbxContent>
                     <w:p>
                       <w:pPr>
-                        <w:pStyle w:val="FrameContentsuser"/>
-                        <w:overflowPunct w:val="false"/>
+                        <w:pStyle w:val="FrameContents"/>
+                        <w:overflowPunct w:val="true"/>
                         <w:bidi w:val="0"/>
                         <w:spacing w:before="0" w:after="0"/>
-                        <w:ind w:hanging="0" w:start="284" w:end="284"/>
+                        <w:ind w:hanging="0" w:left="284" w:right="284"/>
                         <w:rPr/>
                       </w:pPr>
                       <w:r>
@@ -3473,7 +3545,7 @@
     <w:p>
       <w:pPr>
         <w:pStyle w:val="Normal"/>
-        <w:ind w:hanging="0" w:start="0" w:end="0"/>
+        <w:ind w:hanging="0" w:left="0" w:right="0"/>
         <w:jc w:val="both"/>
         <w:rPr/>
       </w:pPr>
@@ -3482,7 +3554,7 @@
         <mc:AlternateContent>
           <mc:Choice Requires="wps">
             <w:drawing>
-              <wp:anchor behindDoc="0" distT="5715" distB="4445" distL="5080" distR="5715" simplePos="0" locked="0" layoutInCell="1" allowOverlap="1" relativeHeight="6">
+              <wp:anchor distT="5715" distB="4445" distL="5080" distR="5715" simplePos="0" relativeHeight="5" behindDoc="0" locked="0" layoutInCell="1" allowOverlap="1">
                 <wp:simplePos x="0" y="0"/>
                 <wp:positionH relativeFrom="column">
                   <wp:posOffset>34925</wp:posOffset>
@@ -3510,11 +3582,11 @@
                           </a:avLst>
                         </a:prstGeom>
                         <a:solidFill>
-                          <a:srgbClr val="729fcf"/>
+                          <a:srgbClr val="729FCF"/>
                         </a:solidFill>
                         <a:ln w="9360">
                           <a:solidFill>
-                            <a:srgbClr val="3465a4"/>
+                            <a:srgbClr val="3465A4"/>
                           </a:solidFill>
                           <a:round/>
                         </a:ln>
@@ -3554,7 +3626,7 @@
                   <v:h position="@2,0"/>
                 </v:handles>
               </v:shapetype>
-              <v:shape id="shape_0" ID="Shape 1" path="l-2147483636,0l-2147483636,-2147483631l-2147483635,-2147483631l-2147483635,0l-2147483622,-2147483632l-2147483635,-2147483621l-2147483635,-2147483629l-2147483636,-2147483629l-2147483636,-2147483621xe" fillcolor="#729fcf" stroked="t" o:allowincell="f" style="position:absolute;margin-left:2.75pt;margin-top:14.95pt;width:37.95pt;height:2.1pt;mso-wrap-style:none;v-text-anchor:middle" type="_x0000_t69">
+              <v:shape id="shape_0" fillcolor="#729fcf" stroked="t" o:allowincell="f" style="position:absolute;margin-left:2.75pt;margin-top:14.95pt;width:37.95pt;height:2.1pt;mso-wrap-style:none;v-text-anchor:middle" type="_x0000_t69" path="l-2147483636,0l-2147483636,-2147483631l-2147483635,-2147483631l-2147483635,0l-2147483622,-2147483632l-2147483635,-2147483621l-2147483635,-2147483629l-2147483636,-2147483629l-2147483636,-2147483621xe">
                 <v:fill o:detectmouseclick="t" type="solid" color2="#8d6030"/>
                 <v:stroke color="#3465a4" weight="9360" joinstyle="round" endcap="flat"/>
                 <w10:wrap type="none"/>
@@ -3565,7 +3637,7 @@
         <mc:AlternateContent>
           <mc:Choice Requires="wps">
             <w:drawing>
-              <wp:anchor behindDoc="0" distT="5715" distB="4445" distL="5080" distR="5715" simplePos="0" locked="0" layoutInCell="1" allowOverlap="1" relativeHeight="7">
+              <wp:anchor distT="5715" distB="4445" distL="5080" distR="5715" simplePos="0" relativeHeight="6" behindDoc="0" locked="0" layoutInCell="1" allowOverlap="1">
                 <wp:simplePos x="0" y="0"/>
                 <wp:positionH relativeFrom="column">
                   <wp:posOffset>34925</wp:posOffset>
@@ -3593,11 +3665,11 @@
                           </a:avLst>
                         </a:prstGeom>
                         <a:solidFill>
-                          <a:srgbClr val="729fcf"/>
+                          <a:srgbClr val="729FCF"/>
                         </a:solidFill>
                         <a:ln w="9360">
                           <a:solidFill>
-                            <a:srgbClr val="3465a4"/>
+                            <a:srgbClr val="3465A4"/>
                           </a:solidFill>
                           <a:round/>
                         </a:ln>
@@ -3617,7 +3689,7 @@
           </mc:Choice>
           <mc:Fallback>
             <w:pict>
-              <v:shape id="shape_0" ID="Shape 2" path="l-2147483636,0l-2147483636,-2147483631l-2147483635,-2147483631l-2147483635,0l-2147483622,-2147483632l-2147483635,-2147483621l-2147483635,-2147483629l-2147483636,-2147483629l-2147483636,-2147483621xe" fillcolor="#729fcf" stroked="t" o:allowincell="f" style="position:absolute;margin-left:2.75pt;margin-top:14.95pt;width:37.95pt;height:2.1pt;mso-wrap-style:none;v-text-anchor:middle" type="_x0000_t69">
+              <v:shape id="shape_0" fillcolor="#729fcf" stroked="t" o:allowincell="f" style="position:absolute;margin-left:2.75pt;margin-top:14.95pt;width:37.95pt;height:2.1pt;mso-wrap-style:none;v-text-anchor:middle" type="_x0000_t69" path="l-2147483636,0l-2147483636,-2147483631l-2147483635,-2147483631l-2147483635,0l-2147483622,-2147483632l-2147483635,-2147483621l-2147483635,-2147483629l-2147483636,-2147483629l-2147483636,-2147483621xe">
                 <v:fill o:detectmouseclick="t" type="solid" color2="#8d6030"/>
                 <v:stroke color="#3465a4" weight="9360" joinstyle="round" endcap="flat"/>
                 <w10:wrap type="none"/>
@@ -3628,7 +3700,7 @@
         <mc:AlternateContent>
           <mc:Choice Requires="wps">
             <w:drawing>
-              <wp:anchor behindDoc="0" distT="5715" distB="4445" distL="5080" distR="5715" simplePos="0" locked="0" layoutInCell="1" allowOverlap="1" relativeHeight="8">
+              <wp:anchor distT="5715" distB="4445" distL="5080" distR="5715" simplePos="0" relativeHeight="7" behindDoc="0" locked="0" layoutInCell="1" allowOverlap="1">
                 <wp:simplePos x="0" y="0"/>
                 <wp:positionH relativeFrom="column">
                   <wp:posOffset>626745</wp:posOffset>
@@ -3656,11 +3728,11 @@
                           </a:avLst>
                         </a:prstGeom>
                         <a:solidFill>
-                          <a:srgbClr val="729fcf"/>
+                          <a:srgbClr val="729FCF"/>
                         </a:solidFill>
                         <a:ln w="9360">
                           <a:solidFill>
-                            <a:srgbClr val="3465a4"/>
+                            <a:srgbClr val="3465A4"/>
                           </a:solidFill>
                           <a:round/>
                         </a:ln>
@@ -3680,7 +3752,7 @@
           </mc:Choice>
           <mc:Fallback>
             <w:pict>
-              <v:shape id="shape_0" ID="Shape 5" path="l-2147483636,0l-2147483636,-2147483631l-2147483635,-2147483631l-2147483635,0l-2147483622,-2147483632l-2147483635,-2147483621l-2147483635,-2147483629l-2147483636,-2147483629l-2147483636,-2147483621xe" fillcolor="#729fcf" stroked="t" o:allowincell="f" style="position:absolute;margin-left:49.35pt;margin-top:14.65pt;width:37.95pt;height:2.1pt;mso-wrap-style:none;v-text-anchor:middle" type="_x0000_t69">
+              <v:shape id="shape_0" fillcolor="#729fcf" stroked="t" o:allowincell="f" style="position:absolute;margin-left:49.35pt;margin-top:14.65pt;width:37.95pt;height:2.1pt;mso-wrap-style:none;v-text-anchor:middle" type="_x0000_t69" path="l-2147483636,0l-2147483636,-2147483631l-2147483635,-2147483631l-2147483635,0l-2147483622,-2147483632l-2147483635,-2147483621l-2147483635,-2147483629l-2147483636,-2147483629l-2147483636,-2147483621xe">
                 <v:fill o:detectmouseclick="t" type="solid" color2="#8d6030"/>
                 <v:stroke color="#3465a4" weight="9360" joinstyle="round" endcap="flat"/>
                 <w10:wrap type="none"/>
@@ -3691,7 +3763,7 @@
         <mc:AlternateContent>
           <mc:Choice Requires="wps">
             <w:drawing>
-              <wp:anchor behindDoc="0" distT="5080" distB="5715" distL="5080" distR="5715" simplePos="0" locked="0" layoutInCell="1" allowOverlap="1" relativeHeight="9">
+              <wp:anchor distT="5080" distB="5715" distL="5080" distR="5715" simplePos="0" relativeHeight="8" behindDoc="0" locked="0" layoutInCell="1" allowOverlap="1">
                 <wp:simplePos x="0" y="0"/>
                 <wp:positionH relativeFrom="column">
                   <wp:posOffset>1202055</wp:posOffset>
@@ -3719,11 +3791,11 @@
                           </a:avLst>
                         </a:prstGeom>
                         <a:solidFill>
-                          <a:srgbClr val="729fcf"/>
+                          <a:srgbClr val="729FCF"/>
                         </a:solidFill>
                         <a:ln w="9360">
                           <a:solidFill>
-                            <a:srgbClr val="3465a4"/>
+                            <a:srgbClr val="3465A4"/>
                           </a:solidFill>
                           <a:round/>
                         </a:ln>
@@ -3743,7 +3815,7 @@
           </mc:Choice>
           <mc:Fallback>
             <w:pict>
-              <v:shape id="shape_0" ID="Shape 3" path="l-2147483636,0l-2147483636,-2147483631l-2147483635,-2147483631l-2147483635,0l-2147483622,-2147483632l-2147483635,-2147483621l-2147483635,-2147483629l-2147483636,-2147483629l-2147483636,-2147483621xe" fillcolor="#729fcf" stroked="t" o:allowincell="f" style="position:absolute;margin-left:94.65pt;margin-top:14.45pt;width:38.05pt;height:2.15pt;mso-wrap-style:none;v-text-anchor:middle" type="_x0000_t69">
+              <v:shape id="shape_0" fillcolor="#729fcf" stroked="t" o:allowincell="f" style="position:absolute;margin-left:94.65pt;margin-top:14.45pt;width:38.05pt;height:2.15pt;mso-wrap-style:none;v-text-anchor:middle" type="_x0000_t69" path="l-2147483636,0l-2147483636,-2147483631l-2147483635,-2147483631l-2147483635,0l-2147483622,-2147483632l-2147483635,-2147483621l-2147483635,-2147483629l-2147483636,-2147483629l-2147483636,-2147483621xe">
                 <v:fill o:detectmouseclick="t" type="solid" color2="#8d6030"/>
                 <v:stroke color="#3465a4" weight="9360" joinstyle="round" endcap="flat"/>
                 <w10:wrap type="none"/>
@@ -3754,7 +3826,7 @@
         <mc:AlternateContent>
           <mc:Choice Requires="wps">
             <w:drawing>
-              <wp:anchor behindDoc="0" distT="5715" distB="4445" distL="5080" distR="5715" simplePos="0" locked="0" layoutInCell="1" allowOverlap="1" relativeHeight="10">
+              <wp:anchor distT="5715" distB="4445" distL="5080" distR="5715" simplePos="0" relativeHeight="9" behindDoc="0" locked="0" layoutInCell="1" allowOverlap="1">
                 <wp:simplePos x="0" y="0"/>
                 <wp:positionH relativeFrom="column">
                   <wp:posOffset>594995</wp:posOffset>
@@ -3782,11 +3854,11 @@
                           </a:avLst>
                         </a:prstGeom>
                         <a:solidFill>
-                          <a:srgbClr val="3465a4"/>
+                          <a:srgbClr val="3465A4"/>
                         </a:solidFill>
                         <a:ln w="9360">
                           <a:solidFill>
-                            <a:srgbClr val="3465a4"/>
+                            <a:srgbClr val="3465A4"/>
                           </a:solidFill>
                           <a:round/>
                         </a:ln>
@@ -3806,7 +3878,7 @@
           </mc:Choice>
           <mc:Fallback>
             <w:pict>
-              <v:shape id="shape_0" ID="Shape 4" path="l-2147483636,0l-2147483636,-2147483631l-2147483635,-2147483631l-2147483635,0l-2147483622,-2147483632l-2147483635,-2147483621l-2147483635,-2147483629l-2147483636,-2147483629l-2147483636,-2147483621xe" fillcolor="#3465a4" stroked="t" o:allowincell="f" style="position:absolute;margin-left:46.85pt;margin-top:1.3pt;width:401.45pt;height:3.7pt;mso-wrap-style:none;v-text-anchor:middle" type="_x0000_t69">
+              <v:shape id="shape_0" fillcolor="#3465a4" stroked="t" o:allowincell="f" style="position:absolute;margin-left:46.85pt;margin-top:1.3pt;width:401.45pt;height:3.7pt;mso-wrap-style:none;v-text-anchor:middle" type="_x0000_t69" path="l-2147483636,0l-2147483636,-2147483631l-2147483635,-2147483631l-2147483635,0l-2147483622,-2147483632l-2147483635,-2147483621l-2147483635,-2147483629l-2147483636,-2147483629l-2147483636,-2147483621xe">
                 <v:fill o:detectmouseclick="t" type="solid" color2="#cb9a5b"/>
                 <v:stroke color="#3465a4" weight="9360" joinstyle="round" endcap="flat"/>
                 <w10:wrap type="none"/>
@@ -3817,7 +3889,7 @@
         <mc:AlternateContent>
           <mc:Choice Requires="wps">
             <w:drawing>
-              <wp:anchor behindDoc="0" distT="5715" distB="4445" distL="5080" distR="5715" simplePos="0" locked="0" layoutInCell="1" allowOverlap="1" relativeHeight="11">
+              <wp:anchor distT="5715" distB="4445" distL="5080" distR="5715" simplePos="0" relativeHeight="10" behindDoc="0" locked="0" layoutInCell="1" allowOverlap="1">
                 <wp:simplePos x="0" y="0"/>
                 <wp:positionH relativeFrom="column">
                   <wp:posOffset>1759585</wp:posOffset>
@@ -3845,11 +3917,11 @@
                           </a:avLst>
                         </a:prstGeom>
                         <a:solidFill>
-                          <a:srgbClr val="729fcf"/>
+                          <a:srgbClr val="729FCF"/>
                         </a:solidFill>
                         <a:ln w="9360">
                           <a:solidFill>
-                            <a:srgbClr val="3465a4"/>
+                            <a:srgbClr val="3465A4"/>
                           </a:solidFill>
                           <a:round/>
                         </a:ln>
@@ -3869,7 +3941,7 @@
           </mc:Choice>
           <mc:Fallback>
             <w:pict>
-              <v:shape id="shape_0" ID="Shape 6" path="l-2147483636,0l-2147483636,-2147483631l-2147483635,-2147483631l-2147483635,0l-2147483622,-2147483632l-2147483635,-2147483621l-2147483635,-2147483629l-2147483636,-2147483629l-2147483636,-2147483621xe" fillcolor="#729fcf" stroked="t" o:allowincell="f" style="position:absolute;margin-left:138.55pt;margin-top:14.45pt;width:37.95pt;height:2.1pt;mso-wrap-style:none;v-text-anchor:middle" type="_x0000_t69">
+              <v:shape id="shape_0" fillcolor="#729fcf" stroked="t" o:allowincell="f" style="position:absolute;margin-left:138.55pt;margin-top:14.45pt;width:37.95pt;height:2.1pt;mso-wrap-style:none;v-text-anchor:middle" type="_x0000_t69" path="l-2147483636,0l-2147483636,-2147483631l-2147483635,-2147483631l-2147483635,0l-2147483622,-2147483632l-2147483635,-2147483621l-2147483635,-2147483629l-2147483636,-2147483629l-2147483636,-2147483621xe">
                 <v:fill o:detectmouseclick="t" type="solid" color2="#8d6030"/>
                 <v:stroke color="#3465a4" weight="9360" joinstyle="round" endcap="flat"/>
                 <w10:wrap type="none"/>
@@ -3880,7 +3952,7 @@
         <mc:AlternateContent>
           <mc:Choice Requires="wps">
             <w:drawing>
-              <wp:anchor behindDoc="0" distT="5715" distB="4445" distL="5080" distR="5715" simplePos="0" locked="0" layoutInCell="1" allowOverlap="1" relativeHeight="12">
+              <wp:anchor distT="5715" distB="4445" distL="5080" distR="5715" simplePos="0" relativeHeight="11" behindDoc="0" locked="0" layoutInCell="1" allowOverlap="1">
                 <wp:simplePos x="0" y="0"/>
                 <wp:positionH relativeFrom="column">
                   <wp:posOffset>2334895</wp:posOffset>
@@ -3908,11 +3980,11 @@
                           </a:avLst>
                         </a:prstGeom>
                         <a:solidFill>
-                          <a:srgbClr val="729fcf"/>
+                          <a:srgbClr val="729FCF"/>
                         </a:solidFill>
                         <a:ln w="9360">
                           <a:solidFill>
-                            <a:srgbClr val="3465a4"/>
+                            <a:srgbClr val="3465A4"/>
                           </a:solidFill>
                           <a:round/>
                         </a:ln>
@@ -3932,7 +4004,7 @@
           </mc:Choice>
           <mc:Fallback>
             <w:pict>
-              <v:shape id="shape_0" ID="Shape 7" path="l-2147483636,0l-2147483636,-2147483631l-2147483635,-2147483631l-2147483635,0l-2147483622,-2147483632l-2147483635,-2147483621l-2147483635,-2147483629l-2147483636,-2147483629l-2147483636,-2147483621xe" fillcolor="#729fcf" stroked="t" o:allowincell="f" style="position:absolute;margin-left:183.85pt;margin-top:14.4pt;width:37.95pt;height:2.1pt;mso-wrap-style:none;v-text-anchor:middle" type="_x0000_t69">
+              <v:shape id="shape_0" fillcolor="#729fcf" stroked="t" o:allowincell="f" style="position:absolute;margin-left:183.85pt;margin-top:14.4pt;width:37.95pt;height:2.1pt;mso-wrap-style:none;v-text-anchor:middle" type="_x0000_t69" path="l-2147483636,0l-2147483636,-2147483631l-2147483635,-2147483631l-2147483635,0l-2147483622,-2147483632l-2147483635,-2147483621l-2147483635,-2147483629l-2147483636,-2147483629l-2147483636,-2147483621xe">
                 <v:fill o:detectmouseclick="t" type="solid" color2="#8d6030"/>
                 <v:stroke color="#3465a4" weight="9360" joinstyle="round" endcap="flat"/>
                 <w10:wrap type="none"/>
@@ -3943,7 +4015,7 @@
         <mc:AlternateContent>
           <mc:Choice Requires="wps">
             <w:drawing>
-              <wp:anchor behindDoc="0" distT="5715" distB="4445" distL="5080" distR="5715" simplePos="0" locked="0" layoutInCell="1" allowOverlap="1" relativeHeight="13">
+              <wp:anchor distT="5715" distB="4445" distL="5080" distR="5715" simplePos="0" relativeHeight="12" behindDoc="0" locked="0" layoutInCell="1" allowOverlap="1">
                 <wp:simplePos x="0" y="0"/>
                 <wp:positionH relativeFrom="column">
                   <wp:posOffset>2916555</wp:posOffset>
@@ -3971,11 +4043,11 @@
                           </a:avLst>
                         </a:prstGeom>
                         <a:solidFill>
-                          <a:srgbClr val="729fcf"/>
+                          <a:srgbClr val="729FCF"/>
                         </a:solidFill>
                         <a:ln w="9360">
                           <a:solidFill>
-                            <a:srgbClr val="3465a4"/>
+                            <a:srgbClr val="3465A4"/>
                           </a:solidFill>
                           <a:round/>
                         </a:ln>
@@ -3995,7 +4067,7 @@
           </mc:Choice>
           <mc:Fallback>
             <w:pict>
-              <v:shape id="shape_0" ID="Shape 8" path="l-2147483636,0l-2147483636,-2147483631l-2147483635,-2147483631l-2147483635,0l-2147483622,-2147483632l-2147483635,-2147483621l-2147483635,-2147483629l-2147483636,-2147483629l-2147483636,-2147483621xe" fillcolor="#729fcf" stroked="t" o:allowincell="f" style="position:absolute;margin-left:229.65pt;margin-top:14.15pt;width:37.95pt;height:2.1pt;mso-wrap-style:none;v-text-anchor:middle" type="_x0000_t69">
+              <v:shape id="shape_0" fillcolor="#729fcf" stroked="t" o:allowincell="f" style="position:absolute;margin-left:229.65pt;margin-top:14.15pt;width:37.95pt;height:2.1pt;mso-wrap-style:none;v-text-anchor:middle" type="_x0000_t69" path="l-2147483636,0l-2147483636,-2147483631l-2147483635,-2147483631l-2147483635,0l-2147483622,-2147483632l-2147483635,-2147483621l-2147483635,-2147483629l-2147483636,-2147483629l-2147483636,-2147483621xe">
                 <v:fill o:detectmouseclick="t" type="solid" color2="#8d6030"/>
                 <v:stroke color="#3465a4" weight="9360" joinstyle="round" endcap="flat"/>
                 <w10:wrap type="none"/>
@@ -4006,7 +4078,7 @@
         <mc:AlternateContent>
           <mc:Choice Requires="wps">
             <w:drawing>
-              <wp:anchor behindDoc="0" distT="5715" distB="4445" distL="5080" distR="5715" simplePos="0" locked="0" layoutInCell="1" allowOverlap="1" relativeHeight="14">
+              <wp:anchor distT="5715" distB="4445" distL="5080" distR="5715" simplePos="0" relativeHeight="13" behindDoc="0" locked="0" layoutInCell="1" allowOverlap="1">
                 <wp:simplePos x="0" y="0"/>
                 <wp:positionH relativeFrom="column">
                   <wp:posOffset>3491230</wp:posOffset>
@@ -4034,11 +4106,11 @@
                           </a:avLst>
                         </a:prstGeom>
                         <a:solidFill>
-                          <a:srgbClr val="729fcf"/>
+                          <a:srgbClr val="729FCF"/>
                         </a:solidFill>
                         <a:ln w="9360">
                           <a:solidFill>
-                            <a:srgbClr val="3465a4"/>
+                            <a:srgbClr val="3465A4"/>
                           </a:solidFill>
                           <a:round/>
                         </a:ln>
@@ -4058,7 +4130,7 @@
           </mc:Choice>
           <mc:Fallback>
             <w:pict>
-              <v:shape id="shape_0" ID="Shape 9" path="l-2147483636,0l-2147483636,-2147483631l-2147483635,-2147483631l-2147483635,0l-2147483622,-2147483632l-2147483635,-2147483621l-2147483635,-2147483629l-2147483636,-2147483629l-2147483636,-2147483621xe" fillcolor="#729fcf" stroked="t" o:allowincell="f" style="position:absolute;margin-left:274.9pt;margin-top:14.15pt;width:37.95pt;height:2.1pt;mso-wrap-style:none;v-text-anchor:middle" type="_x0000_t69">
+              <v:shape id="shape_0" fillcolor="#729fcf" stroked="t" o:allowincell="f" style="position:absolute;margin-left:274.9pt;margin-top:14.15pt;width:37.95pt;height:2.1pt;mso-wrap-style:none;v-text-anchor:middle" type="_x0000_t69" path="l-2147483636,0l-2147483636,-2147483631l-2147483635,-2147483631l-2147483635,0l-2147483622,-2147483632l-2147483635,-2147483621l-2147483635,-2147483629l-2147483636,-2147483629l-2147483636,-2147483621xe">
                 <v:fill o:detectmouseclick="t" type="solid" color2="#8d6030"/>
                 <v:stroke color="#3465a4" weight="9360" joinstyle="round" endcap="flat"/>
                 <w10:wrap type="none"/>
@@ -4069,7 +4141,7 @@
         <mc:AlternateContent>
           <mc:Choice Requires="wps">
             <w:drawing>
-              <wp:anchor behindDoc="0" distT="5715" distB="4445" distL="5080" distR="5715" simplePos="0" locked="0" layoutInCell="1" allowOverlap="1" relativeHeight="15">
+              <wp:anchor distT="5715" distB="4445" distL="5080" distR="5715" simplePos="0" relativeHeight="14" behindDoc="0" locked="0" layoutInCell="1" allowOverlap="1">
                 <wp:simplePos x="0" y="0"/>
                 <wp:positionH relativeFrom="column">
                   <wp:posOffset>4059555</wp:posOffset>
@@ -4097,11 +4169,11 @@
                           </a:avLst>
                         </a:prstGeom>
                         <a:solidFill>
-                          <a:srgbClr val="729fcf"/>
+                          <a:srgbClr val="729FCF"/>
                         </a:solidFill>
                         <a:ln w="9360">
                           <a:solidFill>
-                            <a:srgbClr val="3465a4"/>
+                            <a:srgbClr val="3465A4"/>
                           </a:solidFill>
                           <a:round/>
                         </a:ln>
@@ -4121,7 +4193,7 @@
           </mc:Choice>
           <mc:Fallback>
             <w:pict>
-              <v:shape id="shape_0" ID="Shape 10" path="l-2147483636,0l-2147483636,-2147483631l-2147483635,-2147483631l-2147483635,0l-2147483622,-2147483632l-2147483635,-2147483621l-2147483635,-2147483629l-2147483636,-2147483629l-2147483636,-2147483621xe" fillcolor="#729fcf" stroked="t" o:allowincell="f" style="position:absolute;margin-left:319.65pt;margin-top:13.6pt;width:37.95pt;height:2.1pt;mso-wrap-style:none;v-text-anchor:middle" type="_x0000_t69">
+              <v:shape id="shape_0" fillcolor="#729fcf" stroked="t" o:allowincell="f" style="position:absolute;margin-left:319.65pt;margin-top:13.6pt;width:37.95pt;height:2.1pt;mso-wrap-style:none;v-text-anchor:middle" type="_x0000_t69" path="l-2147483636,0l-2147483636,-2147483631l-2147483635,-2147483631l-2147483635,0l-2147483622,-2147483632l-2147483635,-2147483621l-2147483635,-2147483629l-2147483636,-2147483629l-2147483636,-2147483621xe">
                 <v:fill o:detectmouseclick="t" type="solid" color2="#8d6030"/>
                 <v:stroke color="#3465a4" weight="9360" joinstyle="round" endcap="flat"/>
                 <w10:wrap type="none"/>
@@ -4132,7 +4204,7 @@
         <mc:AlternateContent>
           <mc:Choice Requires="wps">
             <w:drawing>
-              <wp:anchor behindDoc="0" distT="5715" distB="4445" distL="5080" distR="5715" simplePos="0" locked="0" layoutInCell="1" allowOverlap="1" relativeHeight="16">
+              <wp:anchor distT="5715" distB="4445" distL="5080" distR="5715" simplePos="0" relativeHeight="15" behindDoc="0" locked="0" layoutInCell="1" allowOverlap="1">
                 <wp:simplePos x="0" y="0"/>
                 <wp:positionH relativeFrom="column">
                   <wp:posOffset>4613275</wp:posOffset>
@@ -4160,11 +4232,11 @@
                           </a:avLst>
                         </a:prstGeom>
                         <a:solidFill>
-                          <a:srgbClr val="729fcf"/>
+                          <a:srgbClr val="729FCF"/>
                         </a:solidFill>
                         <a:ln w="9360">
                           <a:solidFill>
-                            <a:srgbClr val="3465a4"/>
+                            <a:srgbClr val="3465A4"/>
                           </a:solidFill>
                           <a:round/>
                         </a:ln>
@@ -4184,7 +4256,7 @@
           </mc:Choice>
           <mc:Fallback>
             <w:pict>
-              <v:shape id="shape_0" ID="Shape 11" path="l-2147483636,0l-2147483636,-2147483631l-2147483635,-2147483631l-2147483635,0l-2147483622,-2147483632l-2147483635,-2147483621l-2147483635,-2147483629l-2147483636,-2147483629l-2147483636,-2147483621xe" fillcolor="#729fcf" stroked="t" o:allowincell="f" style="position:absolute;margin-left:363.25pt;margin-top:13.05pt;width:37.95pt;height:2.1pt;mso-wrap-style:none;v-text-anchor:middle" type="_x0000_t69">
+              <v:shape id="shape_0" fillcolor="#729fcf" stroked="t" o:allowincell="f" style="position:absolute;margin-left:363.25pt;margin-top:13.05pt;width:37.95pt;height:2.1pt;mso-wrap-style:none;v-text-anchor:middle" type="_x0000_t69" path="l-2147483636,0l-2147483636,-2147483631l-2147483635,-2147483631l-2147483635,0l-2147483622,-2147483632l-2147483635,-2147483621l-2147483635,-2147483629l-2147483636,-2147483629l-2147483636,-2147483621xe">
                 <v:fill o:detectmouseclick="t" type="solid" color2="#8d6030"/>
                 <v:stroke color="#3465a4" weight="9360" joinstyle="round" endcap="flat"/>
                 <w10:wrap type="none"/>
@@ -4195,7 +4267,7 @@
         <mc:AlternateContent>
           <mc:Choice Requires="wps">
             <w:drawing>
-              <wp:anchor behindDoc="0" distT="0" distB="0" distL="0" distR="0" simplePos="0" locked="0" layoutInCell="1" allowOverlap="1" relativeHeight="17">
+              <wp:anchor distT="0" distB="0" distL="0" distR="0" simplePos="0" relativeHeight="16" behindDoc="0" locked="0" layoutInCell="1" allowOverlap="1">
                 <wp:simplePos x="0" y="0"/>
                 <wp:positionH relativeFrom="column">
                   <wp:posOffset>-5080</wp:posOffset>
@@ -4234,11 +4306,11 @@
                         <w:txbxContent>
                           <w:p>
                             <w:pPr>
-                              <w:pStyle w:val="FrameContentsuser"/>
-                              <w:overflowPunct w:val="false"/>
+                              <w:pStyle w:val="FrameContents"/>
+                              <w:overflowPunct w:val="true"/>
                               <w:bidi w:val="0"/>
                               <w:spacing w:before="0" w:after="0"/>
-                              <w:ind w:hanging="0" w:start="284" w:end="284"/>
+                              <w:ind w:hanging="0" w:left="284" w:right="284"/>
                               <w:rPr/>
                             </w:pPr>
                             <w:r>
@@ -4255,7 +4327,7 @@
                           </w:p>
                         </w:txbxContent>
                       </wps:txbx>
-                      <wps:bodyPr lIns="0" rIns="0" tIns="0" bIns="0" anchor="t">
+                      <wps:bodyPr lIns="0" tIns="0" rIns="0" bIns="0" anchor="t">
                         <a:noAutofit/>
                       </wps:bodyPr>
                     </wps:wsp>
@@ -4266,18 +4338,18 @@
           </mc:Choice>
           <mc:Fallback>
             <w:pict>
-              <v:rect id="shape_0" ID="Shape14" path="m0,0l-2147483645,0l-2147483645,-2147483646l0,-2147483646xe" stroked="f" o:allowincell="f" style="position:absolute;margin-left:-0.4pt;margin-top:5.05pt;width:56.2pt;height:18.5pt;mso-wrap-style:square;v-text-anchor:top">
+              <v:rect id="shape_0" stroked="f" o:allowincell="f" style="position:absolute;margin-left:-0.4pt;margin-top:5.05pt;width:56.2pt;height:18.5pt;mso-wrap-style:square;v-text-anchor:top">
                 <v:fill o:detectmouseclick="t" on="false"/>
                 <v:stroke color="#3465a4" joinstyle="round" endcap="flat"/>
                 <v:textbox>
                   <w:txbxContent>
                     <w:p>
                       <w:pPr>
-                        <w:pStyle w:val="FrameContentsuser"/>
-                        <w:overflowPunct w:val="false"/>
+                        <w:pStyle w:val="FrameContents"/>
+                        <w:overflowPunct w:val="true"/>
                         <w:bidi w:val="0"/>
                         <w:spacing w:before="0" w:after="0"/>
-                        <w:ind w:hanging="0" w:start="284" w:end="284"/>
+                        <w:ind w:hanging="0" w:left="284" w:right="284"/>
                         <w:rPr/>
                       </w:pPr>
                       <w:r>
@@ -4302,7 +4374,7 @@
         <mc:AlternateContent>
           <mc:Choice Requires="wps">
             <w:drawing>
-              <wp:anchor behindDoc="0" distT="0" distB="0" distL="0" distR="0" simplePos="0" locked="0" layoutInCell="1" allowOverlap="1" relativeHeight="19">
+              <wp:anchor distT="0" distB="0" distL="0" distR="0" simplePos="0" relativeHeight="18" behindDoc="0" locked="0" layoutInCell="1" allowOverlap="1">
                 <wp:simplePos x="0" y="0"/>
                 <wp:positionH relativeFrom="column">
                   <wp:posOffset>570230</wp:posOffset>
@@ -4341,11 +4413,11 @@
                         <w:txbxContent>
                           <w:p>
                             <w:pPr>
-                              <w:pStyle w:val="FrameContentsuser"/>
-                              <w:overflowPunct w:val="false"/>
+                              <w:pStyle w:val="FrameContents"/>
+                              <w:overflowPunct w:val="true"/>
                               <w:bidi w:val="0"/>
                               <w:spacing w:before="0" w:after="0"/>
-                              <w:ind w:hanging="0" w:start="284" w:end="284"/>
+                              <w:ind w:hanging="0" w:left="284" w:right="284"/>
                               <w:rPr/>
                             </w:pPr>
                             <w:r>
@@ -4362,7 +4434,7 @@
                           </w:p>
                         </w:txbxContent>
                       </wps:txbx>
-                      <wps:bodyPr lIns="0" rIns="0" tIns="0" bIns="0" anchor="t">
+                      <wps:bodyPr lIns="0" tIns="0" rIns="0" bIns="0" anchor="t">
                         <a:noAutofit/>
                       </wps:bodyPr>
                     </wps:wsp>
@@ -4373,18 +4445,18 @@
           </mc:Choice>
           <mc:Fallback>
             <w:pict>
-              <v:rect id="shape_0" ID="Shape15" path="m0,0l-2147483645,0l-2147483645,-2147483646l0,-2147483646xe" stroked="f" o:allowincell="f" style="position:absolute;margin-left:44.9pt;margin-top:5.05pt;width:56.2pt;height:18.5pt;mso-wrap-style:square;v-text-anchor:top">
+              <v:rect id="shape_0" stroked="f" o:allowincell="f" style="position:absolute;margin-left:44.9pt;margin-top:5.05pt;width:56.2pt;height:18.5pt;mso-wrap-style:square;v-text-anchor:top">
                 <v:fill o:detectmouseclick="t" on="false"/>
                 <v:stroke color="#3465a4" joinstyle="round" endcap="flat"/>
                 <v:textbox>
                   <w:txbxContent>
                     <w:p>
                       <w:pPr>
-                        <w:pStyle w:val="FrameContentsuser"/>
-                        <w:overflowPunct w:val="false"/>
+                        <w:pStyle w:val="FrameContents"/>
+                        <w:overflowPunct w:val="true"/>
                         <w:bidi w:val="0"/>
                         <w:spacing w:before="0" w:after="0"/>
-                        <w:ind w:hanging="0" w:start="284" w:end="284"/>
+                        <w:ind w:hanging="0" w:left="284" w:right="284"/>
                         <w:rPr/>
                       </w:pPr>
                       <w:r>
@@ -4409,7 +4481,7 @@
         <mc:AlternateContent>
           <mc:Choice Requires="wps">
             <w:drawing>
-              <wp:anchor behindDoc="0" distT="0" distB="0" distL="0" distR="0" simplePos="0" locked="0" layoutInCell="1" allowOverlap="1" relativeHeight="21">
+              <wp:anchor distT="0" distB="0" distL="0" distR="0" simplePos="0" relativeHeight="20" behindDoc="0" locked="0" layoutInCell="1" allowOverlap="1">
                 <wp:simplePos x="0" y="0"/>
                 <wp:positionH relativeFrom="column">
                   <wp:posOffset>1736725</wp:posOffset>
@@ -4448,11 +4520,11 @@
                         <w:txbxContent>
                           <w:p>
                             <w:pPr>
-                              <w:pStyle w:val="FrameContentsuser"/>
-                              <w:overflowPunct w:val="false"/>
+                              <w:pStyle w:val="FrameContents"/>
+                              <w:overflowPunct w:val="true"/>
                               <w:bidi w:val="0"/>
                               <w:spacing w:before="0" w:after="0"/>
-                              <w:ind w:hanging="0" w:start="284" w:end="284"/>
+                              <w:ind w:hanging="0" w:left="284" w:right="284"/>
                               <w:rPr/>
                             </w:pPr>
                             <w:r>
@@ -4469,7 +4541,7 @@
                           </w:p>
                         </w:txbxContent>
                       </wps:txbx>
-                      <wps:bodyPr lIns="0" rIns="0" tIns="0" bIns="0" anchor="t">
+                      <wps:bodyPr lIns="0" tIns="0" rIns="0" bIns="0" anchor="t">
                         <a:noAutofit/>
                       </wps:bodyPr>
                     </wps:wsp>
@@ -4480,18 +4552,18 @@
           </mc:Choice>
           <mc:Fallback>
             <w:pict>
-              <v:rect id="shape_0" ID="Shape16" path="m0,0l-2147483645,0l-2147483645,-2147483646l0,-2147483646xe" stroked="f" o:allowincell="f" style="position:absolute;margin-left:136.75pt;margin-top:5.05pt;width:56.2pt;height:18.5pt;mso-wrap-style:square;v-text-anchor:top">
+              <v:rect id="shape_0" stroked="f" o:allowincell="f" style="position:absolute;margin-left:136.75pt;margin-top:5.05pt;width:56.2pt;height:18.5pt;mso-wrap-style:square;v-text-anchor:top">
                 <v:fill o:detectmouseclick="t" on="false"/>
                 <v:stroke color="#3465a4" joinstyle="round" endcap="flat"/>
                 <v:textbox>
                   <w:txbxContent>
                     <w:p>
                       <w:pPr>
-                        <w:pStyle w:val="FrameContentsuser"/>
-                        <w:overflowPunct w:val="false"/>
+                        <w:pStyle w:val="FrameContents"/>
+                        <w:overflowPunct w:val="true"/>
                         <w:bidi w:val="0"/>
                         <w:spacing w:before="0" w:after="0"/>
-                        <w:ind w:hanging="0" w:start="284" w:end="284"/>
+                        <w:ind w:hanging="0" w:left="284" w:right="284"/>
                         <w:rPr/>
                       </w:pPr>
                       <w:r>
@@ -4516,7 +4588,7 @@
         <mc:AlternateContent>
           <mc:Choice Requires="wps">
             <w:drawing>
-              <wp:anchor behindDoc="0" distT="0" distB="0" distL="0" distR="0" simplePos="0" locked="0" layoutInCell="1" allowOverlap="1" relativeHeight="23">
+              <wp:anchor distT="0" distB="0" distL="0" distR="0" simplePos="0" relativeHeight="22" behindDoc="0" locked="0" layoutInCell="1" allowOverlap="1">
                 <wp:simplePos x="0" y="0"/>
                 <wp:positionH relativeFrom="column">
                   <wp:posOffset>2917190</wp:posOffset>
@@ -4555,11 +4627,11 @@
                         <w:txbxContent>
                           <w:p>
                             <w:pPr>
-                              <w:pStyle w:val="FrameContentsuser"/>
-                              <w:overflowPunct w:val="false"/>
+                              <w:pStyle w:val="FrameContents"/>
+                              <w:overflowPunct w:val="true"/>
                               <w:bidi w:val="0"/>
                               <w:spacing w:before="0" w:after="0"/>
-                              <w:ind w:hanging="0" w:start="284" w:end="284"/>
+                              <w:ind w:hanging="0" w:left="284" w:right="284"/>
                               <w:rPr/>
                             </w:pPr>
                             <w:r>
@@ -4576,7 +4648,7 @@
                           </w:p>
                         </w:txbxContent>
                       </wps:txbx>
-                      <wps:bodyPr lIns="0" rIns="0" tIns="0" bIns="0" anchor="t">
+                      <wps:bodyPr lIns="0" tIns="0" rIns="0" bIns="0" anchor="t">
                         <a:noAutofit/>
                       </wps:bodyPr>
                     </wps:wsp>
@@ -4587,18 +4659,18 @@
           </mc:Choice>
           <mc:Fallback>
             <w:pict>
-              <v:rect id="shape_0" ID="Shape17" path="m0,0l-2147483645,0l-2147483645,-2147483646l0,-2147483646xe" stroked="f" o:allowincell="f" style="position:absolute;margin-left:229.7pt;margin-top:5.05pt;width:56.2pt;height:18.5pt;mso-wrap-style:square;v-text-anchor:top">
+              <v:rect id="shape_0" stroked="f" o:allowincell="f" style="position:absolute;margin-left:229.7pt;margin-top:5.05pt;width:56.2pt;height:18.5pt;mso-wrap-style:square;v-text-anchor:top">
                 <v:fill o:detectmouseclick="t" on="false"/>
                 <v:stroke color="#3465a4" joinstyle="round" endcap="flat"/>
                 <v:textbox>
                   <w:txbxContent>
                     <w:p>
                       <w:pPr>
-                        <w:pStyle w:val="FrameContentsuser"/>
-                        <w:overflowPunct w:val="false"/>
+                        <w:pStyle w:val="FrameContents"/>
+                        <w:overflowPunct w:val="true"/>
                         <w:bidi w:val="0"/>
                         <w:spacing w:before="0" w:after="0"/>
-                        <w:ind w:hanging="0" w:start="284" w:end="284"/>
+                        <w:ind w:hanging="0" w:left="284" w:right="284"/>
                         <w:rPr/>
                       </w:pPr>
                       <w:r>
@@ -4623,7 +4695,7 @@
         <mc:AlternateContent>
           <mc:Choice Requires="wps">
             <w:drawing>
-              <wp:anchor behindDoc="0" distT="0" distB="0" distL="0" distR="0" simplePos="0" locked="0" layoutInCell="1" allowOverlap="1" relativeHeight="25">
+              <wp:anchor distT="0" distB="0" distL="0" distR="0" simplePos="0" relativeHeight="24" behindDoc="0" locked="0" layoutInCell="1" allowOverlap="1">
                 <wp:simplePos x="0" y="0"/>
                 <wp:positionH relativeFrom="column">
                   <wp:posOffset>4032885</wp:posOffset>
@@ -4662,11 +4734,11 @@
                         <w:txbxContent>
                           <w:p>
                             <w:pPr>
-                              <w:pStyle w:val="FrameContentsuser"/>
-                              <w:overflowPunct w:val="false"/>
+                              <w:pStyle w:val="FrameContents"/>
+                              <w:overflowPunct w:val="true"/>
                               <w:bidi w:val="0"/>
                               <w:spacing w:before="0" w:after="0"/>
-                              <w:ind w:hanging="0" w:start="284" w:end="284"/>
+                              <w:ind w:hanging="0" w:left="284" w:right="284"/>
                               <w:rPr/>
                             </w:pPr>
                             <w:r>
@@ -4683,7 +4755,7 @@
                           </w:p>
                         </w:txbxContent>
                       </wps:txbx>
-                      <wps:bodyPr lIns="0" rIns="0" tIns="0" bIns="0" anchor="t">
+                      <wps:bodyPr lIns="0" tIns="0" rIns="0" bIns="0" anchor="t">
                         <a:noAutofit/>
                       </wps:bodyPr>
                     </wps:wsp>
@@ -4694,18 +4766,18 @@
           </mc:Choice>
           <mc:Fallback>
             <w:pict>
-              <v:rect id="shape_0" ID="Shape18" path="m0,0l-2147483645,0l-2147483645,-2147483646l0,-2147483646xe" stroked="f" o:allowincell="f" style="position:absolute;margin-left:317.55pt;margin-top:5.05pt;width:56.2pt;height:18.5pt;mso-wrap-style:square;v-text-anchor:top">
+              <v:rect id="shape_0" stroked="f" o:allowincell="f" style="position:absolute;margin-left:317.55pt;margin-top:5.05pt;width:56.2pt;height:18.5pt;mso-wrap-style:square;v-text-anchor:top">
                 <v:fill o:detectmouseclick="t" on="false"/>
                 <v:stroke color="#3465a4" joinstyle="round" endcap="flat"/>
                 <v:textbox>
                   <w:txbxContent>
                     <w:p>
                       <w:pPr>
-                        <w:pStyle w:val="FrameContentsuser"/>
-                        <w:overflowPunct w:val="false"/>
+                        <w:pStyle w:val="FrameContents"/>
+                        <w:overflowPunct w:val="true"/>
                         <w:bidi w:val="0"/>
                         <w:spacing w:before="0" w:after="0"/>
-                        <w:ind w:hanging="0" w:start="284" w:end="284"/>
+                        <w:ind w:hanging="0" w:left="284" w:right="284"/>
                         <w:rPr/>
                       </w:pPr>
                       <w:r>
@@ -4730,7 +4802,7 @@
         <mc:AlternateContent>
           <mc:Choice Requires="wps">
             <w:drawing>
-              <wp:anchor behindDoc="0" distT="0" distB="0" distL="0" distR="0" simplePos="0" locked="0" layoutInCell="1" allowOverlap="1" relativeHeight="27">
+              <wp:anchor distT="0" distB="0" distL="0" distR="0" simplePos="0" relativeHeight="26" behindDoc="0" locked="0" layoutInCell="1" allowOverlap="1">
                 <wp:simplePos x="0" y="0"/>
                 <wp:positionH relativeFrom="column">
                   <wp:posOffset>1175385</wp:posOffset>
@@ -4769,11 +4841,11 @@
                         <w:txbxContent>
                           <w:p>
                             <w:pPr>
-                              <w:pStyle w:val="FrameContentsuser"/>
-                              <w:overflowPunct w:val="false"/>
+                              <w:pStyle w:val="FrameContents"/>
+                              <w:overflowPunct w:val="true"/>
                               <w:bidi w:val="0"/>
                               <w:spacing w:before="0" w:after="0"/>
-                              <w:ind w:hanging="0" w:start="284" w:end="284"/>
+                              <w:ind w:hanging="0" w:left="284" w:right="284"/>
                               <w:rPr/>
                             </w:pPr>
                             <w:r>
@@ -4790,7 +4862,7 @@
                           </w:p>
                         </w:txbxContent>
                       </wps:txbx>
-                      <wps:bodyPr lIns="0" rIns="0" tIns="0" bIns="0" anchor="t">
+                      <wps:bodyPr lIns="0" tIns="0" rIns="0" bIns="0" anchor="t">
                         <a:noAutofit/>
                       </wps:bodyPr>
                     </wps:wsp>
@@ -4801,18 +4873,18 @@
           </mc:Choice>
           <mc:Fallback>
             <w:pict>
-              <v:rect id="shape_0" ID="Shape19" path="m0,0l-2147483645,0l-2147483645,-2147483646l0,-2147483646xe" stroked="f" o:allowincell="f" style="position:absolute;margin-left:92.55pt;margin-top:7.2pt;width:56.2pt;height:18.5pt;mso-wrap-style:square;v-text-anchor:top">
+              <v:rect id="shape_0" stroked="f" o:allowincell="f" style="position:absolute;margin-left:92.55pt;margin-top:7.2pt;width:56.2pt;height:18.5pt;mso-wrap-style:square;v-text-anchor:top">
                 <v:fill o:detectmouseclick="t" on="false"/>
                 <v:stroke color="#3465a4" joinstyle="round" endcap="flat"/>
                 <v:textbox>
                   <w:txbxContent>
                     <w:p>
                       <w:pPr>
-                        <w:pStyle w:val="FrameContentsuser"/>
-                        <w:overflowPunct w:val="false"/>
+                        <w:pStyle w:val="FrameContents"/>
+                        <w:overflowPunct w:val="true"/>
                         <w:bidi w:val="0"/>
                         <w:spacing w:before="0" w:after="0"/>
-                        <w:ind w:hanging="0" w:start="284" w:end="284"/>
+                        <w:ind w:hanging="0" w:left="284" w:right="284"/>
                         <w:rPr/>
                       </w:pPr>
                       <w:r>
@@ -4837,7 +4909,7 @@
         <mc:AlternateContent>
           <mc:Choice Requires="wps">
             <w:drawing>
-              <wp:anchor behindDoc="0" distT="0" distB="0" distL="0" distR="0" simplePos="0" locked="0" layoutInCell="1" allowOverlap="1" relativeHeight="29">
+              <wp:anchor distT="0" distB="0" distL="0" distR="0" simplePos="0" relativeHeight="28" behindDoc="0" locked="0" layoutInCell="1" allowOverlap="1">
                 <wp:simplePos x="0" y="0"/>
                 <wp:positionH relativeFrom="column">
                   <wp:posOffset>2345690</wp:posOffset>
@@ -4876,11 +4948,11 @@
                         <w:txbxContent>
                           <w:p>
                             <w:pPr>
-                              <w:pStyle w:val="FrameContentsuser"/>
-                              <w:overflowPunct w:val="false"/>
+                              <w:pStyle w:val="FrameContents"/>
+                              <w:overflowPunct w:val="true"/>
                               <w:bidi w:val="0"/>
                               <w:spacing w:before="0" w:after="0"/>
-                              <w:ind w:hanging="0" w:start="284" w:end="284"/>
+                              <w:ind w:hanging="0" w:left="284" w:right="284"/>
                               <w:rPr/>
                             </w:pPr>
                             <w:r>
@@ -4897,7 +4969,7 @@
                           </w:p>
                         </w:txbxContent>
                       </wps:txbx>
-                      <wps:bodyPr lIns="0" rIns="0" tIns="0" bIns="0" anchor="t">
+                      <wps:bodyPr lIns="0" tIns="0" rIns="0" bIns="0" anchor="t">
                         <a:noAutofit/>
                       </wps:bodyPr>
                     </wps:wsp>
@@ -4908,18 +4980,18 @@
           </mc:Choice>
           <mc:Fallback>
             <w:pict>
-              <v:rect id="shape_0" ID="Shape20" path="m0,0l-2147483645,0l-2147483645,-2147483646l0,-2147483646xe" stroked="f" o:allowincell="f" style="position:absolute;margin-left:184.7pt;margin-top:7.2pt;width:56.2pt;height:18.5pt;mso-wrap-style:square;v-text-anchor:top">
+              <v:rect id="shape_0" stroked="f" o:allowincell="f" style="position:absolute;margin-left:184.7pt;margin-top:7.2pt;width:56.2pt;height:18.5pt;mso-wrap-style:square;v-text-anchor:top">
                 <v:fill o:detectmouseclick="t" on="false"/>
                 <v:stroke color="#3465a4" joinstyle="round" endcap="flat"/>
                 <v:textbox>
                   <w:txbxContent>
                     <w:p>
                       <w:pPr>
-                        <w:pStyle w:val="FrameContentsuser"/>
-                        <w:overflowPunct w:val="false"/>
+                        <w:pStyle w:val="FrameContents"/>
+                        <w:overflowPunct w:val="true"/>
                         <w:bidi w:val="0"/>
                         <w:spacing w:before="0" w:after="0"/>
-                        <w:ind w:hanging="0" w:start="284" w:end="284"/>
+                        <w:ind w:hanging="0" w:left="284" w:right="284"/>
                         <w:rPr/>
                       </w:pPr>
                       <w:r>
@@ -4944,7 +5016,7 @@
         <mc:AlternateContent>
           <mc:Choice Requires="wps">
             <w:drawing>
-              <wp:anchor behindDoc="0" distT="0" distB="0" distL="0" distR="0" simplePos="0" locked="0" layoutInCell="1" allowOverlap="1" relativeHeight="31">
+              <wp:anchor distT="0" distB="0" distL="0" distR="0" simplePos="0" relativeHeight="30" behindDoc="0" locked="0" layoutInCell="1" allowOverlap="1">
                 <wp:simplePos x="0" y="0"/>
                 <wp:positionH relativeFrom="column">
                   <wp:posOffset>4655185</wp:posOffset>
@@ -4983,11 +5055,11 @@
                         <w:txbxContent>
                           <w:p>
                             <w:pPr>
-                              <w:pStyle w:val="FrameContentsuser"/>
-                              <w:overflowPunct w:val="false"/>
+                              <w:pStyle w:val="FrameContents"/>
+                              <w:overflowPunct w:val="true"/>
                               <w:bidi w:val="0"/>
                               <w:spacing w:before="0" w:after="0"/>
-                              <w:ind w:hanging="0" w:start="284" w:end="284"/>
+                              <w:ind w:hanging="0" w:left="284" w:right="284"/>
                               <w:rPr/>
                             </w:pPr>
                             <w:r>
@@ -5004,7 +5076,7 @@
                           </w:p>
                         </w:txbxContent>
                       </wps:txbx>
-                      <wps:bodyPr lIns="0" rIns="0" tIns="0" bIns="0" anchor="t">
+                      <wps:bodyPr lIns="0" tIns="0" rIns="0" bIns="0" anchor="t">
                         <a:noAutofit/>
                       </wps:bodyPr>
                     </wps:wsp>
@@ -5015,18 +5087,18 @@
           </mc:Choice>
           <mc:Fallback>
             <w:pict>
-              <v:rect id="shape_0" ID="Shape21" path="m0,0l-2147483645,0l-2147483645,-2147483646l0,-2147483646xe" stroked="f" o:allowincell="f" style="position:absolute;margin-left:366.55pt;margin-top:5.05pt;width:56.2pt;height:18.5pt;mso-wrap-style:square;v-text-anchor:top">
+              <v:rect id="shape_0" stroked="f" o:allowincell="f" style="position:absolute;margin-left:366.55pt;margin-top:5.05pt;width:56.2pt;height:18.5pt;mso-wrap-style:square;v-text-anchor:top">
                 <v:fill o:detectmouseclick="t" on="false"/>
                 <v:stroke color="#3465a4" joinstyle="round" endcap="flat"/>
                 <v:textbox>
                   <w:txbxContent>
                     <w:p>
                       <w:pPr>
-                        <w:pStyle w:val="FrameContentsuser"/>
-                        <w:overflowPunct w:val="false"/>
+                        <w:pStyle w:val="FrameContents"/>
+                        <w:overflowPunct w:val="true"/>
                         <w:bidi w:val="0"/>
                         <w:spacing w:before="0" w:after="0"/>
-                        <w:ind w:hanging="0" w:start="284" w:end="284"/>
+                        <w:ind w:hanging="0" w:left="284" w:right="284"/>
                         <w:rPr/>
                       </w:pPr>
                       <w:r>
@@ -5051,7 +5123,7 @@
         <mc:AlternateContent>
           <mc:Choice Requires="wps">
             <w:drawing>
-              <wp:anchor behindDoc="0" distT="0" distB="0" distL="0" distR="0" simplePos="0" locked="0" layoutInCell="1" allowOverlap="1" relativeHeight="33">
+              <wp:anchor distT="0" distB="0" distL="0" distR="0" simplePos="0" relativeHeight="32" behindDoc="0" locked="0" layoutInCell="1" allowOverlap="1">
                 <wp:simplePos x="0" y="0"/>
                 <wp:positionH relativeFrom="column">
                   <wp:posOffset>3515995</wp:posOffset>
@@ -5090,11 +5162,11 @@
                         <w:txbxContent>
                           <w:p>
                             <w:pPr>
-                              <w:pStyle w:val="FrameContentsuser"/>
-                              <w:overflowPunct w:val="false"/>
+                              <w:pStyle w:val="FrameContents"/>
+                              <w:overflowPunct w:val="true"/>
                               <w:bidi w:val="0"/>
                               <w:spacing w:before="0" w:after="0"/>
-                              <w:ind w:hanging="0" w:start="284" w:end="284"/>
+                              <w:ind w:hanging="0" w:left="284" w:right="284"/>
                               <w:rPr/>
                             </w:pPr>
                             <w:r>
@@ -5111,7 +5183,7 @@
                           </w:p>
                         </w:txbxContent>
                       </wps:txbx>
-                      <wps:bodyPr lIns="0" rIns="0" tIns="0" bIns="0" anchor="t">
+                      <wps:bodyPr lIns="0" tIns="0" rIns="0" bIns="0" anchor="t">
                         <a:noAutofit/>
                       </wps:bodyPr>
                     </wps:wsp>
@@ -5122,18 +5194,18 @@
           </mc:Choice>
           <mc:Fallback>
             <w:pict>
-              <v:rect id="shape_0" ID="Shape22" path="m0,0l-2147483645,0l-2147483645,-2147483646l0,-2147483646xe" stroked="f" o:allowincell="f" style="position:absolute;margin-left:276.85pt;margin-top:5.05pt;width:56.2pt;height:18.5pt;mso-wrap-style:square;v-text-anchor:top">
+              <v:rect id="shape_0" stroked="f" o:allowincell="f" style="position:absolute;margin-left:276.85pt;margin-top:5.05pt;width:56.2pt;height:18.5pt;mso-wrap-style:square;v-text-anchor:top">
                 <v:fill o:detectmouseclick="t" on="false"/>
                 <v:stroke color="#3465a4" joinstyle="round" endcap="flat"/>
                 <v:textbox>
                   <w:txbxContent>
                     <w:p>
                       <w:pPr>
-                        <w:pStyle w:val="FrameContentsuser"/>
-                        <w:overflowPunct w:val="false"/>
+                        <w:pStyle w:val="FrameContents"/>
+                        <w:overflowPunct w:val="true"/>
                         <w:bidi w:val="0"/>
                         <w:spacing w:before="0" w:after="0"/>
-                        <w:ind w:hanging="0" w:start="284" w:end="284"/>
+                        <w:ind w:hanging="0" w:left="284" w:right="284"/>
                         <w:rPr/>
                       </w:pPr>
                       <w:r>
@@ -5160,14 +5232,14 @@
     <w:tbl>
       <w:tblPr>
         <w:tblW w:w="5000" w:type="pct"/>
-        <w:jc w:val="start"/>
+        <w:jc w:val="left"/>
         <w:tblInd w:w="55" w:type="dxa"/>
         <w:tblLayout w:type="fixed"/>
         <w:tblCellMar>
           <w:top w:w="55" w:type="dxa"/>
-          <w:start w:w="55" w:type="dxa"/>
+          <w:left w:w="55" w:type="dxa"/>
           <w:bottom w:w="55" w:type="dxa"/>
-          <w:end w:w="55" w:type="dxa"/>
+          <w:right w:w="55" w:type="dxa"/>
         </w:tblCellMar>
       </w:tblPr>
       <w:tblGrid>
@@ -5180,7 +5252,7 @@
         <w:gridCol w:w="906"/>
         <w:gridCol w:w="908"/>
         <w:gridCol w:w="906"/>
-        <w:gridCol w:w="907"/>
+        <w:gridCol w:w="908"/>
       </w:tblGrid>
       <w:tr>
         <w:trPr/>
@@ -5189,7 +5261,7 @@
             <w:tcW w:w="906" w:type="dxa"/>
             <w:tcBorders>
               <w:top w:val="single" w:sz="4" w:space="0" w:color="000000"/>
-              <w:start w:val="single" w:sz="4" w:space="0" w:color="000000"/>
+              <w:left w:val="single" w:sz="4" w:space="0" w:color="000000"/>
               <w:bottom w:val="single" w:sz="4" w:space="0" w:color="000000"/>
             </w:tcBorders>
           </w:tcPr>
@@ -5216,7 +5288,7 @@
             <w:tcW w:w="908" w:type="dxa"/>
             <w:tcBorders>
               <w:top w:val="single" w:sz="4" w:space="0" w:color="000000"/>
-              <w:start w:val="single" w:sz="4" w:space="0" w:color="000000"/>
+              <w:left w:val="single" w:sz="4" w:space="0" w:color="000000"/>
               <w:bottom w:val="single" w:sz="4" w:space="0" w:color="000000"/>
             </w:tcBorders>
           </w:tcPr>
@@ -5237,7 +5309,7 @@
             <w:tcW w:w="906" w:type="dxa"/>
             <w:tcBorders>
               <w:top w:val="single" w:sz="4" w:space="0" w:color="000000"/>
-              <w:start w:val="single" w:sz="4" w:space="0" w:color="000000"/>
+              <w:left w:val="single" w:sz="4" w:space="0" w:color="000000"/>
               <w:bottom w:val="single" w:sz="4" w:space="0" w:color="000000"/>
             </w:tcBorders>
           </w:tcPr>
@@ -5258,7 +5330,7 @@
             <w:tcW w:w="908" w:type="dxa"/>
             <w:tcBorders>
               <w:top w:val="single" w:sz="4" w:space="0" w:color="000000"/>
-              <w:start w:val="single" w:sz="4" w:space="0" w:color="000000"/>
+              <w:left w:val="single" w:sz="4" w:space="0" w:color="000000"/>
               <w:bottom w:val="single" w:sz="4" w:space="0" w:color="000000"/>
             </w:tcBorders>
           </w:tcPr>
@@ -5279,7 +5351,7 @@
             <w:tcW w:w="906" w:type="dxa"/>
             <w:tcBorders>
               <w:top w:val="single" w:sz="4" w:space="0" w:color="000000"/>
-              <w:start w:val="single" w:sz="4" w:space="0" w:color="000000"/>
+              <w:left w:val="single" w:sz="4" w:space="0" w:color="000000"/>
               <w:bottom w:val="single" w:sz="4" w:space="0" w:color="000000"/>
             </w:tcBorders>
           </w:tcPr>
@@ -5300,7 +5372,7 @@
             <w:tcW w:w="908" w:type="dxa"/>
             <w:tcBorders>
               <w:top w:val="single" w:sz="4" w:space="0" w:color="000000"/>
-              <w:start w:val="single" w:sz="4" w:space="0" w:color="000000"/>
+              <w:left w:val="single" w:sz="4" w:space="0" w:color="000000"/>
               <w:bottom w:val="single" w:sz="4" w:space="0" w:color="000000"/>
             </w:tcBorders>
           </w:tcPr>
@@ -5321,7 +5393,7 @@
             <w:tcW w:w="906" w:type="dxa"/>
             <w:tcBorders>
               <w:top w:val="single" w:sz="4" w:space="0" w:color="000000"/>
-              <w:start w:val="single" w:sz="4" w:space="0" w:color="000000"/>
+              <w:left w:val="single" w:sz="4" w:space="0" w:color="000000"/>
               <w:bottom w:val="single" w:sz="4" w:space="0" w:color="000000"/>
             </w:tcBorders>
           </w:tcPr>
@@ -5342,7 +5414,7 @@
             <w:tcW w:w="908" w:type="dxa"/>
             <w:tcBorders>
               <w:top w:val="single" w:sz="4" w:space="0" w:color="000000"/>
-              <w:start w:val="single" w:sz="4" w:space="0" w:color="000000"/>
+              <w:left w:val="single" w:sz="4" w:space="0" w:color="000000"/>
               <w:bottom w:val="single" w:sz="4" w:space="0" w:color="000000"/>
             </w:tcBorders>
           </w:tcPr>
@@ -5363,7 +5435,7 @@
             <w:tcW w:w="906" w:type="dxa"/>
             <w:tcBorders>
               <w:top w:val="single" w:sz="4" w:space="0" w:color="000000"/>
-              <w:start w:val="single" w:sz="4" w:space="0" w:color="000000"/>
+              <w:left w:val="single" w:sz="4" w:space="0" w:color="000000"/>
               <w:bottom w:val="single" w:sz="4" w:space="0" w:color="000000"/>
             </w:tcBorders>
           </w:tcPr>
@@ -5381,12 +5453,12 @@
         </w:tc>
         <w:tc>
           <w:tcPr>
-            <w:tcW w:w="907" w:type="dxa"/>
+            <w:tcW w:w="908" w:type="dxa"/>
             <w:tcBorders>
               <w:top w:val="single" w:sz="4" w:space="0" w:color="000000"/>
-              <w:start w:val="single" w:sz="4" w:space="0" w:color="000000"/>
+              <w:left w:val="single" w:sz="4" w:space="0" w:color="000000"/>
               <w:bottom w:val="single" w:sz="4" w:space="0" w:color="000000"/>
-              <w:end w:val="single" w:sz="4" w:space="0" w:color="000000"/>
+              <w:right w:val="single" w:sz="4" w:space="0" w:color="000000"/>
             </w:tcBorders>
           </w:tcPr>
           <w:p>
@@ -5395,7 +5467,7 @@
               <w:widowControl w:val="false"/>
               <w:suppressLineNumbers/>
               <w:spacing w:before="29" w:after="0"/>
-              <w:ind w:hanging="0" w:start="29" w:end="29"/>
+              <w:ind w:hanging="0" w:left="29" w:right="29"/>
               <w:rPr/>
             </w:pPr>
             <w:r>
@@ -5461,7 +5533,7 @@
           <w:ilvl w:val="0"/>
           <w:numId w:val="0"/>
         </w:numPr>
-        <w:ind w:hanging="0" w:start="0" w:end="0"/>
+        <w:ind w:hanging="0" w:left="0" w:right="0"/>
         <w:jc w:val="both"/>
         <w:rPr/>
       </w:pPr>
@@ -5491,7 +5563,7 @@
           <w:ilvl w:val="0"/>
           <w:numId w:val="0"/>
         </w:numPr>
-        <w:ind w:hanging="0" w:start="0" w:end="0"/>
+        <w:ind w:hanging="0" w:left="0" w:right="0"/>
         <w:jc w:val="both"/>
         <w:rPr/>
       </w:pPr>
@@ -5525,7 +5597,7 @@
           <wp:inline distT="0" distB="0" distL="0" distR="0">
             <wp:extent cx="4708525" cy="3807460"/>
             <wp:effectExtent l="0" t="0" r="0" b="0"/>
-            <wp:docPr id="27" name="Image6" descr="" title=""/>
+            <wp:docPr id="27" name="Image6"/>
             <wp:cNvGraphicFramePr>
               <a:graphicFrameLocks xmlns:a="http://schemas.openxmlformats.org/drawingml/2006/main" noChangeAspect="1"/>
             </wp:cNvGraphicFramePr>
@@ -5533,7 +5605,7 @@
               <a:graphicData uri="http://schemas.openxmlformats.org/drawingml/2006/picture">
                 <pic:pic xmlns:pic="http://schemas.openxmlformats.org/drawingml/2006/picture">
                   <pic:nvPicPr>
-                    <pic:cNvPr id="27" name="Image6" descr="" title=""/>
+                    <pic:cNvPr id="27" name="Image6"/>
                     <pic:cNvPicPr>
                       <a:picLocks noChangeAspect="1" noChangeArrowheads="1"/>
                     </pic:cNvPicPr>
@@ -5573,7 +5645,7 @@
           <w:ilvl w:val="0"/>
           <w:numId w:val="0"/>
         </w:numPr>
-        <w:ind w:hanging="0" w:start="578" w:end="0"/>
+        <w:ind w:hanging="0" w:left="578" w:right="0"/>
         <w:rPr/>
       </w:pPr>
       <w:bookmarkStart w:id="10" w:name="__RefHeading___Toc209893733"/>
@@ -5602,7 +5674,7 @@
           <w:ilvl w:val="0"/>
           <w:numId w:val="0"/>
         </w:numPr>
-        <w:ind w:hanging="0" w:start="0" w:end="0"/>
+        <w:ind w:hanging="0" w:left="0" w:right="0"/>
         <w:jc w:val="both"/>
         <w:rPr/>
       </w:pPr>
@@ -5636,7 +5708,7 @@
           <wp:inline distT="0" distB="0" distL="0" distR="0">
             <wp:extent cx="4393565" cy="3172460"/>
             <wp:effectExtent l="0" t="0" r="0" b="0"/>
-            <wp:docPr id="28" name="Image7" descr="" title=""/>
+            <wp:docPr id="28" name="Image7"/>
             <wp:cNvGraphicFramePr>
               <a:graphicFrameLocks xmlns:a="http://schemas.openxmlformats.org/drawingml/2006/main" noChangeAspect="1"/>
             </wp:cNvGraphicFramePr>
@@ -5644,7 +5716,7 @@
               <a:graphicData uri="http://schemas.openxmlformats.org/drawingml/2006/picture">
                 <pic:pic xmlns:pic="http://schemas.openxmlformats.org/drawingml/2006/picture">
                   <pic:nvPicPr>
-                    <pic:cNvPr id="28" name="Image7" descr="" title=""/>
+                    <pic:cNvPr id="28" name="Image7"/>
                     <pic:cNvPicPr>
                       <a:picLocks noChangeAspect="1" noChangeArrowheads="1"/>
                     </pic:cNvPicPr>
@@ -5684,7 +5756,7 @@
           <w:ilvl w:val="0"/>
           <w:numId w:val="0"/>
         </w:numPr>
-        <w:ind w:hanging="0" w:start="578" w:end="0"/>
+        <w:ind w:hanging="0" w:left="578" w:right="0"/>
         <w:rPr/>
       </w:pPr>
       <w:bookmarkStart w:id="12" w:name="__RefHeading___Toc209893735"/>
@@ -5713,7 +5785,7 @@
           <w:ilvl w:val="0"/>
           <w:numId w:val="0"/>
         </w:numPr>
-        <w:ind w:hanging="0" w:start="578" w:end="0"/>
+        <w:ind w:hanging="0" w:left="578" w:right="0"/>
         <w:rPr/>
       </w:pPr>
       <w:bookmarkStart w:id="13" w:name="__RefHeading___Toc209893736"/>
@@ -5742,7 +5814,7 @@
           <w:ilvl w:val="0"/>
           <w:numId w:val="0"/>
         </w:numPr>
-        <w:ind w:hanging="0" w:start="0" w:end="0"/>
+        <w:ind w:hanging="0" w:left="0" w:right="0"/>
         <w:jc w:val="both"/>
         <w:rPr/>
       </w:pPr>
@@ -5770,7 +5842,7 @@
           <w:ilvl w:val="0"/>
           <w:numId w:val="0"/>
         </w:numPr>
-        <w:ind w:hanging="0" w:start="0" w:end="0"/>
+        <w:ind w:hanging="0" w:left="0" w:right="0"/>
         <w:jc w:val="both"/>
         <w:rPr/>
       </w:pPr>
@@ -5794,7 +5866,7 @@
     <w:p>
       <w:pPr>
         <w:pStyle w:val="Heading1"/>
-        <w:ind w:hanging="142" w:start="431" w:end="0"/>
+        <w:ind w:hanging="142" w:left="431" w:right="0"/>
         <w:rPr/>
       </w:pPr>
       <w:bookmarkStart w:id="16" w:name="__RefHeading___Toc209893739"/>
@@ -5855,7 +5927,7 @@
       <w:pBdr>
         <w:top w:val="single" w:sz="4" w:space="1" w:color="D9D9D9"/>
       </w:pBdr>
-      <w:jc w:val="end"/>
+      <w:jc w:val="right"/>
       <w:rPr/>
     </w:pPr>
     <w:r>
@@ -5946,7 +6018,7 @@
         <w:bottom w:val="nil"/>
         <w:right w:val="nil"/>
       </w:pBdr>
-      <w:jc w:val="end"/>
+      <w:jc w:val="right"/>
       <w:rPr>
         <w:rFonts w:ascii="Arial" w:hAnsi="Arial" w:cs="Arial"/>
         <w:szCs w:val="24"/>
@@ -5956,7 +6028,6 @@
     <w:r>
       <w:rPr>
         <w:rFonts w:ascii="Arial" w:hAnsi="Arial" w:cs="Arial"/>
-        <w:sz w:val="20"/>
         <w:sz w:val="20"/>
         <w:szCs w:val="20"/>
         <w:rtl w:val="true"/>
@@ -5977,7 +6048,6 @@
     <w:r>
       <w:rPr>
         <w:rFonts w:ascii="Arial" w:hAnsi="Arial" w:cs="Arial"/>
-        <w:sz w:val="20"/>
         <w:sz w:val="20"/>
         <w:szCs w:val="20"/>
         <w:rtl w:val="true"/>
@@ -6031,7 +6101,7 @@
         <wp:inline distT="0" distB="0" distL="0" distR="0">
           <wp:extent cx="5760085" cy="1429385"/>
           <wp:effectExtent l="0" t="0" r="0" b="0"/>
-          <wp:docPr id="29" name="Image8" descr="" title=""/>
+          <wp:docPr id="29" name="Image8"/>
           <wp:cNvGraphicFramePr>
             <a:graphicFrameLocks xmlns:a="http://schemas.openxmlformats.org/drawingml/2006/main" noChangeAspect="1"/>
           </wp:cNvGraphicFramePr>
@@ -6039,7 +6109,7 @@
             <a:graphicData uri="http://schemas.openxmlformats.org/drawingml/2006/picture">
               <pic:pic xmlns:pic="http://schemas.openxmlformats.org/drawingml/2006/picture">
                 <pic:nvPicPr>
-                  <pic:cNvPr id="29" name="Image8" descr="" title=""/>
+                  <pic:cNvPr id="29" name="Image8"/>
                   <pic:cNvPicPr>
                     <a:picLocks noChangeAspect="1" noChangeArrowheads="1"/>
                   </pic:cNvPicPr>
@@ -6076,127 +6146,127 @@
   <w:abstractNum w:abstractNumId="1">
     <w:lvl w:ilvl="0">
       <w:start w:val="1"/>
+      <w:numFmt w:val="decimal"/>
       <w:pStyle w:val="Heading1"/>
-      <w:numFmt w:val="decimal"/>
       <w:lvlText w:val="%1."/>
       <w:lvlJc w:val="center"/>
       <w:pPr>
         <w:tabs>
           <w:tab w:val="num" w:pos="648"/>
         </w:tabs>
-        <w:ind w:start="432" w:hanging="144"/>
+        <w:ind w:left="432" w:hanging="144"/>
       </w:pPr>
       <w:rPr/>
     </w:lvl>
     <w:lvl w:ilvl="1">
       <w:start w:val="1"/>
+      <w:numFmt w:val="decimal"/>
       <w:pStyle w:val="Heading2"/>
-      <w:numFmt w:val="decimal"/>
       <w:lvlText w:val="%1.%2"/>
       <w:lvlJc w:val="center"/>
       <w:pPr>
         <w:tabs>
           <w:tab w:val="num" w:pos="864"/>
         </w:tabs>
-        <w:ind w:start="576" w:hanging="288"/>
+        <w:ind w:left="576" w:hanging="288"/>
       </w:pPr>
       <w:rPr/>
     </w:lvl>
     <w:lvl w:ilvl="2">
       <w:start w:val="1"/>
+      <w:numFmt w:val="decimal"/>
       <w:pStyle w:val="Heading3"/>
-      <w:numFmt w:val="decimal"/>
       <w:lvlText w:val="%1.%2.%3"/>
       <w:lvlJc w:val="center"/>
       <w:pPr>
         <w:tabs>
           <w:tab w:val="num" w:pos="1008"/>
         </w:tabs>
-        <w:ind w:start="720" w:hanging="432"/>
+        <w:ind w:left="720" w:hanging="432"/>
       </w:pPr>
       <w:rPr/>
     </w:lvl>
     <w:lvl w:ilvl="3">
       <w:start w:val="1"/>
+      <w:numFmt w:val="decimal"/>
       <w:pStyle w:val="Heading4"/>
-      <w:numFmt w:val="decimal"/>
       <w:lvlText w:val="%1.%2.%3.%4"/>
       <w:lvlJc w:val="center"/>
       <w:pPr>
         <w:tabs>
           <w:tab w:val="num" w:pos="1152"/>
         </w:tabs>
-        <w:ind w:start="864" w:hanging="576"/>
+        <w:ind w:left="864" w:hanging="576"/>
       </w:pPr>
       <w:rPr/>
     </w:lvl>
     <w:lvl w:ilvl="4">
       <w:start w:val="1"/>
+      <w:numFmt w:val="decimal"/>
       <w:pStyle w:val="Heading5"/>
-      <w:numFmt w:val="decimal"/>
       <w:lvlText w:val="%1.%2.%3.%4.%5"/>
       <w:lvlJc w:val="center"/>
       <w:pPr>
         <w:tabs>
           <w:tab w:val="num" w:pos="1296"/>
         </w:tabs>
-        <w:ind w:start="1008" w:hanging="720"/>
+        <w:ind w:left="1008" w:hanging="720"/>
       </w:pPr>
       <w:rPr/>
     </w:lvl>
     <w:lvl w:ilvl="5">
       <w:start w:val="1"/>
+      <w:numFmt w:val="decimal"/>
       <w:pStyle w:val="Heading6"/>
-      <w:numFmt w:val="decimal"/>
       <w:lvlText w:val="%1.%2.%3.%4.%5.%6"/>
       <w:lvlJc w:val="center"/>
       <w:pPr>
         <w:tabs>
           <w:tab w:val="num" w:pos="1440"/>
         </w:tabs>
-        <w:ind w:start="1152" w:hanging="864"/>
+        <w:ind w:left="1152" w:hanging="864"/>
       </w:pPr>
       <w:rPr/>
     </w:lvl>
     <w:lvl w:ilvl="6">
       <w:start w:val="1"/>
+      <w:numFmt w:val="decimal"/>
       <w:pStyle w:val="Heading7"/>
-      <w:numFmt w:val="decimal"/>
       <w:lvlText w:val="%1.%2.%3.%4.%5.%6.%7"/>
       <w:lvlJc w:val="center"/>
       <w:pPr>
         <w:tabs>
           <w:tab w:val="num" w:pos="1584"/>
         </w:tabs>
-        <w:ind w:start="1296" w:hanging="1008"/>
+        <w:ind w:left="1296" w:hanging="1008"/>
       </w:pPr>
       <w:rPr/>
     </w:lvl>
     <w:lvl w:ilvl="7">
       <w:start w:val="1"/>
+      <w:numFmt w:val="decimal"/>
       <w:pStyle w:val="Heading8"/>
-      <w:numFmt w:val="decimal"/>
       <w:lvlText w:val="%1.%2.%3.%4.%5.%6.%7.%8"/>
       <w:lvlJc w:val="center"/>
       <w:pPr>
         <w:tabs>
           <w:tab w:val="num" w:pos="1728"/>
         </w:tabs>
-        <w:ind w:start="1440" w:hanging="1152"/>
+        <w:ind w:left="1440" w:hanging="1152"/>
       </w:pPr>
       <w:rPr/>
     </w:lvl>
     <w:lvl w:ilvl="8">
       <w:start w:val="1"/>
+      <w:numFmt w:val="decimal"/>
       <w:pStyle w:val="Heading9"/>
-      <w:numFmt w:val="decimal"/>
       <w:lvlText w:val="%1.%2.%3.%4.%5.%6.%7.%8.%9"/>
       <w:lvlJc w:val="center"/>
       <w:pPr>
         <w:tabs>
           <w:tab w:val="num" w:pos="1872"/>
         </w:tabs>
-        <w:ind w:start="1584" w:hanging="1296"/>
+        <w:ind w:left="1584" w:hanging="1296"/>
       </w:pPr>
       <w:rPr/>
     </w:lvl>
@@ -6206,12 +6276,12 @@
       <w:start w:val="1"/>
       <w:numFmt w:val="bullet"/>
       <w:lvlText w:val=""/>
-      <w:lvlJc w:val="start"/>
+      <w:lvlJc w:val="left"/>
       <w:pPr>
         <w:tabs>
           <w:tab w:val="num" w:pos="360"/>
         </w:tabs>
-        <w:ind w:start="360" w:hanging="360"/>
+        <w:ind w:left="360" w:hanging="360"/>
       </w:pPr>
       <w:rPr>
         <w:rFonts w:ascii="Symbol" w:hAnsi="Symbol" w:cs="Symbol" w:hint="default"/>
@@ -6221,12 +6291,12 @@
       <w:start w:val="1"/>
       <w:numFmt w:val="decimal"/>
       <w:lvlText w:val="%2."/>
-      <w:lvlJc w:val="start"/>
+      <w:lvlJc w:val="left"/>
       <w:pPr>
         <w:tabs>
           <w:tab w:val="num" w:pos="1080"/>
         </w:tabs>
-        <w:ind w:start="1080" w:hanging="360"/>
+        <w:ind w:left="1080" w:hanging="360"/>
       </w:pPr>
       <w:rPr/>
     </w:lvl>
@@ -6234,12 +6304,12 @@
       <w:start w:val="1"/>
       <w:numFmt w:val="decimal"/>
       <w:lvlText w:val="%3."/>
-      <w:lvlJc w:val="start"/>
+      <w:lvlJc w:val="left"/>
       <w:pPr>
         <w:tabs>
           <w:tab w:val="num" w:pos="1440"/>
         </w:tabs>
-        <w:ind w:start="1440" w:hanging="360"/>
+        <w:ind w:left="1440" w:hanging="360"/>
       </w:pPr>
       <w:rPr/>
     </w:lvl>
@@ -6247,12 +6317,12 @@
       <w:start w:val="1"/>
       <w:numFmt w:val="decimal"/>
       <w:lvlText w:val="%4."/>
-      <w:lvlJc w:val="start"/>
+      <w:lvlJc w:val="left"/>
       <w:pPr>
         <w:tabs>
           <w:tab w:val="num" w:pos="1800"/>
         </w:tabs>
-        <w:ind w:start="1800" w:hanging="360"/>
+        <w:ind w:left="1800" w:hanging="360"/>
       </w:pPr>
       <w:rPr/>
     </w:lvl>
@@ -6260,12 +6330,12 @@
       <w:start w:val="1"/>
       <w:numFmt w:val="decimal"/>
       <w:lvlText w:val="%5."/>
-      <w:lvlJc w:val="start"/>
+      <w:lvlJc w:val="left"/>
       <w:pPr>
         <w:tabs>
           <w:tab w:val="num" w:pos="2160"/>
         </w:tabs>
-        <w:ind w:start="2160" w:hanging="360"/>
+        <w:ind w:left="2160" w:hanging="360"/>
       </w:pPr>
       <w:rPr/>
     </w:lvl>
@@ -6273,12 +6343,12 @@
       <w:start w:val="1"/>
       <w:numFmt w:val="decimal"/>
       <w:lvlText w:val="%6."/>
-      <w:lvlJc w:val="start"/>
+      <w:lvlJc w:val="left"/>
       <w:pPr>
         <w:tabs>
           <w:tab w:val="num" w:pos="2520"/>
         </w:tabs>
-        <w:ind w:start="2520" w:hanging="360"/>
+        <w:ind w:left="2520" w:hanging="360"/>
       </w:pPr>
       <w:rPr/>
     </w:lvl>
@@ -6286,12 +6356,12 @@
       <w:start w:val="1"/>
       <w:numFmt w:val="decimal"/>
       <w:lvlText w:val="%7."/>
-      <w:lvlJc w:val="start"/>
+      <w:lvlJc w:val="left"/>
       <w:pPr>
         <w:tabs>
           <w:tab w:val="num" w:pos="2880"/>
         </w:tabs>
-        <w:ind w:start="2880" w:hanging="360"/>
+        <w:ind w:left="2880" w:hanging="360"/>
       </w:pPr>
       <w:rPr/>
     </w:lvl>
@@ -6299,12 +6369,12 @@
       <w:start w:val="1"/>
       <w:numFmt w:val="decimal"/>
       <w:lvlText w:val="%8."/>
-      <w:lvlJc w:val="start"/>
+      <w:lvlJc w:val="left"/>
       <w:pPr>
         <w:tabs>
           <w:tab w:val="num" w:pos="3240"/>
         </w:tabs>
-        <w:ind w:start="3240" w:hanging="360"/>
+        <w:ind w:left="3240" w:hanging="360"/>
       </w:pPr>
       <w:rPr/>
     </w:lvl>
@@ -6312,12 +6382,12 @@
       <w:start w:val="1"/>
       <w:numFmt w:val="decimal"/>
       <w:lvlText w:val="%9."/>
-      <w:lvlJc w:val="start"/>
+      <w:lvlJc w:val="left"/>
       <w:pPr>
         <w:tabs>
           <w:tab w:val="num" w:pos="3600"/>
         </w:tabs>
-        <w:ind w:start="3600" w:hanging="360"/>
+        <w:ind w:left="3600" w:hanging="360"/>
       </w:pPr>
       <w:rPr/>
     </w:lvl>
@@ -6327,12 +6397,12 @@
       <w:start w:val="1"/>
       <w:numFmt w:val="bullet"/>
       <w:lvlText w:val=""/>
-      <w:lvlJc w:val="start"/>
+      <w:lvlJc w:val="left"/>
       <w:pPr>
         <w:tabs>
           <w:tab w:val="num" w:pos="720"/>
         </w:tabs>
-        <w:ind w:start="720" w:hanging="360"/>
+        <w:ind w:left="720" w:hanging="360"/>
       </w:pPr>
       <w:rPr>
         <w:rFonts w:ascii="Symbol" w:hAnsi="Symbol" w:cs="Symbol" w:hint="default"/>
@@ -6342,12 +6412,12 @@
       <w:start w:val="1"/>
       <w:numFmt w:val="decimal"/>
       <w:lvlText w:val="%2."/>
-      <w:lvlJc w:val="start"/>
+      <w:lvlJc w:val="left"/>
       <w:pPr>
         <w:tabs>
           <w:tab w:val="num" w:pos="1080"/>
         </w:tabs>
-        <w:ind w:start="1080" w:hanging="360"/>
+        <w:ind w:left="1080" w:hanging="360"/>
       </w:pPr>
       <w:rPr/>
     </w:lvl>
@@ -6355,12 +6425,12 @@
       <w:start w:val="1"/>
       <w:numFmt w:val="decimal"/>
       <w:lvlText w:val="%3."/>
-      <w:lvlJc w:val="start"/>
+      <w:lvlJc w:val="left"/>
       <w:pPr>
         <w:tabs>
           <w:tab w:val="num" w:pos="1440"/>
         </w:tabs>
-        <w:ind w:start="1440" w:hanging="360"/>
+        <w:ind w:left="1440" w:hanging="360"/>
       </w:pPr>
       <w:rPr/>
     </w:lvl>
@@ -6368,12 +6438,12 @@
       <w:start w:val="1"/>
       <w:numFmt w:val="decimal"/>
       <w:lvlText w:val="%4."/>
-      <w:lvlJc w:val="start"/>
+      <w:lvlJc w:val="left"/>
       <w:pPr>
         <w:tabs>
           <w:tab w:val="num" w:pos="1800"/>
         </w:tabs>
-        <w:ind w:start="1800" w:hanging="360"/>
+        <w:ind w:left="1800" w:hanging="360"/>
       </w:pPr>
       <w:rPr/>
     </w:lvl>
@@ -6381,12 +6451,12 @@
       <w:start w:val="1"/>
       <w:numFmt w:val="decimal"/>
       <w:lvlText w:val="%5."/>
-      <w:lvlJc w:val="start"/>
+      <w:lvlJc w:val="left"/>
       <w:pPr>
         <w:tabs>
           <w:tab w:val="num" w:pos="2160"/>
         </w:tabs>
-        <w:ind w:start="2160" w:hanging="360"/>
+        <w:ind w:left="2160" w:hanging="360"/>
       </w:pPr>
       <w:rPr/>
     </w:lvl>
@@ -6394,12 +6464,12 @@
       <w:start w:val="1"/>
       <w:numFmt w:val="decimal"/>
       <w:lvlText w:val="%6."/>
-      <w:lvlJc w:val="start"/>
+      <w:lvlJc w:val="left"/>
       <w:pPr>
         <w:tabs>
           <w:tab w:val="num" w:pos="2520"/>
         </w:tabs>
-        <w:ind w:start="2520" w:hanging="360"/>
+        <w:ind w:left="2520" w:hanging="360"/>
       </w:pPr>
       <w:rPr/>
     </w:lvl>
@@ -6407,12 +6477,12 @@
       <w:start w:val="1"/>
       <w:numFmt w:val="decimal"/>
       <w:lvlText w:val="%7."/>
-      <w:lvlJc w:val="start"/>
+      <w:lvlJc w:val="left"/>
       <w:pPr>
         <w:tabs>
           <w:tab w:val="num" w:pos="2880"/>
         </w:tabs>
-        <w:ind w:start="2880" w:hanging="360"/>
+        <w:ind w:left="2880" w:hanging="360"/>
       </w:pPr>
       <w:rPr/>
     </w:lvl>
@@ -6420,12 +6490,12 @@
       <w:start w:val="1"/>
       <w:numFmt w:val="decimal"/>
       <w:lvlText w:val="%8."/>
-      <w:lvlJc w:val="start"/>
+      <w:lvlJc w:val="left"/>
       <w:pPr>
         <w:tabs>
           <w:tab w:val="num" w:pos="3240"/>
         </w:tabs>
-        <w:ind w:start="3240" w:hanging="360"/>
+        <w:ind w:left="3240" w:hanging="360"/>
       </w:pPr>
       <w:rPr/>
     </w:lvl>
@@ -6433,12 +6503,12 @@
       <w:start w:val="1"/>
       <w:numFmt w:val="decimal"/>
       <w:lvlText w:val="%9."/>
-      <w:lvlJc w:val="start"/>
+      <w:lvlJc w:val="left"/>
       <w:pPr>
         <w:tabs>
           <w:tab w:val="num" w:pos="3600"/>
         </w:tabs>
-        <w:ind w:start="3600" w:hanging="360"/>
+        <w:ind w:left="3600" w:hanging="360"/>
       </w:pPr>
       <w:rPr/>
     </w:lvl>
@@ -6449,12 +6519,12 @@
       <w:numFmt w:val="decimal"/>
       <w:suff w:val="space"/>
       <w:lvlText w:val="%1."/>
-      <w:lvlJc w:val="start"/>
+      <w:lvlJc w:val="left"/>
       <w:pPr>
         <w:tabs>
           <w:tab w:val="num" w:pos="0"/>
         </w:tabs>
-        <w:ind w:start="357" w:hanging="68"/>
+        <w:ind w:left="357" w:hanging="68"/>
       </w:pPr>
       <w:rPr/>
     </w:lvl>
@@ -6462,12 +6532,12 @@
       <w:start w:val="1"/>
       <w:numFmt w:val="decimal"/>
       <w:lvlText w:val="%1.%2."/>
-      <w:lvlJc w:val="start"/>
+      <w:lvlJc w:val="left"/>
       <w:pPr>
         <w:tabs>
           <w:tab w:val="num" w:pos="1304"/>
         </w:tabs>
-        <w:ind w:start="1304" w:hanging="453"/>
+        <w:ind w:left="1304" w:hanging="453"/>
       </w:pPr>
       <w:rPr/>
     </w:lvl>
@@ -6475,12 +6545,12 @@
       <w:start w:val="1"/>
       <w:numFmt w:val="decimal"/>
       <w:lvlText w:val="%1.%2.%3."/>
-      <w:lvlJc w:val="start"/>
+      <w:lvlJc w:val="left"/>
       <w:pPr>
         <w:tabs>
           <w:tab w:val="num" w:pos="2211"/>
         </w:tabs>
-        <w:ind w:start="2211" w:hanging="1077"/>
+        <w:ind w:left="2211" w:hanging="1077"/>
       </w:pPr>
       <w:rPr/>
     </w:lvl>
@@ -6493,7 +6563,7 @@
         <w:tabs>
           <w:tab w:val="num" w:pos="3345"/>
         </w:tabs>
-        <w:ind w:start="3345" w:hanging="1134"/>
+        <w:ind w:left="3345" w:hanging="1134"/>
       </w:pPr>
       <w:rPr/>
     </w:lvl>
@@ -6501,12 +6571,12 @@
       <w:start w:val="1"/>
       <w:numFmt w:val="decimal"/>
       <w:lvlText w:val="%1.%2.%3.%4.%5."/>
-      <w:lvlJc w:val="start"/>
+      <w:lvlJc w:val="left"/>
       <w:pPr>
         <w:tabs>
           <w:tab w:val="num" w:pos="2498"/>
         </w:tabs>
-        <w:ind w:start="2234" w:hanging="816"/>
+        <w:ind w:left="2234" w:hanging="816"/>
       </w:pPr>
       <w:rPr/>
     </w:lvl>
@@ -6514,12 +6584,12 @@
       <w:start w:val="1"/>
       <w:numFmt w:val="decimal"/>
       <w:lvlText w:val="%1.%2.%3.%4.%5.%6."/>
-      <w:lvlJc w:val="start"/>
+      <w:lvlJc w:val="left"/>
       <w:pPr>
         <w:tabs>
           <w:tab w:val="num" w:pos="2877"/>
         </w:tabs>
-        <w:ind w:start="2738" w:hanging="941"/>
+        <w:ind w:left="2738" w:hanging="941"/>
       </w:pPr>
       <w:rPr/>
     </w:lvl>
@@ -6527,12 +6597,12 @@
       <w:start w:val="1"/>
       <w:numFmt w:val="decimal"/>
       <w:lvlText w:val="%1.%2.%3.%4.%5.%6.%7."/>
-      <w:lvlJc w:val="start"/>
+      <w:lvlJc w:val="left"/>
       <w:pPr>
         <w:tabs>
           <w:tab w:val="num" w:pos="3600"/>
         </w:tabs>
-        <w:ind w:start="3237" w:hanging="1077"/>
+        <w:ind w:left="3237" w:hanging="1077"/>
       </w:pPr>
       <w:rPr/>
     </w:lvl>
@@ -6540,12 +6610,12 @@
       <w:start w:val="1"/>
       <w:numFmt w:val="decimal"/>
       <w:lvlText w:val="%1.%2.%3.%4.%5.%6.%7.%8."/>
-      <w:lvlJc w:val="start"/>
+      <w:lvlJc w:val="left"/>
       <w:pPr>
         <w:tabs>
           <w:tab w:val="num" w:pos="3957"/>
         </w:tabs>
-        <w:ind w:start="3742" w:hanging="1225"/>
+        <w:ind w:left="3742" w:hanging="1225"/>
       </w:pPr>
       <w:rPr/>
     </w:lvl>
@@ -6553,12 +6623,12 @@
       <w:start w:val="1"/>
       <w:numFmt w:val="decimal"/>
       <w:lvlText w:val="%1.%2.%3.%4.%5.%6.%7.%8.%9."/>
-      <w:lvlJc w:val="start"/>
+      <w:lvlJc w:val="left"/>
       <w:pPr>
         <w:tabs>
           <w:tab w:val="num" w:pos="4680"/>
         </w:tabs>
-        <w:ind w:start="4320" w:hanging="1440"/>
+        <w:ind w:left="4320" w:hanging="1440"/>
       </w:pPr>
       <w:rPr/>
     </w:lvl>
@@ -6568,12 +6638,12 @@
       <w:start w:val="1"/>
       <w:numFmt w:val="bullet"/>
       <w:lvlText w:val=""/>
-      <w:lvlJc w:val="start"/>
+      <w:lvlJc w:val="left"/>
       <w:pPr>
         <w:tabs>
           <w:tab w:val="num" w:pos="1985"/>
         </w:tabs>
-        <w:ind w:start="1985" w:hanging="426"/>
+        <w:ind w:left="1985" w:hanging="426"/>
       </w:pPr>
       <w:rPr>
         <w:rFonts w:ascii="Symbol" w:hAnsi="Symbol" w:cs="Symbol" w:hint="default"/>
@@ -6584,12 +6654,12 @@
       <w:start w:val="1"/>
       <w:numFmt w:val="decimal"/>
       <w:lvlText w:val="%2."/>
-      <w:lvlJc w:val="start"/>
+      <w:lvlJc w:val="left"/>
       <w:pPr>
         <w:tabs>
           <w:tab w:val="num" w:pos="1080"/>
         </w:tabs>
-        <w:ind w:start="1080" w:hanging="360"/>
+        <w:ind w:left="1080" w:hanging="360"/>
       </w:pPr>
       <w:rPr/>
     </w:lvl>
@@ -6597,12 +6667,12 @@
       <w:start w:val="1"/>
       <w:numFmt w:val="decimal"/>
       <w:lvlText w:val="%3."/>
-      <w:lvlJc w:val="start"/>
+      <w:lvlJc w:val="left"/>
       <w:pPr>
         <w:tabs>
           <w:tab w:val="num" w:pos="1440"/>
         </w:tabs>
-        <w:ind w:start="1440" w:hanging="360"/>
+        <w:ind w:left="1440" w:hanging="360"/>
       </w:pPr>
       <w:rPr/>
     </w:lvl>
@@ -6610,12 +6680,12 @@
       <w:start w:val="1"/>
       <w:numFmt w:val="decimal"/>
       <w:lvlText w:val="%4."/>
-      <w:lvlJc w:val="start"/>
+      <w:lvlJc w:val="left"/>
       <w:pPr>
         <w:tabs>
           <w:tab w:val="num" w:pos="1800"/>
         </w:tabs>
-        <w:ind w:start="1800" w:hanging="360"/>
+        <w:ind w:left="1800" w:hanging="360"/>
       </w:pPr>
       <w:rPr/>
     </w:lvl>
@@ -6623,12 +6693,12 @@
       <w:start w:val="1"/>
       <w:numFmt w:val="decimal"/>
       <w:lvlText w:val="%5."/>
-      <w:lvlJc w:val="start"/>
+      <w:lvlJc w:val="left"/>
       <w:pPr>
         <w:tabs>
           <w:tab w:val="num" w:pos="2160"/>
         </w:tabs>
-        <w:ind w:start="2160" w:hanging="360"/>
+        <w:ind w:left="2160" w:hanging="360"/>
       </w:pPr>
       <w:rPr/>
     </w:lvl>
@@ -6636,12 +6706,12 @@
       <w:start w:val="1"/>
       <w:numFmt w:val="decimal"/>
       <w:lvlText w:val="%6."/>
-      <w:lvlJc w:val="start"/>
+      <w:lvlJc w:val="left"/>
       <w:pPr>
         <w:tabs>
           <w:tab w:val="num" w:pos="2520"/>
         </w:tabs>
-        <w:ind w:start="2520" w:hanging="360"/>
+        <w:ind w:left="2520" w:hanging="360"/>
       </w:pPr>
       <w:rPr/>
     </w:lvl>
@@ -6649,12 +6719,12 @@
       <w:start w:val="1"/>
       <w:numFmt w:val="decimal"/>
       <w:lvlText w:val="%7."/>
-      <w:lvlJc w:val="start"/>
+      <w:lvlJc w:val="left"/>
       <w:pPr>
         <w:tabs>
           <w:tab w:val="num" w:pos="2880"/>
         </w:tabs>
-        <w:ind w:start="2880" w:hanging="360"/>
+        <w:ind w:left="2880" w:hanging="360"/>
       </w:pPr>
       <w:rPr/>
     </w:lvl>
@@ -6662,12 +6732,12 @@
       <w:start w:val="1"/>
       <w:numFmt w:val="decimal"/>
       <w:lvlText w:val="%8."/>
-      <w:lvlJc w:val="start"/>
+      <w:lvlJc w:val="left"/>
       <w:pPr>
         <w:tabs>
           <w:tab w:val="num" w:pos="3240"/>
         </w:tabs>
-        <w:ind w:start="3240" w:hanging="360"/>
+        <w:ind w:left="3240" w:hanging="360"/>
       </w:pPr>
       <w:rPr/>
     </w:lvl>
@@ -6675,12 +6745,12 @@
       <w:start w:val="1"/>
       <w:numFmt w:val="decimal"/>
       <w:lvlText w:val="%9."/>
-      <w:lvlJc w:val="start"/>
+      <w:lvlJc w:val="left"/>
       <w:pPr>
         <w:tabs>
           <w:tab w:val="num" w:pos="3600"/>
         </w:tabs>
-        <w:ind w:start="3600" w:hanging="360"/>
+        <w:ind w:left="3600" w:hanging="360"/>
       </w:pPr>
       <w:rPr/>
     </w:lvl>
@@ -6690,12 +6760,12 @@
       <w:start w:val="1"/>
       <w:numFmt w:val="bullet"/>
       <w:lvlText w:val=""/>
-      <w:lvlJc w:val="start"/>
+      <w:lvlJc w:val="left"/>
       <w:pPr>
         <w:tabs>
           <w:tab w:val="num" w:pos="360"/>
         </w:tabs>
-        <w:ind w:start="360" w:hanging="360"/>
+        <w:ind w:left="360" w:hanging="360"/>
       </w:pPr>
       <w:rPr>
         <w:rFonts w:ascii="Monotype Sorts" w:hAnsi="Monotype Sorts" w:cs="Monotype Sorts" w:hint="default"/>
@@ -6705,12 +6775,12 @@
       <w:start w:val="1"/>
       <w:numFmt w:val="decimal"/>
       <w:lvlText w:val="%2."/>
-      <w:lvlJc w:val="start"/>
+      <w:lvlJc w:val="left"/>
       <w:pPr>
         <w:tabs>
           <w:tab w:val="num" w:pos="1080"/>
         </w:tabs>
-        <w:ind w:start="1080" w:hanging="360"/>
+        <w:ind w:left="1080" w:hanging="360"/>
       </w:pPr>
       <w:rPr/>
     </w:lvl>
@@ -6718,12 +6788,12 @@
       <w:start w:val="1"/>
       <w:numFmt w:val="decimal"/>
       <w:lvlText w:val="%3."/>
-      <w:lvlJc w:val="start"/>
+      <w:lvlJc w:val="left"/>
       <w:pPr>
         <w:tabs>
           <w:tab w:val="num" w:pos="1440"/>
         </w:tabs>
-        <w:ind w:start="1440" w:hanging="360"/>
+        <w:ind w:left="1440" w:hanging="360"/>
       </w:pPr>
       <w:rPr/>
     </w:lvl>
@@ -6731,12 +6801,12 @@
       <w:start w:val="1"/>
       <w:numFmt w:val="decimal"/>
       <w:lvlText w:val="%4."/>
-      <w:lvlJc w:val="start"/>
+      <w:lvlJc w:val="left"/>
       <w:pPr>
         <w:tabs>
           <w:tab w:val="num" w:pos="1800"/>
         </w:tabs>
-        <w:ind w:start="1800" w:hanging="360"/>
+        <w:ind w:left="1800" w:hanging="360"/>
       </w:pPr>
       <w:rPr/>
     </w:lvl>
@@ -6744,12 +6814,12 @@
       <w:start w:val="1"/>
       <w:numFmt w:val="decimal"/>
       <w:lvlText w:val="%5."/>
-      <w:lvlJc w:val="start"/>
+      <w:lvlJc w:val="left"/>
       <w:pPr>
         <w:tabs>
           <w:tab w:val="num" w:pos="2160"/>
         </w:tabs>
-        <w:ind w:start="2160" w:hanging="360"/>
+        <w:ind w:left="2160" w:hanging="360"/>
       </w:pPr>
       <w:rPr/>
     </w:lvl>
@@ -6757,12 +6827,12 @@
       <w:start w:val="1"/>
       <w:numFmt w:val="decimal"/>
       <w:lvlText w:val="%6."/>
-      <w:lvlJc w:val="start"/>
+      <w:lvlJc w:val="left"/>
       <w:pPr>
         <w:tabs>
           <w:tab w:val="num" w:pos="2520"/>
         </w:tabs>
-        <w:ind w:start="2520" w:hanging="360"/>
+        <w:ind w:left="2520" w:hanging="360"/>
       </w:pPr>
       <w:rPr/>
     </w:lvl>
@@ -6770,12 +6840,12 @@
       <w:start w:val="1"/>
       <w:numFmt w:val="decimal"/>
       <w:lvlText w:val="%7."/>
-      <w:lvlJc w:val="start"/>
+      <w:lvlJc w:val="left"/>
       <w:pPr>
         <w:tabs>
           <w:tab w:val="num" w:pos="2880"/>
         </w:tabs>
-        <w:ind w:start="2880" w:hanging="360"/>
+        <w:ind w:left="2880" w:hanging="360"/>
       </w:pPr>
       <w:rPr/>
     </w:lvl>
@@ -6783,12 +6853,12 @@
       <w:start w:val="1"/>
       <w:numFmt w:val="decimal"/>
       <w:lvlText w:val="%8."/>
-      <w:lvlJc w:val="start"/>
+      <w:lvlJc w:val="left"/>
       <w:pPr>
         <w:tabs>
           <w:tab w:val="num" w:pos="3240"/>
         </w:tabs>
-        <w:ind w:start="3240" w:hanging="360"/>
+        <w:ind w:left="3240" w:hanging="360"/>
       </w:pPr>
       <w:rPr/>
     </w:lvl>
@@ -6796,12 +6866,12 @@
       <w:start w:val="1"/>
       <w:numFmt w:val="decimal"/>
       <w:lvlText w:val="%9."/>
-      <w:lvlJc w:val="start"/>
+      <w:lvlJc w:val="left"/>
       <w:pPr>
         <w:tabs>
           <w:tab w:val="num" w:pos="3600"/>
         </w:tabs>
-        <w:ind w:start="3600" w:hanging="360"/>
+        <w:ind w:left="3600" w:hanging="360"/>
       </w:pPr>
       <w:rPr/>
     </w:lvl>
@@ -6852,8 +6922,8 @@
       <w:suppressAutoHyphens w:val="true"/>
       <w:bidi w:val="0"/>
       <w:spacing w:before="160" w:after="0"/>
-      <w:ind w:hanging="0" w:start="284" w:end="284"/>
-      <w:jc w:val="start"/>
+      <w:ind w:hanging="0" w:left="284" w:right="284"/>
+      <w:jc w:val="left"/>
     </w:pPr>
     <w:rPr>
       <w:rFonts w:ascii="Times New Roman" w:hAnsi="Times New Roman" w:eastAsia="Times New Roman" w:cs="Arial"/>
@@ -6877,7 +6947,7 @@
       <w:suppressAutoHyphens w:val="true"/>
       <w:bidi w:val="0"/>
       <w:spacing w:before="360" w:after="120"/>
-      <w:jc w:val="start"/>
+      <w:jc w:val="left"/>
       <w:outlineLvl w:val="0"/>
     </w:pPr>
     <w:rPr>
@@ -7198,7 +7268,7 @@
     <w:basedOn w:val="Normal"/>
     <w:pPr>
       <w:spacing w:before="160" w:after="0"/>
-      <w:ind w:hanging="360" w:start="360" w:end="284"/>
+      <w:ind w:hanging="360" w:left="360" w:right="284"/>
       <w:jc w:val="both"/>
     </w:pPr>
     <w:rPr>
@@ -7317,7 +7387,7 @@
     <w:next w:val="Normal"/>
     <w:qFormat/>
     <w:pPr>
-      <w:ind w:hanging="0" w:start="284" w:end="284"/>
+      <w:ind w:hanging="0" w:left="284" w:right="284"/>
       <w:jc w:val="both"/>
     </w:pPr>
     <w:rPr>
@@ -7334,7 +7404,7 @@
         <w:numId w:val="5"/>
       </w:numPr>
       <w:spacing w:before="160" w:after="0"/>
-      <w:ind w:hanging="0" w:start="1134" w:end="284"/>
+      <w:ind w:hanging="0" w:left="1134" w:right="284"/>
       <w:jc w:val="both"/>
     </w:pPr>
     <w:rPr>
@@ -7347,7 +7417,7 @@
     <w:qFormat/>
     <w:pPr>
       <w:spacing w:before="100" w:after="0"/>
-      <w:ind w:hanging="425" w:start="2694" w:end="284"/>
+      <w:ind w:hanging="425" w:left="2694" w:right="284"/>
       <w:jc w:val="both"/>
     </w:pPr>
     <w:rPr>
@@ -7367,7 +7437,7 @@
         <w:left w:val="single" w:sz="18" w:space="4" w:color="000000"/>
       </w:pBdr>
       <w:spacing w:before="120" w:after="40"/>
-      <w:ind w:hanging="0" w:start="1559" w:end="425"/>
+      <w:ind w:hanging="0" w:left="1559" w:right="425"/>
       <w:jc w:val="both"/>
     </w:pPr>
     <w:rPr>
@@ -7395,7 +7465,7 @@
         <w:left w:val="single" w:sz="18" w:space="4" w:color="000000"/>
       </w:pBdr>
       <w:spacing w:before="160" w:after="40"/>
-      <w:ind w:hanging="0" w:start="1559" w:end="567"/>
+      <w:ind w:hanging="0" w:left="1559" w:right="567"/>
       <w:jc w:val="both"/>
     </w:pPr>
     <w:rPr>
@@ -7424,7 +7494,7 @@
         <w:tab w:val="left" w:pos="1021" w:leader="none"/>
       </w:tabs>
       <w:spacing w:before="160" w:after="180"/>
-      <w:ind w:hanging="0" w:start="284" w:end="284"/>
+      <w:ind w:hanging="0" w:left="284" w:right="284"/>
       <w:jc w:val="center"/>
     </w:pPr>
     <w:rPr>
@@ -7472,7 +7542,7 @@
       <w:suppressAutoHyphens w:val="true"/>
       <w:bidi w:val="0"/>
       <w:spacing w:before="0" w:after="0"/>
-      <w:jc w:val="start"/>
+      <w:jc w:val="left"/>
     </w:pPr>
     <w:rPr>
       <w:rFonts w:ascii="Times New Roman" w:hAnsi="Times New Roman" w:eastAsia="Times New Roman" w:cs="Times New Roman"/>
@@ -7496,7 +7566,7 @@
       <w:suppressAutoHyphens w:val="true"/>
       <w:bidi w:val="0"/>
       <w:spacing w:before="0" w:after="0"/>
-      <w:jc w:val="start"/>
+      <w:jc w:val="left"/>
     </w:pPr>
     <w:rPr>
       <w:rFonts w:ascii="Times New Roman" w:hAnsi="Times New Roman" w:eastAsia="Times New Roman" w:cs="Times New Roman"/>
@@ -7518,7 +7588,7 @@
       <w:suppressAutoHyphens w:val="true"/>
       <w:bidi w:val="0"/>
       <w:spacing w:before="0" w:after="0"/>
-      <w:jc w:val="start"/>
+      <w:jc w:val="left"/>
     </w:pPr>
     <w:rPr>
       <w:rFonts w:ascii="Times New Roman" w:hAnsi="Times New Roman" w:eastAsia="Times New Roman" w:cs="Times New Roman"/>
@@ -7535,7 +7605,7 @@
     <w:qFormat/>
     <w:pPr>
       <w:spacing w:before="160" w:after="0"/>
-      <w:ind w:hanging="360" w:start="720" w:end="284"/>
+      <w:ind w:hanging="360" w:left="720" w:right="284"/>
       <w:jc w:val="both"/>
     </w:pPr>
     <w:rPr>
@@ -7574,7 +7644,7 @@
     <w:basedOn w:val="Normal"/>
     <w:qFormat/>
     <w:pPr>
-      <w:ind w:hanging="425" w:start="1134" w:end="284"/>
+      <w:ind w:hanging="425" w:left="1134" w:right="284"/>
     </w:pPr>
     <w:rPr>
       <w:sz w:val="24"/>
@@ -7585,8 +7655,8 @@
     <w:basedOn w:val="ListBullet2"/>
     <w:qFormat/>
     <w:pPr>
-      <w:ind w:hanging="567" w:start="1701" w:end="284"/>
-      <w:jc w:val="start"/>
+      <w:ind w:hanging="567" w:left="1701" w:right="284"/>
+      <w:jc w:val="left"/>
     </w:pPr>
     <w:rPr/>
   </w:style>
@@ -7595,7 +7665,7 @@
     <w:basedOn w:val="list2"/>
     <w:qFormat/>
     <w:pPr>
-      <w:ind w:hanging="851" w:start="2552" w:end="284"/>
+      <w:ind w:hanging="851" w:left="2552" w:right="284"/>
     </w:pPr>
     <w:rPr/>
   </w:style>
@@ -7604,7 +7674,7 @@
     <w:basedOn w:val="list3"/>
     <w:qFormat/>
     <w:pPr>
-      <w:ind w:hanging="850" w:start="3402" w:end="284"/>
+      <w:ind w:hanging="850" w:left="3402" w:right="284"/>
     </w:pPr>
     <w:rPr/>
   </w:style>
@@ -7635,7 +7705,7 @@
         <w:bottom w:val="single" w:sz="6" w:space="1" w:color="000000"/>
       </w:pBdr>
       <w:spacing w:lineRule="atLeast" w:line="240"/>
-      <w:ind w:hanging="0" w:start="0" w:end="284"/>
+      <w:ind w:hanging="0" w:left="0" w:right="284"/>
     </w:pPr>
     <w:rPr>
       <w:rFonts w:ascii="Arial" w:hAnsi="Arial" w:cs="Arial"/>
@@ -7661,7 +7731,7 @@
     <w:qFormat/>
     <w:pPr>
       <w:spacing w:lineRule="atLeast" w:line="240" w:before="160" w:after="120"/>
-      <w:ind w:hanging="0" w:start="-425" w:end="284"/>
+      <w:ind w:hanging="0" w:left="-425" w:right="284"/>
     </w:pPr>
     <w:rPr>
       <w:rFonts w:ascii="Arial" w:hAnsi="Arial" w:cs="Arial"/>
@@ -7676,7 +7746,7 @@
       <w:suppressAutoHyphens w:val="true"/>
       <w:bidi w:val="0"/>
       <w:spacing w:before="40" w:after="40"/>
-      <w:jc w:val="start"/>
+      <w:jc w:val="left"/>
     </w:pPr>
     <w:rPr>
       <w:rFonts w:ascii="Arial" w:hAnsi="Arial" w:eastAsia="Times New Roman" w:cs="Arial"/>
@@ -7697,8 +7767,8 @@
         <w:left w:val="single" w:sz="18" w:space="4" w:color="000000"/>
       </w:pBdr>
       <w:spacing w:before="120" w:after="40"/>
-      <w:ind w:hanging="0" w:start="1559" w:end="567"/>
-      <w:jc w:val="start"/>
+      <w:ind w:hanging="0" w:left="1559" w:right="567"/>
+      <w:jc w:val="left"/>
       <w:outlineLvl w:val="0"/>
     </w:pPr>
     <w:rPr>
@@ -7717,7 +7787,7 @@
         <w:left w:val="single" w:sz="18" w:space="4" w:color="000000"/>
       </w:pBdr>
       <w:spacing w:before="0" w:after="40"/>
-      <w:ind w:hanging="0" w:start="284" w:end="567"/>
+      <w:ind w:hanging="0" w:left="284" w:right="567"/>
     </w:pPr>
     <w:rPr>
       <w:b/>
@@ -7739,9 +7809,9 @@
         <w:ilvl w:val="0"/>
         <w:numId w:val="6"/>
       </w:numPr>
-      <w:overflowPunct w:val="false"/>
+      <w:overflowPunct w:val="true"/>
       <w:spacing w:before="0" w:after="120"/>
-      <w:ind w:hanging="360" w:start="0" w:end="360"/>
+      <w:ind w:hanging="360" w:left="0" w:right="360"/>
       <w:jc w:val="both"/>
       <w:textAlignment w:val="baseline"/>
     </w:pPr>
@@ -7757,7 +7827,7 @@
     <w:qFormat/>
     <w:pPr>
       <w:spacing w:before="0" w:after="120"/>
-      <w:ind w:hanging="0" w:start="0" w:end="284"/>
+      <w:ind w:hanging="0" w:left="0" w:right="284"/>
     </w:pPr>
     <w:rPr>
       <w:rFonts w:cs="Times New Roman"/>
@@ -7789,8 +7859,8 @@
       </w:numPr>
       <w:bidi w:val="1"/>
       <w:spacing w:lineRule="auto" w:line="252" w:before="240" w:after="0"/>
-      <w:ind w:hanging="0" w:start="0" w:end="0"/>
-      <w:jc w:val="start"/>
+      <w:ind w:hanging="0" w:left="0" w:right="0"/>
+      <w:jc w:val="left"/>
       <w:outlineLvl w:val="9"/>
     </w:pPr>
     <w:rPr>
@@ -7810,7 +7880,7 @@
     <w:basedOn w:val="Normal"/>
     <w:next w:val="Normal"/>
     <w:pPr>
-      <w:ind w:hanging="0" w:start="240" w:end="284"/>
+      <w:ind w:hanging="0" w:left="240" w:right="284"/>
     </w:pPr>
     <w:rPr/>
   </w:style>
@@ -7819,7 +7889,7 @@
     <w:basedOn w:val="Normal"/>
     <w:next w:val="Normal"/>
     <w:pPr>
-      <w:ind w:hanging="0" w:start="480" w:end="284"/>
+      <w:ind w:hanging="0" w:left="480" w:right="284"/>
     </w:pPr>
     <w:rPr/>
   </w:style>
@@ -7828,7 +7898,7 @@
     <w:basedOn w:val="Normal"/>
     <w:next w:val="Normal"/>
     <w:pPr>
-      <w:ind w:hanging="0" w:start="0" w:end="284"/>
+      <w:ind w:hanging="0" w:left="0" w:right="284"/>
     </w:pPr>
     <w:rPr/>
   </w:style>
@@ -7840,7 +7910,7 @@
       <w:widowControl w:val="false"/>
       <w:suppressLineNumbers/>
       <w:spacing w:before="29" w:after="0"/>
-      <w:ind w:hanging="0" w:start="29" w:end="29"/>
+      <w:ind w:hanging="0" w:left="29" w:right="29"/>
     </w:pPr>
     <w:rPr/>
   </w:style>
@@ -7902,15 +7972,15 @@
     <w:pPr/>
     <w:rPr/>
   </w:style>
-  <w:style w:type="paragraph" w:styleId="FrameContentsuser">
-    <w:name w:val="Frame Contents (user)"/>
+  <w:style w:type="paragraph" w:styleId="FrameContents">
+    <w:name w:val="Frame Contents"/>
     <w:basedOn w:val="Normal"/>
     <w:qFormat/>
     <w:pPr/>
     <w:rPr/>
   </w:style>
-  <w:style w:type="paragraph" w:styleId="FrameContents">
-    <w:name w:val="Frame Contents"/>
+  <w:style w:type="paragraph" w:styleId="FrameContentsuser">
+    <w:name w:val="Frame Contents (user)"/>
     <w:basedOn w:val="Normal"/>
     <w:qFormat/>
     <w:pPr/>
@@ -7951,37 +8021,37 @@
         <a:srgbClr val="000000"/>
       </a:dk1>
       <a:lt1>
-        <a:srgbClr val="ffffff"/>
+        <a:srgbClr val="FFFFFF"/>
       </a:lt1>
       <a:dk2>
         <a:srgbClr val="000000"/>
       </a:dk2>
       <a:lt2>
-        <a:srgbClr val="ffffff"/>
+        <a:srgbClr val="FFFFFF"/>
       </a:lt2>
       <a:accent1>
-        <a:srgbClr val="18a303"/>
+        <a:srgbClr val="18A303"/>
       </a:accent1>
       <a:accent2>
-        <a:srgbClr val="0369a3"/>
+        <a:srgbClr val="0369A3"/>
       </a:accent2>
       <a:accent3>
-        <a:srgbClr val="a33e03"/>
+        <a:srgbClr val="A33E03"/>
       </a:accent3>
       <a:accent4>
-        <a:srgbClr val="8e03a3"/>
+        <a:srgbClr val="8E03A3"/>
       </a:accent4>
       <a:accent5>
-        <a:srgbClr val="c99c00"/>
+        <a:srgbClr val="C99C00"/>
       </a:accent5>
       <a:accent6>
-        <a:srgbClr val="c9211e"/>
+        <a:srgbClr val="C9211E"/>
       </a:accent6>
       <a:hlink>
-        <a:srgbClr val="0000ee"/>
+        <a:srgbClr val="0000EE"/>
       </a:hlink>
       <a:folHlink>
-        <a:srgbClr val="551a8b"/>
+        <a:srgbClr val="551A8B"/>
       </a:folHlink>
     </a:clrScheme>
     <a:fontScheme name="Office">

</xml_diff>